<commit_message>
docs: consolidate all cost files into single BaoGia_KhachHang (md+docx) - add tablet option, consumables, free services, backup notes. Delete 6 old cost files
</commit_message>
<xml_diff>
--- a/BaoGia_KhachHang.docx
+++ b/BaoGia_KhachHang.docx
@@ -4,7 +4,7 @@
   <w:body>
     <w:p>
       <w:pPr>
-        <w:spacing w:before="120" w:after="40"/>
+        <w:spacing w:before="80" w:after="40"/>
         <w:jc w:val="center"/>
       </w:pPr>
       <w:r>
@@ -156,6 +156,33 @@
           <w:sz w:val="26"/>
         </w:rPr>
         <w:t>A. CHI PHÍ THIẾT BỊ (Thanh toán 1 lần)</w:t>
+      </w:r>
+    </w:p>
+    <w:p>
+      <w:pPr>
+        <w:keepNext/>
+        <w:spacing w:before="200" w:after="80"/>
+      </w:pPr>
+      <w:r>
+        <w:rPr>
+          <w:rFonts w:ascii="Arial" w:hAnsi="Arial"/>
+          <w:b/>
+          <w:color w:val="2563EB"/>
+          <w:sz w:val="22"/>
+        </w:rPr>
+        <w:t>Lựa chọn 1: Màn hình TV + Android Box (Không cảm ứng)</w:t>
+      </w:r>
+    </w:p>
+    <w:p>
+      <w:pPr>
+        <w:spacing w:before="0" w:after="60"/>
+      </w:pPr>
+      <w:r>
+        <w:rPr>
+          <w:rFonts w:ascii="Arial" w:hAnsi="Arial"/>
+          <w:sz w:val="20"/>
+        </w:rPr>
+        <w:t>Nhân viên xem đơn trên TV, thao tác hoàn thành đơn qua điện thoại (Staff App).</w:t>
       </w:r>
     </w:p>
     <w:tbl>
@@ -385,7 +412,7 @@
                 <w:color w:val="1E293B"/>
                 <w:sz w:val="18"/>
               </w:rPr>
-              <w:t>Màn hình TV 32" hiển thị đơn tại quầy</w:t>
+              <w:t>TV 32 inch hiển thị đơn tại quầy</w:t>
             </w:r>
           </w:p>
         </w:tc>
@@ -637,7 +664,7 @@
                 <w:color w:val="1E293B"/>
                 <w:sz w:val="18"/>
               </w:rPr>
-              <w:t>Thiết bị chạy phần mềm trên TV</w:t>
+              <w:t>Chạy phần mềm KDS trên TV</w:t>
             </w:r>
           </w:p>
         </w:tc>
@@ -1242,7 +1269,7 @@
                 <w:color w:val="1E293B"/>
                 <w:sz w:val="18"/>
               </w:rPr>
-              <w:t>TỔNG THIẾT BỊ</w:t>
+              <w:t>TỔNG LỰA CHỌN 1</w:t>
             </w:r>
           </w:p>
         </w:tc>
@@ -1452,6 +1479,1842 @@
                 <w:sz w:val="18"/>
               </w:rPr>
               <w:t>Tiết kiệm 6 triệu</w:t>
+            </w:r>
+          </w:p>
+        </w:tc>
+      </w:tr>
+    </w:tbl>
+    <w:p>
+      <w:pPr>
+        <w:spacing w:after="40"/>
+      </w:pPr>
+    </w:p>
+    <w:p>
+      <w:pPr>
+        <w:keepNext/>
+        <w:spacing w:before="200" w:after="80"/>
+      </w:pPr>
+      <w:r>
+        <w:rPr>
+          <w:rFonts w:ascii="Arial" w:hAnsi="Arial"/>
+          <w:b/>
+          <w:color w:val="2563EB"/>
+          <w:sz w:val="22"/>
+        </w:rPr>
+        <w:t>Lựa chọn 2: Tablet cảm ứng (Đề xuất)</w:t>
+      </w:r>
+    </w:p>
+    <w:p>
+      <w:pPr>
+        <w:spacing w:before="0" w:after="60"/>
+      </w:pPr>
+      <w:r>
+        <w:rPr>
+          <w:rFonts w:ascii="Arial" w:hAnsi="Arial"/>
+          <w:sz w:val="20"/>
+        </w:rPr>
+        <w:t>Nhân viên bấm trực tiếp trên màn hình cảm ứng để hoàn thành đơn, báo hết món, xem chi tiết.</w:t>
+      </w:r>
+    </w:p>
+    <w:tbl>
+      <w:tblPr>
+        <w:tblW w:type="auto" w:w="0"/>
+        <w:jc w:val="center"/>
+        <w:tblLook w:firstColumn="1" w:firstRow="1" w:lastColumn="0" w:lastRow="0" w:noHBand="0" w:noVBand="1" w:val="04A0"/>
+        <w:tblBorders>
+          <w:top w:val="single" w:sz="6" w:space="0" w:color="CBD5E1"/>
+          <w:bottom w:val="single" w:sz="6" w:space="0" w:color="CBD5E1"/>
+          <w:left w:val="single" w:sz="6" w:space="0" w:color="CBD5E1"/>
+          <w:right w:val="single" w:sz="6" w:space="0" w:color="CBD5E1"/>
+          <w:insideH w:val="single" w:sz="4" w:space="0" w:color="E2E8F0"/>
+          <w:insideV w:val="single" w:sz="4" w:space="0" w:color="E2E8F0"/>
+        </w:tblBorders>
+      </w:tblPr>
+      <w:tblGrid>
+        <w:gridCol w:w="1704"/>
+        <w:gridCol w:w="1704"/>
+        <w:gridCol w:w="1704"/>
+        <w:gridCol w:w="1704"/>
+        <w:gridCol w:w="1704"/>
+        <w:gridCol w:w="1704"/>
+      </w:tblGrid>
+      <w:tr>
+        <w:tc>
+          <w:tcPr>
+            <w:tcW w:type="dxa" w:w="1704"/>
+            <w:tcMar>
+              <w:top w:w="70" w:type="dxa"/>
+              <w:bottom w:w="70" w:type="dxa"/>
+              <w:left w:w="100" w:type="dxa"/>
+              <w:right w:w="100" w:type="dxa"/>
+            </w:tcMar>
+            <w:shd w:fill="0F172A"/>
+          </w:tcPr>
+          <w:p>
+            <w:pPr>
+              <w:spacing w:before="0" w:after="0"/>
+            </w:pPr>
+            <w:r>
+              <w:rPr>
+                <w:rFonts w:ascii="Arial" w:hAnsi="Arial"/>
+                <w:b/>
+                <w:color w:val="FFFFFF"/>
+                <w:sz w:val="18"/>
+              </w:rPr>
+              <w:t>STT</w:t>
+            </w:r>
+          </w:p>
+        </w:tc>
+        <w:tc>
+          <w:tcPr>
+            <w:tcW w:type="dxa" w:w="1704"/>
+            <w:tcMar>
+              <w:top w:w="70" w:type="dxa"/>
+              <w:bottom w:w="70" w:type="dxa"/>
+              <w:left w:w="100" w:type="dxa"/>
+              <w:right w:w="100" w:type="dxa"/>
+            </w:tcMar>
+            <w:shd w:fill="0F172A"/>
+          </w:tcPr>
+          <w:p>
+            <w:pPr>
+              <w:spacing w:before="0" w:after="0"/>
+            </w:pPr>
+            <w:r>
+              <w:rPr>
+                <w:rFonts w:ascii="Arial" w:hAnsi="Arial"/>
+                <w:b/>
+                <w:color w:val="FFFFFF"/>
+                <w:sz w:val="18"/>
+              </w:rPr>
+              <w:t>Hạng mục</w:t>
+            </w:r>
+          </w:p>
+        </w:tc>
+        <w:tc>
+          <w:tcPr>
+            <w:tcW w:type="dxa" w:w="1704"/>
+            <w:tcMar>
+              <w:top w:w="70" w:type="dxa"/>
+              <w:bottom w:w="70" w:type="dxa"/>
+              <w:left w:w="100" w:type="dxa"/>
+              <w:right w:w="100" w:type="dxa"/>
+            </w:tcMar>
+            <w:shd w:fill="0F172A"/>
+          </w:tcPr>
+          <w:p>
+            <w:pPr>
+              <w:spacing w:before="0" w:after="0"/>
+            </w:pPr>
+            <w:r>
+              <w:rPr>
+                <w:rFonts w:ascii="Arial" w:hAnsi="Arial"/>
+                <w:b/>
+                <w:color w:val="FFFFFF"/>
+                <w:sz w:val="18"/>
+              </w:rPr>
+              <w:t>Đơn giá</w:t>
+            </w:r>
+          </w:p>
+        </w:tc>
+        <w:tc>
+          <w:tcPr>
+            <w:tcW w:type="dxa" w:w="1704"/>
+            <w:tcMar>
+              <w:top w:w="70" w:type="dxa"/>
+              <w:bottom w:w="70" w:type="dxa"/>
+              <w:left w:w="100" w:type="dxa"/>
+              <w:right w:w="100" w:type="dxa"/>
+            </w:tcMar>
+            <w:shd w:fill="0F172A"/>
+          </w:tcPr>
+          <w:p>
+            <w:pPr>
+              <w:spacing w:before="0" w:after="0"/>
+            </w:pPr>
+            <w:r>
+              <w:rPr>
+                <w:rFonts w:ascii="Arial" w:hAnsi="Arial"/>
+                <w:b/>
+                <w:color w:val="FFFFFF"/>
+                <w:sz w:val="18"/>
+              </w:rPr>
+              <w:t>SL</w:t>
+            </w:r>
+          </w:p>
+        </w:tc>
+        <w:tc>
+          <w:tcPr>
+            <w:tcW w:type="dxa" w:w="1704"/>
+            <w:tcMar>
+              <w:top w:w="70" w:type="dxa"/>
+              <w:bottom w:w="70" w:type="dxa"/>
+              <w:left w:w="100" w:type="dxa"/>
+              <w:right w:w="100" w:type="dxa"/>
+            </w:tcMar>
+            <w:shd w:fill="0F172A"/>
+          </w:tcPr>
+          <w:p>
+            <w:pPr>
+              <w:spacing w:before="0" w:after="0"/>
+            </w:pPr>
+            <w:r>
+              <w:rPr>
+                <w:rFonts w:ascii="Arial" w:hAnsi="Arial"/>
+                <w:b/>
+                <w:color w:val="FFFFFF"/>
+                <w:sz w:val="18"/>
+              </w:rPr>
+              <w:t>Thành tiền</w:t>
+            </w:r>
+          </w:p>
+        </w:tc>
+        <w:tc>
+          <w:tcPr>
+            <w:tcW w:type="dxa" w:w="1704"/>
+            <w:tcMar>
+              <w:top w:w="70" w:type="dxa"/>
+              <w:bottom w:w="70" w:type="dxa"/>
+              <w:left w:w="100" w:type="dxa"/>
+              <w:right w:w="100" w:type="dxa"/>
+            </w:tcMar>
+            <w:shd w:fill="0F172A"/>
+          </w:tcPr>
+          <w:p>
+            <w:pPr>
+              <w:spacing w:before="0" w:after="0"/>
+            </w:pPr>
+            <w:r>
+              <w:rPr>
+                <w:rFonts w:ascii="Arial" w:hAnsi="Arial"/>
+                <w:b/>
+                <w:color w:val="FFFFFF"/>
+                <w:sz w:val="18"/>
+              </w:rPr>
+              <w:t>Ghi chú</w:t>
+            </w:r>
+          </w:p>
+        </w:tc>
+      </w:tr>
+      <w:tr>
+        <w:tc>
+          <w:tcPr>
+            <w:tcW w:type="dxa" w:w="1704"/>
+            <w:tcMar>
+              <w:top w:w="70" w:type="dxa"/>
+              <w:bottom w:w="70" w:type="dxa"/>
+              <w:left w:w="100" w:type="dxa"/>
+              <w:right w:w="100" w:type="dxa"/>
+            </w:tcMar>
+            <w:shd w:fill="FFFFFF"/>
+          </w:tcPr>
+          <w:p>
+            <w:pPr>
+              <w:spacing w:before="0" w:after="0"/>
+            </w:pPr>
+            <w:r>
+              <w:rPr>
+                <w:rFonts w:ascii="Arial" w:hAnsi="Arial"/>
+                <w:color w:val="1E293B"/>
+                <w:sz w:val="18"/>
+              </w:rPr>
+              <w:t>1</w:t>
+            </w:r>
+          </w:p>
+        </w:tc>
+        <w:tc>
+          <w:tcPr>
+            <w:tcW w:type="dxa" w:w="1704"/>
+            <w:tcMar>
+              <w:top w:w="70" w:type="dxa"/>
+              <w:bottom w:w="70" w:type="dxa"/>
+              <w:left w:w="100" w:type="dxa"/>
+              <w:right w:w="100" w:type="dxa"/>
+            </w:tcMar>
+            <w:shd w:fill="FFFFFF"/>
+          </w:tcPr>
+          <w:p>
+            <w:pPr>
+              <w:spacing w:before="0" w:after="0"/>
+            </w:pPr>
+            <w:r>
+              <w:rPr>
+                <w:rFonts w:ascii="Arial" w:hAnsi="Arial"/>
+                <w:color w:val="1E293B"/>
+                <w:sz w:val="18"/>
+              </w:rPr>
+              <w:t>Tablet Android 10-11 inch</w:t>
+            </w:r>
+          </w:p>
+        </w:tc>
+        <w:tc>
+          <w:tcPr>
+            <w:tcW w:type="dxa" w:w="1704"/>
+            <w:tcMar>
+              <w:top w:w="70" w:type="dxa"/>
+              <w:bottom w:w="70" w:type="dxa"/>
+              <w:left w:w="100" w:type="dxa"/>
+              <w:right w:w="100" w:type="dxa"/>
+            </w:tcMar>
+            <w:shd w:fill="FFFFFF"/>
+          </w:tcPr>
+          <w:p>
+            <w:pPr>
+              <w:spacing w:before="0" w:after="0"/>
+            </w:pPr>
+            <w:r>
+              <w:rPr>
+                <w:rFonts w:ascii="Arial" w:hAnsi="Arial"/>
+                <w:color w:val="1E293B"/>
+                <w:sz w:val="18"/>
+              </w:rPr>
+              <w:t>5.000.000</w:t>
+            </w:r>
+          </w:p>
+        </w:tc>
+        <w:tc>
+          <w:tcPr>
+            <w:tcW w:type="dxa" w:w="1704"/>
+            <w:tcMar>
+              <w:top w:w="70" w:type="dxa"/>
+              <w:bottom w:w="70" w:type="dxa"/>
+              <w:left w:w="100" w:type="dxa"/>
+              <w:right w:w="100" w:type="dxa"/>
+            </w:tcMar>
+            <w:shd w:fill="FFFFFF"/>
+          </w:tcPr>
+          <w:p>
+            <w:pPr>
+              <w:spacing w:before="0" w:after="0"/>
+            </w:pPr>
+            <w:r>
+              <w:rPr>
+                <w:rFonts w:ascii="Arial" w:hAnsi="Arial"/>
+                <w:color w:val="1E293B"/>
+                <w:sz w:val="18"/>
+              </w:rPr>
+              <w:t>3</w:t>
+            </w:r>
+          </w:p>
+        </w:tc>
+        <w:tc>
+          <w:tcPr>
+            <w:tcW w:type="dxa" w:w="1704"/>
+            <w:tcMar>
+              <w:top w:w="70" w:type="dxa"/>
+              <w:bottom w:w="70" w:type="dxa"/>
+              <w:left w:w="100" w:type="dxa"/>
+              <w:right w:w="100" w:type="dxa"/>
+            </w:tcMar>
+            <w:shd w:fill="FFFFFF"/>
+          </w:tcPr>
+          <w:p>
+            <w:pPr>
+              <w:spacing w:before="0" w:after="0"/>
+            </w:pPr>
+            <w:r>
+              <w:rPr>
+                <w:rFonts w:ascii="Arial" w:hAnsi="Arial"/>
+                <w:color w:val="1E293B"/>
+                <w:sz w:val="18"/>
+              </w:rPr>
+              <w:t>15.000.000</w:t>
+            </w:r>
+          </w:p>
+        </w:tc>
+        <w:tc>
+          <w:tcPr>
+            <w:tcW w:type="dxa" w:w="1704"/>
+            <w:tcMar>
+              <w:top w:w="70" w:type="dxa"/>
+              <w:bottom w:w="70" w:type="dxa"/>
+              <w:left w:w="100" w:type="dxa"/>
+              <w:right w:w="100" w:type="dxa"/>
+            </w:tcMar>
+            <w:shd w:fill="FFFFFF"/>
+          </w:tcPr>
+          <w:p>
+            <w:pPr>
+              <w:spacing w:before="0" w:after="0"/>
+            </w:pPr>
+            <w:r>
+              <w:rPr>
+                <w:rFonts w:ascii="Arial" w:hAnsi="Arial"/>
+                <w:color w:val="1E293B"/>
+                <w:sz w:val="18"/>
+              </w:rPr>
+              <w:t>Thay thế TV + Box, NV thao tác cảm ứng</w:t>
+            </w:r>
+          </w:p>
+        </w:tc>
+      </w:tr>
+      <w:tr>
+        <w:tc>
+          <w:tcPr>
+            <w:tcW w:type="dxa" w:w="1704"/>
+            <w:tcMar>
+              <w:top w:w="70" w:type="dxa"/>
+              <w:bottom w:w="70" w:type="dxa"/>
+              <w:left w:w="100" w:type="dxa"/>
+              <w:right w:w="100" w:type="dxa"/>
+            </w:tcMar>
+            <w:shd w:fill="F8FAFC"/>
+          </w:tcPr>
+          <w:p>
+            <w:pPr>
+              <w:spacing w:before="0" w:after="0"/>
+            </w:pPr>
+            <w:r>
+              <w:rPr>
+                <w:rFonts w:ascii="Arial" w:hAnsi="Arial"/>
+                <w:color w:val="1E293B"/>
+                <w:sz w:val="18"/>
+              </w:rPr>
+              <w:t>2</w:t>
+            </w:r>
+          </w:p>
+        </w:tc>
+        <w:tc>
+          <w:tcPr>
+            <w:tcW w:type="dxa" w:w="1704"/>
+            <w:tcMar>
+              <w:top w:w="70" w:type="dxa"/>
+              <w:bottom w:w="70" w:type="dxa"/>
+              <w:left w:w="100" w:type="dxa"/>
+              <w:right w:w="100" w:type="dxa"/>
+            </w:tcMar>
+            <w:shd w:fill="F8FAFC"/>
+          </w:tcPr>
+          <w:p>
+            <w:pPr>
+              <w:spacing w:before="0" w:after="0"/>
+            </w:pPr>
+            <w:r>
+              <w:rPr>
+                <w:rFonts w:ascii="Arial" w:hAnsi="Arial"/>
+                <w:color w:val="1E293B"/>
+                <w:sz w:val="18"/>
+              </w:rPr>
+              <w:t>Giá đỡ Tablet cố định tại quầy</w:t>
+            </w:r>
+          </w:p>
+        </w:tc>
+        <w:tc>
+          <w:tcPr>
+            <w:tcW w:type="dxa" w:w="1704"/>
+            <w:tcMar>
+              <w:top w:w="70" w:type="dxa"/>
+              <w:bottom w:w="70" w:type="dxa"/>
+              <w:left w:w="100" w:type="dxa"/>
+              <w:right w:w="100" w:type="dxa"/>
+            </w:tcMar>
+            <w:shd w:fill="F8FAFC"/>
+          </w:tcPr>
+          <w:p>
+            <w:pPr>
+              <w:spacing w:before="0" w:after="0"/>
+            </w:pPr>
+            <w:r>
+              <w:rPr>
+                <w:rFonts w:ascii="Arial" w:hAnsi="Arial"/>
+                <w:color w:val="1E293B"/>
+                <w:sz w:val="18"/>
+              </w:rPr>
+              <w:t>200.000</w:t>
+            </w:r>
+          </w:p>
+        </w:tc>
+        <w:tc>
+          <w:tcPr>
+            <w:tcW w:type="dxa" w:w="1704"/>
+            <w:tcMar>
+              <w:top w:w="70" w:type="dxa"/>
+              <w:bottom w:w="70" w:type="dxa"/>
+              <w:left w:w="100" w:type="dxa"/>
+              <w:right w:w="100" w:type="dxa"/>
+            </w:tcMar>
+            <w:shd w:fill="F8FAFC"/>
+          </w:tcPr>
+          <w:p>
+            <w:pPr>
+              <w:spacing w:before="0" w:after="0"/>
+            </w:pPr>
+            <w:r>
+              <w:rPr>
+                <w:rFonts w:ascii="Arial" w:hAnsi="Arial"/>
+                <w:color w:val="1E293B"/>
+                <w:sz w:val="18"/>
+              </w:rPr>
+              <w:t>3</w:t>
+            </w:r>
+          </w:p>
+        </w:tc>
+        <w:tc>
+          <w:tcPr>
+            <w:tcW w:type="dxa" w:w="1704"/>
+            <w:tcMar>
+              <w:top w:w="70" w:type="dxa"/>
+              <w:bottom w:w="70" w:type="dxa"/>
+              <w:left w:w="100" w:type="dxa"/>
+              <w:right w:w="100" w:type="dxa"/>
+            </w:tcMar>
+            <w:shd w:fill="F8FAFC"/>
+          </w:tcPr>
+          <w:p>
+            <w:pPr>
+              <w:spacing w:before="0" w:after="0"/>
+            </w:pPr>
+            <w:r>
+              <w:rPr>
+                <w:rFonts w:ascii="Arial" w:hAnsi="Arial"/>
+                <w:color w:val="1E293B"/>
+                <w:sz w:val="18"/>
+              </w:rPr>
+              <w:t>600.000</w:t>
+            </w:r>
+          </w:p>
+        </w:tc>
+        <w:tc>
+          <w:tcPr>
+            <w:tcW w:type="dxa" w:w="1704"/>
+            <w:tcMar>
+              <w:top w:w="70" w:type="dxa"/>
+              <w:bottom w:w="70" w:type="dxa"/>
+              <w:left w:w="100" w:type="dxa"/>
+              <w:right w:w="100" w:type="dxa"/>
+            </w:tcMar>
+            <w:shd w:fill="F8FAFC"/>
+          </w:tcPr>
+          <w:p>
+            <w:pPr>
+              <w:spacing w:before="0" w:after="0"/>
+            </w:pPr>
+            <w:r>
+              <w:rPr>
+                <w:rFonts w:ascii="Arial" w:hAnsi="Arial"/>
+                <w:color w:val="1E293B"/>
+                <w:sz w:val="18"/>
+              </w:rPr>
+              <w:t>Gắn cố định hoặc đặt đứng</w:t>
+            </w:r>
+          </w:p>
+        </w:tc>
+      </w:tr>
+      <w:tr>
+        <w:tc>
+          <w:tcPr>
+            <w:tcW w:type="dxa" w:w="1704"/>
+            <w:tcMar>
+              <w:top w:w="70" w:type="dxa"/>
+              <w:bottom w:w="70" w:type="dxa"/>
+              <w:left w:w="100" w:type="dxa"/>
+              <w:right w:w="100" w:type="dxa"/>
+            </w:tcMar>
+            <w:shd w:fill="FFFFFF"/>
+          </w:tcPr>
+          <w:p>
+            <w:pPr>
+              <w:spacing w:before="0" w:after="0"/>
+            </w:pPr>
+            <w:r>
+              <w:rPr>
+                <w:rFonts w:ascii="Arial" w:hAnsi="Arial"/>
+                <w:color w:val="1E293B"/>
+                <w:sz w:val="18"/>
+              </w:rPr>
+              <w:t>3</w:t>
+            </w:r>
+          </w:p>
+        </w:tc>
+        <w:tc>
+          <w:tcPr>
+            <w:tcW w:type="dxa" w:w="1704"/>
+            <w:tcMar>
+              <w:top w:w="70" w:type="dxa"/>
+              <w:bottom w:w="70" w:type="dxa"/>
+              <w:left w:w="100" w:type="dxa"/>
+              <w:right w:w="100" w:type="dxa"/>
+            </w:tcMar>
+            <w:shd w:fill="FFFFFF"/>
+          </w:tcPr>
+          <w:p>
+            <w:pPr>
+              <w:spacing w:before="0" w:after="0"/>
+            </w:pPr>
+            <w:r>
+              <w:rPr>
+                <w:rFonts w:ascii="Arial" w:hAnsi="Arial"/>
+                <w:color w:val="1E293B"/>
+                <w:sz w:val="18"/>
+              </w:rPr>
+              <w:t>Máy in hóa đơn nhiệt 80mm</w:t>
+            </w:r>
+          </w:p>
+        </w:tc>
+        <w:tc>
+          <w:tcPr>
+            <w:tcW w:type="dxa" w:w="1704"/>
+            <w:tcMar>
+              <w:top w:w="70" w:type="dxa"/>
+              <w:bottom w:w="70" w:type="dxa"/>
+              <w:left w:w="100" w:type="dxa"/>
+              <w:right w:w="100" w:type="dxa"/>
+            </w:tcMar>
+            <w:shd w:fill="FFFFFF"/>
+          </w:tcPr>
+          <w:p>
+            <w:pPr>
+              <w:spacing w:before="0" w:after="0"/>
+            </w:pPr>
+            <w:r>
+              <w:rPr>
+                <w:rFonts w:ascii="Arial" w:hAnsi="Arial"/>
+                <w:color w:val="1E293B"/>
+                <w:sz w:val="18"/>
+              </w:rPr>
+              <w:t>2.000.000</w:t>
+            </w:r>
+          </w:p>
+        </w:tc>
+        <w:tc>
+          <w:tcPr>
+            <w:tcW w:type="dxa" w:w="1704"/>
+            <w:tcMar>
+              <w:top w:w="70" w:type="dxa"/>
+              <w:bottom w:w="70" w:type="dxa"/>
+              <w:left w:w="100" w:type="dxa"/>
+              <w:right w:w="100" w:type="dxa"/>
+            </w:tcMar>
+            <w:shd w:fill="FFFFFF"/>
+          </w:tcPr>
+          <w:p>
+            <w:pPr>
+              <w:spacing w:before="0" w:after="0"/>
+            </w:pPr>
+            <w:r>
+              <w:rPr>
+                <w:rFonts w:ascii="Arial" w:hAnsi="Arial"/>
+                <w:color w:val="1E293B"/>
+                <w:sz w:val="18"/>
+              </w:rPr>
+              <w:t>3</w:t>
+            </w:r>
+          </w:p>
+        </w:tc>
+        <w:tc>
+          <w:tcPr>
+            <w:tcW w:type="dxa" w:w="1704"/>
+            <w:tcMar>
+              <w:top w:w="70" w:type="dxa"/>
+              <w:bottom w:w="70" w:type="dxa"/>
+              <w:left w:w="100" w:type="dxa"/>
+              <w:right w:w="100" w:type="dxa"/>
+            </w:tcMar>
+            <w:shd w:fill="FFFFFF"/>
+          </w:tcPr>
+          <w:p>
+            <w:pPr>
+              <w:spacing w:before="0" w:after="0"/>
+            </w:pPr>
+            <w:r>
+              <w:rPr>
+                <w:rFonts w:ascii="Arial" w:hAnsi="Arial"/>
+                <w:color w:val="1E293B"/>
+                <w:sz w:val="18"/>
+              </w:rPr>
+              <w:t>6.000.000</w:t>
+            </w:r>
+          </w:p>
+        </w:tc>
+        <w:tc>
+          <w:tcPr>
+            <w:tcW w:type="dxa" w:w="1704"/>
+            <w:tcMar>
+              <w:top w:w="70" w:type="dxa"/>
+              <w:bottom w:w="70" w:type="dxa"/>
+              <w:left w:w="100" w:type="dxa"/>
+              <w:right w:w="100" w:type="dxa"/>
+            </w:tcMar>
+            <w:shd w:fill="FFFFFF"/>
+          </w:tcPr>
+          <w:p>
+            <w:pPr>
+              <w:spacing w:before="0" w:after="0"/>
+            </w:pPr>
+            <w:r>
+              <w:rPr>
+                <w:rFonts w:ascii="Arial" w:hAnsi="Arial"/>
+                <w:color w:val="1E293B"/>
+                <w:sz w:val="18"/>
+              </w:rPr>
+              <w:t>Dùng lại máy in cũ nếu có: 0 đ</w:t>
+            </w:r>
+          </w:p>
+        </w:tc>
+      </w:tr>
+      <w:tr>
+        <w:tc>
+          <w:tcPr>
+            <w:tcW w:type="dxa" w:w="1704"/>
+            <w:tcMar>
+              <w:top w:w="70" w:type="dxa"/>
+              <w:bottom w:w="70" w:type="dxa"/>
+              <w:left w:w="100" w:type="dxa"/>
+              <w:right w:w="100" w:type="dxa"/>
+            </w:tcMar>
+            <w:shd w:fill="F8FAFC"/>
+          </w:tcPr>
+          <w:p>
+            <w:pPr>
+              <w:spacing w:before="0" w:after="0"/>
+            </w:pPr>
+            <w:r>
+              <w:rPr>
+                <w:rFonts w:ascii="Arial" w:hAnsi="Arial"/>
+                <w:color w:val="1E293B"/>
+                <w:sz w:val="18"/>
+              </w:rPr>
+              <w:t>4</w:t>
+            </w:r>
+          </w:p>
+        </w:tc>
+        <w:tc>
+          <w:tcPr>
+            <w:tcW w:type="dxa" w:w="1704"/>
+            <w:tcMar>
+              <w:top w:w="70" w:type="dxa"/>
+              <w:bottom w:w="70" w:type="dxa"/>
+              <w:left w:w="100" w:type="dxa"/>
+              <w:right w:w="100" w:type="dxa"/>
+            </w:tcMar>
+            <w:shd w:fill="F8FAFC"/>
+          </w:tcPr>
+          <w:p>
+            <w:pPr>
+              <w:spacing w:before="0" w:after="0"/>
+            </w:pPr>
+            <w:r>
+              <w:rPr>
+                <w:rFonts w:ascii="Arial" w:hAnsi="Arial"/>
+                <w:color w:val="1E293B"/>
+                <w:sz w:val="18"/>
+              </w:rPr>
+              <w:t>Bảng QR Code Acrylic để bàn</w:t>
+            </w:r>
+          </w:p>
+        </w:tc>
+        <w:tc>
+          <w:tcPr>
+            <w:tcW w:type="dxa" w:w="1704"/>
+            <w:tcMar>
+              <w:top w:w="70" w:type="dxa"/>
+              <w:bottom w:w="70" w:type="dxa"/>
+              <w:left w:w="100" w:type="dxa"/>
+              <w:right w:w="100" w:type="dxa"/>
+            </w:tcMar>
+            <w:shd w:fill="F8FAFC"/>
+          </w:tcPr>
+          <w:p>
+            <w:pPr>
+              <w:spacing w:before="0" w:after="0"/>
+            </w:pPr>
+            <w:r>
+              <w:rPr>
+                <w:rFonts w:ascii="Arial" w:hAnsi="Arial"/>
+                <w:color w:val="1E293B"/>
+                <w:sz w:val="18"/>
+              </w:rPr>
+              <w:t>30.000</w:t>
+            </w:r>
+          </w:p>
+        </w:tc>
+        <w:tc>
+          <w:tcPr>
+            <w:tcW w:type="dxa" w:w="1704"/>
+            <w:tcMar>
+              <w:top w:w="70" w:type="dxa"/>
+              <w:bottom w:w="70" w:type="dxa"/>
+              <w:left w:w="100" w:type="dxa"/>
+              <w:right w:w="100" w:type="dxa"/>
+            </w:tcMar>
+            <w:shd w:fill="F8FAFC"/>
+          </w:tcPr>
+          <w:p>
+            <w:pPr>
+              <w:spacing w:before="0" w:after="0"/>
+            </w:pPr>
+            <w:r>
+              <w:rPr>
+                <w:rFonts w:ascii="Arial" w:hAnsi="Arial"/>
+                <w:color w:val="1E293B"/>
+                <w:sz w:val="18"/>
+              </w:rPr>
+              <w:t>60</w:t>
+            </w:r>
+          </w:p>
+        </w:tc>
+        <w:tc>
+          <w:tcPr>
+            <w:tcW w:type="dxa" w:w="1704"/>
+            <w:tcMar>
+              <w:top w:w="70" w:type="dxa"/>
+              <w:bottom w:w="70" w:type="dxa"/>
+              <w:left w:w="100" w:type="dxa"/>
+              <w:right w:w="100" w:type="dxa"/>
+            </w:tcMar>
+            <w:shd w:fill="F8FAFC"/>
+          </w:tcPr>
+          <w:p>
+            <w:pPr>
+              <w:spacing w:before="0" w:after="0"/>
+            </w:pPr>
+            <w:r>
+              <w:rPr>
+                <w:rFonts w:ascii="Arial" w:hAnsi="Arial"/>
+                <w:color w:val="1E293B"/>
+                <w:sz w:val="18"/>
+              </w:rPr>
+              <w:t>1.800.000</w:t>
+            </w:r>
+          </w:p>
+        </w:tc>
+        <w:tc>
+          <w:tcPr>
+            <w:tcW w:type="dxa" w:w="1704"/>
+            <w:tcMar>
+              <w:top w:w="70" w:type="dxa"/>
+              <w:bottom w:w="70" w:type="dxa"/>
+              <w:left w:w="100" w:type="dxa"/>
+              <w:right w:w="100" w:type="dxa"/>
+            </w:tcMar>
+            <w:shd w:fill="F8FAFC"/>
+          </w:tcPr>
+          <w:p>
+            <w:pPr>
+              <w:spacing w:before="0" w:after="0"/>
+            </w:pPr>
+            <w:r>
+              <w:rPr>
+                <w:rFonts w:ascii="Arial" w:hAnsi="Arial"/>
+                <w:color w:val="1E293B"/>
+                <w:sz w:val="18"/>
+              </w:rPr>
+              <w:t>20 bàn mỗi chi nhánh</w:t>
+            </w:r>
+          </w:p>
+        </w:tc>
+      </w:tr>
+      <w:tr>
+        <w:tc>
+          <w:tcPr>
+            <w:tcW w:type="dxa" w:w="1704"/>
+            <w:tcMar>
+              <w:top w:w="70" w:type="dxa"/>
+              <w:bottom w:w="70" w:type="dxa"/>
+              <w:left w:w="100" w:type="dxa"/>
+              <w:right w:w="100" w:type="dxa"/>
+            </w:tcMar>
+            <w:shd w:fill="FFFFFF"/>
+          </w:tcPr>
+          <w:p>
+            <w:pPr>
+              <w:spacing w:before="0" w:after="0"/>
+            </w:pPr>
+            <w:r>
+              <w:rPr>
+                <w:rFonts w:ascii="Arial" w:hAnsi="Arial"/>
+                <w:color w:val="1E293B"/>
+                <w:sz w:val="18"/>
+              </w:rPr>
+              <w:t>5</w:t>
+            </w:r>
+          </w:p>
+        </w:tc>
+        <w:tc>
+          <w:tcPr>
+            <w:tcW w:type="dxa" w:w="1704"/>
+            <w:tcMar>
+              <w:top w:w="70" w:type="dxa"/>
+              <w:bottom w:w="70" w:type="dxa"/>
+              <w:left w:w="100" w:type="dxa"/>
+              <w:right w:w="100" w:type="dxa"/>
+            </w:tcMar>
+            <w:shd w:fill="FFFFFF"/>
+          </w:tcPr>
+          <w:p>
+            <w:pPr>
+              <w:spacing w:before="0" w:after="0"/>
+            </w:pPr>
+            <w:r>
+              <w:rPr>
+                <w:rFonts w:ascii="Arial" w:hAnsi="Arial"/>
+                <w:color w:val="1E293B"/>
+                <w:sz w:val="18"/>
+              </w:rPr>
+              <w:t>Lắp đặt, cấu hình &amp; chạy thử</w:t>
+            </w:r>
+          </w:p>
+        </w:tc>
+        <w:tc>
+          <w:tcPr>
+            <w:tcW w:type="dxa" w:w="1704"/>
+            <w:tcMar>
+              <w:top w:w="70" w:type="dxa"/>
+              <w:bottom w:w="70" w:type="dxa"/>
+              <w:left w:w="100" w:type="dxa"/>
+              <w:right w:w="100" w:type="dxa"/>
+            </w:tcMar>
+            <w:shd w:fill="FFFFFF"/>
+          </w:tcPr>
+          <w:p>
+            <w:pPr>
+              <w:spacing w:before="0" w:after="0"/>
+            </w:pPr>
+            <w:r>
+              <w:rPr>
+                <w:rFonts w:ascii="Arial" w:hAnsi="Arial"/>
+                <w:color w:val="1E293B"/>
+                <w:sz w:val="18"/>
+              </w:rPr>
+              <w:t>1.000.000</w:t>
+            </w:r>
+          </w:p>
+        </w:tc>
+        <w:tc>
+          <w:tcPr>
+            <w:tcW w:type="dxa" w:w="1704"/>
+            <w:tcMar>
+              <w:top w:w="70" w:type="dxa"/>
+              <w:bottom w:w="70" w:type="dxa"/>
+              <w:left w:w="100" w:type="dxa"/>
+              <w:right w:w="100" w:type="dxa"/>
+            </w:tcMar>
+            <w:shd w:fill="FFFFFF"/>
+          </w:tcPr>
+          <w:p>
+            <w:pPr>
+              <w:spacing w:before="0" w:after="0"/>
+            </w:pPr>
+            <w:r>
+              <w:rPr>
+                <w:rFonts w:ascii="Arial" w:hAnsi="Arial"/>
+                <w:color w:val="1E293B"/>
+                <w:sz w:val="18"/>
+              </w:rPr>
+              <w:t>3</w:t>
+            </w:r>
+          </w:p>
+        </w:tc>
+        <w:tc>
+          <w:tcPr>
+            <w:tcW w:type="dxa" w:w="1704"/>
+            <w:tcMar>
+              <w:top w:w="70" w:type="dxa"/>
+              <w:bottom w:w="70" w:type="dxa"/>
+              <w:left w:w="100" w:type="dxa"/>
+              <w:right w:w="100" w:type="dxa"/>
+            </w:tcMar>
+            <w:shd w:fill="FFFFFF"/>
+          </w:tcPr>
+          <w:p>
+            <w:pPr>
+              <w:spacing w:before="0" w:after="0"/>
+            </w:pPr>
+            <w:r>
+              <w:rPr>
+                <w:rFonts w:ascii="Arial" w:hAnsi="Arial"/>
+                <w:color w:val="1E293B"/>
+                <w:sz w:val="18"/>
+              </w:rPr>
+              <w:t>3.000.000</w:t>
+            </w:r>
+          </w:p>
+        </w:tc>
+        <w:tc>
+          <w:tcPr>
+            <w:tcW w:type="dxa" w:w="1704"/>
+            <w:tcMar>
+              <w:top w:w="70" w:type="dxa"/>
+              <w:bottom w:w="70" w:type="dxa"/>
+              <w:left w:w="100" w:type="dxa"/>
+              <w:right w:w="100" w:type="dxa"/>
+            </w:tcMar>
+            <w:shd w:fill="FFFFFF"/>
+          </w:tcPr>
+          <w:p>
+            <w:pPr>
+              <w:spacing w:before="0" w:after="0"/>
+            </w:pPr>
+            <w:r>
+              <w:rPr>
+                <w:rFonts w:ascii="Arial" w:hAnsi="Arial"/>
+                <w:color w:val="1E293B"/>
+                <w:sz w:val="18"/>
+              </w:rPr>
+              <w:t>Trọn gói 3 chi nhánh</w:t>
+            </w:r>
+          </w:p>
+        </w:tc>
+      </w:tr>
+      <w:tr>
+        <w:tc>
+          <w:tcPr>
+            <w:tcW w:type="dxa" w:w="1704"/>
+            <w:tcMar>
+              <w:top w:w="70" w:type="dxa"/>
+              <w:bottom w:w="70" w:type="dxa"/>
+              <w:left w:w="100" w:type="dxa"/>
+              <w:right w:w="100" w:type="dxa"/>
+            </w:tcMar>
+            <w:shd w:fill="F8FAFC"/>
+          </w:tcPr>
+          <w:p>
+            <w:pPr>
+              <w:spacing w:before="0" w:after="0"/>
+            </w:pPr>
+          </w:p>
+        </w:tc>
+        <w:tc>
+          <w:tcPr>
+            <w:tcW w:type="dxa" w:w="1704"/>
+            <w:tcMar>
+              <w:top w:w="70" w:type="dxa"/>
+              <w:bottom w:w="70" w:type="dxa"/>
+              <w:left w:w="100" w:type="dxa"/>
+              <w:right w:w="100" w:type="dxa"/>
+            </w:tcMar>
+            <w:shd w:fill="F8FAFC"/>
+          </w:tcPr>
+          <w:p>
+            <w:pPr>
+              <w:spacing w:before="0" w:after="0"/>
+            </w:pPr>
+          </w:p>
+        </w:tc>
+        <w:tc>
+          <w:tcPr>
+            <w:tcW w:type="dxa" w:w="1704"/>
+            <w:tcMar>
+              <w:top w:w="70" w:type="dxa"/>
+              <w:bottom w:w="70" w:type="dxa"/>
+              <w:left w:w="100" w:type="dxa"/>
+              <w:right w:w="100" w:type="dxa"/>
+            </w:tcMar>
+            <w:shd w:fill="F8FAFC"/>
+          </w:tcPr>
+          <w:p>
+            <w:pPr>
+              <w:spacing w:before="0" w:after="0"/>
+            </w:pPr>
+          </w:p>
+        </w:tc>
+        <w:tc>
+          <w:tcPr>
+            <w:tcW w:type="dxa" w:w="1704"/>
+            <w:tcMar>
+              <w:top w:w="70" w:type="dxa"/>
+              <w:bottom w:w="70" w:type="dxa"/>
+              <w:left w:w="100" w:type="dxa"/>
+              <w:right w:w="100" w:type="dxa"/>
+            </w:tcMar>
+            <w:shd w:fill="F8FAFC"/>
+          </w:tcPr>
+          <w:p>
+            <w:pPr>
+              <w:spacing w:before="0" w:after="0"/>
+            </w:pPr>
+          </w:p>
+        </w:tc>
+        <w:tc>
+          <w:tcPr>
+            <w:tcW w:type="dxa" w:w="1704"/>
+            <w:tcMar>
+              <w:top w:w="70" w:type="dxa"/>
+              <w:bottom w:w="70" w:type="dxa"/>
+              <w:left w:w="100" w:type="dxa"/>
+              <w:right w:w="100" w:type="dxa"/>
+            </w:tcMar>
+            <w:shd w:fill="F8FAFC"/>
+          </w:tcPr>
+          <w:p>
+            <w:pPr>
+              <w:spacing w:before="0" w:after="0"/>
+            </w:pPr>
+          </w:p>
+        </w:tc>
+        <w:tc>
+          <w:tcPr>
+            <w:tcW w:type="dxa" w:w="1704"/>
+            <w:tcMar>
+              <w:top w:w="70" w:type="dxa"/>
+              <w:bottom w:w="70" w:type="dxa"/>
+              <w:left w:w="100" w:type="dxa"/>
+              <w:right w:w="100" w:type="dxa"/>
+            </w:tcMar>
+            <w:shd w:fill="F8FAFC"/>
+          </w:tcPr>
+          <w:p>
+            <w:pPr>
+              <w:spacing w:before="0" w:after="0"/>
+            </w:pPr>
+          </w:p>
+        </w:tc>
+      </w:tr>
+      <w:tr>
+        <w:tc>
+          <w:tcPr>
+            <w:tcW w:type="dxa" w:w="1704"/>
+            <w:tcMar>
+              <w:top w:w="70" w:type="dxa"/>
+              <w:bottom w:w="70" w:type="dxa"/>
+              <w:left w:w="100" w:type="dxa"/>
+              <w:right w:w="100" w:type="dxa"/>
+            </w:tcMar>
+            <w:shd w:fill="FFFFFF"/>
+          </w:tcPr>
+          <w:p>
+            <w:pPr>
+              <w:spacing w:before="0" w:after="0"/>
+            </w:pPr>
+          </w:p>
+        </w:tc>
+        <w:tc>
+          <w:tcPr>
+            <w:tcW w:type="dxa" w:w="1704"/>
+            <w:tcMar>
+              <w:top w:w="70" w:type="dxa"/>
+              <w:bottom w:w="70" w:type="dxa"/>
+              <w:left w:w="100" w:type="dxa"/>
+              <w:right w:w="100" w:type="dxa"/>
+            </w:tcMar>
+            <w:shd w:fill="FFFFFF"/>
+          </w:tcPr>
+          <w:p>
+            <w:pPr>
+              <w:spacing w:before="0" w:after="0"/>
+            </w:pPr>
+            <w:r>
+              <w:rPr>
+                <w:rFonts w:ascii="Arial" w:hAnsi="Arial"/>
+                <w:b/>
+                <w:color w:val="1E293B"/>
+                <w:sz w:val="18"/>
+              </w:rPr>
+              <w:t>TỔNG LỰA CHỌN 2</w:t>
+            </w:r>
+          </w:p>
+        </w:tc>
+        <w:tc>
+          <w:tcPr>
+            <w:tcW w:type="dxa" w:w="1704"/>
+            <w:tcMar>
+              <w:top w:w="70" w:type="dxa"/>
+              <w:bottom w:w="70" w:type="dxa"/>
+              <w:left w:w="100" w:type="dxa"/>
+              <w:right w:w="100" w:type="dxa"/>
+            </w:tcMar>
+            <w:shd w:fill="FFFFFF"/>
+          </w:tcPr>
+          <w:p>
+            <w:pPr>
+              <w:spacing w:before="0" w:after="0"/>
+            </w:pPr>
+          </w:p>
+        </w:tc>
+        <w:tc>
+          <w:tcPr>
+            <w:tcW w:type="dxa" w:w="1704"/>
+            <w:tcMar>
+              <w:top w:w="70" w:type="dxa"/>
+              <w:bottom w:w="70" w:type="dxa"/>
+              <w:left w:w="100" w:type="dxa"/>
+              <w:right w:w="100" w:type="dxa"/>
+            </w:tcMar>
+            <w:shd w:fill="FFFFFF"/>
+          </w:tcPr>
+          <w:p>
+            <w:pPr>
+              <w:spacing w:before="0" w:after="0"/>
+            </w:pPr>
+          </w:p>
+        </w:tc>
+        <w:tc>
+          <w:tcPr>
+            <w:tcW w:type="dxa" w:w="1704"/>
+            <w:tcMar>
+              <w:top w:w="70" w:type="dxa"/>
+              <w:bottom w:w="70" w:type="dxa"/>
+              <w:left w:w="100" w:type="dxa"/>
+              <w:right w:w="100" w:type="dxa"/>
+            </w:tcMar>
+            <w:shd w:fill="FFFFFF"/>
+          </w:tcPr>
+          <w:p>
+            <w:pPr>
+              <w:spacing w:before="0" w:after="0"/>
+            </w:pPr>
+            <w:r>
+              <w:rPr>
+                <w:rFonts w:ascii="Arial" w:hAnsi="Arial"/>
+                <w:b/>
+                <w:color w:val="1E293B"/>
+                <w:sz w:val="18"/>
+              </w:rPr>
+              <w:t>26.400.000</w:t>
+            </w:r>
+          </w:p>
+        </w:tc>
+        <w:tc>
+          <w:tcPr>
+            <w:tcW w:type="dxa" w:w="1704"/>
+            <w:tcMar>
+              <w:top w:w="70" w:type="dxa"/>
+              <w:bottom w:w="70" w:type="dxa"/>
+              <w:left w:w="100" w:type="dxa"/>
+              <w:right w:w="100" w:type="dxa"/>
+            </w:tcMar>
+            <w:shd w:fill="FFFFFF"/>
+          </w:tcPr>
+          <w:p>
+            <w:pPr>
+              <w:spacing w:before="0" w:after="0"/>
+            </w:pPr>
+          </w:p>
+        </w:tc>
+      </w:tr>
+      <w:tr>
+        <w:tc>
+          <w:tcPr>
+            <w:tcW w:type="dxa" w:w="1704"/>
+            <w:tcMar>
+              <w:top w:w="70" w:type="dxa"/>
+              <w:bottom w:w="70" w:type="dxa"/>
+              <w:left w:w="100" w:type="dxa"/>
+              <w:right w:w="100" w:type="dxa"/>
+            </w:tcMar>
+            <w:shd w:fill="F8FAFC"/>
+          </w:tcPr>
+          <w:p>
+            <w:pPr>
+              <w:spacing w:before="0" w:after="0"/>
+            </w:pPr>
+          </w:p>
+        </w:tc>
+        <w:tc>
+          <w:tcPr>
+            <w:tcW w:type="dxa" w:w="1704"/>
+            <w:tcMar>
+              <w:top w:w="70" w:type="dxa"/>
+              <w:bottom w:w="70" w:type="dxa"/>
+              <w:left w:w="100" w:type="dxa"/>
+              <w:right w:w="100" w:type="dxa"/>
+            </w:tcMar>
+            <w:shd w:fill="F8FAFC"/>
+          </w:tcPr>
+          <w:p>
+            <w:pPr>
+              <w:spacing w:before="0" w:after="0"/>
+            </w:pPr>
+            <w:r>
+              <w:rPr>
+                <w:rFonts w:ascii="Arial" w:hAnsi="Arial"/>
+                <w:b/>
+                <w:i/>
+                <w:color w:val="1E293B"/>
+                <w:sz w:val="18"/>
+              </w:rPr>
+              <w:t>Nếu dùng lại máy in cũ</w:t>
+            </w:r>
+          </w:p>
+        </w:tc>
+        <w:tc>
+          <w:tcPr>
+            <w:tcW w:type="dxa" w:w="1704"/>
+            <w:tcMar>
+              <w:top w:w="70" w:type="dxa"/>
+              <w:bottom w:w="70" w:type="dxa"/>
+              <w:left w:w="100" w:type="dxa"/>
+              <w:right w:w="100" w:type="dxa"/>
+            </w:tcMar>
+            <w:shd w:fill="F8FAFC"/>
+          </w:tcPr>
+          <w:p>
+            <w:pPr>
+              <w:spacing w:before="0" w:after="0"/>
+            </w:pPr>
+          </w:p>
+        </w:tc>
+        <w:tc>
+          <w:tcPr>
+            <w:tcW w:type="dxa" w:w="1704"/>
+            <w:tcMar>
+              <w:top w:w="70" w:type="dxa"/>
+              <w:bottom w:w="70" w:type="dxa"/>
+              <w:left w:w="100" w:type="dxa"/>
+              <w:right w:w="100" w:type="dxa"/>
+            </w:tcMar>
+            <w:shd w:fill="F8FAFC"/>
+          </w:tcPr>
+          <w:p>
+            <w:pPr>
+              <w:spacing w:before="0" w:after="0"/>
+            </w:pPr>
+          </w:p>
+        </w:tc>
+        <w:tc>
+          <w:tcPr>
+            <w:tcW w:type="dxa" w:w="1704"/>
+            <w:tcMar>
+              <w:top w:w="70" w:type="dxa"/>
+              <w:bottom w:w="70" w:type="dxa"/>
+              <w:left w:w="100" w:type="dxa"/>
+              <w:right w:w="100" w:type="dxa"/>
+            </w:tcMar>
+            <w:shd w:fill="F8FAFC"/>
+          </w:tcPr>
+          <w:p>
+            <w:pPr>
+              <w:spacing w:before="0" w:after="0"/>
+            </w:pPr>
+            <w:r>
+              <w:rPr>
+                <w:rFonts w:ascii="Arial" w:hAnsi="Arial"/>
+                <w:i/>
+                <w:color w:val="1E293B"/>
+                <w:sz w:val="18"/>
+              </w:rPr>
+              <w:t>20.400.000</w:t>
+            </w:r>
+          </w:p>
+        </w:tc>
+        <w:tc>
+          <w:tcPr>
+            <w:tcW w:type="dxa" w:w="1704"/>
+            <w:tcMar>
+              <w:top w:w="70" w:type="dxa"/>
+              <w:bottom w:w="70" w:type="dxa"/>
+              <w:left w:w="100" w:type="dxa"/>
+              <w:right w:w="100" w:type="dxa"/>
+            </w:tcMar>
+            <w:shd w:fill="F8FAFC"/>
+          </w:tcPr>
+          <w:p>
+            <w:pPr>
+              <w:spacing w:before="0" w:after="0"/>
+            </w:pPr>
+            <w:r>
+              <w:rPr>
+                <w:rFonts w:ascii="Arial" w:hAnsi="Arial"/>
+                <w:i/>
+                <w:color w:val="1E293B"/>
+                <w:sz w:val="18"/>
+              </w:rPr>
+              <w:t>Tiết kiệm 6 triệu</w:t>
+            </w:r>
+          </w:p>
+        </w:tc>
+      </w:tr>
+    </w:tbl>
+    <w:p>
+      <w:pPr>
+        <w:spacing w:after="40"/>
+      </w:pPr>
+    </w:p>
+    <w:p>
+      <w:pPr>
+        <w:keepNext/>
+        <w:spacing w:before="200" w:after="80"/>
+      </w:pPr>
+      <w:r>
+        <w:rPr>
+          <w:rFonts w:ascii="Arial" w:hAnsi="Arial"/>
+          <w:b/>
+          <w:color w:val="2563EB"/>
+          <w:sz w:val="22"/>
+        </w:rPr>
+        <w:t>So sánh 2 lựa chọn thiết bị</w:t>
+      </w:r>
+    </w:p>
+    <w:tbl>
+      <w:tblPr>
+        <w:tblW w:type="auto" w:w="0"/>
+        <w:jc w:val="center"/>
+        <w:tblLook w:firstColumn="1" w:firstRow="1" w:lastColumn="0" w:lastRow="0" w:noHBand="0" w:noVBand="1" w:val="04A0"/>
+        <w:tblBorders>
+          <w:top w:val="single" w:sz="6" w:space="0" w:color="CBD5E1"/>
+          <w:bottom w:val="single" w:sz="6" w:space="0" w:color="CBD5E1"/>
+          <w:left w:val="single" w:sz="6" w:space="0" w:color="CBD5E1"/>
+          <w:right w:val="single" w:sz="6" w:space="0" w:color="CBD5E1"/>
+          <w:insideH w:val="single" w:sz="4" w:space="0" w:color="E2E8F0"/>
+          <w:insideV w:val="single" w:sz="4" w:space="0" w:color="E2E8F0"/>
+        </w:tblBorders>
+      </w:tblPr>
+      <w:tblGrid>
+        <w:gridCol w:w="3408"/>
+        <w:gridCol w:w="3408"/>
+        <w:gridCol w:w="3408"/>
+      </w:tblGrid>
+      <w:tr>
+        <w:tc>
+          <w:tcPr>
+            <w:tcW w:type="dxa" w:w="3408"/>
+            <w:tcMar>
+              <w:top w:w="70" w:type="dxa"/>
+              <w:bottom w:w="70" w:type="dxa"/>
+              <w:left w:w="100" w:type="dxa"/>
+              <w:right w:w="100" w:type="dxa"/>
+            </w:tcMar>
+            <w:shd w:fill="0F172A"/>
+          </w:tcPr>
+          <w:p>
+            <w:pPr>
+              <w:spacing w:before="0" w:after="0"/>
+            </w:pPr>
+            <w:r>
+              <w:rPr>
+                <w:rFonts w:ascii="Arial" w:hAnsi="Arial"/>
+                <w:b/>
+                <w:color w:val="FFFFFF"/>
+                <w:sz w:val="18"/>
+              </w:rPr>
+              <w:t>Tiêu chí</w:t>
+            </w:r>
+          </w:p>
+        </w:tc>
+        <w:tc>
+          <w:tcPr>
+            <w:tcW w:type="dxa" w:w="3408"/>
+            <w:tcMar>
+              <w:top w:w="70" w:type="dxa"/>
+              <w:bottom w:w="70" w:type="dxa"/>
+              <w:left w:w="100" w:type="dxa"/>
+              <w:right w:w="100" w:type="dxa"/>
+            </w:tcMar>
+            <w:shd w:fill="0F172A"/>
+          </w:tcPr>
+          <w:p>
+            <w:pPr>
+              <w:spacing w:before="0" w:after="0"/>
+            </w:pPr>
+            <w:r>
+              <w:rPr>
+                <w:rFonts w:ascii="Arial" w:hAnsi="Arial"/>
+                <w:b/>
+                <w:color w:val="FFFFFF"/>
+                <w:sz w:val="18"/>
+              </w:rPr>
+              <w:t>TV + Android Box</w:t>
+            </w:r>
+          </w:p>
+        </w:tc>
+        <w:tc>
+          <w:tcPr>
+            <w:tcW w:type="dxa" w:w="3408"/>
+            <w:tcMar>
+              <w:top w:w="70" w:type="dxa"/>
+              <w:bottom w:w="70" w:type="dxa"/>
+              <w:left w:w="100" w:type="dxa"/>
+              <w:right w:w="100" w:type="dxa"/>
+            </w:tcMar>
+            <w:shd w:fill="0F172A"/>
+          </w:tcPr>
+          <w:p>
+            <w:pPr>
+              <w:spacing w:before="0" w:after="0"/>
+            </w:pPr>
+            <w:r>
+              <w:rPr>
+                <w:rFonts w:ascii="Arial" w:hAnsi="Arial"/>
+                <w:b/>
+                <w:color w:val="FFFFFF"/>
+                <w:sz w:val="18"/>
+              </w:rPr>
+              <w:t>Tablet cảm ứng</w:t>
+            </w:r>
+          </w:p>
+        </w:tc>
+      </w:tr>
+      <w:tr>
+        <w:tc>
+          <w:tcPr>
+            <w:tcW w:type="dxa" w:w="3408"/>
+            <w:tcMar>
+              <w:top w:w="70" w:type="dxa"/>
+              <w:bottom w:w="70" w:type="dxa"/>
+              <w:left w:w="100" w:type="dxa"/>
+              <w:right w:w="100" w:type="dxa"/>
+            </w:tcMar>
+            <w:shd w:fill="FFFFFF"/>
+          </w:tcPr>
+          <w:p>
+            <w:pPr>
+              <w:spacing w:before="0" w:after="0"/>
+            </w:pPr>
+            <w:r>
+              <w:rPr>
+                <w:rFonts w:ascii="Arial" w:hAnsi="Arial"/>
+                <w:color w:val="1E293B"/>
+                <w:sz w:val="18"/>
+              </w:rPr>
+              <w:t>Chi phí thiết bị (3 quán)</w:t>
+            </w:r>
+          </w:p>
+        </w:tc>
+        <w:tc>
+          <w:tcPr>
+            <w:tcW w:type="dxa" w:w="3408"/>
+            <w:tcMar>
+              <w:top w:w="70" w:type="dxa"/>
+              <w:bottom w:w="70" w:type="dxa"/>
+              <w:left w:w="100" w:type="dxa"/>
+              <w:right w:w="100" w:type="dxa"/>
+            </w:tcMar>
+            <w:shd w:fill="FFFFFF"/>
+          </w:tcPr>
+          <w:p>
+            <w:pPr>
+              <w:spacing w:before="0" w:after="0"/>
+            </w:pPr>
+            <w:r>
+              <w:rPr>
+                <w:rFonts w:ascii="Arial" w:hAnsi="Arial"/>
+                <w:color w:val="1E293B"/>
+                <w:sz w:val="18"/>
+              </w:rPr>
+              <w:t>27.300.000</w:t>
+            </w:r>
+          </w:p>
+        </w:tc>
+        <w:tc>
+          <w:tcPr>
+            <w:tcW w:type="dxa" w:w="3408"/>
+            <w:tcMar>
+              <w:top w:w="70" w:type="dxa"/>
+              <w:bottom w:w="70" w:type="dxa"/>
+              <w:left w:w="100" w:type="dxa"/>
+              <w:right w:w="100" w:type="dxa"/>
+            </w:tcMar>
+            <w:shd w:fill="FFFFFF"/>
+          </w:tcPr>
+          <w:p>
+            <w:pPr>
+              <w:spacing w:before="0" w:after="0"/>
+            </w:pPr>
+            <w:r>
+              <w:rPr>
+                <w:rFonts w:ascii="Arial" w:hAnsi="Arial"/>
+                <w:color w:val="1E293B"/>
+                <w:sz w:val="18"/>
+              </w:rPr>
+              <w:t>26.400.000</w:t>
+            </w:r>
+          </w:p>
+        </w:tc>
+      </w:tr>
+      <w:tr>
+        <w:tc>
+          <w:tcPr>
+            <w:tcW w:type="dxa" w:w="3408"/>
+            <w:tcMar>
+              <w:top w:w="70" w:type="dxa"/>
+              <w:bottom w:w="70" w:type="dxa"/>
+              <w:left w:w="100" w:type="dxa"/>
+              <w:right w:w="100" w:type="dxa"/>
+            </w:tcMar>
+            <w:shd w:fill="F8FAFC"/>
+          </w:tcPr>
+          <w:p>
+            <w:pPr>
+              <w:spacing w:before="0" w:after="0"/>
+            </w:pPr>
+            <w:r>
+              <w:rPr>
+                <w:rFonts w:ascii="Arial" w:hAnsi="Arial"/>
+                <w:color w:val="1E293B"/>
+                <w:sz w:val="18"/>
+              </w:rPr>
+              <w:t>Cảm ứng trực tiếp</w:t>
+            </w:r>
+          </w:p>
+        </w:tc>
+        <w:tc>
+          <w:tcPr>
+            <w:tcW w:type="dxa" w:w="3408"/>
+            <w:tcMar>
+              <w:top w:w="70" w:type="dxa"/>
+              <w:bottom w:w="70" w:type="dxa"/>
+              <w:left w:w="100" w:type="dxa"/>
+              <w:right w:w="100" w:type="dxa"/>
+            </w:tcMar>
+            <w:shd w:fill="F8FAFC"/>
+          </w:tcPr>
+          <w:p>
+            <w:pPr>
+              <w:spacing w:before="0" w:after="0"/>
+            </w:pPr>
+            <w:r>
+              <w:rPr>
+                <w:rFonts w:ascii="Arial" w:hAnsi="Arial"/>
+                <w:color w:val="1E293B"/>
+                <w:sz w:val="18"/>
+              </w:rPr>
+              <w:t>Không — NV dùng ĐT thao tác</w:t>
+            </w:r>
+          </w:p>
+        </w:tc>
+        <w:tc>
+          <w:tcPr>
+            <w:tcW w:type="dxa" w:w="3408"/>
+            <w:tcMar>
+              <w:top w:w="70" w:type="dxa"/>
+              <w:bottom w:w="70" w:type="dxa"/>
+              <w:left w:w="100" w:type="dxa"/>
+              <w:right w:w="100" w:type="dxa"/>
+            </w:tcMar>
+            <w:shd w:fill="F8FAFC"/>
+          </w:tcPr>
+          <w:p>
+            <w:pPr>
+              <w:spacing w:before="0" w:after="0"/>
+            </w:pPr>
+            <w:r>
+              <w:rPr>
+                <w:rFonts w:ascii="Arial" w:hAnsi="Arial"/>
+                <w:color w:val="1E293B"/>
+                <w:sz w:val="18"/>
+              </w:rPr>
+              <w:t>Có — bấm trực tiếp trên màn hình</w:t>
+            </w:r>
+          </w:p>
+        </w:tc>
+      </w:tr>
+      <w:tr>
+        <w:tc>
+          <w:tcPr>
+            <w:tcW w:type="dxa" w:w="3408"/>
+            <w:tcMar>
+              <w:top w:w="70" w:type="dxa"/>
+              <w:bottom w:w="70" w:type="dxa"/>
+              <w:left w:w="100" w:type="dxa"/>
+              <w:right w:w="100" w:type="dxa"/>
+            </w:tcMar>
+            <w:shd w:fill="FFFFFF"/>
+          </w:tcPr>
+          <w:p>
+            <w:pPr>
+              <w:spacing w:before="0" w:after="0"/>
+            </w:pPr>
+            <w:r>
+              <w:rPr>
+                <w:rFonts w:ascii="Arial" w:hAnsi="Arial"/>
+                <w:color w:val="1E293B"/>
+                <w:sz w:val="18"/>
+              </w:rPr>
+              <w:t>Kích thước hiển thị</w:t>
+            </w:r>
+          </w:p>
+        </w:tc>
+        <w:tc>
+          <w:tcPr>
+            <w:tcW w:type="dxa" w:w="3408"/>
+            <w:tcMar>
+              <w:top w:w="70" w:type="dxa"/>
+              <w:bottom w:w="70" w:type="dxa"/>
+              <w:left w:w="100" w:type="dxa"/>
+              <w:right w:w="100" w:type="dxa"/>
+            </w:tcMar>
+            <w:shd w:fill="FFFFFF"/>
+          </w:tcPr>
+          <w:p>
+            <w:pPr>
+              <w:spacing w:before="0" w:after="0"/>
+            </w:pPr>
+            <w:r>
+              <w:rPr>
+                <w:rFonts w:ascii="Arial" w:hAnsi="Arial"/>
+                <w:color w:val="1E293B"/>
+                <w:sz w:val="18"/>
+              </w:rPr>
+              <w:t>32 inch (lớn, nhìn xa rõ)</w:t>
+            </w:r>
+          </w:p>
+        </w:tc>
+        <w:tc>
+          <w:tcPr>
+            <w:tcW w:type="dxa" w:w="3408"/>
+            <w:tcMar>
+              <w:top w:w="70" w:type="dxa"/>
+              <w:bottom w:w="70" w:type="dxa"/>
+              <w:left w:w="100" w:type="dxa"/>
+              <w:right w:w="100" w:type="dxa"/>
+            </w:tcMar>
+            <w:shd w:fill="FFFFFF"/>
+          </w:tcPr>
+          <w:p>
+            <w:pPr>
+              <w:spacing w:before="0" w:after="0"/>
+            </w:pPr>
+            <w:r>
+              <w:rPr>
+                <w:rFonts w:ascii="Arial" w:hAnsi="Arial"/>
+                <w:color w:val="1E293B"/>
+                <w:sz w:val="18"/>
+              </w:rPr>
+              <w:t>10-11 inch (vừa tầm tay)</w:t>
+            </w:r>
+          </w:p>
+        </w:tc>
+      </w:tr>
+      <w:tr>
+        <w:tc>
+          <w:tcPr>
+            <w:tcW w:type="dxa" w:w="3408"/>
+            <w:tcMar>
+              <w:top w:w="70" w:type="dxa"/>
+              <w:bottom w:w="70" w:type="dxa"/>
+              <w:left w:w="100" w:type="dxa"/>
+              <w:right w:w="100" w:type="dxa"/>
+            </w:tcMar>
+            <w:shd w:fill="F8FAFC"/>
+          </w:tcPr>
+          <w:p>
+            <w:pPr>
+              <w:spacing w:before="0" w:after="0"/>
+            </w:pPr>
+            <w:r>
+              <w:rPr>
+                <w:rFonts w:ascii="Arial" w:hAnsi="Arial"/>
+                <w:color w:val="1E293B"/>
+                <w:sz w:val="18"/>
+              </w:rPr>
+              <w:t>Di động</w:t>
+            </w:r>
+          </w:p>
+        </w:tc>
+        <w:tc>
+          <w:tcPr>
+            <w:tcW w:type="dxa" w:w="3408"/>
+            <w:tcMar>
+              <w:top w:w="70" w:type="dxa"/>
+              <w:bottom w:w="70" w:type="dxa"/>
+              <w:left w:w="100" w:type="dxa"/>
+              <w:right w:w="100" w:type="dxa"/>
+            </w:tcMar>
+            <w:shd w:fill="F8FAFC"/>
+          </w:tcPr>
+          <w:p>
+            <w:pPr>
+              <w:spacing w:before="0" w:after="0"/>
+            </w:pPr>
+            <w:r>
+              <w:rPr>
+                <w:rFonts w:ascii="Arial" w:hAnsi="Arial"/>
+                <w:color w:val="1E293B"/>
+                <w:sz w:val="18"/>
+              </w:rPr>
+              <w:t>Không (gắn cố định)</w:t>
+            </w:r>
+          </w:p>
+        </w:tc>
+        <w:tc>
+          <w:tcPr>
+            <w:tcW w:type="dxa" w:w="3408"/>
+            <w:tcMar>
+              <w:top w:w="70" w:type="dxa"/>
+              <w:bottom w:w="70" w:type="dxa"/>
+              <w:left w:w="100" w:type="dxa"/>
+              <w:right w:w="100" w:type="dxa"/>
+            </w:tcMar>
+            <w:shd w:fill="F8FAFC"/>
+          </w:tcPr>
+          <w:p>
+            <w:pPr>
+              <w:spacing w:before="0" w:after="0"/>
+            </w:pPr>
+            <w:r>
+              <w:rPr>
+                <w:rFonts w:ascii="Arial" w:hAnsi="Arial"/>
+                <w:color w:val="1E293B"/>
+                <w:sz w:val="18"/>
+              </w:rPr>
+              <w:t>Có thể cầm theo khi cần</w:t>
+            </w:r>
+          </w:p>
+        </w:tc>
+      </w:tr>
+      <w:tr>
+        <w:tc>
+          <w:tcPr>
+            <w:tcW w:type="dxa" w:w="3408"/>
+            <w:tcMar>
+              <w:top w:w="70" w:type="dxa"/>
+              <w:bottom w:w="70" w:type="dxa"/>
+              <w:left w:w="100" w:type="dxa"/>
+              <w:right w:w="100" w:type="dxa"/>
+            </w:tcMar>
+            <w:shd w:fill="FFFFFF"/>
+          </w:tcPr>
+          <w:p>
+            <w:pPr>
+              <w:spacing w:before="0" w:after="0"/>
+            </w:pPr>
+            <w:r>
+              <w:rPr>
+                <w:rFonts w:ascii="Arial" w:hAnsi="Arial"/>
+                <w:color w:val="1E293B"/>
+                <w:sz w:val="18"/>
+              </w:rPr>
+              <w:t>Số thiết bị cần quản lý</w:t>
+            </w:r>
+          </w:p>
+        </w:tc>
+        <w:tc>
+          <w:tcPr>
+            <w:tcW w:type="dxa" w:w="3408"/>
+            <w:tcMar>
+              <w:top w:w="70" w:type="dxa"/>
+              <w:bottom w:w="70" w:type="dxa"/>
+              <w:left w:w="100" w:type="dxa"/>
+              <w:right w:w="100" w:type="dxa"/>
+            </w:tcMar>
+            <w:shd w:fill="FFFFFF"/>
+          </w:tcPr>
+          <w:p>
+            <w:pPr>
+              <w:spacing w:before="0" w:after="0"/>
+            </w:pPr>
+            <w:r>
+              <w:rPr>
+                <w:rFonts w:ascii="Arial" w:hAnsi="Arial"/>
+                <w:color w:val="1E293B"/>
+                <w:sz w:val="18"/>
+              </w:rPr>
+              <w:t>2 (TV + Box)</w:t>
+            </w:r>
+          </w:p>
+        </w:tc>
+        <w:tc>
+          <w:tcPr>
+            <w:tcW w:type="dxa" w:w="3408"/>
+            <w:tcMar>
+              <w:top w:w="70" w:type="dxa"/>
+              <w:bottom w:w="70" w:type="dxa"/>
+              <w:left w:w="100" w:type="dxa"/>
+              <w:right w:w="100" w:type="dxa"/>
+            </w:tcMar>
+            <w:shd w:fill="FFFFFF"/>
+          </w:tcPr>
+          <w:p>
+            <w:pPr>
+              <w:spacing w:before="0" w:after="0"/>
+            </w:pPr>
+            <w:r>
+              <w:rPr>
+                <w:rFonts w:ascii="Arial" w:hAnsi="Arial"/>
+                <w:color w:val="1E293B"/>
+                <w:sz w:val="18"/>
+              </w:rPr>
+              <w:t>1 (Tablet)</w:t>
             </w:r>
           </w:p>
         </w:tc>
@@ -1703,7 +3566,7 @@
                 <w:color w:val="1E293B"/>
                 <w:sz w:val="18"/>
               </w:rPr>
-              <w:t>Chạy toàn bộ hệ thống</w:t>
+              <w:t>VPS 4 vCPU, 8GB RAM — chạy toàn bộ hệ thống</w:t>
             </w:r>
           </w:p>
         </w:tc>
@@ -1805,7 +3668,7 @@
                 <w:color w:val="1E293B"/>
                 <w:sz w:val="18"/>
               </w:rPr>
-              <w:t>360.000/năm</w:t>
+              <w:t>360.000/năm, chia ra 30.000/tháng</w:t>
             </w:r>
           </w:p>
         </w:tc>
@@ -1959,7 +3822,7 @@
                 <w:color w:val="1E293B"/>
                 <w:sz w:val="18"/>
               </w:rPr>
-              <w:t>Thanh toán chuyển khoản (VietQR)</w:t>
+              <w:t>Giấy in nhiệt (tiêu hao)</w:t>
             </w:r>
           </w:p>
         </w:tc>
@@ -1984,7 +3847,7 @@
                 <w:color w:val="1E293B"/>
                 <w:sz w:val="18"/>
               </w:rPr>
-              <w:t>0</w:t>
+              <w:t>180.000</w:t>
             </w:r>
           </w:p>
         </w:tc>
@@ -2009,415 +3872,7 @@
                 <w:color w:val="1E293B"/>
                 <w:sz w:val="18"/>
               </w:rPr>
-              <w:t>Miễn phí</w:t>
-            </w:r>
-          </w:p>
-        </w:tc>
-      </w:tr>
-      <w:tr>
-        <w:tc>
-          <w:tcPr>
-            <w:tcW w:type="dxa" w:w="2556"/>
-            <w:tcMar>
-              <w:top w:w="70" w:type="dxa"/>
-              <w:bottom w:w="70" w:type="dxa"/>
-              <w:left w:w="100" w:type="dxa"/>
-              <w:right w:w="100" w:type="dxa"/>
-            </w:tcMar>
-            <w:shd w:fill="FFFFFF"/>
-          </w:tcPr>
-          <w:p>
-            <w:pPr>
-              <w:spacing w:before="0" w:after="0"/>
-            </w:pPr>
-            <w:r>
-              <w:rPr>
-                <w:rFonts w:ascii="Arial" w:hAnsi="Arial"/>
-                <w:color w:val="1E293B"/>
-                <w:sz w:val="18"/>
-              </w:rPr>
-              <w:t>5</w:t>
-            </w:r>
-          </w:p>
-        </w:tc>
-        <w:tc>
-          <w:tcPr>
-            <w:tcW w:type="dxa" w:w="2556"/>
-            <w:tcMar>
-              <w:top w:w="70" w:type="dxa"/>
-              <w:bottom w:w="70" w:type="dxa"/>
-              <w:left w:w="100" w:type="dxa"/>
-              <w:right w:w="100" w:type="dxa"/>
-            </w:tcMar>
-            <w:shd w:fill="FFFFFF"/>
-          </w:tcPr>
-          <w:p>
-            <w:pPr>
-              <w:spacing w:before="0" w:after="0"/>
-            </w:pPr>
-            <w:r>
-              <w:rPr>
-                <w:rFonts w:ascii="Arial" w:hAnsi="Arial"/>
-                <w:color w:val="1E293B"/>
-                <w:sz w:val="18"/>
-              </w:rPr>
-              <w:t>Bảo mật SSL &amp; tăng tốc (CDN)</w:t>
-            </w:r>
-          </w:p>
-        </w:tc>
-        <w:tc>
-          <w:tcPr>
-            <w:tcW w:type="dxa" w:w="2556"/>
-            <w:tcMar>
-              <w:top w:w="70" w:type="dxa"/>
-              <w:bottom w:w="70" w:type="dxa"/>
-              <w:left w:w="100" w:type="dxa"/>
-              <w:right w:w="100" w:type="dxa"/>
-            </w:tcMar>
-            <w:shd w:fill="FFFFFF"/>
-          </w:tcPr>
-          <w:p>
-            <w:pPr>
-              <w:spacing w:before="0" w:after="0"/>
-            </w:pPr>
-            <w:r>
-              <w:rPr>
-                <w:rFonts w:ascii="Arial" w:hAnsi="Arial"/>
-                <w:color w:val="1E293B"/>
-                <w:sz w:val="18"/>
-              </w:rPr>
-              <w:t>0</w:t>
-            </w:r>
-          </w:p>
-        </w:tc>
-        <w:tc>
-          <w:tcPr>
-            <w:tcW w:type="dxa" w:w="2556"/>
-            <w:tcMar>
-              <w:top w:w="70" w:type="dxa"/>
-              <w:bottom w:w="70" w:type="dxa"/>
-              <w:left w:w="100" w:type="dxa"/>
-              <w:right w:w="100" w:type="dxa"/>
-            </w:tcMar>
-            <w:shd w:fill="FFFFFF"/>
-          </w:tcPr>
-          <w:p>
-            <w:pPr>
-              <w:spacing w:before="0" w:after="0"/>
-            </w:pPr>
-            <w:r>
-              <w:rPr>
-                <w:rFonts w:ascii="Arial" w:hAnsi="Arial"/>
-                <w:color w:val="1E293B"/>
-                <w:sz w:val="18"/>
-              </w:rPr>
-              <w:t>Cloudflare miễn phí</w:t>
-            </w:r>
-          </w:p>
-        </w:tc>
-      </w:tr>
-      <w:tr>
-        <w:tc>
-          <w:tcPr>
-            <w:tcW w:type="dxa" w:w="2556"/>
-            <w:tcMar>
-              <w:top w:w="70" w:type="dxa"/>
-              <w:bottom w:w="70" w:type="dxa"/>
-              <w:left w:w="100" w:type="dxa"/>
-              <w:right w:w="100" w:type="dxa"/>
-            </w:tcMar>
-            <w:shd w:fill="F8FAFC"/>
-          </w:tcPr>
-          <w:p>
-            <w:pPr>
-              <w:spacing w:before="0" w:after="0"/>
-            </w:pPr>
-            <w:r>
-              <w:rPr>
-                <w:rFonts w:ascii="Arial" w:hAnsi="Arial"/>
-                <w:color w:val="1E293B"/>
-                <w:sz w:val="18"/>
-              </w:rPr>
-              <w:t>6</w:t>
-            </w:r>
-          </w:p>
-        </w:tc>
-        <w:tc>
-          <w:tcPr>
-            <w:tcW w:type="dxa" w:w="2556"/>
-            <w:tcMar>
-              <w:top w:w="70" w:type="dxa"/>
-              <w:bottom w:w="70" w:type="dxa"/>
-              <w:left w:w="100" w:type="dxa"/>
-              <w:right w:w="100" w:type="dxa"/>
-            </w:tcMar>
-            <w:shd w:fill="F8FAFC"/>
-          </w:tcPr>
-          <w:p>
-            <w:pPr>
-              <w:spacing w:before="0" w:after="0"/>
-            </w:pPr>
-            <w:r>
-              <w:rPr>
-                <w:rFonts w:ascii="Arial" w:hAnsi="Arial"/>
-                <w:color w:val="1E293B"/>
-                <w:sz w:val="18"/>
-              </w:rPr>
-              <w:t>Thông báo đẩy (Push)</w:t>
-            </w:r>
-          </w:p>
-        </w:tc>
-        <w:tc>
-          <w:tcPr>
-            <w:tcW w:type="dxa" w:w="2556"/>
-            <w:tcMar>
-              <w:top w:w="70" w:type="dxa"/>
-              <w:bottom w:w="70" w:type="dxa"/>
-              <w:left w:w="100" w:type="dxa"/>
-              <w:right w:w="100" w:type="dxa"/>
-            </w:tcMar>
-            <w:shd w:fill="F8FAFC"/>
-          </w:tcPr>
-          <w:p>
-            <w:pPr>
-              <w:spacing w:before="0" w:after="0"/>
-            </w:pPr>
-            <w:r>
-              <w:rPr>
-                <w:rFonts w:ascii="Arial" w:hAnsi="Arial"/>
-                <w:color w:val="1E293B"/>
-                <w:sz w:val="18"/>
-              </w:rPr>
-              <w:t>0</w:t>
-            </w:r>
-          </w:p>
-        </w:tc>
-        <w:tc>
-          <w:tcPr>
-            <w:tcW w:type="dxa" w:w="2556"/>
-            <w:tcMar>
-              <w:top w:w="70" w:type="dxa"/>
-              <w:bottom w:w="70" w:type="dxa"/>
-              <w:left w:w="100" w:type="dxa"/>
-              <w:right w:w="100" w:type="dxa"/>
-            </w:tcMar>
-            <w:shd w:fill="F8FAFC"/>
-          </w:tcPr>
-          <w:p>
-            <w:pPr>
-              <w:spacing w:before="0" w:after="0"/>
-            </w:pPr>
-            <w:r>
-              <w:rPr>
-                <w:rFonts w:ascii="Arial" w:hAnsi="Arial"/>
-                <w:color w:val="1E293B"/>
-                <w:sz w:val="18"/>
-              </w:rPr>
-              <w:t>Firebase miễn phí</w:t>
-            </w:r>
-          </w:p>
-        </w:tc>
-      </w:tr>
-      <w:tr>
-        <w:tc>
-          <w:tcPr>
-            <w:tcW w:type="dxa" w:w="2556"/>
-            <w:tcMar>
-              <w:top w:w="70" w:type="dxa"/>
-              <w:bottom w:w="70" w:type="dxa"/>
-              <w:left w:w="100" w:type="dxa"/>
-              <w:right w:w="100" w:type="dxa"/>
-            </w:tcMar>
-            <w:shd w:fill="FFFFFF"/>
-          </w:tcPr>
-          <w:p>
-            <w:pPr>
-              <w:spacing w:before="0" w:after="0"/>
-            </w:pPr>
-            <w:r>
-              <w:rPr>
-                <w:rFonts w:ascii="Arial" w:hAnsi="Arial"/>
-                <w:color w:val="1E293B"/>
-                <w:sz w:val="18"/>
-              </w:rPr>
-              <w:t>7</w:t>
-            </w:r>
-          </w:p>
-        </w:tc>
-        <w:tc>
-          <w:tcPr>
-            <w:tcW w:type="dxa" w:w="2556"/>
-            <w:tcMar>
-              <w:top w:w="70" w:type="dxa"/>
-              <w:bottom w:w="70" w:type="dxa"/>
-              <w:left w:w="100" w:type="dxa"/>
-              <w:right w:w="100" w:type="dxa"/>
-            </w:tcMar>
-            <w:shd w:fill="FFFFFF"/>
-          </w:tcPr>
-          <w:p>
-            <w:pPr>
-              <w:spacing w:before="0" w:after="0"/>
-            </w:pPr>
-            <w:r>
-              <w:rPr>
-                <w:rFonts w:ascii="Arial" w:hAnsi="Arial"/>
-                <w:color w:val="1E293B"/>
-                <w:sz w:val="18"/>
-              </w:rPr>
-              <w:t>Gửi báo cáo Email cuối ca</w:t>
-            </w:r>
-          </w:p>
-        </w:tc>
-        <w:tc>
-          <w:tcPr>
-            <w:tcW w:type="dxa" w:w="2556"/>
-            <w:tcMar>
-              <w:top w:w="70" w:type="dxa"/>
-              <w:bottom w:w="70" w:type="dxa"/>
-              <w:left w:w="100" w:type="dxa"/>
-              <w:right w:w="100" w:type="dxa"/>
-            </w:tcMar>
-            <w:shd w:fill="FFFFFF"/>
-          </w:tcPr>
-          <w:p>
-            <w:pPr>
-              <w:spacing w:before="0" w:after="0"/>
-            </w:pPr>
-            <w:r>
-              <w:rPr>
-                <w:rFonts w:ascii="Arial" w:hAnsi="Arial"/>
-                <w:color w:val="1E293B"/>
-                <w:sz w:val="18"/>
-              </w:rPr>
-              <w:t>0</w:t>
-            </w:r>
-          </w:p>
-        </w:tc>
-        <w:tc>
-          <w:tcPr>
-            <w:tcW w:type="dxa" w:w="2556"/>
-            <w:tcMar>
-              <w:top w:w="70" w:type="dxa"/>
-              <w:bottom w:w="70" w:type="dxa"/>
-              <w:left w:w="100" w:type="dxa"/>
-              <w:right w:w="100" w:type="dxa"/>
-            </w:tcMar>
-            <w:shd w:fill="FFFFFF"/>
-          </w:tcPr>
-          <w:p>
-            <w:pPr>
-              <w:spacing w:before="0" w:after="0"/>
-            </w:pPr>
-            <w:r>
-              <w:rPr>
-                <w:rFonts w:ascii="Arial" w:hAnsi="Arial"/>
-                <w:color w:val="1E293B"/>
-                <w:sz w:val="18"/>
-              </w:rPr>
-              <w:t>SendGrid miễn phí</w:t>
-            </w:r>
-          </w:p>
-        </w:tc>
-      </w:tr>
-      <w:tr>
-        <w:tc>
-          <w:tcPr>
-            <w:tcW w:type="dxa" w:w="2556"/>
-            <w:tcMar>
-              <w:top w:w="70" w:type="dxa"/>
-              <w:bottom w:w="70" w:type="dxa"/>
-              <w:left w:w="100" w:type="dxa"/>
-              <w:right w:w="100" w:type="dxa"/>
-            </w:tcMar>
-            <w:shd w:fill="F8FAFC"/>
-          </w:tcPr>
-          <w:p>
-            <w:pPr>
-              <w:spacing w:before="0" w:after="0"/>
-            </w:pPr>
-            <w:r>
-              <w:rPr>
-                <w:rFonts w:ascii="Arial" w:hAnsi="Arial"/>
-                <w:color w:val="1E293B"/>
-                <w:sz w:val="18"/>
-              </w:rPr>
-              <w:t>8</w:t>
-            </w:r>
-          </w:p>
-        </w:tc>
-        <w:tc>
-          <w:tcPr>
-            <w:tcW w:type="dxa" w:w="2556"/>
-            <w:tcMar>
-              <w:top w:w="70" w:type="dxa"/>
-              <w:bottom w:w="70" w:type="dxa"/>
-              <w:left w:w="100" w:type="dxa"/>
-              <w:right w:w="100" w:type="dxa"/>
-            </w:tcMar>
-            <w:shd w:fill="F8FAFC"/>
-          </w:tcPr>
-          <w:p>
-            <w:pPr>
-              <w:spacing w:before="0" w:after="0"/>
-            </w:pPr>
-            <w:r>
-              <w:rPr>
-                <w:rFonts w:ascii="Arial" w:hAnsi="Arial"/>
-                <w:color w:val="1E293B"/>
-                <w:sz w:val="18"/>
-              </w:rPr>
-              <w:t>Gửi voucher qua Zalo</w:t>
-            </w:r>
-          </w:p>
-        </w:tc>
-        <w:tc>
-          <w:tcPr>
-            <w:tcW w:type="dxa" w:w="2556"/>
-            <w:tcMar>
-              <w:top w:w="70" w:type="dxa"/>
-              <w:bottom w:w="70" w:type="dxa"/>
-              <w:left w:w="100" w:type="dxa"/>
-              <w:right w:w="100" w:type="dxa"/>
-            </w:tcMar>
-            <w:shd w:fill="F8FAFC"/>
-          </w:tcPr>
-          <w:p>
-            <w:pPr>
-              <w:spacing w:before="0" w:after="0"/>
-            </w:pPr>
-            <w:r>
-              <w:rPr>
-                <w:rFonts w:ascii="Arial" w:hAnsi="Arial"/>
-                <w:color w:val="1E293B"/>
-                <w:sz w:val="18"/>
-              </w:rPr>
-              <w:t>0</w:t>
-            </w:r>
-          </w:p>
-        </w:tc>
-        <w:tc>
-          <w:tcPr>
-            <w:tcW w:type="dxa" w:w="2556"/>
-            <w:tcMar>
-              <w:top w:w="70" w:type="dxa"/>
-              <w:bottom w:w="70" w:type="dxa"/>
-              <w:left w:w="100" w:type="dxa"/>
-              <w:right w:w="100" w:type="dxa"/>
-            </w:tcMar>
-            <w:shd w:fill="F8FAFC"/>
-          </w:tcPr>
-          <w:p>
-            <w:pPr>
-              <w:spacing w:before="0" w:after="0"/>
-            </w:pPr>
-            <w:r>
-              <w:rPr>
-                <w:rFonts w:ascii="Arial" w:hAnsi="Arial"/>
-                <w:color w:val="1E293B"/>
-                <w:sz w:val="18"/>
-              </w:rPr>
-              <w:t>Zalo OA miễn phí</w:t>
+              <w:t>3 quán x 3 cuộn/tháng x 20.000/cuộn</w:t>
             </w:r>
           </w:p>
         </w:tc>
@@ -2558,7 +4013,7 @@
                 <w:color w:val="1E293B"/>
                 <w:sz w:val="18"/>
               </w:rPr>
-              <w:t>1.230.000</w:t>
+              <w:t>1.410.000</w:t>
             </w:r>
           </w:p>
         </w:tc>
@@ -2584,7 +4039,7 @@
                 <w:color w:val="1E293B"/>
                 <w:sz w:val="18"/>
               </w:rPr>
-              <w:t>~410.000/chi nhánh</w:t>
+              <w:t>~470.000/chi nhánh</w:t>
             </w:r>
           </w:p>
         </w:tc>
@@ -2610,7 +4065,7 @@
           <w:color w:val="0F172A"/>
           <w:sz w:val="26"/>
         </w:rPr>
-        <w:t>C. CHI PHÍ PHÁT SINH CÓ THỂ XẢY RA</w:t>
+        <w:t>C. DỊCH VỤ MIỄN PHÍ ĐI KÈM (0 đ — Không phát sinh chi phí)</w:t>
       </w:r>
     </w:p>
     <w:tbl>
@@ -2682,7 +4137,973 @@
                 <w:color w:val="FFFFFF"/>
                 <w:sz w:val="18"/>
               </w:rPr>
-              <w:t>Hạng mục phát sinh</w:t>
+              <w:t>Dịch vụ</w:t>
+            </w:r>
+          </w:p>
+        </w:tc>
+        <w:tc>
+          <w:tcPr>
+            <w:tcW w:type="dxa" w:w="2556"/>
+            <w:tcMar>
+              <w:top w:w="70" w:type="dxa"/>
+              <w:bottom w:w="70" w:type="dxa"/>
+              <w:left w:w="100" w:type="dxa"/>
+              <w:right w:w="100" w:type="dxa"/>
+            </w:tcMar>
+            <w:shd w:fill="0F172A"/>
+          </w:tcPr>
+          <w:p>
+            <w:pPr>
+              <w:spacing w:before="0" w:after="0"/>
+            </w:pPr>
+            <w:r>
+              <w:rPr>
+                <w:rFonts w:ascii="Arial" w:hAnsi="Arial"/>
+                <w:b/>
+                <w:color w:val="FFFFFF"/>
+                <w:sz w:val="18"/>
+              </w:rPr>
+              <w:t>Nhà cung cấp</w:t>
+            </w:r>
+          </w:p>
+        </w:tc>
+        <w:tc>
+          <w:tcPr>
+            <w:tcW w:type="dxa" w:w="2556"/>
+            <w:tcMar>
+              <w:top w:w="70" w:type="dxa"/>
+              <w:bottom w:w="70" w:type="dxa"/>
+              <w:left w:w="100" w:type="dxa"/>
+              <w:right w:w="100" w:type="dxa"/>
+            </w:tcMar>
+            <w:shd w:fill="0F172A"/>
+          </w:tcPr>
+          <w:p>
+            <w:pPr>
+              <w:spacing w:before="0" w:after="0"/>
+            </w:pPr>
+            <w:r>
+              <w:rPr>
+                <w:rFonts w:ascii="Arial" w:hAnsi="Arial"/>
+                <w:b/>
+                <w:color w:val="FFFFFF"/>
+                <w:sz w:val="18"/>
+              </w:rPr>
+              <w:t>Mục đích</w:t>
+            </w:r>
+          </w:p>
+        </w:tc>
+      </w:tr>
+      <w:tr>
+        <w:tc>
+          <w:tcPr>
+            <w:tcW w:type="dxa" w:w="2556"/>
+            <w:tcMar>
+              <w:top w:w="70" w:type="dxa"/>
+              <w:bottom w:w="70" w:type="dxa"/>
+              <w:left w:w="100" w:type="dxa"/>
+              <w:right w:w="100" w:type="dxa"/>
+            </w:tcMar>
+            <w:shd w:fill="FFFFFF"/>
+          </w:tcPr>
+          <w:p>
+            <w:pPr>
+              <w:spacing w:before="0" w:after="0"/>
+            </w:pPr>
+            <w:r>
+              <w:rPr>
+                <w:rFonts w:ascii="Arial" w:hAnsi="Arial"/>
+                <w:color w:val="1E293B"/>
+                <w:sz w:val="18"/>
+              </w:rPr>
+              <w:t>1</w:t>
+            </w:r>
+          </w:p>
+        </w:tc>
+        <w:tc>
+          <w:tcPr>
+            <w:tcW w:type="dxa" w:w="2556"/>
+            <w:tcMar>
+              <w:top w:w="70" w:type="dxa"/>
+              <w:bottom w:w="70" w:type="dxa"/>
+              <w:left w:w="100" w:type="dxa"/>
+              <w:right w:w="100" w:type="dxa"/>
+            </w:tcMar>
+            <w:shd w:fill="FFFFFF"/>
+          </w:tcPr>
+          <w:p>
+            <w:pPr>
+              <w:spacing w:before="0" w:after="0"/>
+            </w:pPr>
+            <w:r>
+              <w:rPr>
+                <w:rFonts w:ascii="Arial" w:hAnsi="Arial"/>
+                <w:color w:val="1E293B"/>
+                <w:sz w:val="18"/>
+              </w:rPr>
+              <w:t>Thanh toán chuyển khoản VietQR</w:t>
+            </w:r>
+          </w:p>
+        </w:tc>
+        <w:tc>
+          <w:tcPr>
+            <w:tcW w:type="dxa" w:w="2556"/>
+            <w:tcMar>
+              <w:top w:w="70" w:type="dxa"/>
+              <w:bottom w:w="70" w:type="dxa"/>
+              <w:left w:w="100" w:type="dxa"/>
+              <w:right w:w="100" w:type="dxa"/>
+            </w:tcMar>
+            <w:shd w:fill="FFFFFF"/>
+          </w:tcPr>
+          <w:p>
+            <w:pPr>
+              <w:spacing w:before="0" w:after="0"/>
+            </w:pPr>
+            <w:r>
+              <w:rPr>
+                <w:rFonts w:ascii="Arial" w:hAnsi="Arial"/>
+                <w:color w:val="1E293B"/>
+                <w:sz w:val="18"/>
+              </w:rPr>
+              <w:t>NAPAS</w:t>
+            </w:r>
+          </w:p>
+        </w:tc>
+        <w:tc>
+          <w:tcPr>
+            <w:tcW w:type="dxa" w:w="2556"/>
+            <w:tcMar>
+              <w:top w:w="70" w:type="dxa"/>
+              <w:bottom w:w="70" w:type="dxa"/>
+              <w:left w:w="100" w:type="dxa"/>
+              <w:right w:w="100" w:type="dxa"/>
+            </w:tcMar>
+            <w:shd w:fill="FFFFFF"/>
+          </w:tcPr>
+          <w:p>
+            <w:pPr>
+              <w:spacing w:before="0" w:after="0"/>
+            </w:pPr>
+            <w:r>
+              <w:rPr>
+                <w:rFonts w:ascii="Arial" w:hAnsi="Arial"/>
+                <w:color w:val="1E293B"/>
+                <w:sz w:val="18"/>
+              </w:rPr>
+              <w:t>Khách quét mã thanh toán, miễn phí 100%</w:t>
+            </w:r>
+          </w:p>
+        </w:tc>
+      </w:tr>
+      <w:tr>
+        <w:tc>
+          <w:tcPr>
+            <w:tcW w:type="dxa" w:w="2556"/>
+            <w:tcMar>
+              <w:top w:w="70" w:type="dxa"/>
+              <w:bottom w:w="70" w:type="dxa"/>
+              <w:left w:w="100" w:type="dxa"/>
+              <w:right w:w="100" w:type="dxa"/>
+            </w:tcMar>
+            <w:shd w:fill="F8FAFC"/>
+          </w:tcPr>
+          <w:p>
+            <w:pPr>
+              <w:spacing w:before="0" w:after="0"/>
+            </w:pPr>
+            <w:r>
+              <w:rPr>
+                <w:rFonts w:ascii="Arial" w:hAnsi="Arial"/>
+                <w:color w:val="1E293B"/>
+                <w:sz w:val="18"/>
+              </w:rPr>
+              <w:t>2</w:t>
+            </w:r>
+          </w:p>
+        </w:tc>
+        <w:tc>
+          <w:tcPr>
+            <w:tcW w:type="dxa" w:w="2556"/>
+            <w:tcMar>
+              <w:top w:w="70" w:type="dxa"/>
+              <w:bottom w:w="70" w:type="dxa"/>
+              <w:left w:w="100" w:type="dxa"/>
+              <w:right w:w="100" w:type="dxa"/>
+            </w:tcMar>
+            <w:shd w:fill="F8FAFC"/>
+          </w:tcPr>
+          <w:p>
+            <w:pPr>
+              <w:spacing w:before="0" w:after="0"/>
+            </w:pPr>
+            <w:r>
+              <w:rPr>
+                <w:rFonts w:ascii="Arial" w:hAnsi="Arial"/>
+                <w:color w:val="1E293B"/>
+                <w:sz w:val="18"/>
+              </w:rPr>
+              <w:t>Bảo mật SSL &amp; tăng tốc CDN</w:t>
+            </w:r>
+          </w:p>
+        </w:tc>
+        <w:tc>
+          <w:tcPr>
+            <w:tcW w:type="dxa" w:w="2556"/>
+            <w:tcMar>
+              <w:top w:w="70" w:type="dxa"/>
+              <w:bottom w:w="70" w:type="dxa"/>
+              <w:left w:w="100" w:type="dxa"/>
+              <w:right w:w="100" w:type="dxa"/>
+            </w:tcMar>
+            <w:shd w:fill="F8FAFC"/>
+          </w:tcPr>
+          <w:p>
+            <w:pPr>
+              <w:spacing w:before="0" w:after="0"/>
+            </w:pPr>
+            <w:r>
+              <w:rPr>
+                <w:rFonts w:ascii="Arial" w:hAnsi="Arial"/>
+                <w:color w:val="1E293B"/>
+                <w:sz w:val="18"/>
+              </w:rPr>
+              <w:t>Cloudflare</w:t>
+            </w:r>
+          </w:p>
+        </w:tc>
+        <w:tc>
+          <w:tcPr>
+            <w:tcW w:type="dxa" w:w="2556"/>
+            <w:tcMar>
+              <w:top w:w="70" w:type="dxa"/>
+              <w:bottom w:w="70" w:type="dxa"/>
+              <w:left w:w="100" w:type="dxa"/>
+              <w:right w:w="100" w:type="dxa"/>
+            </w:tcMar>
+            <w:shd w:fill="F8FAFC"/>
+          </w:tcPr>
+          <w:p>
+            <w:pPr>
+              <w:spacing w:before="0" w:after="0"/>
+            </w:pPr>
+            <w:r>
+              <w:rPr>
+                <w:rFonts w:ascii="Arial" w:hAnsi="Arial"/>
+                <w:color w:val="1E293B"/>
+                <w:sz w:val="18"/>
+              </w:rPr>
+              <w:t>Chứng chỉ bảo mật &amp; tăng tốc tải trang</w:t>
+            </w:r>
+          </w:p>
+        </w:tc>
+      </w:tr>
+      <w:tr>
+        <w:tc>
+          <w:tcPr>
+            <w:tcW w:type="dxa" w:w="2556"/>
+            <w:tcMar>
+              <w:top w:w="70" w:type="dxa"/>
+              <w:bottom w:w="70" w:type="dxa"/>
+              <w:left w:w="100" w:type="dxa"/>
+              <w:right w:w="100" w:type="dxa"/>
+            </w:tcMar>
+            <w:shd w:fill="FFFFFF"/>
+          </w:tcPr>
+          <w:p>
+            <w:pPr>
+              <w:spacing w:before="0" w:after="0"/>
+            </w:pPr>
+            <w:r>
+              <w:rPr>
+                <w:rFonts w:ascii="Arial" w:hAnsi="Arial"/>
+                <w:color w:val="1E293B"/>
+                <w:sz w:val="18"/>
+              </w:rPr>
+              <w:t>3</w:t>
+            </w:r>
+          </w:p>
+        </w:tc>
+        <w:tc>
+          <w:tcPr>
+            <w:tcW w:type="dxa" w:w="2556"/>
+            <w:tcMar>
+              <w:top w:w="70" w:type="dxa"/>
+              <w:bottom w:w="70" w:type="dxa"/>
+              <w:left w:w="100" w:type="dxa"/>
+              <w:right w:w="100" w:type="dxa"/>
+            </w:tcMar>
+            <w:shd w:fill="FFFFFF"/>
+          </w:tcPr>
+          <w:p>
+            <w:pPr>
+              <w:spacing w:before="0" w:after="0"/>
+            </w:pPr>
+            <w:r>
+              <w:rPr>
+                <w:rFonts w:ascii="Arial" w:hAnsi="Arial"/>
+                <w:color w:val="1E293B"/>
+                <w:sz w:val="18"/>
+              </w:rPr>
+              <w:t>Thông báo đẩy (Push Notification)</w:t>
+            </w:r>
+          </w:p>
+        </w:tc>
+        <w:tc>
+          <w:tcPr>
+            <w:tcW w:type="dxa" w:w="2556"/>
+            <w:tcMar>
+              <w:top w:w="70" w:type="dxa"/>
+              <w:bottom w:w="70" w:type="dxa"/>
+              <w:left w:w="100" w:type="dxa"/>
+              <w:right w:w="100" w:type="dxa"/>
+            </w:tcMar>
+            <w:shd w:fill="FFFFFF"/>
+          </w:tcPr>
+          <w:p>
+            <w:pPr>
+              <w:spacing w:before="0" w:after="0"/>
+            </w:pPr>
+            <w:r>
+              <w:rPr>
+                <w:rFonts w:ascii="Arial" w:hAnsi="Arial"/>
+                <w:color w:val="1E293B"/>
+                <w:sz w:val="18"/>
+              </w:rPr>
+              <w:t>Firebase (Google)</w:t>
+            </w:r>
+          </w:p>
+        </w:tc>
+        <w:tc>
+          <w:tcPr>
+            <w:tcW w:type="dxa" w:w="2556"/>
+            <w:tcMar>
+              <w:top w:w="70" w:type="dxa"/>
+              <w:bottom w:w="70" w:type="dxa"/>
+              <w:left w:w="100" w:type="dxa"/>
+              <w:right w:w="100" w:type="dxa"/>
+            </w:tcMar>
+            <w:shd w:fill="FFFFFF"/>
+          </w:tcPr>
+          <w:p>
+            <w:pPr>
+              <w:spacing w:before="0" w:after="0"/>
+            </w:pPr>
+            <w:r>
+              <w:rPr>
+                <w:rFonts w:ascii="Arial" w:hAnsi="Arial"/>
+                <w:color w:val="1E293B"/>
+                <w:sz w:val="18"/>
+              </w:rPr>
+              <w:t>Báo trạng thái đơn, gọi nhân viên</w:t>
+            </w:r>
+          </w:p>
+        </w:tc>
+      </w:tr>
+      <w:tr>
+        <w:tc>
+          <w:tcPr>
+            <w:tcW w:type="dxa" w:w="2556"/>
+            <w:tcMar>
+              <w:top w:w="70" w:type="dxa"/>
+              <w:bottom w:w="70" w:type="dxa"/>
+              <w:left w:w="100" w:type="dxa"/>
+              <w:right w:w="100" w:type="dxa"/>
+            </w:tcMar>
+            <w:shd w:fill="F8FAFC"/>
+          </w:tcPr>
+          <w:p>
+            <w:pPr>
+              <w:spacing w:before="0" w:after="0"/>
+            </w:pPr>
+            <w:r>
+              <w:rPr>
+                <w:rFonts w:ascii="Arial" w:hAnsi="Arial"/>
+                <w:color w:val="1E293B"/>
+                <w:sz w:val="18"/>
+              </w:rPr>
+              <w:t>4</w:t>
+            </w:r>
+          </w:p>
+        </w:tc>
+        <w:tc>
+          <w:tcPr>
+            <w:tcW w:type="dxa" w:w="2556"/>
+            <w:tcMar>
+              <w:top w:w="70" w:type="dxa"/>
+              <w:bottom w:w="70" w:type="dxa"/>
+              <w:left w:w="100" w:type="dxa"/>
+              <w:right w:w="100" w:type="dxa"/>
+            </w:tcMar>
+            <w:shd w:fill="F8FAFC"/>
+          </w:tcPr>
+          <w:p>
+            <w:pPr>
+              <w:spacing w:before="0" w:after="0"/>
+            </w:pPr>
+            <w:r>
+              <w:rPr>
+                <w:rFonts w:ascii="Arial" w:hAnsi="Arial"/>
+                <w:color w:val="1E293B"/>
+                <w:sz w:val="18"/>
+              </w:rPr>
+              <w:t>Gửi báo cáo Email cuối ca</w:t>
+            </w:r>
+          </w:p>
+        </w:tc>
+        <w:tc>
+          <w:tcPr>
+            <w:tcW w:type="dxa" w:w="2556"/>
+            <w:tcMar>
+              <w:top w:w="70" w:type="dxa"/>
+              <w:bottom w:w="70" w:type="dxa"/>
+              <w:left w:w="100" w:type="dxa"/>
+              <w:right w:w="100" w:type="dxa"/>
+            </w:tcMar>
+            <w:shd w:fill="F8FAFC"/>
+          </w:tcPr>
+          <w:p>
+            <w:pPr>
+              <w:spacing w:before="0" w:after="0"/>
+            </w:pPr>
+            <w:r>
+              <w:rPr>
+                <w:rFonts w:ascii="Arial" w:hAnsi="Arial"/>
+                <w:color w:val="1E293B"/>
+                <w:sz w:val="18"/>
+              </w:rPr>
+              <w:t>SendGrid</w:t>
+            </w:r>
+          </w:p>
+        </w:tc>
+        <w:tc>
+          <w:tcPr>
+            <w:tcW w:type="dxa" w:w="2556"/>
+            <w:tcMar>
+              <w:top w:w="70" w:type="dxa"/>
+              <w:bottom w:w="70" w:type="dxa"/>
+              <w:left w:w="100" w:type="dxa"/>
+              <w:right w:w="100" w:type="dxa"/>
+            </w:tcMar>
+            <w:shd w:fill="F8FAFC"/>
+          </w:tcPr>
+          <w:p>
+            <w:pPr>
+              <w:spacing w:before="0" w:after="0"/>
+            </w:pPr>
+            <w:r>
+              <w:rPr>
+                <w:rFonts w:ascii="Arial" w:hAnsi="Arial"/>
+                <w:color w:val="1E293B"/>
+                <w:sz w:val="18"/>
+              </w:rPr>
+              <w:t>Tự động gửi báo cáo kết ca cho Quản lý</w:t>
+            </w:r>
+          </w:p>
+        </w:tc>
+      </w:tr>
+      <w:tr>
+        <w:tc>
+          <w:tcPr>
+            <w:tcW w:type="dxa" w:w="2556"/>
+            <w:tcMar>
+              <w:top w:w="70" w:type="dxa"/>
+              <w:bottom w:w="70" w:type="dxa"/>
+              <w:left w:w="100" w:type="dxa"/>
+              <w:right w:w="100" w:type="dxa"/>
+            </w:tcMar>
+            <w:shd w:fill="FFFFFF"/>
+          </w:tcPr>
+          <w:p>
+            <w:pPr>
+              <w:spacing w:before="0" w:after="0"/>
+            </w:pPr>
+            <w:r>
+              <w:rPr>
+                <w:rFonts w:ascii="Arial" w:hAnsi="Arial"/>
+                <w:color w:val="1E293B"/>
+                <w:sz w:val="18"/>
+              </w:rPr>
+              <w:t>5</w:t>
+            </w:r>
+          </w:p>
+        </w:tc>
+        <w:tc>
+          <w:tcPr>
+            <w:tcW w:type="dxa" w:w="2556"/>
+            <w:tcMar>
+              <w:top w:w="70" w:type="dxa"/>
+              <w:bottom w:w="70" w:type="dxa"/>
+              <w:left w:w="100" w:type="dxa"/>
+              <w:right w:w="100" w:type="dxa"/>
+            </w:tcMar>
+            <w:shd w:fill="FFFFFF"/>
+          </w:tcPr>
+          <w:p>
+            <w:pPr>
+              <w:spacing w:before="0" w:after="0"/>
+            </w:pPr>
+            <w:r>
+              <w:rPr>
+                <w:rFonts w:ascii="Arial" w:hAnsi="Arial"/>
+                <w:color w:val="1E293B"/>
+                <w:sz w:val="18"/>
+              </w:rPr>
+              <w:t>Gửi voucher tri ân qua Zalo</w:t>
+            </w:r>
+          </w:p>
+        </w:tc>
+        <w:tc>
+          <w:tcPr>
+            <w:tcW w:type="dxa" w:w="2556"/>
+            <w:tcMar>
+              <w:top w:w="70" w:type="dxa"/>
+              <w:bottom w:w="70" w:type="dxa"/>
+              <w:left w:w="100" w:type="dxa"/>
+              <w:right w:w="100" w:type="dxa"/>
+            </w:tcMar>
+            <w:shd w:fill="FFFFFF"/>
+          </w:tcPr>
+          <w:p>
+            <w:pPr>
+              <w:spacing w:before="0" w:after="0"/>
+            </w:pPr>
+            <w:r>
+              <w:rPr>
+                <w:rFonts w:ascii="Arial" w:hAnsi="Arial"/>
+                <w:color w:val="1E293B"/>
+                <w:sz w:val="18"/>
+              </w:rPr>
+              <w:t>Zalo OA</w:t>
+            </w:r>
+          </w:p>
+        </w:tc>
+        <w:tc>
+          <w:tcPr>
+            <w:tcW w:type="dxa" w:w="2556"/>
+            <w:tcMar>
+              <w:top w:w="70" w:type="dxa"/>
+              <w:bottom w:w="70" w:type="dxa"/>
+              <w:left w:w="100" w:type="dxa"/>
+              <w:right w:w="100" w:type="dxa"/>
+            </w:tcMar>
+            <w:shd w:fill="FFFFFF"/>
+          </w:tcPr>
+          <w:p>
+            <w:pPr>
+              <w:spacing w:before="0" w:after="0"/>
+            </w:pPr>
+            <w:r>
+              <w:rPr>
+                <w:rFonts w:ascii="Arial" w:hAnsi="Arial"/>
+                <w:color w:val="1E293B"/>
+                <w:sz w:val="18"/>
+              </w:rPr>
+              <w:t>Voucher sinh nhật, khách lâu chưa ghé</w:t>
+            </w:r>
+          </w:p>
+        </w:tc>
+      </w:tr>
+      <w:tr>
+        <w:tc>
+          <w:tcPr>
+            <w:tcW w:type="dxa" w:w="2556"/>
+            <w:tcMar>
+              <w:top w:w="70" w:type="dxa"/>
+              <w:bottom w:w="70" w:type="dxa"/>
+              <w:left w:w="100" w:type="dxa"/>
+              <w:right w:w="100" w:type="dxa"/>
+            </w:tcMar>
+            <w:shd w:fill="F8FAFC"/>
+          </w:tcPr>
+          <w:p>
+            <w:pPr>
+              <w:spacing w:before="0" w:after="0"/>
+            </w:pPr>
+            <w:r>
+              <w:rPr>
+                <w:rFonts w:ascii="Arial" w:hAnsi="Arial"/>
+                <w:color w:val="1E293B"/>
+                <w:sz w:val="18"/>
+              </w:rPr>
+              <w:t>6</w:t>
+            </w:r>
+          </w:p>
+        </w:tc>
+        <w:tc>
+          <w:tcPr>
+            <w:tcW w:type="dxa" w:w="2556"/>
+            <w:tcMar>
+              <w:top w:w="70" w:type="dxa"/>
+              <w:bottom w:w="70" w:type="dxa"/>
+              <w:left w:w="100" w:type="dxa"/>
+              <w:right w:w="100" w:type="dxa"/>
+            </w:tcMar>
+            <w:shd w:fill="F8FAFC"/>
+          </w:tcPr>
+          <w:p>
+            <w:pPr>
+              <w:spacing w:before="0" w:after="0"/>
+            </w:pPr>
+            <w:r>
+              <w:rPr>
+                <w:rFonts w:ascii="Arial" w:hAnsi="Arial"/>
+                <w:color w:val="1E293B"/>
+                <w:sz w:val="18"/>
+              </w:rPr>
+              <w:t>Lưu trữ ảnh menu &amp; feedback</w:t>
+            </w:r>
+          </w:p>
+        </w:tc>
+        <w:tc>
+          <w:tcPr>
+            <w:tcW w:type="dxa" w:w="2556"/>
+            <w:tcMar>
+              <w:top w:w="70" w:type="dxa"/>
+              <w:bottom w:w="70" w:type="dxa"/>
+              <w:left w:w="100" w:type="dxa"/>
+              <w:right w:w="100" w:type="dxa"/>
+            </w:tcMar>
+            <w:shd w:fill="F8FAFC"/>
+          </w:tcPr>
+          <w:p>
+            <w:pPr>
+              <w:spacing w:before="0" w:after="0"/>
+            </w:pPr>
+            <w:r>
+              <w:rPr>
+                <w:rFonts w:ascii="Arial" w:hAnsi="Arial"/>
+                <w:color w:val="1E293B"/>
+                <w:sz w:val="18"/>
+              </w:rPr>
+              <w:t>Self-hosted (trên Server)</w:t>
+            </w:r>
+          </w:p>
+        </w:tc>
+        <w:tc>
+          <w:tcPr>
+            <w:tcW w:type="dxa" w:w="2556"/>
+            <w:tcMar>
+              <w:top w:w="70" w:type="dxa"/>
+              <w:bottom w:w="70" w:type="dxa"/>
+              <w:left w:w="100" w:type="dxa"/>
+              <w:right w:w="100" w:type="dxa"/>
+            </w:tcMar>
+            <w:shd w:fill="F8FAFC"/>
+          </w:tcPr>
+          <w:p>
+            <w:pPr>
+              <w:spacing w:before="0" w:after="0"/>
+            </w:pPr>
+            <w:r>
+              <w:rPr>
+                <w:rFonts w:ascii="Arial" w:hAnsi="Arial"/>
+                <w:color w:val="1E293B"/>
+                <w:sz w:val="18"/>
+              </w:rPr>
+              <w:t>Ảnh món, ảnh feedback khách chụp</w:t>
+            </w:r>
+          </w:p>
+        </w:tc>
+      </w:tr>
+      <w:tr>
+        <w:tc>
+          <w:tcPr>
+            <w:tcW w:type="dxa" w:w="2556"/>
+            <w:tcMar>
+              <w:top w:w="70" w:type="dxa"/>
+              <w:bottom w:w="70" w:type="dxa"/>
+              <w:left w:w="100" w:type="dxa"/>
+              <w:right w:w="100" w:type="dxa"/>
+            </w:tcMar>
+            <w:shd w:fill="FFFFFF"/>
+          </w:tcPr>
+          <w:p>
+            <w:pPr>
+              <w:spacing w:before="0" w:after="0"/>
+            </w:pPr>
+            <w:r>
+              <w:rPr>
+                <w:rFonts w:ascii="Arial" w:hAnsi="Arial"/>
+                <w:color w:val="1E293B"/>
+                <w:sz w:val="18"/>
+              </w:rPr>
+              <w:t>7</w:t>
+            </w:r>
+          </w:p>
+        </w:tc>
+        <w:tc>
+          <w:tcPr>
+            <w:tcW w:type="dxa" w:w="2556"/>
+            <w:tcMar>
+              <w:top w:w="70" w:type="dxa"/>
+              <w:bottom w:w="70" w:type="dxa"/>
+              <w:left w:w="100" w:type="dxa"/>
+              <w:right w:w="100" w:type="dxa"/>
+            </w:tcMar>
+            <w:shd w:fill="FFFFFF"/>
+          </w:tcPr>
+          <w:p>
+            <w:pPr>
+              <w:spacing w:before="0" w:after="0"/>
+            </w:pPr>
+            <w:r>
+              <w:rPr>
+                <w:rFonts w:ascii="Arial" w:hAnsi="Arial"/>
+                <w:color w:val="1E293B"/>
+                <w:sz w:val="18"/>
+              </w:rPr>
+              <w:t>Sao lưu dữ liệu tự động</w:t>
+            </w:r>
+          </w:p>
+        </w:tc>
+        <w:tc>
+          <w:tcPr>
+            <w:tcW w:type="dxa" w:w="2556"/>
+            <w:tcMar>
+              <w:top w:w="70" w:type="dxa"/>
+              <w:bottom w:w="70" w:type="dxa"/>
+              <w:left w:w="100" w:type="dxa"/>
+              <w:right w:w="100" w:type="dxa"/>
+            </w:tcMar>
+            <w:shd w:fill="FFFFFF"/>
+          </w:tcPr>
+          <w:p>
+            <w:pPr>
+              <w:spacing w:before="0" w:after="0"/>
+            </w:pPr>
+            <w:r>
+              <w:rPr>
+                <w:rFonts w:ascii="Arial" w:hAnsi="Arial"/>
+                <w:color w:val="1E293B"/>
+                <w:sz w:val="18"/>
+              </w:rPr>
+              <w:t>Script tự động hàng ngày</w:t>
+            </w:r>
+          </w:p>
+        </w:tc>
+        <w:tc>
+          <w:tcPr>
+            <w:tcW w:type="dxa" w:w="2556"/>
+            <w:tcMar>
+              <w:top w:w="70" w:type="dxa"/>
+              <w:bottom w:w="70" w:type="dxa"/>
+              <w:left w:w="100" w:type="dxa"/>
+              <w:right w:w="100" w:type="dxa"/>
+            </w:tcMar>
+            <w:shd w:fill="FFFFFF"/>
+          </w:tcPr>
+          <w:p>
+            <w:pPr>
+              <w:spacing w:before="0" w:after="0"/>
+            </w:pPr>
+            <w:r>
+              <w:rPr>
+                <w:rFonts w:ascii="Arial" w:hAnsi="Arial"/>
+                <w:color w:val="1E293B"/>
+                <w:sz w:val="18"/>
+              </w:rPr>
+              <w:t>Backup database, ảnh lên Cloud miễn phí</w:t>
+            </w:r>
+          </w:p>
+        </w:tc>
+      </w:tr>
+      <w:tr>
+        <w:tc>
+          <w:tcPr>
+            <w:tcW w:type="dxa" w:w="2556"/>
+            <w:tcMar>
+              <w:top w:w="70" w:type="dxa"/>
+              <w:bottom w:w="70" w:type="dxa"/>
+              <w:left w:w="100" w:type="dxa"/>
+              <w:right w:w="100" w:type="dxa"/>
+            </w:tcMar>
+            <w:shd w:fill="F8FAFC"/>
+          </w:tcPr>
+          <w:p>
+            <w:pPr>
+              <w:spacing w:before="0" w:after="0"/>
+            </w:pPr>
+            <w:r>
+              <w:rPr>
+                <w:rFonts w:ascii="Arial" w:hAnsi="Arial"/>
+                <w:color w:val="1E293B"/>
+                <w:sz w:val="18"/>
+              </w:rPr>
+              <w:t>8</w:t>
+            </w:r>
+          </w:p>
+        </w:tc>
+        <w:tc>
+          <w:tcPr>
+            <w:tcW w:type="dxa" w:w="2556"/>
+            <w:tcMar>
+              <w:top w:w="70" w:type="dxa"/>
+              <w:bottom w:w="70" w:type="dxa"/>
+              <w:left w:w="100" w:type="dxa"/>
+              <w:right w:w="100" w:type="dxa"/>
+            </w:tcMar>
+            <w:shd w:fill="F8FAFC"/>
+          </w:tcPr>
+          <w:p>
+            <w:pPr>
+              <w:spacing w:before="0" w:after="0"/>
+            </w:pPr>
+            <w:r>
+              <w:rPr>
+                <w:rFonts w:ascii="Arial" w:hAnsi="Arial"/>
+                <w:color w:val="1E293B"/>
+                <w:sz w:val="18"/>
+              </w:rPr>
+              <w:t>Dữ liệu thời tiết (cho AI)</w:t>
+            </w:r>
+          </w:p>
+        </w:tc>
+        <w:tc>
+          <w:tcPr>
+            <w:tcW w:type="dxa" w:w="2556"/>
+            <w:tcMar>
+              <w:top w:w="70" w:type="dxa"/>
+              <w:bottom w:w="70" w:type="dxa"/>
+              <w:left w:w="100" w:type="dxa"/>
+              <w:right w:w="100" w:type="dxa"/>
+            </w:tcMar>
+            <w:shd w:fill="F8FAFC"/>
+          </w:tcPr>
+          <w:p>
+            <w:pPr>
+              <w:spacing w:before="0" w:after="0"/>
+            </w:pPr>
+            <w:r>
+              <w:rPr>
+                <w:rFonts w:ascii="Arial" w:hAnsi="Arial"/>
+                <w:color w:val="1E293B"/>
+                <w:sz w:val="18"/>
+              </w:rPr>
+              <w:t>OpenWeatherMap</w:t>
+            </w:r>
+          </w:p>
+        </w:tc>
+        <w:tc>
+          <w:tcPr>
+            <w:tcW w:type="dxa" w:w="2556"/>
+            <w:tcMar>
+              <w:top w:w="70" w:type="dxa"/>
+              <w:bottom w:w="70" w:type="dxa"/>
+              <w:left w:w="100" w:type="dxa"/>
+              <w:right w:w="100" w:type="dxa"/>
+            </w:tcMar>
+            <w:shd w:fill="F8FAFC"/>
+          </w:tcPr>
+          <w:p>
+            <w:pPr>
+              <w:spacing w:before="0" w:after="0"/>
+            </w:pPr>
+            <w:r>
+              <w:rPr>
+                <w:rFonts w:ascii="Arial" w:hAnsi="Arial"/>
+                <w:color w:val="1E293B"/>
+                <w:sz w:val="18"/>
+              </w:rPr>
+              <w:t>AI Chatbot tham khảo thời tiết gợi ý đồ uống</w:t>
+            </w:r>
+          </w:p>
+        </w:tc>
+      </w:tr>
+    </w:tbl>
+    <w:p>
+      <w:pPr>
+        <w:spacing w:after="40"/>
+      </w:pPr>
+    </w:p>
+    <w:p>
+      <w:pPr>
+        <w:keepNext/>
+        <w:spacing w:before="280" w:after="120"/>
+        <w:pBdr>
+          <w:bottom w:val="single" w:sz="8" w:space="4" w:color="CBD5E1"/>
+        </w:pBdr>
+      </w:pPr>
+      <w:r>
+        <w:rPr>
+          <w:rFonts w:ascii="Arial" w:hAnsi="Arial"/>
+          <w:b/>
+          <w:color w:val="0F172A"/>
+          <w:sz w:val="26"/>
+        </w:rPr>
+        <w:t>D. CHI PHÍ PHÁT SINH CÓ THỂ XẢY RA</w:t>
+      </w:r>
+    </w:p>
+    <w:tbl>
+      <w:tblPr>
+        <w:tblW w:type="auto" w:w="0"/>
+        <w:jc w:val="center"/>
+        <w:tblLook w:firstColumn="1" w:firstRow="1" w:lastColumn="0" w:lastRow="0" w:noHBand="0" w:noVBand="1" w:val="04A0"/>
+        <w:tblBorders>
+          <w:top w:val="single" w:sz="6" w:space="0" w:color="CBD5E1"/>
+          <w:bottom w:val="single" w:sz="6" w:space="0" w:color="CBD5E1"/>
+          <w:left w:val="single" w:sz="6" w:space="0" w:color="CBD5E1"/>
+          <w:right w:val="single" w:sz="6" w:space="0" w:color="CBD5E1"/>
+          <w:insideH w:val="single" w:sz="4" w:space="0" w:color="E2E8F0"/>
+          <w:insideV w:val="single" w:sz="4" w:space="0" w:color="E2E8F0"/>
+        </w:tblBorders>
+      </w:tblPr>
+      <w:tblGrid>
+        <w:gridCol w:w="2556"/>
+        <w:gridCol w:w="2556"/>
+        <w:gridCol w:w="2556"/>
+        <w:gridCol w:w="2556"/>
+      </w:tblGrid>
+      <w:tr>
+        <w:tc>
+          <w:tcPr>
+            <w:tcW w:type="dxa" w:w="2556"/>
+            <w:tcMar>
+              <w:top w:w="70" w:type="dxa"/>
+              <w:bottom w:w="70" w:type="dxa"/>
+              <w:left w:w="100" w:type="dxa"/>
+              <w:right w:w="100" w:type="dxa"/>
+            </w:tcMar>
+            <w:shd w:fill="0F172A"/>
+          </w:tcPr>
+          <w:p>
+            <w:pPr>
+              <w:spacing w:before="0" w:after="0"/>
+            </w:pPr>
+            <w:r>
+              <w:rPr>
+                <w:rFonts w:ascii="Arial" w:hAnsi="Arial"/>
+                <w:b/>
+                <w:color w:val="FFFFFF"/>
+                <w:sz w:val="18"/>
+              </w:rPr>
+              <w:t>STT</w:t>
+            </w:r>
+          </w:p>
+        </w:tc>
+        <w:tc>
+          <w:tcPr>
+            <w:tcW w:type="dxa" w:w="2556"/>
+            <w:tcMar>
+              <w:top w:w="70" w:type="dxa"/>
+              <w:bottom w:w="70" w:type="dxa"/>
+              <w:left w:w="100" w:type="dxa"/>
+              <w:right w:w="100" w:type="dxa"/>
+            </w:tcMar>
+            <w:shd w:fill="0F172A"/>
+          </w:tcPr>
+          <w:p>
+            <w:pPr>
+              <w:spacing w:before="0" w:after="0"/>
+            </w:pPr>
+            <w:r>
+              <w:rPr>
+                <w:rFonts w:ascii="Arial" w:hAnsi="Arial"/>
+                <w:b/>
+                <w:color w:val="FFFFFF"/>
+                <w:sz w:val="18"/>
+              </w:rPr>
+              <w:t>Hạng mục</w:t>
             </w:r>
           </w:p>
         </w:tc>
@@ -2786,7 +5207,7 @@
                 <w:color w:val="1E293B"/>
                 <w:sz w:val="18"/>
               </w:rPr>
-              <w:t>Thay thế QR Acrylic hư/mất</w:t>
+              <w:t>Thay bảng QR Acrylic hư/mất</w:t>
             </w:r>
           </w:p>
         </w:tc>
@@ -2811,7 +5232,7 @@
                 <w:color w:val="1E293B"/>
                 <w:sz w:val="18"/>
               </w:rPr>
-              <w:t>Khách làm hư hoặc mất bảng QR</w:t>
+              <w:t>Khách làm hư hoặc mất</w:t>
             </w:r>
           </w:p>
         </w:tc>
@@ -2990,7 +5411,7 @@
                 <w:color w:val="1E293B"/>
                 <w:sz w:val="18"/>
               </w:rPr>
-              <w:t>Nâng cấp Server</w:t>
+              <w:t>Nâng cấp cấu hình Server</w:t>
             </w:r>
           </w:p>
         </w:tc>
@@ -3015,7 +5436,7 @@
                 <w:color w:val="1E293B"/>
                 <w:sz w:val="18"/>
               </w:rPr>
-              <w:t>Mở rộng &gt; 5 chi nhánh hoặc lượng khách tăng đột biến</w:t>
+              <w:t>Mở rộng &gt; 5 chi nhánh</w:t>
             </w:r>
           </w:p>
         </w:tc>
@@ -3092,7 +5513,7 @@
                 <w:color w:val="1E293B"/>
                 <w:sz w:val="18"/>
               </w:rPr>
-              <w:t>Thay Android Box hỏng</w:t>
+              <w:t>Thay Tablet hoặc Android Box hỏng</w:t>
             </w:r>
           </w:p>
         </w:tc>
@@ -3142,7 +5563,7 @@
                 <w:color w:val="1E293B"/>
                 <w:sz w:val="18"/>
               </w:rPr>
-              <w:t>1.500.000/cái</w:t>
+              <w:t>1.500.000 - 5.000.000/cái</w:t>
             </w:r>
           </w:p>
         </w:tc>
@@ -3194,7 +5615,7 @@
                 <w:color w:val="1E293B"/>
                 <w:sz w:val="18"/>
               </w:rPr>
-              <w:t>Thay cuộn giấy in nhiệt</w:t>
+              <w:t>Bảo trì &amp; cập nhật phần mềm</w:t>
             </w:r>
           </w:p>
         </w:tc>
@@ -3219,7 +5640,7 @@
                 <w:color w:val="1E293B"/>
                 <w:sz w:val="18"/>
               </w:rPr>
-              <w:t>Tiêu hao, khoảng 2-4 cuộn/tháng/quán</w:t>
+              <w:t>Nếu ký hợp đồng bảo trì riêng</w:t>
             </w:r>
           </w:p>
         </w:tc>
@@ -3244,7 +5665,7 @@
                 <w:color w:val="1E293B"/>
                 <w:sz w:val="18"/>
               </w:rPr>
-              <w:t>15.000 - 25.000/cuộn</w:t>
+              <w:t>Thỏa thuận riêng</w:t>
             </w:r>
           </w:p>
         </w:tc>
@@ -3296,7 +5717,7 @@
                 <w:color w:val="1E293B"/>
                 <w:sz w:val="18"/>
               </w:rPr>
-              <w:t>Bảo trì phần mềm định kỳ</w:t>
+              <w:t>Đào tạo nhân viên mới</w:t>
             </w:r>
           </w:p>
         </w:tc>
@@ -3321,7 +5742,7 @@
                 <w:color w:val="1E293B"/>
                 <w:sz w:val="18"/>
               </w:rPr>
-              <w:t>Cập nhật tính năng mới, sửa lỗi (nếu ký hợp đồng bảo trì)</w:t>
+              <w:t>Tuyển NV mới cần hướng dẫn</w:t>
             </w:r>
           </w:p>
         </w:tc>
@@ -3346,109 +5767,7 @@
                 <w:color w:val="1E293B"/>
                 <w:sz w:val="18"/>
               </w:rPr>
-              <w:t>Thỏa thuận riêng</w:t>
-            </w:r>
-          </w:p>
-        </w:tc>
-      </w:tr>
-      <w:tr>
-        <w:tc>
-          <w:tcPr>
-            <w:tcW w:type="dxa" w:w="2556"/>
-            <w:tcMar>
-              <w:top w:w="70" w:type="dxa"/>
-              <w:bottom w:w="70" w:type="dxa"/>
-              <w:left w:w="100" w:type="dxa"/>
-              <w:right w:w="100" w:type="dxa"/>
-            </w:tcMar>
-            <w:shd w:fill="FFFFFF"/>
-          </w:tcPr>
-          <w:p>
-            <w:pPr>
-              <w:spacing w:before="0" w:after="0"/>
-            </w:pPr>
-            <w:r>
-              <w:rPr>
-                <w:rFonts w:ascii="Arial" w:hAnsi="Arial"/>
-                <w:color w:val="1E293B"/>
-                <w:sz w:val="18"/>
-              </w:rPr>
-              <w:t>7</w:t>
-            </w:r>
-          </w:p>
-        </w:tc>
-        <w:tc>
-          <w:tcPr>
-            <w:tcW w:type="dxa" w:w="2556"/>
-            <w:tcMar>
-              <w:top w:w="70" w:type="dxa"/>
-              <w:bottom w:w="70" w:type="dxa"/>
-              <w:left w:w="100" w:type="dxa"/>
-              <w:right w:w="100" w:type="dxa"/>
-            </w:tcMar>
-            <w:shd w:fill="FFFFFF"/>
-          </w:tcPr>
-          <w:p>
-            <w:pPr>
-              <w:spacing w:before="0" w:after="0"/>
-            </w:pPr>
-            <w:r>
-              <w:rPr>
-                <w:rFonts w:ascii="Arial" w:hAnsi="Arial"/>
-                <w:color w:val="1E293B"/>
-                <w:sz w:val="18"/>
-              </w:rPr>
-              <w:t>Đào tạo nhân viên mới</w:t>
-            </w:r>
-          </w:p>
-        </w:tc>
-        <w:tc>
-          <w:tcPr>
-            <w:tcW w:type="dxa" w:w="2556"/>
-            <w:tcMar>
-              <w:top w:w="70" w:type="dxa"/>
-              <w:bottom w:w="70" w:type="dxa"/>
-              <w:left w:w="100" w:type="dxa"/>
-              <w:right w:w="100" w:type="dxa"/>
-            </w:tcMar>
-            <w:shd w:fill="FFFFFF"/>
-          </w:tcPr>
-          <w:p>
-            <w:pPr>
-              <w:spacing w:before="0" w:after="0"/>
-            </w:pPr>
-            <w:r>
-              <w:rPr>
-                <w:rFonts w:ascii="Arial" w:hAnsi="Arial"/>
-                <w:color w:val="1E293B"/>
-                <w:sz w:val="18"/>
-              </w:rPr>
-              <w:t>Khi tuyển NV mới cần hướng dẫn sử dụng</w:t>
-            </w:r>
-          </w:p>
-        </w:tc>
-        <w:tc>
-          <w:tcPr>
-            <w:tcW w:type="dxa" w:w="2556"/>
-            <w:tcMar>
-              <w:top w:w="70" w:type="dxa"/>
-              <w:bottom w:w="70" w:type="dxa"/>
-              <w:left w:w="100" w:type="dxa"/>
-              <w:right w:w="100" w:type="dxa"/>
-            </w:tcMar>
-            <w:shd w:fill="FFFFFF"/>
-          </w:tcPr>
-          <w:p>
-            <w:pPr>
-              <w:spacing w:before="0" w:after="0"/>
-            </w:pPr>
-            <w:r>
-              <w:rPr>
-                <w:rFonts w:ascii="Arial" w:hAnsi="Arial"/>
-                <w:color w:val="1E293B"/>
-                <w:sz w:val="18"/>
-              </w:rPr>
-              <w:t>Miễn phí (tự đào tạo nội bộ)</w:t>
+              <w:t>Miễn phí (đào tạo nội bộ)</w:t>
             </w:r>
           </w:p>
         </w:tc>
@@ -3474,7 +5793,22 @@
           <w:color w:val="0F172A"/>
           <w:sz w:val="26"/>
         </w:rPr>
-        <w:t>D. TỔNG HỢP CHI PHÍ THEO THỜI GIAN</w:t>
+        <w:t>E. TỔNG HỢP CHI PHÍ THEO THỜI GIAN</w:t>
+      </w:r>
+    </w:p>
+    <w:p>
+      <w:pPr>
+        <w:keepNext/>
+        <w:spacing w:before="200" w:after="80"/>
+      </w:pPr>
+      <w:r>
+        <w:rPr>
+          <w:rFonts w:ascii="Arial" w:hAnsi="Arial"/>
+          <w:b/>
+          <w:color w:val="2563EB"/>
+          <w:sz w:val="22"/>
+        </w:rPr>
+        <w:t>Với Lựa chọn 2 — Tablet cảm ứng (Đề xuất)</w:t>
       </w:r>
     </w:p>
     <w:tbl>
@@ -3599,7 +5933,7 @@
                 <w:color w:val="1E293B"/>
                 <w:sz w:val="18"/>
               </w:rPr>
-              <w:t>Ban đầu (mua thiết bị)</w:t>
+              <w:t>Ban đầu (thiết bị)</w:t>
             </w:r>
           </w:p>
         </w:tc>
@@ -3625,7 +5959,7 @@
                 <w:color w:val="1E293B"/>
                 <w:sz w:val="18"/>
               </w:rPr>
-              <w:t>27.300.000</w:t>
+              <w:t>26.400.000</w:t>
             </w:r>
           </w:p>
         </w:tc>
@@ -3650,7 +5984,7 @@
                 <w:color w:val="1E293B"/>
                 <w:sz w:val="18"/>
               </w:rPr>
-              <w:t>Thanh toán 1 lần, tái sử dụng máy in: 21.300.000</w:t>
+              <w:t>Thanh toán 1 lần. Dùng lại máy in cũ: 20.400.000</w:t>
             </w:r>
           </w:p>
         </w:tc>
@@ -3704,7 +6038,7 @@
                 <w:color w:val="1E293B"/>
                 <w:sz w:val="18"/>
               </w:rPr>
-              <w:t>1.230.000</w:t>
+              <w:t>1.410.000</w:t>
             </w:r>
           </w:p>
         </w:tc>
@@ -3729,7 +6063,7 @@
                 <w:color w:val="1E293B"/>
                 <w:sz w:val="18"/>
               </w:rPr>
-              <w:t>Trung bình 410.000/chi nhánh/tháng</w:t>
+              <w:t>Trung bình 470.000/chi nhánh/tháng</w:t>
             </w:r>
           </w:p>
         </w:tc>
@@ -3783,7 +6117,7 @@
                 <w:color w:val="1E293B"/>
                 <w:sz w:val="18"/>
               </w:rPr>
-              <w:t>~42.000.000</w:t>
+              <w:t>~43.300.000</w:t>
             </w:r>
           </w:p>
         </w:tc>
@@ -3808,7 +6142,7 @@
                 <w:color w:val="1E293B"/>
                 <w:sz w:val="18"/>
               </w:rPr>
-              <w:t>Gồm thiết bị + 12 tháng vận hành</w:t>
+              <w:t>Thiết bị + 12 tháng vận hành</w:t>
             </w:r>
           </w:p>
         </w:tc>
@@ -3862,7 +6196,443 @@
                 <w:color w:val="1E293B"/>
                 <w:sz w:val="18"/>
               </w:rPr>
-              <w:t>~14.800.000/năm</w:t>
+              <w:t>~16.900.000/năm</w:t>
+            </w:r>
+          </w:p>
+        </w:tc>
+        <w:tc>
+          <w:tcPr>
+            <w:tcW w:type="dxa" w:w="3408"/>
+            <w:tcMar>
+              <w:top w:w="70" w:type="dxa"/>
+              <w:bottom w:w="70" w:type="dxa"/>
+              <w:left w:w="100" w:type="dxa"/>
+              <w:right w:w="100" w:type="dxa"/>
+            </w:tcMar>
+            <w:shd w:fill="F8FAFC"/>
+          </w:tcPr>
+          <w:p>
+            <w:pPr>
+              <w:spacing w:before="0" w:after="0"/>
+            </w:pPr>
+            <w:r>
+              <w:rPr>
+                <w:rFonts w:ascii="Arial" w:hAnsi="Arial"/>
+                <w:color w:val="1E293B"/>
+                <w:sz w:val="18"/>
+              </w:rPr>
+              <w:t>Chỉ còn chi phí vận hành hàng tháng</w:t>
+            </w:r>
+          </w:p>
+        </w:tc>
+      </w:tr>
+    </w:tbl>
+    <w:p>
+      <w:pPr>
+        <w:spacing w:after="40"/>
+      </w:pPr>
+    </w:p>
+    <w:p>
+      <w:pPr>
+        <w:keepNext/>
+        <w:spacing w:before="200" w:after="80"/>
+      </w:pPr>
+      <w:r>
+        <w:rPr>
+          <w:rFonts w:ascii="Arial" w:hAnsi="Arial"/>
+          <w:b/>
+          <w:color w:val="2563EB"/>
+          <w:sz w:val="22"/>
+        </w:rPr>
+        <w:t>Với Lựa chọn 1 — TV + Android Box</w:t>
+      </w:r>
+    </w:p>
+    <w:tbl>
+      <w:tblPr>
+        <w:tblW w:type="auto" w:w="0"/>
+        <w:jc w:val="center"/>
+        <w:tblLook w:firstColumn="1" w:firstRow="1" w:lastColumn="0" w:lastRow="0" w:noHBand="0" w:noVBand="1" w:val="04A0"/>
+        <w:tblBorders>
+          <w:top w:val="single" w:sz="6" w:space="0" w:color="CBD5E1"/>
+          <w:bottom w:val="single" w:sz="6" w:space="0" w:color="CBD5E1"/>
+          <w:left w:val="single" w:sz="6" w:space="0" w:color="CBD5E1"/>
+          <w:right w:val="single" w:sz="6" w:space="0" w:color="CBD5E1"/>
+          <w:insideH w:val="single" w:sz="4" w:space="0" w:color="E2E8F0"/>
+          <w:insideV w:val="single" w:sz="4" w:space="0" w:color="E2E8F0"/>
+        </w:tblBorders>
+      </w:tblPr>
+      <w:tblGrid>
+        <w:gridCol w:w="3408"/>
+        <w:gridCol w:w="3408"/>
+        <w:gridCol w:w="3408"/>
+      </w:tblGrid>
+      <w:tr>
+        <w:tc>
+          <w:tcPr>
+            <w:tcW w:type="dxa" w:w="3408"/>
+            <w:tcMar>
+              <w:top w:w="70" w:type="dxa"/>
+              <w:bottom w:w="70" w:type="dxa"/>
+              <w:left w:w="100" w:type="dxa"/>
+              <w:right w:w="100" w:type="dxa"/>
+            </w:tcMar>
+            <w:shd w:fill="0F172A"/>
+          </w:tcPr>
+          <w:p>
+            <w:pPr>
+              <w:spacing w:before="0" w:after="0"/>
+            </w:pPr>
+            <w:r>
+              <w:rPr>
+                <w:rFonts w:ascii="Arial" w:hAnsi="Arial"/>
+                <w:b/>
+                <w:color w:val="FFFFFF"/>
+                <w:sz w:val="18"/>
+              </w:rPr>
+              <w:t>Mốc thời gian</w:t>
+            </w:r>
+          </w:p>
+        </w:tc>
+        <w:tc>
+          <w:tcPr>
+            <w:tcW w:type="dxa" w:w="3408"/>
+            <w:tcMar>
+              <w:top w:w="70" w:type="dxa"/>
+              <w:bottom w:w="70" w:type="dxa"/>
+              <w:left w:w="100" w:type="dxa"/>
+              <w:right w:w="100" w:type="dxa"/>
+            </w:tcMar>
+            <w:shd w:fill="0F172A"/>
+          </w:tcPr>
+          <w:p>
+            <w:pPr>
+              <w:spacing w:before="0" w:after="0"/>
+            </w:pPr>
+            <w:r>
+              <w:rPr>
+                <w:rFonts w:ascii="Arial" w:hAnsi="Arial"/>
+                <w:b/>
+                <w:color w:val="FFFFFF"/>
+                <w:sz w:val="18"/>
+              </w:rPr>
+              <w:t>Chi phí</w:t>
+            </w:r>
+          </w:p>
+        </w:tc>
+        <w:tc>
+          <w:tcPr>
+            <w:tcW w:type="dxa" w:w="3408"/>
+            <w:tcMar>
+              <w:top w:w="70" w:type="dxa"/>
+              <w:bottom w:w="70" w:type="dxa"/>
+              <w:left w:w="100" w:type="dxa"/>
+              <w:right w:w="100" w:type="dxa"/>
+            </w:tcMar>
+            <w:shd w:fill="0F172A"/>
+          </w:tcPr>
+          <w:p>
+            <w:pPr>
+              <w:spacing w:before="0" w:after="0"/>
+            </w:pPr>
+            <w:r>
+              <w:rPr>
+                <w:rFonts w:ascii="Arial" w:hAnsi="Arial"/>
+                <w:b/>
+                <w:color w:val="FFFFFF"/>
+                <w:sz w:val="18"/>
+              </w:rPr>
+              <w:t>Ghi chú</w:t>
+            </w:r>
+          </w:p>
+        </w:tc>
+      </w:tr>
+      <w:tr>
+        <w:tc>
+          <w:tcPr>
+            <w:tcW w:type="dxa" w:w="3408"/>
+            <w:tcMar>
+              <w:top w:w="70" w:type="dxa"/>
+              <w:bottom w:w="70" w:type="dxa"/>
+              <w:left w:w="100" w:type="dxa"/>
+              <w:right w:w="100" w:type="dxa"/>
+            </w:tcMar>
+            <w:shd w:fill="FFFFFF"/>
+          </w:tcPr>
+          <w:p>
+            <w:pPr>
+              <w:spacing w:before="0" w:after="0"/>
+            </w:pPr>
+            <w:r>
+              <w:rPr>
+                <w:rFonts w:ascii="Arial" w:hAnsi="Arial"/>
+                <w:b/>
+                <w:color w:val="1E293B"/>
+                <w:sz w:val="18"/>
+              </w:rPr>
+              <w:t>Ban đầu (thiết bị)</w:t>
+            </w:r>
+          </w:p>
+        </w:tc>
+        <w:tc>
+          <w:tcPr>
+            <w:tcW w:type="dxa" w:w="3408"/>
+            <w:tcMar>
+              <w:top w:w="70" w:type="dxa"/>
+              <w:bottom w:w="70" w:type="dxa"/>
+              <w:left w:w="100" w:type="dxa"/>
+              <w:right w:w="100" w:type="dxa"/>
+            </w:tcMar>
+            <w:shd w:fill="FFFFFF"/>
+          </w:tcPr>
+          <w:p>
+            <w:pPr>
+              <w:spacing w:before="0" w:after="0"/>
+            </w:pPr>
+            <w:r>
+              <w:rPr>
+                <w:rFonts w:ascii="Arial" w:hAnsi="Arial"/>
+                <w:b/>
+                <w:color w:val="1E293B"/>
+                <w:sz w:val="18"/>
+              </w:rPr>
+              <w:t>27.300.000</w:t>
+            </w:r>
+          </w:p>
+        </w:tc>
+        <w:tc>
+          <w:tcPr>
+            <w:tcW w:type="dxa" w:w="3408"/>
+            <w:tcMar>
+              <w:top w:w="70" w:type="dxa"/>
+              <w:bottom w:w="70" w:type="dxa"/>
+              <w:left w:w="100" w:type="dxa"/>
+              <w:right w:w="100" w:type="dxa"/>
+            </w:tcMar>
+            <w:shd w:fill="FFFFFF"/>
+          </w:tcPr>
+          <w:p>
+            <w:pPr>
+              <w:spacing w:before="0" w:after="0"/>
+            </w:pPr>
+            <w:r>
+              <w:rPr>
+                <w:rFonts w:ascii="Arial" w:hAnsi="Arial"/>
+                <w:color w:val="1E293B"/>
+                <w:sz w:val="18"/>
+              </w:rPr>
+              <w:t>Thanh toán 1 lần. Dùng lại máy in cũ: 21.300.000</w:t>
+            </w:r>
+          </w:p>
+        </w:tc>
+      </w:tr>
+      <w:tr>
+        <w:tc>
+          <w:tcPr>
+            <w:tcW w:type="dxa" w:w="3408"/>
+            <w:tcMar>
+              <w:top w:w="70" w:type="dxa"/>
+              <w:bottom w:w="70" w:type="dxa"/>
+              <w:left w:w="100" w:type="dxa"/>
+              <w:right w:w="100" w:type="dxa"/>
+            </w:tcMar>
+            <w:shd w:fill="F8FAFC"/>
+          </w:tcPr>
+          <w:p>
+            <w:pPr>
+              <w:spacing w:before="0" w:after="0"/>
+            </w:pPr>
+            <w:r>
+              <w:rPr>
+                <w:rFonts w:ascii="Arial" w:hAnsi="Arial"/>
+                <w:b/>
+                <w:color w:val="1E293B"/>
+                <w:sz w:val="18"/>
+              </w:rPr>
+              <w:t>Mỗi tháng (vận hành)</w:t>
+            </w:r>
+          </w:p>
+        </w:tc>
+        <w:tc>
+          <w:tcPr>
+            <w:tcW w:type="dxa" w:w="3408"/>
+            <w:tcMar>
+              <w:top w:w="70" w:type="dxa"/>
+              <w:bottom w:w="70" w:type="dxa"/>
+              <w:left w:w="100" w:type="dxa"/>
+              <w:right w:w="100" w:type="dxa"/>
+            </w:tcMar>
+            <w:shd w:fill="F8FAFC"/>
+          </w:tcPr>
+          <w:p>
+            <w:pPr>
+              <w:spacing w:before="0" w:after="0"/>
+            </w:pPr>
+            <w:r>
+              <w:rPr>
+                <w:rFonts w:ascii="Arial" w:hAnsi="Arial"/>
+                <w:b/>
+                <w:color w:val="1E293B"/>
+                <w:sz w:val="18"/>
+              </w:rPr>
+              <w:t>1.410.000</w:t>
+            </w:r>
+          </w:p>
+        </w:tc>
+        <w:tc>
+          <w:tcPr>
+            <w:tcW w:type="dxa" w:w="3408"/>
+            <w:tcMar>
+              <w:top w:w="70" w:type="dxa"/>
+              <w:bottom w:w="70" w:type="dxa"/>
+              <w:left w:w="100" w:type="dxa"/>
+              <w:right w:w="100" w:type="dxa"/>
+            </w:tcMar>
+            <w:shd w:fill="F8FAFC"/>
+          </w:tcPr>
+          <w:p>
+            <w:pPr>
+              <w:spacing w:before="0" w:after="0"/>
+            </w:pPr>
+            <w:r>
+              <w:rPr>
+                <w:rFonts w:ascii="Arial" w:hAnsi="Arial"/>
+                <w:color w:val="1E293B"/>
+                <w:sz w:val="18"/>
+              </w:rPr>
+              <w:t>Trung bình 470.000/chi nhánh/tháng</w:t>
+            </w:r>
+          </w:p>
+        </w:tc>
+      </w:tr>
+      <w:tr>
+        <w:tc>
+          <w:tcPr>
+            <w:tcW w:type="dxa" w:w="3408"/>
+            <w:tcMar>
+              <w:top w:w="70" w:type="dxa"/>
+              <w:bottom w:w="70" w:type="dxa"/>
+              <w:left w:w="100" w:type="dxa"/>
+              <w:right w:w="100" w:type="dxa"/>
+            </w:tcMar>
+            <w:shd w:fill="FFFFFF"/>
+          </w:tcPr>
+          <w:p>
+            <w:pPr>
+              <w:spacing w:before="0" w:after="0"/>
+            </w:pPr>
+            <w:r>
+              <w:rPr>
+                <w:rFonts w:ascii="Arial" w:hAnsi="Arial"/>
+                <w:b/>
+                <w:color w:val="1E293B"/>
+                <w:sz w:val="18"/>
+              </w:rPr>
+              <w:t>Năm đầu tiên</w:t>
+            </w:r>
+          </w:p>
+        </w:tc>
+        <w:tc>
+          <w:tcPr>
+            <w:tcW w:type="dxa" w:w="3408"/>
+            <w:tcMar>
+              <w:top w:w="70" w:type="dxa"/>
+              <w:bottom w:w="70" w:type="dxa"/>
+              <w:left w:w="100" w:type="dxa"/>
+              <w:right w:w="100" w:type="dxa"/>
+            </w:tcMar>
+            <w:shd w:fill="FFFFFF"/>
+          </w:tcPr>
+          <w:p>
+            <w:pPr>
+              <w:spacing w:before="0" w:after="0"/>
+            </w:pPr>
+            <w:r>
+              <w:rPr>
+                <w:rFonts w:ascii="Arial" w:hAnsi="Arial"/>
+                <w:b/>
+                <w:color w:val="1E293B"/>
+                <w:sz w:val="18"/>
+              </w:rPr>
+              <w:t>~44.200.000</w:t>
+            </w:r>
+          </w:p>
+        </w:tc>
+        <w:tc>
+          <w:tcPr>
+            <w:tcW w:type="dxa" w:w="3408"/>
+            <w:tcMar>
+              <w:top w:w="70" w:type="dxa"/>
+              <w:bottom w:w="70" w:type="dxa"/>
+              <w:left w:w="100" w:type="dxa"/>
+              <w:right w:w="100" w:type="dxa"/>
+            </w:tcMar>
+            <w:shd w:fill="FFFFFF"/>
+          </w:tcPr>
+          <w:p>
+            <w:pPr>
+              <w:spacing w:before="0" w:after="0"/>
+            </w:pPr>
+            <w:r>
+              <w:rPr>
+                <w:rFonts w:ascii="Arial" w:hAnsi="Arial"/>
+                <w:color w:val="1E293B"/>
+                <w:sz w:val="18"/>
+              </w:rPr>
+              <w:t>Thiết bị + 12 tháng vận hành</w:t>
+            </w:r>
+          </w:p>
+        </w:tc>
+      </w:tr>
+      <w:tr>
+        <w:tc>
+          <w:tcPr>
+            <w:tcW w:type="dxa" w:w="3408"/>
+            <w:tcMar>
+              <w:top w:w="70" w:type="dxa"/>
+              <w:bottom w:w="70" w:type="dxa"/>
+              <w:left w:w="100" w:type="dxa"/>
+              <w:right w:w="100" w:type="dxa"/>
+            </w:tcMar>
+            <w:shd w:fill="F8FAFC"/>
+          </w:tcPr>
+          <w:p>
+            <w:pPr>
+              <w:spacing w:before="0" w:after="0"/>
+            </w:pPr>
+            <w:r>
+              <w:rPr>
+                <w:rFonts w:ascii="Arial" w:hAnsi="Arial"/>
+                <w:b/>
+                <w:color w:val="1E293B"/>
+                <w:sz w:val="18"/>
+              </w:rPr>
+              <w:t>Từ năm thứ 2</w:t>
+            </w:r>
+          </w:p>
+        </w:tc>
+        <w:tc>
+          <w:tcPr>
+            <w:tcW w:type="dxa" w:w="3408"/>
+            <w:tcMar>
+              <w:top w:w="70" w:type="dxa"/>
+              <w:bottom w:w="70" w:type="dxa"/>
+              <w:left w:w="100" w:type="dxa"/>
+              <w:right w:w="100" w:type="dxa"/>
+            </w:tcMar>
+            <w:shd w:fill="F8FAFC"/>
+          </w:tcPr>
+          <w:p>
+            <w:pPr>
+              <w:spacing w:before="0" w:after="0"/>
+            </w:pPr>
+            <w:r>
+              <w:rPr>
+                <w:rFonts w:ascii="Arial" w:hAnsi="Arial"/>
+                <w:b/>
+                <w:color w:val="1E293B"/>
+                <w:sz w:val="18"/>
+              </w:rPr>
+              <w:t>~16.900.000/năm</w:t>
             </w:r>
           </w:p>
         </w:tc>
@@ -3913,7 +6683,7 @@
           <w:color w:val="0F172A"/>
           <w:sz w:val="26"/>
         </w:rPr>
-        <w:t>E. SO SÁNH CHI PHÍ: CÂY POS CŨ vs SMART F&amp;B OS</w:t>
+        <w:t>F. SO SÁNH CHI PHÍ: CÂY POS CŨ vs SMART F&amp;B OS</w:t>
       </w:r>
     </w:p>
     <w:tbl>
@@ -4037,7 +6807,7 @@
                 <w:color w:val="FFFFFF"/>
                 <w:sz w:val="18"/>
               </w:rPr>
-              <w:t>Chênh lệch</w:t>
+              <w:t>Tiết kiệm</w:t>
             </w:r>
           </w:p>
         </w:tc>
@@ -4191,7 +6961,7 @@
                 <w:color w:val="1E293B"/>
                 <w:sz w:val="18"/>
               </w:rPr>
-              <w:t>4.500.000</w:t>
+              <w:t>3.000.000 - 6.000.000</w:t>
             </w:r>
           </w:p>
         </w:tc>
@@ -4241,7 +7011,7 @@
                 <w:color w:val="1E293B"/>
                 <w:sz w:val="18"/>
               </w:rPr>
-              <w:t>-4.500.000</w:t>
+              <w:t>-3.000.000 ~ -6.000.000</w:t>
             </w:r>
           </w:p>
         </w:tc>
@@ -4293,7 +7063,7 @@
                 <w:color w:val="1E293B"/>
                 <w:sz w:val="18"/>
               </w:rPr>
-              <w:t>15.000.000</w:t>
+              <w:t>10 - 15% doanh thu</w:t>
             </w:r>
           </w:p>
         </w:tc>
@@ -4318,7 +7088,7 @@
                 <w:color w:val="1E293B"/>
                 <w:sz w:val="18"/>
               </w:rPr>
-              <w:t>3.000.000</w:t>
+              <w:t>&lt; 2% doanh thu</w:t>
             </w:r>
           </w:p>
         </w:tc>
@@ -4343,7 +7113,7 @@
                 <w:color w:val="1E293B"/>
                 <w:sz w:val="18"/>
               </w:rPr>
-              <w:t>-12.000.000</w:t>
+              <w:t>Giảm 8 - 13%</w:t>
             </w:r>
           </w:p>
         </w:tc>
@@ -4395,7 +7165,7 @@
                 <w:color w:val="1E293B"/>
                 <w:sz w:val="18"/>
               </w:rPr>
-              <w:t>1.500.000</w:t>
+              <w:t>1.000.000 - 1.500.000</w:t>
             </w:r>
           </w:p>
         </w:tc>
@@ -4420,7 +7190,7 @@
                 <w:color w:val="1E293B"/>
                 <w:sz w:val="18"/>
               </w:rPr>
-              <w:t>1.230.000</w:t>
+              <w:t>1.410.000</w:t>
             </w:r>
           </w:p>
         </w:tc>
@@ -4445,7 +7215,7 @@
                 <w:color w:val="1E293B"/>
                 <w:sz w:val="18"/>
               </w:rPr>
-              <w:t>-270.000</w:t>
+              <w:t>Tương đương</w:t>
             </w:r>
           </w:p>
         </w:tc>
@@ -4466,15 +7236,6 @@
             <w:pPr>
               <w:spacing w:before="0" w:after="0"/>
             </w:pPr>
-            <w:r>
-              <w:rPr>
-                <w:rFonts w:ascii="Arial" w:hAnsi="Arial"/>
-                <w:b/>
-                <w:color w:val="1E293B"/>
-                <w:sz w:val="18"/>
-              </w:rPr>
-              <w:t>Tổng chi phí hàng tháng</w:t>
-            </w:r>
           </w:p>
         </w:tc>
         <w:tc>
@@ -4492,15 +7253,6 @@
             <w:pPr>
               <w:spacing w:before="0" w:after="0"/>
             </w:pPr>
-            <w:r>
-              <w:rPr>
-                <w:rFonts w:ascii="Arial" w:hAnsi="Arial"/>
-                <w:b/>
-                <w:color w:val="1E293B"/>
-                <w:sz w:val="18"/>
-              </w:rPr>
-              <w:t>42.000.000</w:t>
-            </w:r>
           </w:p>
         </w:tc>
         <w:tc>
@@ -4518,15 +7270,6 @@
             <w:pPr>
               <w:spacing w:before="0" w:after="0"/>
             </w:pPr>
-            <w:r>
-              <w:rPr>
-                <w:rFonts w:ascii="Arial" w:hAnsi="Arial"/>
-                <w:b/>
-                <w:color w:val="1E293B"/>
-                <w:sz w:val="18"/>
-              </w:rPr>
-              <w:t>4.230.000</w:t>
-            </w:r>
           </w:p>
         </w:tc>
         <w:tc>
@@ -4544,6 +7287,25 @@
             <w:pPr>
               <w:spacing w:before="0" w:after="0"/>
             </w:pPr>
+          </w:p>
+        </w:tc>
+      </w:tr>
+      <w:tr>
+        <w:tc>
+          <w:tcPr>
+            <w:tcW w:type="dxa" w:w="2556"/>
+            <w:tcMar>
+              <w:top w:w="70" w:type="dxa"/>
+              <w:bottom w:w="70" w:type="dxa"/>
+              <w:left w:w="100" w:type="dxa"/>
+              <w:right w:w="100" w:type="dxa"/>
+            </w:tcMar>
+            <w:shd w:fill="F8FAFC"/>
+          </w:tcPr>
+          <w:p>
+            <w:pPr>
+              <w:spacing w:before="0" w:after="0"/>
+            </w:pPr>
             <w:r>
               <w:rPr>
                 <w:rFonts w:ascii="Arial" w:hAnsi="Arial"/>
@@ -4551,7 +7313,85 @@
                 <w:color w:val="1E293B"/>
                 <w:sz w:val="18"/>
               </w:rPr>
-              <w:t>-37.770.000</w:t>
+              <w:t>Tổng ước tính/tháng</w:t>
+            </w:r>
+          </w:p>
+        </w:tc>
+        <w:tc>
+          <w:tcPr>
+            <w:tcW w:type="dxa" w:w="2556"/>
+            <w:tcMar>
+              <w:top w:w="70" w:type="dxa"/>
+              <w:bottom w:w="70" w:type="dxa"/>
+              <w:left w:w="100" w:type="dxa"/>
+              <w:right w:w="100" w:type="dxa"/>
+            </w:tcMar>
+            <w:shd w:fill="F8FAFC"/>
+          </w:tcPr>
+          <w:p>
+            <w:pPr>
+              <w:spacing w:before="0" w:after="0"/>
+            </w:pPr>
+            <w:r>
+              <w:rPr>
+                <w:rFonts w:ascii="Arial" w:hAnsi="Arial"/>
+                <w:b/>
+                <w:color w:val="1E293B"/>
+                <w:sz w:val="18"/>
+              </w:rPr>
+              <w:t>~35.000.000 - 42.000.000</w:t>
+            </w:r>
+          </w:p>
+        </w:tc>
+        <w:tc>
+          <w:tcPr>
+            <w:tcW w:type="dxa" w:w="2556"/>
+            <w:tcMar>
+              <w:top w:w="70" w:type="dxa"/>
+              <w:bottom w:w="70" w:type="dxa"/>
+              <w:left w:w="100" w:type="dxa"/>
+              <w:right w:w="100" w:type="dxa"/>
+            </w:tcMar>
+            <w:shd w:fill="F8FAFC"/>
+          </w:tcPr>
+          <w:p>
+            <w:pPr>
+              <w:spacing w:before="0" w:after="0"/>
+            </w:pPr>
+            <w:r>
+              <w:rPr>
+                <w:rFonts w:ascii="Arial" w:hAnsi="Arial"/>
+                <w:b/>
+                <w:color w:val="1E293B"/>
+                <w:sz w:val="18"/>
+              </w:rPr>
+              <w:t>~4.410.000</w:t>
+            </w:r>
+          </w:p>
+        </w:tc>
+        <w:tc>
+          <w:tcPr>
+            <w:tcW w:type="dxa" w:w="2556"/>
+            <w:tcMar>
+              <w:top w:w="70" w:type="dxa"/>
+              <w:bottom w:w="70" w:type="dxa"/>
+              <w:left w:w="100" w:type="dxa"/>
+              <w:right w:w="100" w:type="dxa"/>
+            </w:tcMar>
+            <w:shd w:fill="F8FAFC"/>
+          </w:tcPr>
+          <w:p>
+            <w:pPr>
+              <w:spacing w:before="0" w:after="0"/>
+            </w:pPr>
+            <w:r>
+              <w:rPr>
+                <w:rFonts w:ascii="Arial" w:hAnsi="Arial"/>
+                <w:b/>
+                <w:color w:val="1E293B"/>
+                <w:sz w:val="18"/>
+              </w:rPr>
+              <w:t>Tiết kiệm ~30 - 37 triệu</w:t>
             </w:r>
           </w:p>
         </w:tc>
@@ -4600,7 +7440,7 @@
                 <w:color w:val="1E293B"/>
                 <w:sz w:val="19"/>
               </w:rPr>
-              <w:t>Tiết kiệm ròng:</w:t>
+              <w:t>Thời gian hoàn vốn thiết bị:</w:t>
             </w:r>
             <w:r>
               <w:rPr>
@@ -4608,24 +7448,7 @@
                 <w:color w:val="1E293B"/>
                 <w:sz w:val="19"/>
               </w:rPr>
-              <w:t xml:space="preserve"> Khoảng </w:t>
-            </w:r>
-            <w:r>
-              <w:rPr>
-                <w:rFonts w:ascii="Arial" w:hAnsi="Arial"/>
-                <w:b/>
-                <w:color w:val="1E293B"/>
-                <w:sz w:val="19"/>
-              </w:rPr>
-              <w:t>36.500.000 VNĐ/tháng</w:t>
-            </w:r>
-            <w:r>
-              <w:rPr>
-                <w:rFonts w:ascii="Arial" w:hAnsi="Arial"/>
-                <w:color w:val="1E293B"/>
-                <w:sz w:val="19"/>
-              </w:rPr>
-              <w:t xml:space="preserve"> sau khi trừ chi phí vận hành Smart F&amp;B OS.</w:t>
+              <w:t xml:space="preserve"> Trong vòng tháng đầu tiên vận hành.</w:t>
             </w:r>
           </w:p>
           <w:p>
@@ -4635,36 +7458,23 @@
             <w:r>
               <w:rPr>
                 <w:rFonts w:ascii="Arial" w:hAnsi="Arial"/>
-                <w:b/>
                 <w:color w:val="1E293B"/>
                 <w:sz w:val="19"/>
               </w:rPr>
-              <w:t>Hoàn vốn thiết bị:</w:t>
+              <w:t>Lương thu ngân: Tùy khu vực, ước tính 6 - 7 triệu/NV (gồm phụ cấp &amp; BHXH).</w:t>
             </w:r>
+          </w:p>
+          <w:p>
+            <w:pPr>
+              <w:spacing w:before="0" w:after="20"/>
+            </w:pPr>
             <w:r>
               <w:rPr>
                 <w:rFonts w:ascii="Arial" w:hAnsi="Arial"/>
                 <w:color w:val="1E293B"/>
                 <w:sz w:val="19"/>
               </w:rPr>
-              <w:t xml:space="preserve"> Trong vòng </w:t>
-            </w:r>
-            <w:r>
-              <w:rPr>
-                <w:rFonts w:ascii="Arial" w:hAnsi="Arial"/>
-                <w:b/>
-                <w:color w:val="1E293B"/>
-                <w:sz w:val="19"/>
-              </w:rPr>
-              <w:t>tháng đầu tiên</w:t>
-            </w:r>
-            <w:r>
-              <w:rPr>
-                <w:rFonts w:ascii="Arial" w:hAnsi="Arial"/>
-                <w:color w:val="1E293B"/>
-                <w:sz w:val="19"/>
-              </w:rPr>
-              <w:t xml:space="preserve"> vận hành (khoảng 22-25 ngày).</w:t>
+              <w:t>Phí POS cũ: Tùy nhà cung cấp đang dùng (iPOS, KiotViet, CukCuk,...).</w:t>
             </w:r>
           </w:p>
         </w:tc>
@@ -4690,7 +7500,7 @@
           <w:color w:val="0F172A"/>
           <w:sz w:val="26"/>
         </w:rPr>
-        <w:t>F. ĐIỀU KHOẢN THANH TOÁN</w:t>
+        <w:t>G. ĐIỀU KHOẢN THANH TOÁN</w:t>
       </w:r>
     </w:p>
     <w:tbl>
@@ -4891,7 +7701,7 @@
                 <w:color w:val="1E293B"/>
                 <w:sz w:val="18"/>
               </w:rPr>
-              <w:t>27.300.000</w:t>
+              <w:t>26.400.000 - 27.300.000</w:t>
             </w:r>
           </w:p>
         </w:tc>
@@ -4993,7 +7803,7 @@
                 <w:color w:val="1E293B"/>
                 <w:sz w:val="18"/>
               </w:rPr>
-              <w:t>1.230.000</w:t>
+              <w:t>1.410.000</w:t>
             </w:r>
           </w:p>
         </w:tc>
@@ -5029,79 +7839,101 @@
         <w:spacing w:after="40"/>
       </w:pPr>
     </w:p>
-    <w:tbl>
-      <w:tblPr>
-        <w:tblW w:type="auto" w:w="0"/>
-        <w:jc w:val="center"/>
-        <w:tblLook w:firstColumn="1" w:firstRow="1" w:lastColumn="0" w:lastRow="0" w:noHBand="0" w:noVBand="1" w:val="04A0"/>
-      </w:tblPr>
-      <w:tblGrid>
-        <w:gridCol w:w="10224"/>
-      </w:tblGrid>
-      <w:tr>
-        <w:tc>
-          <w:tcPr>
-            <w:tcW w:type="dxa" w:w="10224"/>
-            <w:shd w:fill="F8FAFC"/>
-            <w:tcMar>
-              <w:top w:w="120" w:type="dxa"/>
-              <w:bottom w:w="120" w:type="dxa"/>
-              <w:left w:w="180" w:type="dxa"/>
-              <w:right w:w="180" w:type="dxa"/>
-            </w:tcMar>
-            <w:tcBorders>
-              <w:top w:val="single" w:sz="4" w:space="0" w:color="CBD5E1"/>
-              <w:left w:val="single" w:sz="16" w:space="0" w:color="3B82F6"/>
-              <w:bottom w:val="single" w:sz="4" w:space="0" w:color="CBD5E1"/>
-              <w:right w:val="single" w:sz="4" w:space="0" w:color="CBD5E1"/>
-            </w:tcBorders>
-          </w:tcPr>
-          <w:p>
-            <w:pPr>
-              <w:spacing w:before="0" w:after="20"/>
-            </w:pPr>
-            <w:r>
-              <w:rPr>
-                <w:rFonts w:ascii="Arial" w:hAnsi="Arial"/>
-                <w:color w:val="1E293B"/>
-                <w:sz w:val="19"/>
-              </w:rPr>
-              <w:t>Báo giá trên chưa bao gồm thuế VAT (nếu có).</w:t>
-            </w:r>
-          </w:p>
-          <w:p>
-            <w:pPr>
-              <w:spacing w:before="0" w:after="20"/>
-            </w:pPr>
-            <w:r>
-              <w:rPr>
-                <w:rFonts w:ascii="Arial" w:hAnsi="Arial"/>
-                <w:color w:val="1E293B"/>
-                <w:sz w:val="19"/>
-              </w:rPr>
-              <w:t>Giá thiết bị có thể thay đổi tùy thời điểm mua &amp; nhà cung cấp.</w:t>
-            </w:r>
-          </w:p>
-          <w:p>
-            <w:pPr>
-              <w:spacing w:before="0" w:after="20"/>
-            </w:pPr>
-            <w:r>
-              <w:rPr>
-                <w:rFonts w:ascii="Arial" w:hAnsi="Arial"/>
-                <w:color w:val="1E293B"/>
-                <w:sz w:val="19"/>
-              </w:rPr>
-              <w:t>Chi phí phát sinh (Mục C) chỉ phát sinh khi có nhu cầu thực tế, không bắt buộc.</w:t>
-            </w:r>
-          </w:p>
-        </w:tc>
-      </w:tr>
-    </w:tbl>
     <w:p>
       <w:pPr>
-        <w:spacing w:after="40"/>
+        <w:keepNext/>
+        <w:spacing w:before="280" w:after="120"/>
+        <w:pBdr>
+          <w:bottom w:val="single" w:sz="8" w:space="4" w:color="CBD5E1"/>
+        </w:pBdr>
       </w:pPr>
+      <w:r>
+        <w:rPr>
+          <w:rFonts w:ascii="Arial" w:hAnsi="Arial"/>
+          <w:b/>
+          <w:color w:val="0F172A"/>
+          <w:sz w:val="26"/>
+        </w:rPr>
+        <w:t>H. GHI CHÚ QUAN TRỌNG</w:t>
+      </w:r>
+    </w:p>
+    <w:p>
+      <w:pPr>
+        <w:spacing w:before="0" w:after="60"/>
+        <w:ind w:left="360"/>
+      </w:pPr>
+      <w:r>
+        <w:rPr>
+          <w:rFonts w:ascii="Arial" w:hAnsi="Arial"/>
+          <w:sz w:val="20"/>
+        </w:rPr>
+        <w:t>1. Báo giá trên chưa bao gồm thuế VAT (nếu có).</w:t>
+      </w:r>
+    </w:p>
+    <w:p>
+      <w:pPr>
+        <w:spacing w:before="0" w:after="60"/>
+        <w:ind w:left="360"/>
+      </w:pPr>
+      <w:r>
+        <w:rPr>
+          <w:rFonts w:ascii="Arial" w:hAnsi="Arial"/>
+          <w:sz w:val="20"/>
+        </w:rPr>
+        <w:t>2. Giá thiết bị có thể thay đổi tùy thời điểm mua &amp; nhà cung cấp.</w:t>
+      </w:r>
+    </w:p>
+    <w:p>
+      <w:pPr>
+        <w:spacing w:before="0" w:after="60"/>
+        <w:ind w:left="360"/>
+      </w:pPr>
+      <w:r>
+        <w:rPr>
+          <w:rFonts w:ascii="Arial" w:hAnsi="Arial"/>
+          <w:sz w:val="20"/>
+        </w:rPr>
+        <w:t>3. Chi phí phát sinh (Mục D) chỉ phát sinh khi có nhu cầu thực tế, không bắt buộc.</w:t>
+      </w:r>
+    </w:p>
+    <w:p>
+      <w:pPr>
+        <w:spacing w:before="0" w:after="60"/>
+        <w:ind w:left="360"/>
+      </w:pPr>
+      <w:r>
+        <w:rPr>
+          <w:rFonts w:ascii="Arial" w:hAnsi="Arial"/>
+          <w:sz w:val="20"/>
+        </w:rPr>
+        <w:t>4. Hệ thống yêu cầu kết nối Internet ổn định tại mỗi chi nhánh (sử dụng WiFi sẵn có của quán).</w:t>
+      </w:r>
+    </w:p>
+    <w:p>
+      <w:pPr>
+        <w:spacing w:before="0" w:after="60"/>
+        <w:ind w:left="360"/>
+      </w:pPr>
+      <w:r>
+        <w:rPr>
+          <w:rFonts w:ascii="Arial" w:hAnsi="Arial"/>
+          <w:sz w:val="20"/>
+        </w:rPr>
+        <w:t>5. Máy in hóa đơn cũ của cây POS (chuẩn ESC/POS, khổ 80mm) có thể tái sử dụng, giảm 6.000.000 trong tổng chi phí thiết bị.</w:t>
+      </w:r>
+    </w:p>
+    <w:p>
+      <w:pPr>
+        <w:spacing w:before="0" w:after="60"/>
+        <w:ind w:left="360"/>
+      </w:pPr>
+      <w:r>
+        <w:rPr>
+          <w:rFonts w:ascii="Arial" w:hAnsi="Arial"/>
+          <w:sz w:val="20"/>
+        </w:rPr>
+        <w:t>6. Dữ liệu hệ thống (khách hàng, doanh thu, kho) được sao lưu tự động hàng ngày, đảm bảo an toàn.</w:t>
+      </w:r>
     </w:p>
     <w:p>
       <w:pPr>

</xml_diff>

<commit_message>
docs: update quotation - replace TV+Box with dual-screen POS (Sunmi T2s/D2s), add QR Takeaway, customer-facing display for bill+VietQR
</commit_message>
<xml_diff>
--- a/BaoGia_KhachHang.docx
+++ b/BaoGia_KhachHang.docx
@@ -170,7 +170,7 @@
           <w:color w:val="2563EB"/>
           <w:sz w:val="22"/>
         </w:rPr>
-        <w:t>Lựa chọn 1: Màn hình TV + Android Box (Không cảm ứng)</w:t>
+        <w:t>Thiết bị chính: Máy POS cảm ứng 2 màn hình</w:t>
       </w:r>
     </w:p>
     <w:p>
@@ -182,7 +182,45 @@
           <w:rFonts w:ascii="Arial" w:hAnsi="Arial"/>
           <w:sz w:val="20"/>
         </w:rPr>
-        <w:t>Nhân viên xem đơn trên TV, thao tác hoàn thành đơn qua điện thoại (Staff App).</w:t>
+        <w:t>Mỗi chi nhánh trang bị 1 máy POS cảm ứng chuyên dụng đặt tại quầy:</w:t>
+      </w:r>
+    </w:p>
+    <w:p>
+      <w:pPr>
+        <w:spacing w:before="0" w:after="60"/>
+        <w:ind w:left="360"/>
+      </w:pPr>
+      <w:r>
+        <w:rPr>
+          <w:rFonts w:ascii="Arial" w:hAnsi="Arial"/>
+          <w:sz w:val="20"/>
+        </w:rPr>
+        <w:t>Mặt trong (Nhân viên): Màn hình cảm ứng 15.6 inch — thao tác nhận đơn, hoàn thành pha chế, báo hết món.</w:t>
+      </w:r>
+    </w:p>
+    <w:p>
+      <w:pPr>
+        <w:spacing w:before="0" w:after="60"/>
+        <w:ind w:left="360"/>
+      </w:pPr>
+      <w:r>
+        <w:rPr>
+          <w:rFonts w:ascii="Arial" w:hAnsi="Arial"/>
+          <w:sz w:val="20"/>
+        </w:rPr>
+        <w:t>Mặt ngoài (Khách hàng): Màn hình phụ 10 inch — hiển thị chi tiết đơn hàng, giá tiền, tổng cộng và mã VietQR thanh toán.</w:t>
+      </w:r>
+    </w:p>
+    <w:p>
+      <w:pPr>
+        <w:spacing w:before="0" w:after="60"/>
+      </w:pPr>
+      <w:r>
+        <w:rPr>
+          <w:rFonts w:ascii="Arial" w:hAnsi="Arial"/>
+          <w:sz w:val="20"/>
+        </w:rPr>
+        <w:t>Thiết bị chạy liên tục cả ngày (16-18 tiếng), thiết kế chuyên dụng cho ngành F&amp;B, có quạt tản nhiệt và pin dự phòng khi mất điện.</w:t>
       </w:r>
     </w:p>
     <w:tbl>
@@ -412,7 +450,7 @@
                 <w:color w:val="1E293B"/>
                 <w:sz w:val="18"/>
               </w:rPr>
-              <w:t>TV 32 inch hiển thị đơn tại quầy</w:t>
+              <w:t>Máy POS 2 màn hình cảm ứng (Sunmi T2s / D2s)</w:t>
             </w:r>
           </w:p>
         </w:tc>
@@ -437,7 +475,7 @@
                 <w:color w:val="1E293B"/>
                 <w:sz w:val="18"/>
               </w:rPr>
-              <w:t>4.000.000</w:t>
+              <w:t>9.000.000</w:t>
             </w:r>
           </w:p>
         </w:tc>
@@ -487,7 +525,7 @@
                 <w:color w:val="1E293B"/>
                 <w:sz w:val="18"/>
               </w:rPr>
-              <w:t>12.000.000</w:t>
+              <w:t>27.000.000</w:t>
             </w:r>
           </w:p>
         </w:tc>
@@ -512,7 +550,7 @@
                 <w:color w:val="1E293B"/>
                 <w:sz w:val="18"/>
               </w:rPr>
-              <w:t>Đặt tại vị trí cây POS cũ</w:t>
+              <w:t>15.6" NV cảm ứng + 10" Khách xem đơn &amp; QR</w:t>
             </w:r>
           </w:p>
         </w:tc>
@@ -564,7 +602,7 @@
                 <w:color w:val="1E293B"/>
                 <w:sz w:val="18"/>
               </w:rPr>
-              <w:t>Android Box kết nối TV</w:t>
+              <w:t>Máy in hóa đơn nhiệt 80mm</w:t>
             </w:r>
           </w:p>
         </w:tc>
@@ -589,7 +627,7 @@
                 <w:color w:val="1E293B"/>
                 <w:sz w:val="18"/>
               </w:rPr>
-              <w:t>1.500.000</w:t>
+              <w:t>2.000.000</w:t>
             </w:r>
           </w:p>
         </w:tc>
@@ -639,7 +677,7 @@
                 <w:color w:val="1E293B"/>
                 <w:sz w:val="18"/>
               </w:rPr>
-              <w:t>4.500.000</w:t>
+              <w:t>6.000.000</w:t>
             </w:r>
           </w:p>
         </w:tc>
@@ -664,7 +702,7 @@
                 <w:color w:val="1E293B"/>
                 <w:sz w:val="18"/>
               </w:rPr>
-              <w:t>Chạy phần mềm KDS trên TV</w:t>
+              <w:t>Dùng lại máy in cũ nếu có: 0 đ</w:t>
             </w:r>
           </w:p>
         </w:tc>
@@ -716,7 +754,7 @@
                 <w:color w:val="1E293B"/>
                 <w:sz w:val="18"/>
               </w:rPr>
-              <w:t>Máy in hóa đơn nhiệt 80mm</w:t>
+              <w:t>Bảng QR Code Acrylic để bàn</w:t>
             </w:r>
           </w:p>
         </w:tc>
@@ -741,7 +779,7 @@
                 <w:color w:val="1E293B"/>
                 <w:sz w:val="18"/>
               </w:rPr>
-              <w:t>2.000.000</w:t>
+              <w:t>30.000</w:t>
             </w:r>
           </w:p>
         </w:tc>
@@ -766,7 +804,7 @@
                 <w:color w:val="1E293B"/>
                 <w:sz w:val="18"/>
               </w:rPr>
-              <w:t>3</w:t>
+              <w:t>60</w:t>
             </w:r>
           </w:p>
         </w:tc>
@@ -791,7 +829,7 @@
                 <w:color w:val="1E293B"/>
                 <w:sz w:val="18"/>
               </w:rPr>
-              <w:t>6.000.000</w:t>
+              <w:t>1.800.000</w:t>
             </w:r>
           </w:p>
         </w:tc>
@@ -816,7 +854,7 @@
                 <w:color w:val="1E293B"/>
                 <w:sz w:val="18"/>
               </w:rPr>
-              <w:t>Dùng lại máy in cũ nếu có: 0 đ</w:t>
+              <w:t>20 bàn mỗi chi nhánh</w:t>
             </w:r>
           </w:p>
         </w:tc>
@@ -868,7 +906,7 @@
                 <w:color w:val="1E293B"/>
                 <w:sz w:val="18"/>
               </w:rPr>
-              <w:t>Bảng QR Code Acrylic để bàn</w:t>
+              <w:t>Bảng QR Takeaway tại quầy</w:t>
             </w:r>
           </w:p>
         </w:tc>
@@ -918,7 +956,7 @@
                 <w:color w:val="1E293B"/>
                 <w:sz w:val="18"/>
               </w:rPr>
-              <w:t>60</w:t>
+              <w:t>3</w:t>
             </w:r>
           </w:p>
         </w:tc>
@@ -943,7 +981,7 @@
                 <w:color w:val="1E293B"/>
                 <w:sz w:val="18"/>
               </w:rPr>
-              <w:t>1.800.000</w:t>
+              <w:t>90.000</w:t>
             </w:r>
           </w:p>
         </w:tc>
@@ -968,7 +1006,7 @@
                 <w:color w:val="1E293B"/>
                 <w:sz w:val="18"/>
               </w:rPr>
-              <w:t>20 bàn mỗi chi nhánh</w:t>
+              <w:t>Khách mang đi quét QR đặt món tại quầy</w:t>
             </w:r>
           </w:p>
         </w:tc>
@@ -1269,7 +1307,7 @@
                 <w:color w:val="1E293B"/>
                 <w:sz w:val="18"/>
               </w:rPr>
-              <w:t>TỔNG LỰA CHỌN 1</w:t>
+              <w:t>TỔNG THIẾT BỊ</w:t>
             </w:r>
           </w:p>
         </w:tc>
@@ -1329,7 +1367,7 @@
                 <w:color w:val="1E293B"/>
                 <w:sz w:val="18"/>
               </w:rPr>
-              <w:t>27.300.000</w:t>
+              <w:t>37.890.000</w:t>
             </w:r>
           </w:p>
         </w:tc>
@@ -1452,7 +1490,7 @@
                 <w:color w:val="1E293B"/>
                 <w:sz w:val="18"/>
               </w:rPr>
-              <w:t>21.300.000</w:t>
+              <w:t>31.890.000</w:t>
             </w:r>
           </w:p>
         </w:tc>
@@ -1501,7 +1539,7 @@
           <w:color w:val="2563EB"/>
           <w:sz w:val="22"/>
         </w:rPr>
-        <w:t>Lựa chọn 2: Tablet cảm ứng (Đề xuất)</w:t>
+        <w:t>Máy POS 2 màn hình hoạt động như thế nào?</w:t>
       </w:r>
     </w:p>
     <w:p>
@@ -1513,1817 +1551,111 @@
           <w:rFonts w:ascii="Arial" w:hAnsi="Arial"/>
           <w:sz w:val="20"/>
         </w:rPr>
-        <w:t>Nhân viên bấm trực tiếp trên màn hình cảm ứng để hoàn thành đơn, báo hết món, xem chi tiết.</w:t>
+        <w:t>Mặt nhân viên (15.6 inch cảm ứng):</w:t>
       </w:r>
-    </w:p>
-    <w:tbl>
-      <w:tblPr>
-        <w:tblW w:type="auto" w:w="0"/>
-        <w:jc w:val="center"/>
-        <w:tblLook w:firstColumn="1" w:firstRow="1" w:lastColumn="0" w:lastRow="0" w:noHBand="0" w:noVBand="1" w:val="04A0"/>
-        <w:tblBorders>
-          <w:top w:val="single" w:sz="6" w:space="0" w:color="CBD5E1"/>
-          <w:bottom w:val="single" w:sz="6" w:space="0" w:color="CBD5E1"/>
-          <w:left w:val="single" w:sz="6" w:space="0" w:color="CBD5E1"/>
-          <w:right w:val="single" w:sz="6" w:space="0" w:color="CBD5E1"/>
-          <w:insideH w:val="single" w:sz="4" w:space="0" w:color="E2E8F0"/>
-          <w:insideV w:val="single" w:sz="4" w:space="0" w:color="E2E8F0"/>
-        </w:tblBorders>
-      </w:tblPr>
-      <w:tblGrid>
-        <w:gridCol w:w="1704"/>
-        <w:gridCol w:w="1704"/>
-        <w:gridCol w:w="1704"/>
-        <w:gridCol w:w="1704"/>
-        <w:gridCol w:w="1704"/>
-        <w:gridCol w:w="1704"/>
-      </w:tblGrid>
-      <w:tr>
-        <w:tc>
-          <w:tcPr>
-            <w:tcW w:type="dxa" w:w="1704"/>
-            <w:tcMar>
-              <w:top w:w="70" w:type="dxa"/>
-              <w:bottom w:w="70" w:type="dxa"/>
-              <w:left w:w="100" w:type="dxa"/>
-              <w:right w:w="100" w:type="dxa"/>
-            </w:tcMar>
-            <w:shd w:fill="0F172A"/>
-          </w:tcPr>
-          <w:p>
-            <w:pPr>
-              <w:spacing w:before="0" w:after="0"/>
-            </w:pPr>
-            <w:r>
-              <w:rPr>
-                <w:rFonts w:ascii="Arial" w:hAnsi="Arial"/>
-                <w:b/>
-                <w:color w:val="FFFFFF"/>
-                <w:sz w:val="18"/>
-              </w:rPr>
-              <w:t>STT</w:t>
-            </w:r>
-          </w:p>
-        </w:tc>
-        <w:tc>
-          <w:tcPr>
-            <w:tcW w:type="dxa" w:w="1704"/>
-            <w:tcMar>
-              <w:top w:w="70" w:type="dxa"/>
-              <w:bottom w:w="70" w:type="dxa"/>
-              <w:left w:w="100" w:type="dxa"/>
-              <w:right w:w="100" w:type="dxa"/>
-            </w:tcMar>
-            <w:shd w:fill="0F172A"/>
-          </w:tcPr>
-          <w:p>
-            <w:pPr>
-              <w:spacing w:before="0" w:after="0"/>
-            </w:pPr>
-            <w:r>
-              <w:rPr>
-                <w:rFonts w:ascii="Arial" w:hAnsi="Arial"/>
-                <w:b/>
-                <w:color w:val="FFFFFF"/>
-                <w:sz w:val="18"/>
-              </w:rPr>
-              <w:t>Hạng mục</w:t>
-            </w:r>
-          </w:p>
-        </w:tc>
-        <w:tc>
-          <w:tcPr>
-            <w:tcW w:type="dxa" w:w="1704"/>
-            <w:tcMar>
-              <w:top w:w="70" w:type="dxa"/>
-              <w:bottom w:w="70" w:type="dxa"/>
-              <w:left w:w="100" w:type="dxa"/>
-              <w:right w:w="100" w:type="dxa"/>
-            </w:tcMar>
-            <w:shd w:fill="0F172A"/>
-          </w:tcPr>
-          <w:p>
-            <w:pPr>
-              <w:spacing w:before="0" w:after="0"/>
-            </w:pPr>
-            <w:r>
-              <w:rPr>
-                <w:rFonts w:ascii="Arial" w:hAnsi="Arial"/>
-                <w:b/>
-                <w:color w:val="FFFFFF"/>
-                <w:sz w:val="18"/>
-              </w:rPr>
-              <w:t>Đơn giá</w:t>
-            </w:r>
-          </w:p>
-        </w:tc>
-        <w:tc>
-          <w:tcPr>
-            <w:tcW w:type="dxa" w:w="1704"/>
-            <w:tcMar>
-              <w:top w:w="70" w:type="dxa"/>
-              <w:bottom w:w="70" w:type="dxa"/>
-              <w:left w:w="100" w:type="dxa"/>
-              <w:right w:w="100" w:type="dxa"/>
-            </w:tcMar>
-            <w:shd w:fill="0F172A"/>
-          </w:tcPr>
-          <w:p>
-            <w:pPr>
-              <w:spacing w:before="0" w:after="0"/>
-            </w:pPr>
-            <w:r>
-              <w:rPr>
-                <w:rFonts w:ascii="Arial" w:hAnsi="Arial"/>
-                <w:b/>
-                <w:color w:val="FFFFFF"/>
-                <w:sz w:val="18"/>
-              </w:rPr>
-              <w:t>SL</w:t>
-            </w:r>
-          </w:p>
-        </w:tc>
-        <w:tc>
-          <w:tcPr>
-            <w:tcW w:type="dxa" w:w="1704"/>
-            <w:tcMar>
-              <w:top w:w="70" w:type="dxa"/>
-              <w:bottom w:w="70" w:type="dxa"/>
-              <w:left w:w="100" w:type="dxa"/>
-              <w:right w:w="100" w:type="dxa"/>
-            </w:tcMar>
-            <w:shd w:fill="0F172A"/>
-          </w:tcPr>
-          <w:p>
-            <w:pPr>
-              <w:spacing w:before="0" w:after="0"/>
-            </w:pPr>
-            <w:r>
-              <w:rPr>
-                <w:rFonts w:ascii="Arial" w:hAnsi="Arial"/>
-                <w:b/>
-                <w:color w:val="FFFFFF"/>
-                <w:sz w:val="18"/>
-              </w:rPr>
-              <w:t>Thành tiền</w:t>
-            </w:r>
-          </w:p>
-        </w:tc>
-        <w:tc>
-          <w:tcPr>
-            <w:tcW w:type="dxa" w:w="1704"/>
-            <w:tcMar>
-              <w:top w:w="70" w:type="dxa"/>
-              <w:bottom w:w="70" w:type="dxa"/>
-              <w:left w:w="100" w:type="dxa"/>
-              <w:right w:w="100" w:type="dxa"/>
-            </w:tcMar>
-            <w:shd w:fill="0F172A"/>
-          </w:tcPr>
-          <w:p>
-            <w:pPr>
-              <w:spacing w:before="0" w:after="0"/>
-            </w:pPr>
-            <w:r>
-              <w:rPr>
-                <w:rFonts w:ascii="Arial" w:hAnsi="Arial"/>
-                <w:b/>
-                <w:color w:val="FFFFFF"/>
-                <w:sz w:val="18"/>
-              </w:rPr>
-              <w:t>Ghi chú</w:t>
-            </w:r>
-          </w:p>
-        </w:tc>
-      </w:tr>
-      <w:tr>
-        <w:tc>
-          <w:tcPr>
-            <w:tcW w:type="dxa" w:w="1704"/>
-            <w:tcMar>
-              <w:top w:w="70" w:type="dxa"/>
-              <w:bottom w:w="70" w:type="dxa"/>
-              <w:left w:w="100" w:type="dxa"/>
-              <w:right w:w="100" w:type="dxa"/>
-            </w:tcMar>
-            <w:shd w:fill="FFFFFF"/>
-          </w:tcPr>
-          <w:p>
-            <w:pPr>
-              <w:spacing w:before="0" w:after="0"/>
-            </w:pPr>
-            <w:r>
-              <w:rPr>
-                <w:rFonts w:ascii="Arial" w:hAnsi="Arial"/>
-                <w:color w:val="1E293B"/>
-                <w:sz w:val="18"/>
-              </w:rPr>
-              <w:t>1</w:t>
-            </w:r>
-          </w:p>
-        </w:tc>
-        <w:tc>
-          <w:tcPr>
-            <w:tcW w:type="dxa" w:w="1704"/>
-            <w:tcMar>
-              <w:top w:w="70" w:type="dxa"/>
-              <w:bottom w:w="70" w:type="dxa"/>
-              <w:left w:w="100" w:type="dxa"/>
-              <w:right w:w="100" w:type="dxa"/>
-            </w:tcMar>
-            <w:shd w:fill="FFFFFF"/>
-          </w:tcPr>
-          <w:p>
-            <w:pPr>
-              <w:spacing w:before="0" w:after="0"/>
-            </w:pPr>
-            <w:r>
-              <w:rPr>
-                <w:rFonts w:ascii="Arial" w:hAnsi="Arial"/>
-                <w:color w:val="1E293B"/>
-                <w:sz w:val="18"/>
-              </w:rPr>
-              <w:t>Tablet Android 10-11 inch</w:t>
-            </w:r>
-          </w:p>
-        </w:tc>
-        <w:tc>
-          <w:tcPr>
-            <w:tcW w:type="dxa" w:w="1704"/>
-            <w:tcMar>
-              <w:top w:w="70" w:type="dxa"/>
-              <w:bottom w:w="70" w:type="dxa"/>
-              <w:left w:w="100" w:type="dxa"/>
-              <w:right w:w="100" w:type="dxa"/>
-            </w:tcMar>
-            <w:shd w:fill="FFFFFF"/>
-          </w:tcPr>
-          <w:p>
-            <w:pPr>
-              <w:spacing w:before="0" w:after="0"/>
-            </w:pPr>
-            <w:r>
-              <w:rPr>
-                <w:rFonts w:ascii="Arial" w:hAnsi="Arial"/>
-                <w:color w:val="1E293B"/>
-                <w:sz w:val="18"/>
-              </w:rPr>
-              <w:t>5.000.000</w:t>
-            </w:r>
-          </w:p>
-        </w:tc>
-        <w:tc>
-          <w:tcPr>
-            <w:tcW w:type="dxa" w:w="1704"/>
-            <w:tcMar>
-              <w:top w:w="70" w:type="dxa"/>
-              <w:bottom w:w="70" w:type="dxa"/>
-              <w:left w:w="100" w:type="dxa"/>
-              <w:right w:w="100" w:type="dxa"/>
-            </w:tcMar>
-            <w:shd w:fill="FFFFFF"/>
-          </w:tcPr>
-          <w:p>
-            <w:pPr>
-              <w:spacing w:before="0" w:after="0"/>
-            </w:pPr>
-            <w:r>
-              <w:rPr>
-                <w:rFonts w:ascii="Arial" w:hAnsi="Arial"/>
-                <w:color w:val="1E293B"/>
-                <w:sz w:val="18"/>
-              </w:rPr>
-              <w:t>3</w:t>
-            </w:r>
-          </w:p>
-        </w:tc>
-        <w:tc>
-          <w:tcPr>
-            <w:tcW w:type="dxa" w:w="1704"/>
-            <w:tcMar>
-              <w:top w:w="70" w:type="dxa"/>
-              <w:bottom w:w="70" w:type="dxa"/>
-              <w:left w:w="100" w:type="dxa"/>
-              <w:right w:w="100" w:type="dxa"/>
-            </w:tcMar>
-            <w:shd w:fill="FFFFFF"/>
-          </w:tcPr>
-          <w:p>
-            <w:pPr>
-              <w:spacing w:before="0" w:after="0"/>
-            </w:pPr>
-            <w:r>
-              <w:rPr>
-                <w:rFonts w:ascii="Arial" w:hAnsi="Arial"/>
-                <w:color w:val="1E293B"/>
-                <w:sz w:val="18"/>
-              </w:rPr>
-              <w:t>15.000.000</w:t>
-            </w:r>
-          </w:p>
-        </w:tc>
-        <w:tc>
-          <w:tcPr>
-            <w:tcW w:type="dxa" w:w="1704"/>
-            <w:tcMar>
-              <w:top w:w="70" w:type="dxa"/>
-              <w:bottom w:w="70" w:type="dxa"/>
-              <w:left w:w="100" w:type="dxa"/>
-              <w:right w:w="100" w:type="dxa"/>
-            </w:tcMar>
-            <w:shd w:fill="FFFFFF"/>
-          </w:tcPr>
-          <w:p>
-            <w:pPr>
-              <w:spacing w:before="0" w:after="0"/>
-            </w:pPr>
-            <w:r>
-              <w:rPr>
-                <w:rFonts w:ascii="Arial" w:hAnsi="Arial"/>
-                <w:color w:val="1E293B"/>
-                <w:sz w:val="18"/>
-              </w:rPr>
-              <w:t>Thay thế TV + Box, NV thao tác cảm ứng</w:t>
-            </w:r>
-          </w:p>
-        </w:tc>
-      </w:tr>
-      <w:tr>
-        <w:tc>
-          <w:tcPr>
-            <w:tcW w:type="dxa" w:w="1704"/>
-            <w:tcMar>
-              <w:top w:w="70" w:type="dxa"/>
-              <w:bottom w:w="70" w:type="dxa"/>
-              <w:left w:w="100" w:type="dxa"/>
-              <w:right w:w="100" w:type="dxa"/>
-            </w:tcMar>
-            <w:shd w:fill="F8FAFC"/>
-          </w:tcPr>
-          <w:p>
-            <w:pPr>
-              <w:spacing w:before="0" w:after="0"/>
-            </w:pPr>
-            <w:r>
-              <w:rPr>
-                <w:rFonts w:ascii="Arial" w:hAnsi="Arial"/>
-                <w:color w:val="1E293B"/>
-                <w:sz w:val="18"/>
-              </w:rPr>
-              <w:t>2</w:t>
-            </w:r>
-          </w:p>
-        </w:tc>
-        <w:tc>
-          <w:tcPr>
-            <w:tcW w:type="dxa" w:w="1704"/>
-            <w:tcMar>
-              <w:top w:w="70" w:type="dxa"/>
-              <w:bottom w:w="70" w:type="dxa"/>
-              <w:left w:w="100" w:type="dxa"/>
-              <w:right w:w="100" w:type="dxa"/>
-            </w:tcMar>
-            <w:shd w:fill="F8FAFC"/>
-          </w:tcPr>
-          <w:p>
-            <w:pPr>
-              <w:spacing w:before="0" w:after="0"/>
-            </w:pPr>
-            <w:r>
-              <w:rPr>
-                <w:rFonts w:ascii="Arial" w:hAnsi="Arial"/>
-                <w:color w:val="1E293B"/>
-                <w:sz w:val="18"/>
-              </w:rPr>
-              <w:t>Giá đỡ Tablet cố định tại quầy</w:t>
-            </w:r>
-          </w:p>
-        </w:tc>
-        <w:tc>
-          <w:tcPr>
-            <w:tcW w:type="dxa" w:w="1704"/>
-            <w:tcMar>
-              <w:top w:w="70" w:type="dxa"/>
-              <w:bottom w:w="70" w:type="dxa"/>
-              <w:left w:w="100" w:type="dxa"/>
-              <w:right w:w="100" w:type="dxa"/>
-            </w:tcMar>
-            <w:shd w:fill="F8FAFC"/>
-          </w:tcPr>
-          <w:p>
-            <w:pPr>
-              <w:spacing w:before="0" w:after="0"/>
-            </w:pPr>
-            <w:r>
-              <w:rPr>
-                <w:rFonts w:ascii="Arial" w:hAnsi="Arial"/>
-                <w:color w:val="1E293B"/>
-                <w:sz w:val="18"/>
-              </w:rPr>
-              <w:t>200.000</w:t>
-            </w:r>
-          </w:p>
-        </w:tc>
-        <w:tc>
-          <w:tcPr>
-            <w:tcW w:type="dxa" w:w="1704"/>
-            <w:tcMar>
-              <w:top w:w="70" w:type="dxa"/>
-              <w:bottom w:w="70" w:type="dxa"/>
-              <w:left w:w="100" w:type="dxa"/>
-              <w:right w:w="100" w:type="dxa"/>
-            </w:tcMar>
-            <w:shd w:fill="F8FAFC"/>
-          </w:tcPr>
-          <w:p>
-            <w:pPr>
-              <w:spacing w:before="0" w:after="0"/>
-            </w:pPr>
-            <w:r>
-              <w:rPr>
-                <w:rFonts w:ascii="Arial" w:hAnsi="Arial"/>
-                <w:color w:val="1E293B"/>
-                <w:sz w:val="18"/>
-              </w:rPr>
-              <w:t>3</w:t>
-            </w:r>
-          </w:p>
-        </w:tc>
-        <w:tc>
-          <w:tcPr>
-            <w:tcW w:type="dxa" w:w="1704"/>
-            <w:tcMar>
-              <w:top w:w="70" w:type="dxa"/>
-              <w:bottom w:w="70" w:type="dxa"/>
-              <w:left w:w="100" w:type="dxa"/>
-              <w:right w:w="100" w:type="dxa"/>
-            </w:tcMar>
-            <w:shd w:fill="F8FAFC"/>
-          </w:tcPr>
-          <w:p>
-            <w:pPr>
-              <w:spacing w:before="0" w:after="0"/>
-            </w:pPr>
-            <w:r>
-              <w:rPr>
-                <w:rFonts w:ascii="Arial" w:hAnsi="Arial"/>
-                <w:color w:val="1E293B"/>
-                <w:sz w:val="18"/>
-              </w:rPr>
-              <w:t>600.000</w:t>
-            </w:r>
-          </w:p>
-        </w:tc>
-        <w:tc>
-          <w:tcPr>
-            <w:tcW w:type="dxa" w:w="1704"/>
-            <w:tcMar>
-              <w:top w:w="70" w:type="dxa"/>
-              <w:bottom w:w="70" w:type="dxa"/>
-              <w:left w:w="100" w:type="dxa"/>
-              <w:right w:w="100" w:type="dxa"/>
-            </w:tcMar>
-            <w:shd w:fill="F8FAFC"/>
-          </w:tcPr>
-          <w:p>
-            <w:pPr>
-              <w:spacing w:before="0" w:after="0"/>
-            </w:pPr>
-            <w:r>
-              <w:rPr>
-                <w:rFonts w:ascii="Arial" w:hAnsi="Arial"/>
-                <w:color w:val="1E293B"/>
-                <w:sz w:val="18"/>
-              </w:rPr>
-              <w:t>Gắn cố định hoặc đặt đứng</w:t>
-            </w:r>
-          </w:p>
-        </w:tc>
-      </w:tr>
-      <w:tr>
-        <w:tc>
-          <w:tcPr>
-            <w:tcW w:type="dxa" w:w="1704"/>
-            <w:tcMar>
-              <w:top w:w="70" w:type="dxa"/>
-              <w:bottom w:w="70" w:type="dxa"/>
-              <w:left w:w="100" w:type="dxa"/>
-              <w:right w:w="100" w:type="dxa"/>
-            </w:tcMar>
-            <w:shd w:fill="FFFFFF"/>
-          </w:tcPr>
-          <w:p>
-            <w:pPr>
-              <w:spacing w:before="0" w:after="0"/>
-            </w:pPr>
-            <w:r>
-              <w:rPr>
-                <w:rFonts w:ascii="Arial" w:hAnsi="Arial"/>
-                <w:color w:val="1E293B"/>
-                <w:sz w:val="18"/>
-              </w:rPr>
-              <w:t>3</w:t>
-            </w:r>
-          </w:p>
-        </w:tc>
-        <w:tc>
-          <w:tcPr>
-            <w:tcW w:type="dxa" w:w="1704"/>
-            <w:tcMar>
-              <w:top w:w="70" w:type="dxa"/>
-              <w:bottom w:w="70" w:type="dxa"/>
-              <w:left w:w="100" w:type="dxa"/>
-              <w:right w:w="100" w:type="dxa"/>
-            </w:tcMar>
-            <w:shd w:fill="FFFFFF"/>
-          </w:tcPr>
-          <w:p>
-            <w:pPr>
-              <w:spacing w:before="0" w:after="0"/>
-            </w:pPr>
-            <w:r>
-              <w:rPr>
-                <w:rFonts w:ascii="Arial" w:hAnsi="Arial"/>
-                <w:color w:val="1E293B"/>
-                <w:sz w:val="18"/>
-              </w:rPr>
-              <w:t>Máy in hóa đơn nhiệt 80mm</w:t>
-            </w:r>
-          </w:p>
-        </w:tc>
-        <w:tc>
-          <w:tcPr>
-            <w:tcW w:type="dxa" w:w="1704"/>
-            <w:tcMar>
-              <w:top w:w="70" w:type="dxa"/>
-              <w:bottom w:w="70" w:type="dxa"/>
-              <w:left w:w="100" w:type="dxa"/>
-              <w:right w:w="100" w:type="dxa"/>
-            </w:tcMar>
-            <w:shd w:fill="FFFFFF"/>
-          </w:tcPr>
-          <w:p>
-            <w:pPr>
-              <w:spacing w:before="0" w:after="0"/>
-            </w:pPr>
-            <w:r>
-              <w:rPr>
-                <w:rFonts w:ascii="Arial" w:hAnsi="Arial"/>
-                <w:color w:val="1E293B"/>
-                <w:sz w:val="18"/>
-              </w:rPr>
-              <w:t>2.000.000</w:t>
-            </w:r>
-          </w:p>
-        </w:tc>
-        <w:tc>
-          <w:tcPr>
-            <w:tcW w:type="dxa" w:w="1704"/>
-            <w:tcMar>
-              <w:top w:w="70" w:type="dxa"/>
-              <w:bottom w:w="70" w:type="dxa"/>
-              <w:left w:w="100" w:type="dxa"/>
-              <w:right w:w="100" w:type="dxa"/>
-            </w:tcMar>
-            <w:shd w:fill="FFFFFF"/>
-          </w:tcPr>
-          <w:p>
-            <w:pPr>
-              <w:spacing w:before="0" w:after="0"/>
-            </w:pPr>
-            <w:r>
-              <w:rPr>
-                <w:rFonts w:ascii="Arial" w:hAnsi="Arial"/>
-                <w:color w:val="1E293B"/>
-                <w:sz w:val="18"/>
-              </w:rPr>
-              <w:t>3</w:t>
-            </w:r>
-          </w:p>
-        </w:tc>
-        <w:tc>
-          <w:tcPr>
-            <w:tcW w:type="dxa" w:w="1704"/>
-            <w:tcMar>
-              <w:top w:w="70" w:type="dxa"/>
-              <w:bottom w:w="70" w:type="dxa"/>
-              <w:left w:w="100" w:type="dxa"/>
-              <w:right w:w="100" w:type="dxa"/>
-            </w:tcMar>
-            <w:shd w:fill="FFFFFF"/>
-          </w:tcPr>
-          <w:p>
-            <w:pPr>
-              <w:spacing w:before="0" w:after="0"/>
-            </w:pPr>
-            <w:r>
-              <w:rPr>
-                <w:rFonts w:ascii="Arial" w:hAnsi="Arial"/>
-                <w:color w:val="1E293B"/>
-                <w:sz w:val="18"/>
-              </w:rPr>
-              <w:t>6.000.000</w:t>
-            </w:r>
-          </w:p>
-        </w:tc>
-        <w:tc>
-          <w:tcPr>
-            <w:tcW w:type="dxa" w:w="1704"/>
-            <w:tcMar>
-              <w:top w:w="70" w:type="dxa"/>
-              <w:bottom w:w="70" w:type="dxa"/>
-              <w:left w:w="100" w:type="dxa"/>
-              <w:right w:w="100" w:type="dxa"/>
-            </w:tcMar>
-            <w:shd w:fill="FFFFFF"/>
-          </w:tcPr>
-          <w:p>
-            <w:pPr>
-              <w:spacing w:before="0" w:after="0"/>
-            </w:pPr>
-            <w:r>
-              <w:rPr>
-                <w:rFonts w:ascii="Arial" w:hAnsi="Arial"/>
-                <w:color w:val="1E293B"/>
-                <w:sz w:val="18"/>
-              </w:rPr>
-              <w:t>Dùng lại máy in cũ nếu có: 0 đ</w:t>
-            </w:r>
-          </w:p>
-        </w:tc>
-      </w:tr>
-      <w:tr>
-        <w:tc>
-          <w:tcPr>
-            <w:tcW w:type="dxa" w:w="1704"/>
-            <w:tcMar>
-              <w:top w:w="70" w:type="dxa"/>
-              <w:bottom w:w="70" w:type="dxa"/>
-              <w:left w:w="100" w:type="dxa"/>
-              <w:right w:w="100" w:type="dxa"/>
-            </w:tcMar>
-            <w:shd w:fill="F8FAFC"/>
-          </w:tcPr>
-          <w:p>
-            <w:pPr>
-              <w:spacing w:before="0" w:after="0"/>
-            </w:pPr>
-            <w:r>
-              <w:rPr>
-                <w:rFonts w:ascii="Arial" w:hAnsi="Arial"/>
-                <w:color w:val="1E293B"/>
-                <w:sz w:val="18"/>
-              </w:rPr>
-              <w:t>4</w:t>
-            </w:r>
-          </w:p>
-        </w:tc>
-        <w:tc>
-          <w:tcPr>
-            <w:tcW w:type="dxa" w:w="1704"/>
-            <w:tcMar>
-              <w:top w:w="70" w:type="dxa"/>
-              <w:bottom w:w="70" w:type="dxa"/>
-              <w:left w:w="100" w:type="dxa"/>
-              <w:right w:w="100" w:type="dxa"/>
-            </w:tcMar>
-            <w:shd w:fill="F8FAFC"/>
-          </w:tcPr>
-          <w:p>
-            <w:pPr>
-              <w:spacing w:before="0" w:after="0"/>
-            </w:pPr>
-            <w:r>
-              <w:rPr>
-                <w:rFonts w:ascii="Arial" w:hAnsi="Arial"/>
-                <w:color w:val="1E293B"/>
-                <w:sz w:val="18"/>
-              </w:rPr>
-              <w:t>Bảng QR Code Acrylic để bàn</w:t>
-            </w:r>
-          </w:p>
-        </w:tc>
-        <w:tc>
-          <w:tcPr>
-            <w:tcW w:type="dxa" w:w="1704"/>
-            <w:tcMar>
-              <w:top w:w="70" w:type="dxa"/>
-              <w:bottom w:w="70" w:type="dxa"/>
-              <w:left w:w="100" w:type="dxa"/>
-              <w:right w:w="100" w:type="dxa"/>
-            </w:tcMar>
-            <w:shd w:fill="F8FAFC"/>
-          </w:tcPr>
-          <w:p>
-            <w:pPr>
-              <w:spacing w:before="0" w:after="0"/>
-            </w:pPr>
-            <w:r>
-              <w:rPr>
-                <w:rFonts w:ascii="Arial" w:hAnsi="Arial"/>
-                <w:color w:val="1E293B"/>
-                <w:sz w:val="18"/>
-              </w:rPr>
-              <w:t>30.000</w:t>
-            </w:r>
-          </w:p>
-        </w:tc>
-        <w:tc>
-          <w:tcPr>
-            <w:tcW w:type="dxa" w:w="1704"/>
-            <w:tcMar>
-              <w:top w:w="70" w:type="dxa"/>
-              <w:bottom w:w="70" w:type="dxa"/>
-              <w:left w:w="100" w:type="dxa"/>
-              <w:right w:w="100" w:type="dxa"/>
-            </w:tcMar>
-            <w:shd w:fill="F8FAFC"/>
-          </w:tcPr>
-          <w:p>
-            <w:pPr>
-              <w:spacing w:before="0" w:after="0"/>
-            </w:pPr>
-            <w:r>
-              <w:rPr>
-                <w:rFonts w:ascii="Arial" w:hAnsi="Arial"/>
-                <w:color w:val="1E293B"/>
-                <w:sz w:val="18"/>
-              </w:rPr>
-              <w:t>60</w:t>
-            </w:r>
-          </w:p>
-        </w:tc>
-        <w:tc>
-          <w:tcPr>
-            <w:tcW w:type="dxa" w:w="1704"/>
-            <w:tcMar>
-              <w:top w:w="70" w:type="dxa"/>
-              <w:bottom w:w="70" w:type="dxa"/>
-              <w:left w:w="100" w:type="dxa"/>
-              <w:right w:w="100" w:type="dxa"/>
-            </w:tcMar>
-            <w:shd w:fill="F8FAFC"/>
-          </w:tcPr>
-          <w:p>
-            <w:pPr>
-              <w:spacing w:before="0" w:after="0"/>
-            </w:pPr>
-            <w:r>
-              <w:rPr>
-                <w:rFonts w:ascii="Arial" w:hAnsi="Arial"/>
-                <w:color w:val="1E293B"/>
-                <w:sz w:val="18"/>
-              </w:rPr>
-              <w:t>1.800.000</w:t>
-            </w:r>
-          </w:p>
-        </w:tc>
-        <w:tc>
-          <w:tcPr>
-            <w:tcW w:type="dxa" w:w="1704"/>
-            <w:tcMar>
-              <w:top w:w="70" w:type="dxa"/>
-              <w:bottom w:w="70" w:type="dxa"/>
-              <w:left w:w="100" w:type="dxa"/>
-              <w:right w:w="100" w:type="dxa"/>
-            </w:tcMar>
-            <w:shd w:fill="F8FAFC"/>
-          </w:tcPr>
-          <w:p>
-            <w:pPr>
-              <w:spacing w:before="0" w:after="0"/>
-            </w:pPr>
-            <w:r>
-              <w:rPr>
-                <w:rFonts w:ascii="Arial" w:hAnsi="Arial"/>
-                <w:color w:val="1E293B"/>
-                <w:sz w:val="18"/>
-              </w:rPr>
-              <w:t>20 bàn mỗi chi nhánh</w:t>
-            </w:r>
-          </w:p>
-        </w:tc>
-      </w:tr>
-      <w:tr>
-        <w:tc>
-          <w:tcPr>
-            <w:tcW w:type="dxa" w:w="1704"/>
-            <w:tcMar>
-              <w:top w:w="70" w:type="dxa"/>
-              <w:bottom w:w="70" w:type="dxa"/>
-              <w:left w:w="100" w:type="dxa"/>
-              <w:right w:w="100" w:type="dxa"/>
-            </w:tcMar>
-            <w:shd w:fill="FFFFFF"/>
-          </w:tcPr>
-          <w:p>
-            <w:pPr>
-              <w:spacing w:before="0" w:after="0"/>
-            </w:pPr>
-            <w:r>
-              <w:rPr>
-                <w:rFonts w:ascii="Arial" w:hAnsi="Arial"/>
-                <w:color w:val="1E293B"/>
-                <w:sz w:val="18"/>
-              </w:rPr>
-              <w:t>5</w:t>
-            </w:r>
-          </w:p>
-        </w:tc>
-        <w:tc>
-          <w:tcPr>
-            <w:tcW w:type="dxa" w:w="1704"/>
-            <w:tcMar>
-              <w:top w:w="70" w:type="dxa"/>
-              <w:bottom w:w="70" w:type="dxa"/>
-              <w:left w:w="100" w:type="dxa"/>
-              <w:right w:w="100" w:type="dxa"/>
-            </w:tcMar>
-            <w:shd w:fill="FFFFFF"/>
-          </w:tcPr>
-          <w:p>
-            <w:pPr>
-              <w:spacing w:before="0" w:after="0"/>
-            </w:pPr>
-            <w:r>
-              <w:rPr>
-                <w:rFonts w:ascii="Arial" w:hAnsi="Arial"/>
-                <w:color w:val="1E293B"/>
-                <w:sz w:val="18"/>
-              </w:rPr>
-              <w:t>Lắp đặt, cấu hình &amp; chạy thử</w:t>
-            </w:r>
-          </w:p>
-        </w:tc>
-        <w:tc>
-          <w:tcPr>
-            <w:tcW w:type="dxa" w:w="1704"/>
-            <w:tcMar>
-              <w:top w:w="70" w:type="dxa"/>
-              <w:bottom w:w="70" w:type="dxa"/>
-              <w:left w:w="100" w:type="dxa"/>
-              <w:right w:w="100" w:type="dxa"/>
-            </w:tcMar>
-            <w:shd w:fill="FFFFFF"/>
-          </w:tcPr>
-          <w:p>
-            <w:pPr>
-              <w:spacing w:before="0" w:after="0"/>
-            </w:pPr>
-            <w:r>
-              <w:rPr>
-                <w:rFonts w:ascii="Arial" w:hAnsi="Arial"/>
-                <w:color w:val="1E293B"/>
-                <w:sz w:val="18"/>
-              </w:rPr>
-              <w:t>1.000.000</w:t>
-            </w:r>
-          </w:p>
-        </w:tc>
-        <w:tc>
-          <w:tcPr>
-            <w:tcW w:type="dxa" w:w="1704"/>
-            <w:tcMar>
-              <w:top w:w="70" w:type="dxa"/>
-              <w:bottom w:w="70" w:type="dxa"/>
-              <w:left w:w="100" w:type="dxa"/>
-              <w:right w:w="100" w:type="dxa"/>
-            </w:tcMar>
-            <w:shd w:fill="FFFFFF"/>
-          </w:tcPr>
-          <w:p>
-            <w:pPr>
-              <w:spacing w:before="0" w:after="0"/>
-            </w:pPr>
-            <w:r>
-              <w:rPr>
-                <w:rFonts w:ascii="Arial" w:hAnsi="Arial"/>
-                <w:color w:val="1E293B"/>
-                <w:sz w:val="18"/>
-              </w:rPr>
-              <w:t>3</w:t>
-            </w:r>
-          </w:p>
-        </w:tc>
-        <w:tc>
-          <w:tcPr>
-            <w:tcW w:type="dxa" w:w="1704"/>
-            <w:tcMar>
-              <w:top w:w="70" w:type="dxa"/>
-              <w:bottom w:w="70" w:type="dxa"/>
-              <w:left w:w="100" w:type="dxa"/>
-              <w:right w:w="100" w:type="dxa"/>
-            </w:tcMar>
-            <w:shd w:fill="FFFFFF"/>
-          </w:tcPr>
-          <w:p>
-            <w:pPr>
-              <w:spacing w:before="0" w:after="0"/>
-            </w:pPr>
-            <w:r>
-              <w:rPr>
-                <w:rFonts w:ascii="Arial" w:hAnsi="Arial"/>
-                <w:color w:val="1E293B"/>
-                <w:sz w:val="18"/>
-              </w:rPr>
-              <w:t>3.000.000</w:t>
-            </w:r>
-          </w:p>
-        </w:tc>
-        <w:tc>
-          <w:tcPr>
-            <w:tcW w:type="dxa" w:w="1704"/>
-            <w:tcMar>
-              <w:top w:w="70" w:type="dxa"/>
-              <w:bottom w:w="70" w:type="dxa"/>
-              <w:left w:w="100" w:type="dxa"/>
-              <w:right w:w="100" w:type="dxa"/>
-            </w:tcMar>
-            <w:shd w:fill="FFFFFF"/>
-          </w:tcPr>
-          <w:p>
-            <w:pPr>
-              <w:spacing w:before="0" w:after="0"/>
-            </w:pPr>
-            <w:r>
-              <w:rPr>
-                <w:rFonts w:ascii="Arial" w:hAnsi="Arial"/>
-                <w:color w:val="1E293B"/>
-                <w:sz w:val="18"/>
-              </w:rPr>
-              <w:t>Trọn gói 3 chi nhánh</w:t>
-            </w:r>
-          </w:p>
-        </w:tc>
-      </w:tr>
-      <w:tr>
-        <w:tc>
-          <w:tcPr>
-            <w:tcW w:type="dxa" w:w="1704"/>
-            <w:tcMar>
-              <w:top w:w="70" w:type="dxa"/>
-              <w:bottom w:w="70" w:type="dxa"/>
-              <w:left w:w="100" w:type="dxa"/>
-              <w:right w:w="100" w:type="dxa"/>
-            </w:tcMar>
-            <w:shd w:fill="F8FAFC"/>
-          </w:tcPr>
-          <w:p>
-            <w:pPr>
-              <w:spacing w:before="0" w:after="0"/>
-            </w:pPr>
-          </w:p>
-        </w:tc>
-        <w:tc>
-          <w:tcPr>
-            <w:tcW w:type="dxa" w:w="1704"/>
-            <w:tcMar>
-              <w:top w:w="70" w:type="dxa"/>
-              <w:bottom w:w="70" w:type="dxa"/>
-              <w:left w:w="100" w:type="dxa"/>
-              <w:right w:w="100" w:type="dxa"/>
-            </w:tcMar>
-            <w:shd w:fill="F8FAFC"/>
-          </w:tcPr>
-          <w:p>
-            <w:pPr>
-              <w:spacing w:before="0" w:after="0"/>
-            </w:pPr>
-          </w:p>
-        </w:tc>
-        <w:tc>
-          <w:tcPr>
-            <w:tcW w:type="dxa" w:w="1704"/>
-            <w:tcMar>
-              <w:top w:w="70" w:type="dxa"/>
-              <w:bottom w:w="70" w:type="dxa"/>
-              <w:left w:w="100" w:type="dxa"/>
-              <w:right w:w="100" w:type="dxa"/>
-            </w:tcMar>
-            <w:shd w:fill="F8FAFC"/>
-          </w:tcPr>
-          <w:p>
-            <w:pPr>
-              <w:spacing w:before="0" w:after="0"/>
-            </w:pPr>
-          </w:p>
-        </w:tc>
-        <w:tc>
-          <w:tcPr>
-            <w:tcW w:type="dxa" w:w="1704"/>
-            <w:tcMar>
-              <w:top w:w="70" w:type="dxa"/>
-              <w:bottom w:w="70" w:type="dxa"/>
-              <w:left w:w="100" w:type="dxa"/>
-              <w:right w:w="100" w:type="dxa"/>
-            </w:tcMar>
-            <w:shd w:fill="F8FAFC"/>
-          </w:tcPr>
-          <w:p>
-            <w:pPr>
-              <w:spacing w:before="0" w:after="0"/>
-            </w:pPr>
-          </w:p>
-        </w:tc>
-        <w:tc>
-          <w:tcPr>
-            <w:tcW w:type="dxa" w:w="1704"/>
-            <w:tcMar>
-              <w:top w:w="70" w:type="dxa"/>
-              <w:bottom w:w="70" w:type="dxa"/>
-              <w:left w:w="100" w:type="dxa"/>
-              <w:right w:w="100" w:type="dxa"/>
-            </w:tcMar>
-            <w:shd w:fill="F8FAFC"/>
-          </w:tcPr>
-          <w:p>
-            <w:pPr>
-              <w:spacing w:before="0" w:after="0"/>
-            </w:pPr>
-          </w:p>
-        </w:tc>
-        <w:tc>
-          <w:tcPr>
-            <w:tcW w:type="dxa" w:w="1704"/>
-            <w:tcMar>
-              <w:top w:w="70" w:type="dxa"/>
-              <w:bottom w:w="70" w:type="dxa"/>
-              <w:left w:w="100" w:type="dxa"/>
-              <w:right w:w="100" w:type="dxa"/>
-            </w:tcMar>
-            <w:shd w:fill="F8FAFC"/>
-          </w:tcPr>
-          <w:p>
-            <w:pPr>
-              <w:spacing w:before="0" w:after="0"/>
-            </w:pPr>
-          </w:p>
-        </w:tc>
-      </w:tr>
-      <w:tr>
-        <w:tc>
-          <w:tcPr>
-            <w:tcW w:type="dxa" w:w="1704"/>
-            <w:tcMar>
-              <w:top w:w="70" w:type="dxa"/>
-              <w:bottom w:w="70" w:type="dxa"/>
-              <w:left w:w="100" w:type="dxa"/>
-              <w:right w:w="100" w:type="dxa"/>
-            </w:tcMar>
-            <w:shd w:fill="FFFFFF"/>
-          </w:tcPr>
-          <w:p>
-            <w:pPr>
-              <w:spacing w:before="0" w:after="0"/>
-            </w:pPr>
-          </w:p>
-        </w:tc>
-        <w:tc>
-          <w:tcPr>
-            <w:tcW w:type="dxa" w:w="1704"/>
-            <w:tcMar>
-              <w:top w:w="70" w:type="dxa"/>
-              <w:bottom w:w="70" w:type="dxa"/>
-              <w:left w:w="100" w:type="dxa"/>
-              <w:right w:w="100" w:type="dxa"/>
-            </w:tcMar>
-            <w:shd w:fill="FFFFFF"/>
-          </w:tcPr>
-          <w:p>
-            <w:pPr>
-              <w:spacing w:before="0" w:after="0"/>
-            </w:pPr>
-            <w:r>
-              <w:rPr>
-                <w:rFonts w:ascii="Arial" w:hAnsi="Arial"/>
-                <w:b/>
-                <w:color w:val="1E293B"/>
-                <w:sz w:val="18"/>
-              </w:rPr>
-              <w:t>TỔNG LỰA CHỌN 2</w:t>
-            </w:r>
-          </w:p>
-        </w:tc>
-        <w:tc>
-          <w:tcPr>
-            <w:tcW w:type="dxa" w:w="1704"/>
-            <w:tcMar>
-              <w:top w:w="70" w:type="dxa"/>
-              <w:bottom w:w="70" w:type="dxa"/>
-              <w:left w:w="100" w:type="dxa"/>
-              <w:right w:w="100" w:type="dxa"/>
-            </w:tcMar>
-            <w:shd w:fill="FFFFFF"/>
-          </w:tcPr>
-          <w:p>
-            <w:pPr>
-              <w:spacing w:before="0" w:after="0"/>
-            </w:pPr>
-          </w:p>
-        </w:tc>
-        <w:tc>
-          <w:tcPr>
-            <w:tcW w:type="dxa" w:w="1704"/>
-            <w:tcMar>
-              <w:top w:w="70" w:type="dxa"/>
-              <w:bottom w:w="70" w:type="dxa"/>
-              <w:left w:w="100" w:type="dxa"/>
-              <w:right w:w="100" w:type="dxa"/>
-            </w:tcMar>
-            <w:shd w:fill="FFFFFF"/>
-          </w:tcPr>
-          <w:p>
-            <w:pPr>
-              <w:spacing w:before="0" w:after="0"/>
-            </w:pPr>
-          </w:p>
-        </w:tc>
-        <w:tc>
-          <w:tcPr>
-            <w:tcW w:type="dxa" w:w="1704"/>
-            <w:tcMar>
-              <w:top w:w="70" w:type="dxa"/>
-              <w:bottom w:w="70" w:type="dxa"/>
-              <w:left w:w="100" w:type="dxa"/>
-              <w:right w:w="100" w:type="dxa"/>
-            </w:tcMar>
-            <w:shd w:fill="FFFFFF"/>
-          </w:tcPr>
-          <w:p>
-            <w:pPr>
-              <w:spacing w:before="0" w:after="0"/>
-            </w:pPr>
-            <w:r>
-              <w:rPr>
-                <w:rFonts w:ascii="Arial" w:hAnsi="Arial"/>
-                <w:b/>
-                <w:color w:val="1E293B"/>
-                <w:sz w:val="18"/>
-              </w:rPr>
-              <w:t>26.400.000</w:t>
-            </w:r>
-          </w:p>
-        </w:tc>
-        <w:tc>
-          <w:tcPr>
-            <w:tcW w:type="dxa" w:w="1704"/>
-            <w:tcMar>
-              <w:top w:w="70" w:type="dxa"/>
-              <w:bottom w:w="70" w:type="dxa"/>
-              <w:left w:w="100" w:type="dxa"/>
-              <w:right w:w="100" w:type="dxa"/>
-            </w:tcMar>
-            <w:shd w:fill="FFFFFF"/>
-          </w:tcPr>
-          <w:p>
-            <w:pPr>
-              <w:spacing w:before="0" w:after="0"/>
-            </w:pPr>
-          </w:p>
-        </w:tc>
-      </w:tr>
-      <w:tr>
-        <w:tc>
-          <w:tcPr>
-            <w:tcW w:type="dxa" w:w="1704"/>
-            <w:tcMar>
-              <w:top w:w="70" w:type="dxa"/>
-              <w:bottom w:w="70" w:type="dxa"/>
-              <w:left w:w="100" w:type="dxa"/>
-              <w:right w:w="100" w:type="dxa"/>
-            </w:tcMar>
-            <w:shd w:fill="F8FAFC"/>
-          </w:tcPr>
-          <w:p>
-            <w:pPr>
-              <w:spacing w:before="0" w:after="0"/>
-            </w:pPr>
-          </w:p>
-        </w:tc>
-        <w:tc>
-          <w:tcPr>
-            <w:tcW w:type="dxa" w:w="1704"/>
-            <w:tcMar>
-              <w:top w:w="70" w:type="dxa"/>
-              <w:bottom w:w="70" w:type="dxa"/>
-              <w:left w:w="100" w:type="dxa"/>
-              <w:right w:w="100" w:type="dxa"/>
-            </w:tcMar>
-            <w:shd w:fill="F8FAFC"/>
-          </w:tcPr>
-          <w:p>
-            <w:pPr>
-              <w:spacing w:before="0" w:after="0"/>
-            </w:pPr>
-            <w:r>
-              <w:rPr>
-                <w:rFonts w:ascii="Arial" w:hAnsi="Arial"/>
-                <w:b/>
-                <w:i/>
-                <w:color w:val="1E293B"/>
-                <w:sz w:val="18"/>
-              </w:rPr>
-              <w:t>Nếu dùng lại máy in cũ</w:t>
-            </w:r>
-          </w:p>
-        </w:tc>
-        <w:tc>
-          <w:tcPr>
-            <w:tcW w:type="dxa" w:w="1704"/>
-            <w:tcMar>
-              <w:top w:w="70" w:type="dxa"/>
-              <w:bottom w:w="70" w:type="dxa"/>
-              <w:left w:w="100" w:type="dxa"/>
-              <w:right w:w="100" w:type="dxa"/>
-            </w:tcMar>
-            <w:shd w:fill="F8FAFC"/>
-          </w:tcPr>
-          <w:p>
-            <w:pPr>
-              <w:spacing w:before="0" w:after="0"/>
-            </w:pPr>
-          </w:p>
-        </w:tc>
-        <w:tc>
-          <w:tcPr>
-            <w:tcW w:type="dxa" w:w="1704"/>
-            <w:tcMar>
-              <w:top w:w="70" w:type="dxa"/>
-              <w:bottom w:w="70" w:type="dxa"/>
-              <w:left w:w="100" w:type="dxa"/>
-              <w:right w:w="100" w:type="dxa"/>
-            </w:tcMar>
-            <w:shd w:fill="F8FAFC"/>
-          </w:tcPr>
-          <w:p>
-            <w:pPr>
-              <w:spacing w:before="0" w:after="0"/>
-            </w:pPr>
-          </w:p>
-        </w:tc>
-        <w:tc>
-          <w:tcPr>
-            <w:tcW w:type="dxa" w:w="1704"/>
-            <w:tcMar>
-              <w:top w:w="70" w:type="dxa"/>
-              <w:bottom w:w="70" w:type="dxa"/>
-              <w:left w:w="100" w:type="dxa"/>
-              <w:right w:w="100" w:type="dxa"/>
-            </w:tcMar>
-            <w:shd w:fill="F8FAFC"/>
-          </w:tcPr>
-          <w:p>
-            <w:pPr>
-              <w:spacing w:before="0" w:after="0"/>
-            </w:pPr>
-            <w:r>
-              <w:rPr>
-                <w:rFonts w:ascii="Arial" w:hAnsi="Arial"/>
-                <w:i/>
-                <w:color w:val="1E293B"/>
-                <w:sz w:val="18"/>
-              </w:rPr>
-              <w:t>20.400.000</w:t>
-            </w:r>
-          </w:p>
-        </w:tc>
-        <w:tc>
-          <w:tcPr>
-            <w:tcW w:type="dxa" w:w="1704"/>
-            <w:tcMar>
-              <w:top w:w="70" w:type="dxa"/>
-              <w:bottom w:w="70" w:type="dxa"/>
-              <w:left w:w="100" w:type="dxa"/>
-              <w:right w:w="100" w:type="dxa"/>
-            </w:tcMar>
-            <w:shd w:fill="F8FAFC"/>
-          </w:tcPr>
-          <w:p>
-            <w:pPr>
-              <w:spacing w:before="0" w:after="0"/>
-            </w:pPr>
-            <w:r>
-              <w:rPr>
-                <w:rFonts w:ascii="Arial" w:hAnsi="Arial"/>
-                <w:i/>
-                <w:color w:val="1E293B"/>
-                <w:sz w:val="18"/>
-              </w:rPr>
-              <w:t>Tiết kiệm 6 triệu</w:t>
-            </w:r>
-          </w:p>
-        </w:tc>
-      </w:tr>
-    </w:tbl>
-    <w:p>
-      <w:pPr>
-        <w:spacing w:after="40"/>
-      </w:pPr>
     </w:p>
     <w:p>
       <w:pPr>
-        <w:keepNext/>
-        <w:spacing w:before="200" w:after="80"/>
+        <w:spacing w:before="0" w:after="60"/>
+        <w:ind w:left="360"/>
       </w:pPr>
       <w:r>
         <w:rPr>
           <w:rFonts w:ascii="Arial" w:hAnsi="Arial"/>
-          <w:b/>
-          <w:color w:val="2563EB"/>
-          <w:sz w:val="22"/>
+          <w:sz w:val="20"/>
         </w:rPr>
-        <w:t>So sánh 2 lựa chọn thiết bị</w:t>
+        <w:t>Hiển thị đơn hàng real-time từ QR Order của khách.</w:t>
       </w:r>
     </w:p>
-    <w:tbl>
-      <w:tblPr>
-        <w:tblW w:type="auto" w:w="0"/>
-        <w:jc w:val="center"/>
-        <w:tblLook w:firstColumn="1" w:firstRow="1" w:lastColumn="0" w:lastRow="0" w:noHBand="0" w:noVBand="1" w:val="04A0"/>
-        <w:tblBorders>
-          <w:top w:val="single" w:sz="6" w:space="0" w:color="CBD5E1"/>
-          <w:bottom w:val="single" w:sz="6" w:space="0" w:color="CBD5E1"/>
-          <w:left w:val="single" w:sz="6" w:space="0" w:color="CBD5E1"/>
-          <w:right w:val="single" w:sz="6" w:space="0" w:color="CBD5E1"/>
-          <w:insideH w:val="single" w:sz="4" w:space="0" w:color="E2E8F0"/>
-          <w:insideV w:val="single" w:sz="4" w:space="0" w:color="E2E8F0"/>
-        </w:tblBorders>
-      </w:tblPr>
-      <w:tblGrid>
-        <w:gridCol w:w="3408"/>
-        <w:gridCol w:w="3408"/>
-        <w:gridCol w:w="3408"/>
-      </w:tblGrid>
-      <w:tr>
-        <w:tc>
-          <w:tcPr>
-            <w:tcW w:type="dxa" w:w="3408"/>
-            <w:tcMar>
-              <w:top w:w="70" w:type="dxa"/>
-              <w:bottom w:w="70" w:type="dxa"/>
-              <w:left w:w="100" w:type="dxa"/>
-              <w:right w:w="100" w:type="dxa"/>
-            </w:tcMar>
-            <w:shd w:fill="0F172A"/>
-          </w:tcPr>
-          <w:p>
-            <w:pPr>
-              <w:spacing w:before="0" w:after="0"/>
-            </w:pPr>
-            <w:r>
-              <w:rPr>
-                <w:rFonts w:ascii="Arial" w:hAnsi="Arial"/>
-                <w:b/>
-                <w:color w:val="FFFFFF"/>
-                <w:sz w:val="18"/>
-              </w:rPr>
-              <w:t>Tiêu chí</w:t>
-            </w:r>
-          </w:p>
-        </w:tc>
-        <w:tc>
-          <w:tcPr>
-            <w:tcW w:type="dxa" w:w="3408"/>
-            <w:tcMar>
-              <w:top w:w="70" w:type="dxa"/>
-              <w:bottom w:w="70" w:type="dxa"/>
-              <w:left w:w="100" w:type="dxa"/>
-              <w:right w:w="100" w:type="dxa"/>
-            </w:tcMar>
-            <w:shd w:fill="0F172A"/>
-          </w:tcPr>
-          <w:p>
-            <w:pPr>
-              <w:spacing w:before="0" w:after="0"/>
-            </w:pPr>
-            <w:r>
-              <w:rPr>
-                <w:rFonts w:ascii="Arial" w:hAnsi="Arial"/>
-                <w:b/>
-                <w:color w:val="FFFFFF"/>
-                <w:sz w:val="18"/>
-              </w:rPr>
-              <w:t>TV + Android Box</w:t>
-            </w:r>
-          </w:p>
-        </w:tc>
-        <w:tc>
-          <w:tcPr>
-            <w:tcW w:type="dxa" w:w="3408"/>
-            <w:tcMar>
-              <w:top w:w="70" w:type="dxa"/>
-              <w:bottom w:w="70" w:type="dxa"/>
-              <w:left w:w="100" w:type="dxa"/>
-              <w:right w:w="100" w:type="dxa"/>
-            </w:tcMar>
-            <w:shd w:fill="0F172A"/>
-          </w:tcPr>
-          <w:p>
-            <w:pPr>
-              <w:spacing w:before="0" w:after="0"/>
-            </w:pPr>
-            <w:r>
-              <w:rPr>
-                <w:rFonts w:ascii="Arial" w:hAnsi="Arial"/>
-                <w:b/>
-                <w:color w:val="FFFFFF"/>
-                <w:sz w:val="18"/>
-              </w:rPr>
-              <w:t>Tablet cảm ứng</w:t>
-            </w:r>
-          </w:p>
-        </w:tc>
-      </w:tr>
-      <w:tr>
-        <w:tc>
-          <w:tcPr>
-            <w:tcW w:type="dxa" w:w="3408"/>
-            <w:tcMar>
-              <w:top w:w="70" w:type="dxa"/>
-              <w:bottom w:w="70" w:type="dxa"/>
-              <w:left w:w="100" w:type="dxa"/>
-              <w:right w:w="100" w:type="dxa"/>
-            </w:tcMar>
-            <w:shd w:fill="FFFFFF"/>
-          </w:tcPr>
-          <w:p>
-            <w:pPr>
-              <w:spacing w:before="0" w:after="0"/>
-            </w:pPr>
-            <w:r>
-              <w:rPr>
-                <w:rFonts w:ascii="Arial" w:hAnsi="Arial"/>
-                <w:color w:val="1E293B"/>
-                <w:sz w:val="18"/>
-              </w:rPr>
-              <w:t>Chi phí thiết bị (3 quán)</w:t>
-            </w:r>
-          </w:p>
-        </w:tc>
-        <w:tc>
-          <w:tcPr>
-            <w:tcW w:type="dxa" w:w="3408"/>
-            <w:tcMar>
-              <w:top w:w="70" w:type="dxa"/>
-              <w:bottom w:w="70" w:type="dxa"/>
-              <w:left w:w="100" w:type="dxa"/>
-              <w:right w:w="100" w:type="dxa"/>
-            </w:tcMar>
-            <w:shd w:fill="FFFFFF"/>
-          </w:tcPr>
-          <w:p>
-            <w:pPr>
-              <w:spacing w:before="0" w:after="0"/>
-            </w:pPr>
-            <w:r>
-              <w:rPr>
-                <w:rFonts w:ascii="Arial" w:hAnsi="Arial"/>
-                <w:color w:val="1E293B"/>
-                <w:sz w:val="18"/>
-              </w:rPr>
-              <w:t>27.300.000</w:t>
-            </w:r>
-          </w:p>
-        </w:tc>
-        <w:tc>
-          <w:tcPr>
-            <w:tcW w:type="dxa" w:w="3408"/>
-            <w:tcMar>
-              <w:top w:w="70" w:type="dxa"/>
-              <w:bottom w:w="70" w:type="dxa"/>
-              <w:left w:w="100" w:type="dxa"/>
-              <w:right w:w="100" w:type="dxa"/>
-            </w:tcMar>
-            <w:shd w:fill="FFFFFF"/>
-          </w:tcPr>
-          <w:p>
-            <w:pPr>
-              <w:spacing w:before="0" w:after="0"/>
-            </w:pPr>
-            <w:r>
-              <w:rPr>
-                <w:rFonts w:ascii="Arial" w:hAnsi="Arial"/>
-                <w:color w:val="1E293B"/>
-                <w:sz w:val="18"/>
-              </w:rPr>
-              <w:t>26.400.000</w:t>
-            </w:r>
-          </w:p>
-        </w:tc>
-      </w:tr>
-      <w:tr>
-        <w:tc>
-          <w:tcPr>
-            <w:tcW w:type="dxa" w:w="3408"/>
-            <w:tcMar>
-              <w:top w:w="70" w:type="dxa"/>
-              <w:bottom w:w="70" w:type="dxa"/>
-              <w:left w:w="100" w:type="dxa"/>
-              <w:right w:w="100" w:type="dxa"/>
-            </w:tcMar>
-            <w:shd w:fill="F8FAFC"/>
-          </w:tcPr>
-          <w:p>
-            <w:pPr>
-              <w:spacing w:before="0" w:after="0"/>
-            </w:pPr>
-            <w:r>
-              <w:rPr>
-                <w:rFonts w:ascii="Arial" w:hAnsi="Arial"/>
-                <w:color w:val="1E293B"/>
-                <w:sz w:val="18"/>
-              </w:rPr>
-              <w:t>Cảm ứng trực tiếp</w:t>
-            </w:r>
-          </w:p>
-        </w:tc>
-        <w:tc>
-          <w:tcPr>
-            <w:tcW w:type="dxa" w:w="3408"/>
-            <w:tcMar>
-              <w:top w:w="70" w:type="dxa"/>
-              <w:bottom w:w="70" w:type="dxa"/>
-              <w:left w:w="100" w:type="dxa"/>
-              <w:right w:w="100" w:type="dxa"/>
-            </w:tcMar>
-            <w:shd w:fill="F8FAFC"/>
-          </w:tcPr>
-          <w:p>
-            <w:pPr>
-              <w:spacing w:before="0" w:after="0"/>
-            </w:pPr>
-            <w:r>
-              <w:rPr>
-                <w:rFonts w:ascii="Arial" w:hAnsi="Arial"/>
-                <w:color w:val="1E293B"/>
-                <w:sz w:val="18"/>
-              </w:rPr>
-              <w:t>Không — NV dùng ĐT thao tác</w:t>
-            </w:r>
-          </w:p>
-        </w:tc>
-        <w:tc>
-          <w:tcPr>
-            <w:tcW w:type="dxa" w:w="3408"/>
-            <w:tcMar>
-              <w:top w:w="70" w:type="dxa"/>
-              <w:bottom w:w="70" w:type="dxa"/>
-              <w:left w:w="100" w:type="dxa"/>
-              <w:right w:w="100" w:type="dxa"/>
-            </w:tcMar>
-            <w:shd w:fill="F8FAFC"/>
-          </w:tcPr>
-          <w:p>
-            <w:pPr>
-              <w:spacing w:before="0" w:after="0"/>
-            </w:pPr>
-            <w:r>
-              <w:rPr>
-                <w:rFonts w:ascii="Arial" w:hAnsi="Arial"/>
-                <w:color w:val="1E293B"/>
-                <w:sz w:val="18"/>
-              </w:rPr>
-              <w:t>Có — bấm trực tiếp trên màn hình</w:t>
-            </w:r>
-          </w:p>
-        </w:tc>
-      </w:tr>
-      <w:tr>
-        <w:tc>
-          <w:tcPr>
-            <w:tcW w:type="dxa" w:w="3408"/>
-            <w:tcMar>
-              <w:top w:w="70" w:type="dxa"/>
-              <w:bottom w:w="70" w:type="dxa"/>
-              <w:left w:w="100" w:type="dxa"/>
-              <w:right w:w="100" w:type="dxa"/>
-            </w:tcMar>
-            <w:shd w:fill="FFFFFF"/>
-          </w:tcPr>
-          <w:p>
-            <w:pPr>
-              <w:spacing w:before="0" w:after="0"/>
-            </w:pPr>
-            <w:r>
-              <w:rPr>
-                <w:rFonts w:ascii="Arial" w:hAnsi="Arial"/>
-                <w:color w:val="1E293B"/>
-                <w:sz w:val="18"/>
-              </w:rPr>
-              <w:t>Kích thước hiển thị</w:t>
-            </w:r>
-          </w:p>
-        </w:tc>
-        <w:tc>
-          <w:tcPr>
-            <w:tcW w:type="dxa" w:w="3408"/>
-            <w:tcMar>
-              <w:top w:w="70" w:type="dxa"/>
-              <w:bottom w:w="70" w:type="dxa"/>
-              <w:left w:w="100" w:type="dxa"/>
-              <w:right w:w="100" w:type="dxa"/>
-            </w:tcMar>
-            <w:shd w:fill="FFFFFF"/>
-          </w:tcPr>
-          <w:p>
-            <w:pPr>
-              <w:spacing w:before="0" w:after="0"/>
-            </w:pPr>
-            <w:r>
-              <w:rPr>
-                <w:rFonts w:ascii="Arial" w:hAnsi="Arial"/>
-                <w:color w:val="1E293B"/>
-                <w:sz w:val="18"/>
-              </w:rPr>
-              <w:t>32 inch (lớn, nhìn xa rõ)</w:t>
-            </w:r>
-          </w:p>
-        </w:tc>
-        <w:tc>
-          <w:tcPr>
-            <w:tcW w:type="dxa" w:w="3408"/>
-            <w:tcMar>
-              <w:top w:w="70" w:type="dxa"/>
-              <w:bottom w:w="70" w:type="dxa"/>
-              <w:left w:w="100" w:type="dxa"/>
-              <w:right w:w="100" w:type="dxa"/>
-            </w:tcMar>
-            <w:shd w:fill="FFFFFF"/>
-          </w:tcPr>
-          <w:p>
-            <w:pPr>
-              <w:spacing w:before="0" w:after="0"/>
-            </w:pPr>
-            <w:r>
-              <w:rPr>
-                <w:rFonts w:ascii="Arial" w:hAnsi="Arial"/>
-                <w:color w:val="1E293B"/>
-                <w:sz w:val="18"/>
-              </w:rPr>
-              <w:t>10-11 inch (vừa tầm tay)</w:t>
-            </w:r>
-          </w:p>
-        </w:tc>
-      </w:tr>
-      <w:tr>
-        <w:tc>
-          <w:tcPr>
-            <w:tcW w:type="dxa" w:w="3408"/>
-            <w:tcMar>
-              <w:top w:w="70" w:type="dxa"/>
-              <w:bottom w:w="70" w:type="dxa"/>
-              <w:left w:w="100" w:type="dxa"/>
-              <w:right w:w="100" w:type="dxa"/>
-            </w:tcMar>
-            <w:shd w:fill="F8FAFC"/>
-          </w:tcPr>
-          <w:p>
-            <w:pPr>
-              <w:spacing w:before="0" w:after="0"/>
-            </w:pPr>
-            <w:r>
-              <w:rPr>
-                <w:rFonts w:ascii="Arial" w:hAnsi="Arial"/>
-                <w:color w:val="1E293B"/>
-                <w:sz w:val="18"/>
-              </w:rPr>
-              <w:t>Di động</w:t>
-            </w:r>
-          </w:p>
-        </w:tc>
-        <w:tc>
-          <w:tcPr>
-            <w:tcW w:type="dxa" w:w="3408"/>
-            <w:tcMar>
-              <w:top w:w="70" w:type="dxa"/>
-              <w:bottom w:w="70" w:type="dxa"/>
-              <w:left w:w="100" w:type="dxa"/>
-              <w:right w:w="100" w:type="dxa"/>
-            </w:tcMar>
-            <w:shd w:fill="F8FAFC"/>
-          </w:tcPr>
-          <w:p>
-            <w:pPr>
-              <w:spacing w:before="0" w:after="0"/>
-            </w:pPr>
-            <w:r>
-              <w:rPr>
-                <w:rFonts w:ascii="Arial" w:hAnsi="Arial"/>
-                <w:color w:val="1E293B"/>
-                <w:sz w:val="18"/>
-              </w:rPr>
-              <w:t>Không (gắn cố định)</w:t>
-            </w:r>
-          </w:p>
-        </w:tc>
-        <w:tc>
-          <w:tcPr>
-            <w:tcW w:type="dxa" w:w="3408"/>
-            <w:tcMar>
-              <w:top w:w="70" w:type="dxa"/>
-              <w:bottom w:w="70" w:type="dxa"/>
-              <w:left w:w="100" w:type="dxa"/>
-              <w:right w:w="100" w:type="dxa"/>
-            </w:tcMar>
-            <w:shd w:fill="F8FAFC"/>
-          </w:tcPr>
-          <w:p>
-            <w:pPr>
-              <w:spacing w:before="0" w:after="0"/>
-            </w:pPr>
-            <w:r>
-              <w:rPr>
-                <w:rFonts w:ascii="Arial" w:hAnsi="Arial"/>
-                <w:color w:val="1E293B"/>
-                <w:sz w:val="18"/>
-              </w:rPr>
-              <w:t>Có thể cầm theo khi cần</w:t>
-            </w:r>
-          </w:p>
-        </w:tc>
-      </w:tr>
-      <w:tr>
-        <w:tc>
-          <w:tcPr>
-            <w:tcW w:type="dxa" w:w="3408"/>
-            <w:tcMar>
-              <w:top w:w="70" w:type="dxa"/>
-              <w:bottom w:w="70" w:type="dxa"/>
-              <w:left w:w="100" w:type="dxa"/>
-              <w:right w:w="100" w:type="dxa"/>
-            </w:tcMar>
-            <w:shd w:fill="FFFFFF"/>
-          </w:tcPr>
-          <w:p>
-            <w:pPr>
-              <w:spacing w:before="0" w:after="0"/>
-            </w:pPr>
-            <w:r>
-              <w:rPr>
-                <w:rFonts w:ascii="Arial" w:hAnsi="Arial"/>
-                <w:color w:val="1E293B"/>
-                <w:sz w:val="18"/>
-              </w:rPr>
-              <w:t>Số thiết bị cần quản lý</w:t>
-            </w:r>
-          </w:p>
-        </w:tc>
-        <w:tc>
-          <w:tcPr>
-            <w:tcW w:type="dxa" w:w="3408"/>
-            <w:tcMar>
-              <w:top w:w="70" w:type="dxa"/>
-              <w:bottom w:w="70" w:type="dxa"/>
-              <w:left w:w="100" w:type="dxa"/>
-              <w:right w:w="100" w:type="dxa"/>
-            </w:tcMar>
-            <w:shd w:fill="FFFFFF"/>
-          </w:tcPr>
-          <w:p>
-            <w:pPr>
-              <w:spacing w:before="0" w:after="0"/>
-            </w:pPr>
-            <w:r>
-              <w:rPr>
-                <w:rFonts w:ascii="Arial" w:hAnsi="Arial"/>
-                <w:color w:val="1E293B"/>
-                <w:sz w:val="18"/>
-              </w:rPr>
-              <w:t>2 (TV + Box)</w:t>
-            </w:r>
-          </w:p>
-        </w:tc>
-        <w:tc>
-          <w:tcPr>
-            <w:tcW w:type="dxa" w:w="3408"/>
-            <w:tcMar>
-              <w:top w:w="70" w:type="dxa"/>
-              <w:bottom w:w="70" w:type="dxa"/>
-              <w:left w:w="100" w:type="dxa"/>
-              <w:right w:w="100" w:type="dxa"/>
-            </w:tcMar>
-            <w:shd w:fill="FFFFFF"/>
-          </w:tcPr>
-          <w:p>
-            <w:pPr>
-              <w:spacing w:before="0" w:after="0"/>
-            </w:pPr>
-            <w:r>
-              <w:rPr>
-                <w:rFonts w:ascii="Arial" w:hAnsi="Arial"/>
-                <w:color w:val="1E293B"/>
-                <w:sz w:val="18"/>
-              </w:rPr>
-              <w:t>1 (Tablet)</w:t>
-            </w:r>
-          </w:p>
-        </w:tc>
-      </w:tr>
-    </w:tbl>
     <w:p>
       <w:pPr>
-        <w:spacing w:after="40"/>
+        <w:spacing w:before="0" w:after="60"/>
+        <w:ind w:left="360"/>
       </w:pPr>
+      <w:r>
+        <w:rPr>
+          <w:rFonts w:ascii="Arial" w:hAnsi="Arial"/>
+          <w:sz w:val="20"/>
+        </w:rPr>
+        <w:t>Nhân viên bấm cảm ứng: hoàn thành đơn, báo hết món, xem sơ đồ bàn.</w:t>
+      </w:r>
+    </w:p>
+    <w:p>
+      <w:pPr>
+        <w:spacing w:before="0" w:after="60"/>
+        <w:ind w:left="360"/>
+      </w:pPr>
+      <w:r>
+        <w:rPr>
+          <w:rFonts w:ascii="Arial" w:hAnsi="Arial"/>
+          <w:sz w:val="20"/>
+        </w:rPr>
+        <w:t>Hiển thị công thức pha chi tiết kèm mỗi đơn.</w:t>
+      </w:r>
+    </w:p>
+    <w:p>
+      <w:pPr>
+        <w:spacing w:before="0" w:after="60"/>
+        <w:ind w:left="360"/>
+      </w:pPr>
+      <w:r>
+        <w:rPr>
+          <w:rFonts w:ascii="Arial" w:hAnsi="Arial"/>
+          <w:sz w:val="20"/>
+        </w:rPr>
+        <w:t>Tạo đơn thủ công cho khách order tại quầy (Takeaway).</w:t>
+      </w:r>
+    </w:p>
+    <w:p>
+      <w:pPr>
+        <w:spacing w:before="0" w:after="60"/>
+      </w:pPr>
+      <w:r>
+        <w:rPr>
+          <w:rFonts w:ascii="Arial" w:hAnsi="Arial"/>
+          <w:sz w:val="20"/>
+        </w:rPr>
+        <w:t>Mặt khách hàng (10 inch hiển thị):</w:t>
+      </w:r>
+    </w:p>
+    <w:p>
+      <w:pPr>
+        <w:spacing w:before="0" w:after="60"/>
+        <w:ind w:left="360"/>
+      </w:pPr>
+      <w:r>
+        <w:rPr>
+          <w:rFonts w:ascii="Arial" w:hAnsi="Arial"/>
+          <w:sz w:val="20"/>
+        </w:rPr>
+        <w:t>Hiển thị danh sách món đang order, số lượng, đơn giá và tổng tiền.</w:t>
+      </w:r>
+    </w:p>
+    <w:p>
+      <w:pPr>
+        <w:spacing w:before="0" w:after="60"/>
+        <w:ind w:left="360"/>
+      </w:pPr>
+      <w:r>
+        <w:rPr>
+          <w:rFonts w:ascii="Arial" w:hAnsi="Arial"/>
+          <w:sz w:val="20"/>
+        </w:rPr>
+        <w:t>Hiển thị mã VietQR để khách quét thanh toán chuyển khoản.</w:t>
+      </w:r>
+    </w:p>
+    <w:p>
+      <w:pPr>
+        <w:spacing w:before="0" w:after="60"/>
+        <w:ind w:left="360"/>
+      </w:pPr>
+      <w:r>
+        <w:rPr>
+          <w:rFonts w:ascii="Arial" w:hAnsi="Arial"/>
+          <w:sz w:val="20"/>
+        </w:rPr>
+        <w:t>Khách kiểm tra đơn hàng minh bạch trước khi thanh toán.</w:t>
+      </w:r>
     </w:p>
     <w:p>
       <w:pPr>
@@ -4065,7 +2397,7 @@
           <w:color w:val="0F172A"/>
           <w:sz w:val="26"/>
         </w:rPr>
-        <w:t>C. DỊCH VỤ MIỄN PHÍ ĐI KÈM (0 đ — Không phát sinh chi phí)</w:t>
+        <w:t>C. DỊCH VỤ MIỄN PHÍ ĐI KÈM (0 đ)</w:t>
       </w:r>
     </w:p>
     <w:tbl>
@@ -4903,7 +3235,7 @@
                 <w:color w:val="1E293B"/>
                 <w:sz w:val="18"/>
               </w:rPr>
-              <w:t>Backup database, ảnh lên Cloud miễn phí</w:t>
+              <w:t>Backup database lên Cloud miễn phí</w:t>
             </w:r>
           </w:p>
         </w:tc>
@@ -5513,7 +3845,7 @@
                 <w:color w:val="1E293B"/>
                 <w:sz w:val="18"/>
               </w:rPr>
-              <w:t>Thay Tablet hoặc Android Box hỏng</w:t>
+              <w:t>Sửa chữa/thay thế máy POS</w:t>
             </w:r>
           </w:p>
         </w:tc>
@@ -5538,7 +3870,7 @@
                 <w:color w:val="1E293B"/>
                 <w:sz w:val="18"/>
               </w:rPr>
-              <w:t>Sau 2-3 năm sử dụng</w:t>
+              <w:t>Sau 3-5 năm hoặc hư hỏng</w:t>
             </w:r>
           </w:p>
         </w:tc>
@@ -5563,7 +3895,7 @@
                 <w:color w:val="1E293B"/>
                 <w:sz w:val="18"/>
               </w:rPr>
-              <w:t>1.500.000 - 5.000.000/cái</w:t>
+              <w:t>5.000.000 - 9.000.000/máy</w:t>
             </w:r>
           </w:p>
         </w:tc>
@@ -5796,21 +4128,6 @@
         <w:t>E. TỔNG HỢP CHI PHÍ THEO THỜI GIAN</w:t>
       </w:r>
     </w:p>
-    <w:p>
-      <w:pPr>
-        <w:keepNext/>
-        <w:spacing w:before="200" w:after="80"/>
-      </w:pPr>
-      <w:r>
-        <w:rPr>
-          <w:rFonts w:ascii="Arial" w:hAnsi="Arial"/>
-          <w:b/>
-          <w:color w:val="2563EB"/>
-          <w:sz w:val="22"/>
-        </w:rPr>
-        <w:t>Với Lựa chọn 2 — Tablet cảm ứng (Đề xuất)</w:t>
-      </w:r>
-    </w:p>
     <w:tbl>
       <w:tblPr>
         <w:tblW w:type="auto" w:w="0"/>
@@ -5959,7 +4276,7 @@
                 <w:color w:val="1E293B"/>
                 <w:sz w:val="18"/>
               </w:rPr>
-              <w:t>26.400.000</w:t>
+              <w:t>37.890.000</w:t>
             </w:r>
           </w:p>
         </w:tc>
@@ -5984,7 +4301,7 @@
                 <w:color w:val="1E293B"/>
                 <w:sz w:val="18"/>
               </w:rPr>
-              <w:t>Thanh toán 1 lần. Dùng lại máy in cũ: 20.400.000</w:t>
+              <w:t>Thanh toán 1 lần. Dùng lại máy in cũ: 31.890.000</w:t>
             </w:r>
           </w:p>
         </w:tc>
@@ -6117,443 +4434,7 @@
                 <w:color w:val="1E293B"/>
                 <w:sz w:val="18"/>
               </w:rPr>
-              <w:t>~43.300.000</w:t>
-            </w:r>
-          </w:p>
-        </w:tc>
-        <w:tc>
-          <w:tcPr>
-            <w:tcW w:type="dxa" w:w="3408"/>
-            <w:tcMar>
-              <w:top w:w="70" w:type="dxa"/>
-              <w:bottom w:w="70" w:type="dxa"/>
-              <w:left w:w="100" w:type="dxa"/>
-              <w:right w:w="100" w:type="dxa"/>
-            </w:tcMar>
-            <w:shd w:fill="FFFFFF"/>
-          </w:tcPr>
-          <w:p>
-            <w:pPr>
-              <w:spacing w:before="0" w:after="0"/>
-            </w:pPr>
-            <w:r>
-              <w:rPr>
-                <w:rFonts w:ascii="Arial" w:hAnsi="Arial"/>
-                <w:color w:val="1E293B"/>
-                <w:sz w:val="18"/>
-              </w:rPr>
-              <w:t>Thiết bị + 12 tháng vận hành</w:t>
-            </w:r>
-          </w:p>
-        </w:tc>
-      </w:tr>
-      <w:tr>
-        <w:tc>
-          <w:tcPr>
-            <w:tcW w:type="dxa" w:w="3408"/>
-            <w:tcMar>
-              <w:top w:w="70" w:type="dxa"/>
-              <w:bottom w:w="70" w:type="dxa"/>
-              <w:left w:w="100" w:type="dxa"/>
-              <w:right w:w="100" w:type="dxa"/>
-            </w:tcMar>
-            <w:shd w:fill="F8FAFC"/>
-          </w:tcPr>
-          <w:p>
-            <w:pPr>
-              <w:spacing w:before="0" w:after="0"/>
-            </w:pPr>
-            <w:r>
-              <w:rPr>
-                <w:rFonts w:ascii="Arial" w:hAnsi="Arial"/>
-                <w:b/>
-                <w:color w:val="1E293B"/>
-                <w:sz w:val="18"/>
-              </w:rPr>
-              <w:t>Từ năm thứ 2</w:t>
-            </w:r>
-          </w:p>
-        </w:tc>
-        <w:tc>
-          <w:tcPr>
-            <w:tcW w:type="dxa" w:w="3408"/>
-            <w:tcMar>
-              <w:top w:w="70" w:type="dxa"/>
-              <w:bottom w:w="70" w:type="dxa"/>
-              <w:left w:w="100" w:type="dxa"/>
-              <w:right w:w="100" w:type="dxa"/>
-            </w:tcMar>
-            <w:shd w:fill="F8FAFC"/>
-          </w:tcPr>
-          <w:p>
-            <w:pPr>
-              <w:spacing w:before="0" w:after="0"/>
-            </w:pPr>
-            <w:r>
-              <w:rPr>
-                <w:rFonts w:ascii="Arial" w:hAnsi="Arial"/>
-                <w:b/>
-                <w:color w:val="1E293B"/>
-                <w:sz w:val="18"/>
-              </w:rPr>
-              <w:t>~16.900.000/năm</w:t>
-            </w:r>
-          </w:p>
-        </w:tc>
-        <w:tc>
-          <w:tcPr>
-            <w:tcW w:type="dxa" w:w="3408"/>
-            <w:tcMar>
-              <w:top w:w="70" w:type="dxa"/>
-              <w:bottom w:w="70" w:type="dxa"/>
-              <w:left w:w="100" w:type="dxa"/>
-              <w:right w:w="100" w:type="dxa"/>
-            </w:tcMar>
-            <w:shd w:fill="F8FAFC"/>
-          </w:tcPr>
-          <w:p>
-            <w:pPr>
-              <w:spacing w:before="0" w:after="0"/>
-            </w:pPr>
-            <w:r>
-              <w:rPr>
-                <w:rFonts w:ascii="Arial" w:hAnsi="Arial"/>
-                <w:color w:val="1E293B"/>
-                <w:sz w:val="18"/>
-              </w:rPr>
-              <w:t>Chỉ còn chi phí vận hành hàng tháng</w:t>
-            </w:r>
-          </w:p>
-        </w:tc>
-      </w:tr>
-    </w:tbl>
-    <w:p>
-      <w:pPr>
-        <w:spacing w:after="40"/>
-      </w:pPr>
-    </w:p>
-    <w:p>
-      <w:pPr>
-        <w:keepNext/>
-        <w:spacing w:before="200" w:after="80"/>
-      </w:pPr>
-      <w:r>
-        <w:rPr>
-          <w:rFonts w:ascii="Arial" w:hAnsi="Arial"/>
-          <w:b/>
-          <w:color w:val="2563EB"/>
-          <w:sz w:val="22"/>
-        </w:rPr>
-        <w:t>Với Lựa chọn 1 — TV + Android Box</w:t>
-      </w:r>
-    </w:p>
-    <w:tbl>
-      <w:tblPr>
-        <w:tblW w:type="auto" w:w="0"/>
-        <w:jc w:val="center"/>
-        <w:tblLook w:firstColumn="1" w:firstRow="1" w:lastColumn="0" w:lastRow="0" w:noHBand="0" w:noVBand="1" w:val="04A0"/>
-        <w:tblBorders>
-          <w:top w:val="single" w:sz="6" w:space="0" w:color="CBD5E1"/>
-          <w:bottom w:val="single" w:sz="6" w:space="0" w:color="CBD5E1"/>
-          <w:left w:val="single" w:sz="6" w:space="0" w:color="CBD5E1"/>
-          <w:right w:val="single" w:sz="6" w:space="0" w:color="CBD5E1"/>
-          <w:insideH w:val="single" w:sz="4" w:space="0" w:color="E2E8F0"/>
-          <w:insideV w:val="single" w:sz="4" w:space="0" w:color="E2E8F0"/>
-        </w:tblBorders>
-      </w:tblPr>
-      <w:tblGrid>
-        <w:gridCol w:w="3408"/>
-        <w:gridCol w:w="3408"/>
-        <w:gridCol w:w="3408"/>
-      </w:tblGrid>
-      <w:tr>
-        <w:tc>
-          <w:tcPr>
-            <w:tcW w:type="dxa" w:w="3408"/>
-            <w:tcMar>
-              <w:top w:w="70" w:type="dxa"/>
-              <w:bottom w:w="70" w:type="dxa"/>
-              <w:left w:w="100" w:type="dxa"/>
-              <w:right w:w="100" w:type="dxa"/>
-            </w:tcMar>
-            <w:shd w:fill="0F172A"/>
-          </w:tcPr>
-          <w:p>
-            <w:pPr>
-              <w:spacing w:before="0" w:after="0"/>
-            </w:pPr>
-            <w:r>
-              <w:rPr>
-                <w:rFonts w:ascii="Arial" w:hAnsi="Arial"/>
-                <w:b/>
-                <w:color w:val="FFFFFF"/>
-                <w:sz w:val="18"/>
-              </w:rPr>
-              <w:t>Mốc thời gian</w:t>
-            </w:r>
-          </w:p>
-        </w:tc>
-        <w:tc>
-          <w:tcPr>
-            <w:tcW w:type="dxa" w:w="3408"/>
-            <w:tcMar>
-              <w:top w:w="70" w:type="dxa"/>
-              <w:bottom w:w="70" w:type="dxa"/>
-              <w:left w:w="100" w:type="dxa"/>
-              <w:right w:w="100" w:type="dxa"/>
-            </w:tcMar>
-            <w:shd w:fill="0F172A"/>
-          </w:tcPr>
-          <w:p>
-            <w:pPr>
-              <w:spacing w:before="0" w:after="0"/>
-            </w:pPr>
-            <w:r>
-              <w:rPr>
-                <w:rFonts w:ascii="Arial" w:hAnsi="Arial"/>
-                <w:b/>
-                <w:color w:val="FFFFFF"/>
-                <w:sz w:val="18"/>
-              </w:rPr>
-              <w:t>Chi phí</w:t>
-            </w:r>
-          </w:p>
-        </w:tc>
-        <w:tc>
-          <w:tcPr>
-            <w:tcW w:type="dxa" w:w="3408"/>
-            <w:tcMar>
-              <w:top w:w="70" w:type="dxa"/>
-              <w:bottom w:w="70" w:type="dxa"/>
-              <w:left w:w="100" w:type="dxa"/>
-              <w:right w:w="100" w:type="dxa"/>
-            </w:tcMar>
-            <w:shd w:fill="0F172A"/>
-          </w:tcPr>
-          <w:p>
-            <w:pPr>
-              <w:spacing w:before="0" w:after="0"/>
-            </w:pPr>
-            <w:r>
-              <w:rPr>
-                <w:rFonts w:ascii="Arial" w:hAnsi="Arial"/>
-                <w:b/>
-                <w:color w:val="FFFFFF"/>
-                <w:sz w:val="18"/>
-              </w:rPr>
-              <w:t>Ghi chú</w:t>
-            </w:r>
-          </w:p>
-        </w:tc>
-      </w:tr>
-      <w:tr>
-        <w:tc>
-          <w:tcPr>
-            <w:tcW w:type="dxa" w:w="3408"/>
-            <w:tcMar>
-              <w:top w:w="70" w:type="dxa"/>
-              <w:bottom w:w="70" w:type="dxa"/>
-              <w:left w:w="100" w:type="dxa"/>
-              <w:right w:w="100" w:type="dxa"/>
-            </w:tcMar>
-            <w:shd w:fill="FFFFFF"/>
-          </w:tcPr>
-          <w:p>
-            <w:pPr>
-              <w:spacing w:before="0" w:after="0"/>
-            </w:pPr>
-            <w:r>
-              <w:rPr>
-                <w:rFonts w:ascii="Arial" w:hAnsi="Arial"/>
-                <w:b/>
-                <w:color w:val="1E293B"/>
-                <w:sz w:val="18"/>
-              </w:rPr>
-              <w:t>Ban đầu (thiết bị)</w:t>
-            </w:r>
-          </w:p>
-        </w:tc>
-        <w:tc>
-          <w:tcPr>
-            <w:tcW w:type="dxa" w:w="3408"/>
-            <w:tcMar>
-              <w:top w:w="70" w:type="dxa"/>
-              <w:bottom w:w="70" w:type="dxa"/>
-              <w:left w:w="100" w:type="dxa"/>
-              <w:right w:w="100" w:type="dxa"/>
-            </w:tcMar>
-            <w:shd w:fill="FFFFFF"/>
-          </w:tcPr>
-          <w:p>
-            <w:pPr>
-              <w:spacing w:before="0" w:after="0"/>
-            </w:pPr>
-            <w:r>
-              <w:rPr>
-                <w:rFonts w:ascii="Arial" w:hAnsi="Arial"/>
-                <w:b/>
-                <w:color w:val="1E293B"/>
-                <w:sz w:val="18"/>
-              </w:rPr>
-              <w:t>27.300.000</w:t>
-            </w:r>
-          </w:p>
-        </w:tc>
-        <w:tc>
-          <w:tcPr>
-            <w:tcW w:type="dxa" w:w="3408"/>
-            <w:tcMar>
-              <w:top w:w="70" w:type="dxa"/>
-              <w:bottom w:w="70" w:type="dxa"/>
-              <w:left w:w="100" w:type="dxa"/>
-              <w:right w:w="100" w:type="dxa"/>
-            </w:tcMar>
-            <w:shd w:fill="FFFFFF"/>
-          </w:tcPr>
-          <w:p>
-            <w:pPr>
-              <w:spacing w:before="0" w:after="0"/>
-            </w:pPr>
-            <w:r>
-              <w:rPr>
-                <w:rFonts w:ascii="Arial" w:hAnsi="Arial"/>
-                <w:color w:val="1E293B"/>
-                <w:sz w:val="18"/>
-              </w:rPr>
-              <w:t>Thanh toán 1 lần. Dùng lại máy in cũ: 21.300.000</w:t>
-            </w:r>
-          </w:p>
-        </w:tc>
-      </w:tr>
-      <w:tr>
-        <w:tc>
-          <w:tcPr>
-            <w:tcW w:type="dxa" w:w="3408"/>
-            <w:tcMar>
-              <w:top w:w="70" w:type="dxa"/>
-              <w:bottom w:w="70" w:type="dxa"/>
-              <w:left w:w="100" w:type="dxa"/>
-              <w:right w:w="100" w:type="dxa"/>
-            </w:tcMar>
-            <w:shd w:fill="F8FAFC"/>
-          </w:tcPr>
-          <w:p>
-            <w:pPr>
-              <w:spacing w:before="0" w:after="0"/>
-            </w:pPr>
-            <w:r>
-              <w:rPr>
-                <w:rFonts w:ascii="Arial" w:hAnsi="Arial"/>
-                <w:b/>
-                <w:color w:val="1E293B"/>
-                <w:sz w:val="18"/>
-              </w:rPr>
-              <w:t>Mỗi tháng (vận hành)</w:t>
-            </w:r>
-          </w:p>
-        </w:tc>
-        <w:tc>
-          <w:tcPr>
-            <w:tcW w:type="dxa" w:w="3408"/>
-            <w:tcMar>
-              <w:top w:w="70" w:type="dxa"/>
-              <w:bottom w:w="70" w:type="dxa"/>
-              <w:left w:w="100" w:type="dxa"/>
-              <w:right w:w="100" w:type="dxa"/>
-            </w:tcMar>
-            <w:shd w:fill="F8FAFC"/>
-          </w:tcPr>
-          <w:p>
-            <w:pPr>
-              <w:spacing w:before="0" w:after="0"/>
-            </w:pPr>
-            <w:r>
-              <w:rPr>
-                <w:rFonts w:ascii="Arial" w:hAnsi="Arial"/>
-                <w:b/>
-                <w:color w:val="1E293B"/>
-                <w:sz w:val="18"/>
-              </w:rPr>
-              <w:t>1.410.000</w:t>
-            </w:r>
-          </w:p>
-        </w:tc>
-        <w:tc>
-          <w:tcPr>
-            <w:tcW w:type="dxa" w:w="3408"/>
-            <w:tcMar>
-              <w:top w:w="70" w:type="dxa"/>
-              <w:bottom w:w="70" w:type="dxa"/>
-              <w:left w:w="100" w:type="dxa"/>
-              <w:right w:w="100" w:type="dxa"/>
-            </w:tcMar>
-            <w:shd w:fill="F8FAFC"/>
-          </w:tcPr>
-          <w:p>
-            <w:pPr>
-              <w:spacing w:before="0" w:after="0"/>
-            </w:pPr>
-            <w:r>
-              <w:rPr>
-                <w:rFonts w:ascii="Arial" w:hAnsi="Arial"/>
-                <w:color w:val="1E293B"/>
-                <w:sz w:val="18"/>
-              </w:rPr>
-              <w:t>Trung bình 470.000/chi nhánh/tháng</w:t>
-            </w:r>
-          </w:p>
-        </w:tc>
-      </w:tr>
-      <w:tr>
-        <w:tc>
-          <w:tcPr>
-            <w:tcW w:type="dxa" w:w="3408"/>
-            <w:tcMar>
-              <w:top w:w="70" w:type="dxa"/>
-              <w:bottom w:w="70" w:type="dxa"/>
-              <w:left w:w="100" w:type="dxa"/>
-              <w:right w:w="100" w:type="dxa"/>
-            </w:tcMar>
-            <w:shd w:fill="FFFFFF"/>
-          </w:tcPr>
-          <w:p>
-            <w:pPr>
-              <w:spacing w:before="0" w:after="0"/>
-            </w:pPr>
-            <w:r>
-              <w:rPr>
-                <w:rFonts w:ascii="Arial" w:hAnsi="Arial"/>
-                <w:b/>
-                <w:color w:val="1E293B"/>
-                <w:sz w:val="18"/>
-              </w:rPr>
-              <w:t>Năm đầu tiên</w:t>
-            </w:r>
-          </w:p>
-        </w:tc>
-        <w:tc>
-          <w:tcPr>
-            <w:tcW w:type="dxa" w:w="3408"/>
-            <w:tcMar>
-              <w:top w:w="70" w:type="dxa"/>
-              <w:bottom w:w="70" w:type="dxa"/>
-              <w:left w:w="100" w:type="dxa"/>
-              <w:right w:w="100" w:type="dxa"/>
-            </w:tcMar>
-            <w:shd w:fill="FFFFFF"/>
-          </w:tcPr>
-          <w:p>
-            <w:pPr>
-              <w:spacing w:before="0" w:after="0"/>
-            </w:pPr>
-            <w:r>
-              <w:rPr>
-                <w:rFonts w:ascii="Arial" w:hAnsi="Arial"/>
-                <w:b/>
-                <w:color w:val="1E293B"/>
-                <w:sz w:val="18"/>
-              </w:rPr>
-              <w:t>~44.200.000</w:t>
+              <w:t>~54.800.000</w:t>
             </w:r>
           </w:p>
         </w:tc>
@@ -7436,32 +5317,10 @@
             <w:r>
               <w:rPr>
                 <w:rFonts w:ascii="Arial" w:hAnsi="Arial"/>
-                <w:b/>
                 <w:color w:val="1E293B"/>
                 <w:sz w:val="19"/>
               </w:rPr>
-              <w:t>Thời gian hoàn vốn thiết bị:</w:t>
-            </w:r>
-            <w:r>
-              <w:rPr>
-                <w:rFonts w:ascii="Arial" w:hAnsi="Arial"/>
-                <w:color w:val="1E293B"/>
-                <w:sz w:val="19"/>
-              </w:rPr>
-              <w:t xml:space="preserve"> Trong vòng tháng đầu tiên vận hành.</w:t>
-            </w:r>
-          </w:p>
-          <w:p>
-            <w:pPr>
-              <w:spacing w:before="0" w:after="20"/>
-            </w:pPr>
-            <w:r>
-              <w:rPr>
-                <w:rFonts w:ascii="Arial" w:hAnsi="Arial"/>
-                <w:color w:val="1E293B"/>
-                <w:sz w:val="19"/>
-              </w:rPr>
-              <w:t>Lương thu ngân: Tùy khu vực, ước tính 6 - 7 triệu/NV (gồm phụ cấp &amp; BHXH).</w:t>
+              <w:t>Lương thu ngân: Ước tính 6 - 7 triệu/NV (gồm phụ cấp &amp; BHXH), tùy khu vực.</w:t>
             </w:r>
           </w:p>
           <w:p>
@@ -7475,6 +5334,28 @@
                 <w:sz w:val="19"/>
               </w:rPr>
               <w:t>Phí POS cũ: Tùy nhà cung cấp đang dùng (iPOS, KiotViet, CukCuk,...).</w:t>
+            </w:r>
+          </w:p>
+          <w:p>
+            <w:pPr>
+              <w:spacing w:before="0" w:after="20"/>
+            </w:pPr>
+            <w:r>
+              <w:rPr>
+                <w:rFonts w:ascii="Arial" w:hAnsi="Arial"/>
+                <w:b/>
+                <w:color w:val="1E293B"/>
+                <w:sz w:val="19"/>
+              </w:rPr>
+              <w:t>Thời gian hoàn vốn thiết bị:</w:t>
+            </w:r>
+            <w:r>
+              <w:rPr>
+                <w:rFonts w:ascii="Arial" w:hAnsi="Arial"/>
+                <w:color w:val="1E293B"/>
+                <w:sz w:val="19"/>
+              </w:rPr>
+              <w:t xml:space="preserve"> Khoảng 1 - 1.5 tháng vận hành.</w:t>
             </w:r>
           </w:p>
         </w:tc>
@@ -7701,7 +5582,7 @@
                 <w:color w:val="1E293B"/>
                 <w:sz w:val="18"/>
               </w:rPr>
-              <w:t>26.400.000 - 27.300.000</w:t>
+              <w:t>37.890.000</w:t>
             </w:r>
           </w:p>
         </w:tc>
@@ -7919,7 +5800,7 @@
           <w:rFonts w:ascii="Arial" w:hAnsi="Arial"/>
           <w:sz w:val="20"/>
         </w:rPr>
-        <w:t>5. Máy in hóa đơn cũ của cây POS (chuẩn ESC/POS, khổ 80mm) có thể tái sử dụng, giảm 6.000.000 trong tổng chi phí thiết bị.</w:t>
+        <w:t>5. Máy in hóa đơn cũ của cây POS (chuẩn ESC/POS, khổ 80mm) có thể tái sử dụng, giảm 6.000.000 trong tổng chi phí.</w:t>
       </w:r>
     </w:p>
     <w:p>
@@ -7932,7 +5813,20 @@
           <w:rFonts w:ascii="Arial" w:hAnsi="Arial"/>
           <w:sz w:val="20"/>
         </w:rPr>
-        <w:t>6. Dữ liệu hệ thống (khách hàng, doanh thu, kho) được sao lưu tự động hàng ngày, đảm bảo an toàn.</w:t>
+        <w:t>6. Dữ liệu hệ thống (khách hàng, doanh thu, kho) được sao lưu tự động hàng ngày.</w:t>
+      </w:r>
+    </w:p>
+    <w:p>
+      <w:pPr>
+        <w:spacing w:before="0" w:after="60"/>
+        <w:ind w:left="360"/>
+      </w:pPr>
+      <w:r>
+        <w:rPr>
+          <w:rFonts w:ascii="Arial" w:hAnsi="Arial"/>
+          <w:sz w:val="20"/>
+        </w:rPr>
+        <w:t>7. Máy POS cảm ứng Sunmi T2s/D2s là thiết bị chuyên dụng F&amp;B, bảo hành chính hãng 12 tháng, tuổi thọ trung bình 3-5 năm sử dụng liên tục.</w:t>
       </w:r>
     </w:p>
     <w:p>

</xml_diff>

<commit_message>
feat: add 3-layer offline resilience to system spec + add Router 4G & SIM to quotation - system never stops serving even without internet
</commit_message>
<xml_diff>
--- a/BaoGia_KhachHang.docx
+++ b/BaoGia_KhachHang.docx
@@ -1058,7 +1058,7 @@
                 <w:color w:val="1E293B"/>
                 <w:sz w:val="18"/>
               </w:rPr>
-              <w:t>Lắp đặt, cấu hình &amp; chạy thử</w:t>
+              <w:t>Router WiFi + 4G Backup</w:t>
             </w:r>
           </w:p>
         </w:tc>
@@ -1083,7 +1083,7 @@
                 <w:color w:val="1E293B"/>
                 <w:sz w:val="18"/>
               </w:rPr>
-              <w:t>1.000.000</w:t>
+              <w:t>1.200.000</w:t>
             </w:r>
           </w:p>
         </w:tc>
@@ -1133,6 +1133,158 @@
                 <w:color w:val="1E293B"/>
                 <w:sz w:val="18"/>
               </w:rPr>
+              <w:t>3.600.000</w:t>
+            </w:r>
+          </w:p>
+        </w:tc>
+        <w:tc>
+          <w:tcPr>
+            <w:tcW w:type="dxa" w:w="1704"/>
+            <w:tcMar>
+              <w:top w:w="70" w:type="dxa"/>
+              <w:bottom w:w="70" w:type="dxa"/>
+              <w:left w:w="100" w:type="dxa"/>
+              <w:right w:w="100" w:type="dxa"/>
+            </w:tcMar>
+            <w:shd w:fill="FFFFFF"/>
+          </w:tcPr>
+          <w:p>
+            <w:pPr>
+              <w:spacing w:before="0" w:after="0"/>
+            </w:pPr>
+            <w:r>
+              <w:rPr>
+                <w:rFonts w:ascii="Arial" w:hAnsi="Arial"/>
+                <w:color w:val="1E293B"/>
+                <w:sz w:val="18"/>
+              </w:rPr>
+              <w:t>Tự chuyển sang 4G khi WiFi chết, không gián đoạn</w:t>
+            </w:r>
+          </w:p>
+        </w:tc>
+      </w:tr>
+      <w:tr>
+        <w:tc>
+          <w:tcPr>
+            <w:tcW w:type="dxa" w:w="1704"/>
+            <w:tcMar>
+              <w:top w:w="70" w:type="dxa"/>
+              <w:bottom w:w="70" w:type="dxa"/>
+              <w:left w:w="100" w:type="dxa"/>
+              <w:right w:w="100" w:type="dxa"/>
+            </w:tcMar>
+            <w:shd w:fill="F8FAFC"/>
+          </w:tcPr>
+          <w:p>
+            <w:pPr>
+              <w:spacing w:before="0" w:after="0"/>
+            </w:pPr>
+            <w:r>
+              <w:rPr>
+                <w:rFonts w:ascii="Arial" w:hAnsi="Arial"/>
+                <w:color w:val="1E293B"/>
+                <w:sz w:val="18"/>
+              </w:rPr>
+              <w:t>6</w:t>
+            </w:r>
+          </w:p>
+        </w:tc>
+        <w:tc>
+          <w:tcPr>
+            <w:tcW w:type="dxa" w:w="1704"/>
+            <w:tcMar>
+              <w:top w:w="70" w:type="dxa"/>
+              <w:bottom w:w="70" w:type="dxa"/>
+              <w:left w:w="100" w:type="dxa"/>
+              <w:right w:w="100" w:type="dxa"/>
+            </w:tcMar>
+            <w:shd w:fill="F8FAFC"/>
+          </w:tcPr>
+          <w:p>
+            <w:pPr>
+              <w:spacing w:before="0" w:after="0"/>
+            </w:pPr>
+            <w:r>
+              <w:rPr>
+                <w:rFonts w:ascii="Arial" w:hAnsi="Arial"/>
+                <w:color w:val="1E293B"/>
+                <w:sz w:val="18"/>
+              </w:rPr>
+              <w:t>Lắp đặt, cấu hình &amp; chạy thử</w:t>
+            </w:r>
+          </w:p>
+        </w:tc>
+        <w:tc>
+          <w:tcPr>
+            <w:tcW w:type="dxa" w:w="1704"/>
+            <w:tcMar>
+              <w:top w:w="70" w:type="dxa"/>
+              <w:bottom w:w="70" w:type="dxa"/>
+              <w:left w:w="100" w:type="dxa"/>
+              <w:right w:w="100" w:type="dxa"/>
+            </w:tcMar>
+            <w:shd w:fill="F8FAFC"/>
+          </w:tcPr>
+          <w:p>
+            <w:pPr>
+              <w:spacing w:before="0" w:after="0"/>
+            </w:pPr>
+            <w:r>
+              <w:rPr>
+                <w:rFonts w:ascii="Arial" w:hAnsi="Arial"/>
+                <w:color w:val="1E293B"/>
+                <w:sz w:val="18"/>
+              </w:rPr>
+              <w:t>1.000.000</w:t>
+            </w:r>
+          </w:p>
+        </w:tc>
+        <w:tc>
+          <w:tcPr>
+            <w:tcW w:type="dxa" w:w="1704"/>
+            <w:tcMar>
+              <w:top w:w="70" w:type="dxa"/>
+              <w:bottom w:w="70" w:type="dxa"/>
+              <w:left w:w="100" w:type="dxa"/>
+              <w:right w:w="100" w:type="dxa"/>
+            </w:tcMar>
+            <w:shd w:fill="F8FAFC"/>
+          </w:tcPr>
+          <w:p>
+            <w:pPr>
+              <w:spacing w:before="0" w:after="0"/>
+            </w:pPr>
+            <w:r>
+              <w:rPr>
+                <w:rFonts w:ascii="Arial" w:hAnsi="Arial"/>
+                <w:color w:val="1E293B"/>
+                <w:sz w:val="18"/>
+              </w:rPr>
+              <w:t>3</w:t>
+            </w:r>
+          </w:p>
+        </w:tc>
+        <w:tc>
+          <w:tcPr>
+            <w:tcW w:type="dxa" w:w="1704"/>
+            <w:tcMar>
+              <w:top w:w="70" w:type="dxa"/>
+              <w:bottom w:w="70" w:type="dxa"/>
+              <w:left w:w="100" w:type="dxa"/>
+              <w:right w:w="100" w:type="dxa"/>
+            </w:tcMar>
+            <w:shd w:fill="F8FAFC"/>
+          </w:tcPr>
+          <w:p>
+            <w:pPr>
+              <w:spacing w:before="0" w:after="0"/>
+            </w:pPr>
+            <w:r>
+              <w:rPr>
+                <w:rFonts w:ascii="Arial" w:hAnsi="Arial"/>
+                <w:color w:val="1E293B"/>
+                <w:sz w:val="18"/>
+              </w:rPr>
               <w:t>3.000.000</w:t>
             </w:r>
           </w:p>
@@ -1146,7 +1298,7 @@
               <w:left w:w="100" w:type="dxa"/>
               <w:right w:w="100" w:type="dxa"/>
             </w:tcMar>
-            <w:shd w:fill="FFFFFF"/>
+            <w:shd w:fill="F8FAFC"/>
           </w:tcPr>
           <w:p>
             <w:pPr>
@@ -1173,12 +1325,142 @@
               <w:left w:w="100" w:type="dxa"/>
               <w:right w:w="100" w:type="dxa"/>
             </w:tcMar>
+            <w:shd w:fill="FFFFFF"/>
+          </w:tcPr>
+          <w:p>
+            <w:pPr>
+              <w:spacing w:before="0" w:after="0"/>
+            </w:pPr>
+          </w:p>
+        </w:tc>
+        <w:tc>
+          <w:tcPr>
+            <w:tcW w:type="dxa" w:w="1704"/>
+            <w:tcMar>
+              <w:top w:w="70" w:type="dxa"/>
+              <w:bottom w:w="70" w:type="dxa"/>
+              <w:left w:w="100" w:type="dxa"/>
+              <w:right w:w="100" w:type="dxa"/>
+            </w:tcMar>
+            <w:shd w:fill="FFFFFF"/>
+          </w:tcPr>
+          <w:p>
+            <w:pPr>
+              <w:spacing w:before="0" w:after="0"/>
+            </w:pPr>
+          </w:p>
+        </w:tc>
+        <w:tc>
+          <w:tcPr>
+            <w:tcW w:type="dxa" w:w="1704"/>
+            <w:tcMar>
+              <w:top w:w="70" w:type="dxa"/>
+              <w:bottom w:w="70" w:type="dxa"/>
+              <w:left w:w="100" w:type="dxa"/>
+              <w:right w:w="100" w:type="dxa"/>
+            </w:tcMar>
+            <w:shd w:fill="FFFFFF"/>
+          </w:tcPr>
+          <w:p>
+            <w:pPr>
+              <w:spacing w:before="0" w:after="0"/>
+            </w:pPr>
+          </w:p>
+        </w:tc>
+        <w:tc>
+          <w:tcPr>
+            <w:tcW w:type="dxa" w:w="1704"/>
+            <w:tcMar>
+              <w:top w:w="70" w:type="dxa"/>
+              <w:bottom w:w="70" w:type="dxa"/>
+              <w:left w:w="100" w:type="dxa"/>
+              <w:right w:w="100" w:type="dxa"/>
+            </w:tcMar>
+            <w:shd w:fill="FFFFFF"/>
+          </w:tcPr>
+          <w:p>
+            <w:pPr>
+              <w:spacing w:before="0" w:after="0"/>
+            </w:pPr>
+          </w:p>
+        </w:tc>
+        <w:tc>
+          <w:tcPr>
+            <w:tcW w:type="dxa" w:w="1704"/>
+            <w:tcMar>
+              <w:top w:w="70" w:type="dxa"/>
+              <w:bottom w:w="70" w:type="dxa"/>
+              <w:left w:w="100" w:type="dxa"/>
+              <w:right w:w="100" w:type="dxa"/>
+            </w:tcMar>
+            <w:shd w:fill="FFFFFF"/>
+          </w:tcPr>
+          <w:p>
+            <w:pPr>
+              <w:spacing w:before="0" w:after="0"/>
+            </w:pPr>
+          </w:p>
+        </w:tc>
+        <w:tc>
+          <w:tcPr>
+            <w:tcW w:type="dxa" w:w="1704"/>
+            <w:tcMar>
+              <w:top w:w="70" w:type="dxa"/>
+              <w:bottom w:w="70" w:type="dxa"/>
+              <w:left w:w="100" w:type="dxa"/>
+              <w:right w:w="100" w:type="dxa"/>
+            </w:tcMar>
+            <w:shd w:fill="FFFFFF"/>
+          </w:tcPr>
+          <w:p>
+            <w:pPr>
+              <w:spacing w:before="0" w:after="0"/>
+            </w:pPr>
+          </w:p>
+        </w:tc>
+      </w:tr>
+      <w:tr>
+        <w:tc>
+          <w:tcPr>
+            <w:tcW w:type="dxa" w:w="1704"/>
+            <w:tcMar>
+              <w:top w:w="70" w:type="dxa"/>
+              <w:bottom w:w="70" w:type="dxa"/>
+              <w:left w:w="100" w:type="dxa"/>
+              <w:right w:w="100" w:type="dxa"/>
+            </w:tcMar>
             <w:shd w:fill="F8FAFC"/>
           </w:tcPr>
           <w:p>
             <w:pPr>
               <w:spacing w:before="0" w:after="0"/>
             </w:pPr>
+          </w:p>
+        </w:tc>
+        <w:tc>
+          <w:tcPr>
+            <w:tcW w:type="dxa" w:w="1704"/>
+            <w:tcMar>
+              <w:top w:w="70" w:type="dxa"/>
+              <w:bottom w:w="70" w:type="dxa"/>
+              <w:left w:w="100" w:type="dxa"/>
+              <w:right w:w="100" w:type="dxa"/>
+            </w:tcMar>
+            <w:shd w:fill="F8FAFC"/>
+          </w:tcPr>
+          <w:p>
+            <w:pPr>
+              <w:spacing w:before="0" w:after="0"/>
+            </w:pPr>
+            <w:r>
+              <w:rPr>
+                <w:rFonts w:ascii="Arial" w:hAnsi="Arial"/>
+                <w:b/>
+                <w:color w:val="1E293B"/>
+                <w:sz w:val="18"/>
+              </w:rPr>
+              <w:t>TỔNG THIẾT BỊ</w:t>
+            </w:r>
           </w:p>
         </w:tc>
         <w:tc>
@@ -1230,23 +1512,15 @@
             <w:pPr>
               <w:spacing w:before="0" w:after="0"/>
             </w:pPr>
-          </w:p>
-        </w:tc>
-        <w:tc>
-          <w:tcPr>
-            <w:tcW w:type="dxa" w:w="1704"/>
-            <w:tcMar>
-              <w:top w:w="70" w:type="dxa"/>
-              <w:bottom w:w="70" w:type="dxa"/>
-              <w:left w:w="100" w:type="dxa"/>
-              <w:right w:w="100" w:type="dxa"/>
-            </w:tcMar>
-            <w:shd w:fill="F8FAFC"/>
-          </w:tcPr>
-          <w:p>
-            <w:pPr>
-              <w:spacing w:before="0" w:after="0"/>
-            </w:pPr>
+            <w:r>
+              <w:rPr>
+                <w:rFonts w:ascii="Arial" w:hAnsi="Arial"/>
+                <w:b/>
+                <w:color w:val="1E293B"/>
+                <w:sz w:val="18"/>
+              </w:rPr>
+              <w:t>41.490.000</w:t>
+            </w:r>
           </w:p>
         </w:tc>
         <w:tc>
@@ -1304,10 +1578,11 @@
               <w:rPr>
                 <w:rFonts w:ascii="Arial" w:hAnsi="Arial"/>
                 <w:b/>
+                <w:i/>
                 <w:color w:val="1E293B"/>
                 <w:sz w:val="18"/>
               </w:rPr>
-              <w:t>TỔNG THIẾT BỊ</w:t>
+              <w:t>Nếu dùng lại máy in cũ</w:t>
             </w:r>
           </w:p>
         </w:tc>
@@ -1363,11 +1638,11 @@
             <w:r>
               <w:rPr>
                 <w:rFonts w:ascii="Arial" w:hAnsi="Arial"/>
-                <w:b/>
+                <w:i/>
                 <w:color w:val="1E293B"/>
                 <w:sz w:val="18"/>
               </w:rPr>
-              <w:t>37.890.000</w:t>
+              <w:t>35.490.000</w:t>
             </w:r>
           </w:p>
         </w:tc>
@@ -1381,129 +1656,6 @@
               <w:right w:w="100" w:type="dxa"/>
             </w:tcMar>
             <w:shd w:fill="FFFFFF"/>
-          </w:tcPr>
-          <w:p>
-            <w:pPr>
-              <w:spacing w:before="0" w:after="0"/>
-            </w:pPr>
-          </w:p>
-        </w:tc>
-      </w:tr>
-      <w:tr>
-        <w:tc>
-          <w:tcPr>
-            <w:tcW w:type="dxa" w:w="1704"/>
-            <w:tcMar>
-              <w:top w:w="70" w:type="dxa"/>
-              <w:bottom w:w="70" w:type="dxa"/>
-              <w:left w:w="100" w:type="dxa"/>
-              <w:right w:w="100" w:type="dxa"/>
-            </w:tcMar>
-            <w:shd w:fill="F8FAFC"/>
-          </w:tcPr>
-          <w:p>
-            <w:pPr>
-              <w:spacing w:before="0" w:after="0"/>
-            </w:pPr>
-          </w:p>
-        </w:tc>
-        <w:tc>
-          <w:tcPr>
-            <w:tcW w:type="dxa" w:w="1704"/>
-            <w:tcMar>
-              <w:top w:w="70" w:type="dxa"/>
-              <w:bottom w:w="70" w:type="dxa"/>
-              <w:left w:w="100" w:type="dxa"/>
-              <w:right w:w="100" w:type="dxa"/>
-            </w:tcMar>
-            <w:shd w:fill="F8FAFC"/>
-          </w:tcPr>
-          <w:p>
-            <w:pPr>
-              <w:spacing w:before="0" w:after="0"/>
-            </w:pPr>
-            <w:r>
-              <w:rPr>
-                <w:rFonts w:ascii="Arial" w:hAnsi="Arial"/>
-                <w:b/>
-                <w:i/>
-                <w:color w:val="1E293B"/>
-                <w:sz w:val="18"/>
-              </w:rPr>
-              <w:t>Nếu dùng lại máy in cũ</w:t>
-            </w:r>
-          </w:p>
-        </w:tc>
-        <w:tc>
-          <w:tcPr>
-            <w:tcW w:type="dxa" w:w="1704"/>
-            <w:tcMar>
-              <w:top w:w="70" w:type="dxa"/>
-              <w:bottom w:w="70" w:type="dxa"/>
-              <w:left w:w="100" w:type="dxa"/>
-              <w:right w:w="100" w:type="dxa"/>
-            </w:tcMar>
-            <w:shd w:fill="F8FAFC"/>
-          </w:tcPr>
-          <w:p>
-            <w:pPr>
-              <w:spacing w:before="0" w:after="0"/>
-            </w:pPr>
-          </w:p>
-        </w:tc>
-        <w:tc>
-          <w:tcPr>
-            <w:tcW w:type="dxa" w:w="1704"/>
-            <w:tcMar>
-              <w:top w:w="70" w:type="dxa"/>
-              <w:bottom w:w="70" w:type="dxa"/>
-              <w:left w:w="100" w:type="dxa"/>
-              <w:right w:w="100" w:type="dxa"/>
-            </w:tcMar>
-            <w:shd w:fill="F8FAFC"/>
-          </w:tcPr>
-          <w:p>
-            <w:pPr>
-              <w:spacing w:before="0" w:after="0"/>
-            </w:pPr>
-          </w:p>
-        </w:tc>
-        <w:tc>
-          <w:tcPr>
-            <w:tcW w:type="dxa" w:w="1704"/>
-            <w:tcMar>
-              <w:top w:w="70" w:type="dxa"/>
-              <w:bottom w:w="70" w:type="dxa"/>
-              <w:left w:w="100" w:type="dxa"/>
-              <w:right w:w="100" w:type="dxa"/>
-            </w:tcMar>
-            <w:shd w:fill="F8FAFC"/>
-          </w:tcPr>
-          <w:p>
-            <w:pPr>
-              <w:spacing w:before="0" w:after="0"/>
-            </w:pPr>
-            <w:r>
-              <w:rPr>
-                <w:rFonts w:ascii="Arial" w:hAnsi="Arial"/>
-                <w:i/>
-                <w:color w:val="1E293B"/>
-                <w:sz w:val="18"/>
-              </w:rPr>
-              <w:t>31.890.000</w:t>
-            </w:r>
-          </w:p>
-        </w:tc>
-        <w:tc>
-          <w:tcPr>
-            <w:tcW w:type="dxa" w:w="1704"/>
-            <w:tcMar>
-              <w:top w:w="70" w:type="dxa"/>
-              <w:bottom w:w="70" w:type="dxa"/>
-              <w:left w:w="100" w:type="dxa"/>
-              <w:right w:w="100" w:type="dxa"/>
-            </w:tcMar>
-            <w:shd w:fill="F8FAFC"/>
           </w:tcPr>
           <w:p>
             <w:pPr>
@@ -2154,7 +2306,7 @@
                 <w:color w:val="1E293B"/>
                 <w:sz w:val="18"/>
               </w:rPr>
-              <w:t>Giấy in nhiệt (tiêu hao)</w:t>
+              <w:t>SIM 4G Data backup (3 quán)</w:t>
             </w:r>
           </w:p>
         </w:tc>
@@ -2179,7 +2331,7 @@
                 <w:color w:val="1E293B"/>
                 <w:sz w:val="18"/>
               </w:rPr>
-              <w:t>180.000</w:t>
+              <w:t>450.000</w:t>
             </w:r>
           </w:p>
         </w:tc>
@@ -2204,8 +2356,180 @@
                 <w:color w:val="1E293B"/>
                 <w:sz w:val="18"/>
               </w:rPr>
+              <w:t>3 quán x 150.000/tháng, chỉ dùng khi WiFi chết</w:t>
+            </w:r>
+          </w:p>
+        </w:tc>
+      </w:tr>
+      <w:tr>
+        <w:tc>
+          <w:tcPr>
+            <w:tcW w:type="dxa" w:w="2556"/>
+            <w:tcMar>
+              <w:top w:w="70" w:type="dxa"/>
+              <w:bottom w:w="70" w:type="dxa"/>
+              <w:left w:w="100" w:type="dxa"/>
+              <w:right w:w="100" w:type="dxa"/>
+            </w:tcMar>
+            <w:shd w:fill="FFFFFF"/>
+          </w:tcPr>
+          <w:p>
+            <w:pPr>
+              <w:spacing w:before="0" w:after="0"/>
+            </w:pPr>
+            <w:r>
+              <w:rPr>
+                <w:rFonts w:ascii="Arial" w:hAnsi="Arial"/>
+                <w:color w:val="1E293B"/>
+                <w:sz w:val="18"/>
+              </w:rPr>
+              <w:t>5</w:t>
+            </w:r>
+          </w:p>
+        </w:tc>
+        <w:tc>
+          <w:tcPr>
+            <w:tcW w:type="dxa" w:w="2556"/>
+            <w:tcMar>
+              <w:top w:w="70" w:type="dxa"/>
+              <w:bottom w:w="70" w:type="dxa"/>
+              <w:left w:w="100" w:type="dxa"/>
+              <w:right w:w="100" w:type="dxa"/>
+            </w:tcMar>
+            <w:shd w:fill="FFFFFF"/>
+          </w:tcPr>
+          <w:p>
+            <w:pPr>
+              <w:spacing w:before="0" w:after="0"/>
+            </w:pPr>
+            <w:r>
+              <w:rPr>
+                <w:rFonts w:ascii="Arial" w:hAnsi="Arial"/>
+                <w:color w:val="1E293B"/>
+                <w:sz w:val="18"/>
+              </w:rPr>
+              <w:t>Giấy in nhiệt (tiêu hao)</w:t>
+            </w:r>
+          </w:p>
+        </w:tc>
+        <w:tc>
+          <w:tcPr>
+            <w:tcW w:type="dxa" w:w="2556"/>
+            <w:tcMar>
+              <w:top w:w="70" w:type="dxa"/>
+              <w:bottom w:w="70" w:type="dxa"/>
+              <w:left w:w="100" w:type="dxa"/>
+              <w:right w:w="100" w:type="dxa"/>
+            </w:tcMar>
+            <w:shd w:fill="FFFFFF"/>
+          </w:tcPr>
+          <w:p>
+            <w:pPr>
+              <w:spacing w:before="0" w:after="0"/>
+            </w:pPr>
+            <w:r>
+              <w:rPr>
+                <w:rFonts w:ascii="Arial" w:hAnsi="Arial"/>
+                <w:color w:val="1E293B"/>
+                <w:sz w:val="18"/>
+              </w:rPr>
+              <w:t>180.000</w:t>
+            </w:r>
+          </w:p>
+        </w:tc>
+        <w:tc>
+          <w:tcPr>
+            <w:tcW w:type="dxa" w:w="2556"/>
+            <w:tcMar>
+              <w:top w:w="70" w:type="dxa"/>
+              <w:bottom w:w="70" w:type="dxa"/>
+              <w:left w:w="100" w:type="dxa"/>
+              <w:right w:w="100" w:type="dxa"/>
+            </w:tcMar>
+            <w:shd w:fill="FFFFFF"/>
+          </w:tcPr>
+          <w:p>
+            <w:pPr>
+              <w:spacing w:before="0" w:after="0"/>
+            </w:pPr>
+            <w:r>
+              <w:rPr>
+                <w:rFonts w:ascii="Arial" w:hAnsi="Arial"/>
+                <w:color w:val="1E293B"/>
+                <w:sz w:val="18"/>
+              </w:rPr>
               <w:t>3 quán x 3 cuộn/tháng x 20.000/cuộn</w:t>
             </w:r>
+          </w:p>
+        </w:tc>
+      </w:tr>
+      <w:tr>
+        <w:tc>
+          <w:tcPr>
+            <w:tcW w:type="dxa" w:w="2556"/>
+            <w:tcMar>
+              <w:top w:w="70" w:type="dxa"/>
+              <w:bottom w:w="70" w:type="dxa"/>
+              <w:left w:w="100" w:type="dxa"/>
+              <w:right w:w="100" w:type="dxa"/>
+            </w:tcMar>
+            <w:shd w:fill="F8FAFC"/>
+          </w:tcPr>
+          <w:p>
+            <w:pPr>
+              <w:spacing w:before="0" w:after="0"/>
+            </w:pPr>
+          </w:p>
+        </w:tc>
+        <w:tc>
+          <w:tcPr>
+            <w:tcW w:type="dxa" w:w="2556"/>
+            <w:tcMar>
+              <w:top w:w="70" w:type="dxa"/>
+              <w:bottom w:w="70" w:type="dxa"/>
+              <w:left w:w="100" w:type="dxa"/>
+              <w:right w:w="100" w:type="dxa"/>
+            </w:tcMar>
+            <w:shd w:fill="F8FAFC"/>
+          </w:tcPr>
+          <w:p>
+            <w:pPr>
+              <w:spacing w:before="0" w:after="0"/>
+            </w:pPr>
+          </w:p>
+        </w:tc>
+        <w:tc>
+          <w:tcPr>
+            <w:tcW w:type="dxa" w:w="2556"/>
+            <w:tcMar>
+              <w:top w:w="70" w:type="dxa"/>
+              <w:bottom w:w="70" w:type="dxa"/>
+              <w:left w:w="100" w:type="dxa"/>
+              <w:right w:w="100" w:type="dxa"/>
+            </w:tcMar>
+            <w:shd w:fill="F8FAFC"/>
+          </w:tcPr>
+          <w:p>
+            <w:pPr>
+              <w:spacing w:before="0" w:after="0"/>
+            </w:pPr>
+          </w:p>
+        </w:tc>
+        <w:tc>
+          <w:tcPr>
+            <w:tcW w:type="dxa" w:w="2556"/>
+            <w:tcMar>
+              <w:top w:w="70" w:type="dxa"/>
+              <w:bottom w:w="70" w:type="dxa"/>
+              <w:left w:w="100" w:type="dxa"/>
+              <w:right w:w="100" w:type="dxa"/>
+            </w:tcMar>
+            <w:shd w:fill="F8FAFC"/>
+          </w:tcPr>
+          <w:p>
+            <w:pPr>
+              <w:spacing w:before="0" w:after="0"/>
+            </w:pPr>
           </w:p>
         </w:tc>
       </w:tr>
@@ -2242,76 +2566,6 @@
             <w:pPr>
               <w:spacing w:before="0" w:after="0"/>
             </w:pPr>
-          </w:p>
-        </w:tc>
-        <w:tc>
-          <w:tcPr>
-            <w:tcW w:type="dxa" w:w="2556"/>
-            <w:tcMar>
-              <w:top w:w="70" w:type="dxa"/>
-              <w:bottom w:w="70" w:type="dxa"/>
-              <w:left w:w="100" w:type="dxa"/>
-              <w:right w:w="100" w:type="dxa"/>
-            </w:tcMar>
-            <w:shd w:fill="FFFFFF"/>
-          </w:tcPr>
-          <w:p>
-            <w:pPr>
-              <w:spacing w:before="0" w:after="0"/>
-            </w:pPr>
-          </w:p>
-        </w:tc>
-        <w:tc>
-          <w:tcPr>
-            <w:tcW w:type="dxa" w:w="2556"/>
-            <w:tcMar>
-              <w:top w:w="70" w:type="dxa"/>
-              <w:bottom w:w="70" w:type="dxa"/>
-              <w:left w:w="100" w:type="dxa"/>
-              <w:right w:w="100" w:type="dxa"/>
-            </w:tcMar>
-            <w:shd w:fill="FFFFFF"/>
-          </w:tcPr>
-          <w:p>
-            <w:pPr>
-              <w:spacing w:before="0" w:after="0"/>
-            </w:pPr>
-          </w:p>
-        </w:tc>
-      </w:tr>
-      <w:tr>
-        <w:tc>
-          <w:tcPr>
-            <w:tcW w:type="dxa" w:w="2556"/>
-            <w:tcMar>
-              <w:top w:w="70" w:type="dxa"/>
-              <w:bottom w:w="70" w:type="dxa"/>
-              <w:left w:w="100" w:type="dxa"/>
-              <w:right w:w="100" w:type="dxa"/>
-            </w:tcMar>
-            <w:shd w:fill="F8FAFC"/>
-          </w:tcPr>
-          <w:p>
-            <w:pPr>
-              <w:spacing w:before="0" w:after="0"/>
-            </w:pPr>
-          </w:p>
-        </w:tc>
-        <w:tc>
-          <w:tcPr>
-            <w:tcW w:type="dxa" w:w="2556"/>
-            <w:tcMar>
-              <w:top w:w="70" w:type="dxa"/>
-              <w:bottom w:w="70" w:type="dxa"/>
-              <w:left w:w="100" w:type="dxa"/>
-              <w:right w:w="100" w:type="dxa"/>
-            </w:tcMar>
-            <w:shd w:fill="F8FAFC"/>
-          </w:tcPr>
-          <w:p>
-            <w:pPr>
-              <w:spacing w:before="0" w:after="0"/>
-            </w:pPr>
             <w:r>
               <w:rPr>
                 <w:rFonts w:ascii="Arial" w:hAnsi="Arial"/>
@@ -2332,7 +2586,7 @@
               <w:left w:w="100" w:type="dxa"/>
               <w:right w:w="100" w:type="dxa"/>
             </w:tcMar>
-            <w:shd w:fill="F8FAFC"/>
+            <w:shd w:fill="FFFFFF"/>
           </w:tcPr>
           <w:p>
             <w:pPr>
@@ -2345,7 +2599,7 @@
                 <w:color w:val="1E293B"/>
                 <w:sz w:val="18"/>
               </w:rPr>
-              <w:t>1.410.000</w:t>
+              <w:t>1.860.000</w:t>
             </w:r>
           </w:p>
         </w:tc>
@@ -2358,7 +2612,7 @@
               <w:left w:w="100" w:type="dxa"/>
               <w:right w:w="100" w:type="dxa"/>
             </w:tcMar>
-            <w:shd w:fill="F8FAFC"/>
+            <w:shd w:fill="FFFFFF"/>
           </w:tcPr>
           <w:p>
             <w:pPr>
@@ -2371,7 +2625,7 @@
                 <w:color w:val="1E293B"/>
                 <w:sz w:val="18"/>
               </w:rPr>
-              <w:t>~470.000/chi nhánh</w:t>
+              <w:t>~620.000/chi nhánh</w:t>
             </w:r>
           </w:p>
         </w:tc>
@@ -4276,7 +4530,7 @@
                 <w:color w:val="1E293B"/>
                 <w:sz w:val="18"/>
               </w:rPr>
-              <w:t>37.890.000</w:t>
+              <w:t>41.490.000</w:t>
             </w:r>
           </w:p>
         </w:tc>
@@ -4301,7 +4555,7 @@
                 <w:color w:val="1E293B"/>
                 <w:sz w:val="18"/>
               </w:rPr>
-              <w:t>Thanh toán 1 lần. Dùng lại máy in cũ: 31.890.000</w:t>
+              <w:t>Thanh toán 1 lần. Dùng lại máy in cũ: 35.490.000</w:t>
             </w:r>
           </w:p>
         </w:tc>
@@ -4355,7 +4609,7 @@
                 <w:color w:val="1E293B"/>
                 <w:sz w:val="18"/>
               </w:rPr>
-              <w:t>1.410.000</w:t>
+              <w:t>1.860.000</w:t>
             </w:r>
           </w:p>
         </w:tc>
@@ -4380,7 +4634,7 @@
                 <w:color w:val="1E293B"/>
                 <w:sz w:val="18"/>
               </w:rPr>
-              <w:t>Trung bình 470.000/chi nhánh/tháng</w:t>
+              <w:t>Trung bình 620.000/chi nhánh/tháng</w:t>
             </w:r>
           </w:p>
         </w:tc>
@@ -4434,7 +4688,7 @@
                 <w:color w:val="1E293B"/>
                 <w:sz w:val="18"/>
               </w:rPr>
-              <w:t>~54.800.000</w:t>
+              <w:t>~63.800.000</w:t>
             </w:r>
           </w:p>
         </w:tc>
@@ -4513,7 +4767,7 @@
                 <w:color w:val="1E293B"/>
                 <w:sz w:val="18"/>
               </w:rPr>
-              <w:t>~16.900.000/năm</w:t>
+              <w:t>~22.300.000/năm</w:t>
             </w:r>
           </w:p>
         </w:tc>
@@ -5071,7 +5325,7 @@
                 <w:color w:val="1E293B"/>
                 <w:sz w:val="18"/>
               </w:rPr>
-              <w:t>1.410.000</w:t>
+              <w:t>1.860.000</w:t>
             </w:r>
           </w:p>
         </w:tc>
@@ -5246,7 +5500,7 @@
                 <w:color w:val="1E293B"/>
                 <w:sz w:val="18"/>
               </w:rPr>
-              <w:t>~4.410.000</w:t>
+              <w:t>~4.860.000</w:t>
             </w:r>
           </w:p>
         </w:tc>
@@ -5355,7 +5609,7 @@
                 <w:color w:val="1E293B"/>
                 <w:sz w:val="19"/>
               </w:rPr>
-              <w:t xml:space="preserve"> Khoảng 1 - 1.5 tháng vận hành.</w:t>
+              <w:t xml:space="preserve"> Khoảng 1.5 - 2 tháng vận hành.</w:t>
             </w:r>
           </w:p>
         </w:tc>
@@ -5582,7 +5836,7 @@
                 <w:color w:val="1E293B"/>
                 <w:sz w:val="18"/>
               </w:rPr>
-              <w:t>37.890.000</w:t>
+              <w:t>41.490.000</w:t>
             </w:r>
           </w:p>
         </w:tc>
@@ -5684,7 +5938,7 @@
                 <w:color w:val="1E293B"/>
                 <w:sz w:val="18"/>
               </w:rPr>
-              <w:t>1.410.000</w:t>
+              <w:t>1.860.000</w:t>
             </w:r>
           </w:p>
         </w:tc>
@@ -5787,7 +6041,7 @@
           <w:rFonts w:ascii="Arial" w:hAnsi="Arial"/>
           <w:sz w:val="20"/>
         </w:rPr>
-        <w:t>4. Hệ thống yêu cầu kết nối Internet ổn định tại mỗi chi nhánh (sử dụng WiFi sẵn có của quán).</w:t>
+        <w:t>4. Hệ thống có cơ chế dự phòng mất mạng 3 lớp: Router 4G tự chuyển, chế độ Offline trên POS, và PWA cache menu cho khách.</w:t>
       </w:r>
     </w:p>
     <w:p>
@@ -5827,6 +6081,19 @@
           <w:sz w:val="20"/>
         </w:rPr>
         <w:t>7. Máy POS cảm ứng Sunmi T2s/D2s là thiết bị chuyên dụng F&amp;B, bảo hành chính hãng 12 tháng, tuổi thọ trung bình 3-5 năm sử dụng liên tục.</w:t>
+      </w:r>
+    </w:p>
+    <w:p>
+      <w:pPr>
+        <w:spacing w:before="0" w:after="60"/>
+        <w:ind w:left="360"/>
+      </w:pPr>
+      <w:r>
+        <w:rPr>
+          <w:rFonts w:ascii="Arial" w:hAnsi="Arial"/>
+          <w:sz w:val="20"/>
+        </w:rPr>
+        <w:t>8. Khi mất mạng hoàn toàn, quán vẫn hoạt động bình thường: NV tạo đơn trên POS, thu tiền mặt. Khi có mạng lại, dữ liệu tự đồng bộ lên Cloud.</w:t>
       </w:r>
     </w:p>
     <w:p>

</xml_diff>

<commit_message>
docs: complete quotation with software dev costs (175M), 2-tier maintenance plans (3M/6M), phased payment, ROI with 7-8 month payback
</commit_message>
<xml_diff>
--- a/BaoGia_KhachHang.docx
+++ b/BaoGia_KhachHang.docx
@@ -155,7 +155,1763 @@
           <w:color w:val="0F172A"/>
           <w:sz w:val="26"/>
         </w:rPr>
-        <w:t>A. CHI PHÍ THIẾT BỊ (Thanh toán 1 lần)</w:t>
+        <w:t>A. CHI PHÍ PHÁT TRIỂN PHẦN MỀM (Thanh toán 1 lần)</w:t>
+      </w:r>
+    </w:p>
+    <w:p>
+      <w:pPr>
+        <w:spacing w:before="0" w:after="60"/>
+      </w:pPr>
+      <w:r>
+        <w:rPr>
+          <w:rFonts w:ascii="Arial" w:hAnsi="Arial"/>
+          <w:sz w:val="20"/>
+        </w:rPr>
+        <w:t>Hệ thống gồm 5 module phần mềm, 5 AI module, 71 tính năng, phát triển trong 4-5 tháng.</w:t>
+      </w:r>
+    </w:p>
+    <w:p>
+      <w:pPr>
+        <w:keepNext/>
+        <w:spacing w:before="200" w:after="80"/>
+      </w:pPr>
+      <w:r>
+        <w:rPr>
+          <w:rFonts w:ascii="Arial" w:hAnsi="Arial"/>
+          <w:b/>
+          <w:color w:val="2563EB"/>
+          <w:sz w:val="22"/>
+        </w:rPr>
+        <w:t>Bảng chi phí phát triển theo module</w:t>
+      </w:r>
+    </w:p>
+    <w:tbl>
+      <w:tblPr>
+        <w:tblW w:type="auto" w:w="0"/>
+        <w:jc w:val="center"/>
+        <w:tblLook w:firstColumn="1" w:firstRow="1" w:lastColumn="0" w:lastRow="0" w:noHBand="0" w:noVBand="1" w:val="04A0"/>
+        <w:tblBorders>
+          <w:top w:val="single" w:sz="6" w:space="0" w:color="CBD5E1"/>
+          <w:bottom w:val="single" w:sz="6" w:space="0" w:color="CBD5E1"/>
+          <w:left w:val="single" w:sz="6" w:space="0" w:color="CBD5E1"/>
+          <w:right w:val="single" w:sz="6" w:space="0" w:color="CBD5E1"/>
+          <w:insideH w:val="single" w:sz="4" w:space="0" w:color="E2E8F0"/>
+          <w:insideV w:val="single" w:sz="4" w:space="0" w:color="E2E8F0"/>
+        </w:tblBorders>
+      </w:tblPr>
+      <w:tblGrid>
+        <w:gridCol w:w="2045"/>
+        <w:gridCol w:w="2045"/>
+        <w:gridCol w:w="2045"/>
+        <w:gridCol w:w="2045"/>
+        <w:gridCol w:w="2045"/>
+      </w:tblGrid>
+      <w:tr>
+        <w:tc>
+          <w:tcPr>
+            <w:tcW w:type="dxa" w:w="2045"/>
+            <w:tcMar>
+              <w:top w:w="70" w:type="dxa"/>
+              <w:bottom w:w="70" w:type="dxa"/>
+              <w:left w:w="100" w:type="dxa"/>
+              <w:right w:w="100" w:type="dxa"/>
+            </w:tcMar>
+            <w:shd w:fill="0F172A"/>
+          </w:tcPr>
+          <w:p>
+            <w:pPr>
+              <w:spacing w:before="0" w:after="0"/>
+            </w:pPr>
+            <w:r>
+              <w:rPr>
+                <w:rFonts w:ascii="Arial" w:hAnsi="Arial"/>
+                <w:b/>
+                <w:color w:val="FFFFFF"/>
+                <w:sz w:val="18"/>
+              </w:rPr>
+              <w:t>STT</w:t>
+            </w:r>
+          </w:p>
+        </w:tc>
+        <w:tc>
+          <w:tcPr>
+            <w:tcW w:type="dxa" w:w="2045"/>
+            <w:tcMar>
+              <w:top w:w="70" w:type="dxa"/>
+              <w:bottom w:w="70" w:type="dxa"/>
+              <w:left w:w="100" w:type="dxa"/>
+              <w:right w:w="100" w:type="dxa"/>
+            </w:tcMar>
+            <w:shd w:fill="0F172A"/>
+          </w:tcPr>
+          <w:p>
+            <w:pPr>
+              <w:spacing w:before="0" w:after="0"/>
+            </w:pPr>
+            <w:r>
+              <w:rPr>
+                <w:rFonts w:ascii="Arial" w:hAnsi="Arial"/>
+                <w:b/>
+                <w:color w:val="FFFFFF"/>
+                <w:sz w:val="18"/>
+              </w:rPr>
+              <w:t>Module phần mềm</w:t>
+            </w:r>
+          </w:p>
+        </w:tc>
+        <w:tc>
+          <w:tcPr>
+            <w:tcW w:type="dxa" w:w="2045"/>
+            <w:tcMar>
+              <w:top w:w="70" w:type="dxa"/>
+              <w:bottom w:w="70" w:type="dxa"/>
+              <w:left w:w="100" w:type="dxa"/>
+              <w:right w:w="100" w:type="dxa"/>
+            </w:tcMar>
+            <w:shd w:fill="0F172A"/>
+          </w:tcPr>
+          <w:p>
+            <w:pPr>
+              <w:spacing w:before="0" w:after="0"/>
+            </w:pPr>
+            <w:r>
+              <w:rPr>
+                <w:rFonts w:ascii="Arial" w:hAnsi="Arial"/>
+                <w:b/>
+                <w:color w:val="FFFFFF"/>
+                <w:sz w:val="18"/>
+              </w:rPr>
+              <w:t>Mô tả</w:t>
+            </w:r>
+          </w:p>
+        </w:tc>
+        <w:tc>
+          <w:tcPr>
+            <w:tcW w:type="dxa" w:w="2045"/>
+            <w:tcMar>
+              <w:top w:w="70" w:type="dxa"/>
+              <w:bottom w:w="70" w:type="dxa"/>
+              <w:left w:w="100" w:type="dxa"/>
+              <w:right w:w="100" w:type="dxa"/>
+            </w:tcMar>
+            <w:shd w:fill="0F172A"/>
+          </w:tcPr>
+          <w:p>
+            <w:pPr>
+              <w:spacing w:before="0" w:after="0"/>
+            </w:pPr>
+            <w:r>
+              <w:rPr>
+                <w:rFonts w:ascii="Arial" w:hAnsi="Arial"/>
+                <w:b/>
+                <w:color w:val="FFFFFF"/>
+                <w:sz w:val="18"/>
+              </w:rPr>
+              <w:t>Thời gian</w:t>
+            </w:r>
+          </w:p>
+        </w:tc>
+        <w:tc>
+          <w:tcPr>
+            <w:tcW w:type="dxa" w:w="2045"/>
+            <w:tcMar>
+              <w:top w:w="70" w:type="dxa"/>
+              <w:bottom w:w="70" w:type="dxa"/>
+              <w:left w:w="100" w:type="dxa"/>
+              <w:right w:w="100" w:type="dxa"/>
+            </w:tcMar>
+            <w:shd w:fill="0F172A"/>
+          </w:tcPr>
+          <w:p>
+            <w:pPr>
+              <w:spacing w:before="0" w:after="0"/>
+            </w:pPr>
+            <w:r>
+              <w:rPr>
+                <w:rFonts w:ascii="Arial" w:hAnsi="Arial"/>
+                <w:b/>
+                <w:color w:val="FFFFFF"/>
+                <w:sz w:val="18"/>
+              </w:rPr>
+              <w:t>Chi phí</w:t>
+            </w:r>
+          </w:p>
+        </w:tc>
+      </w:tr>
+      <w:tr>
+        <w:tc>
+          <w:tcPr>
+            <w:tcW w:type="dxa" w:w="2045"/>
+            <w:tcMar>
+              <w:top w:w="70" w:type="dxa"/>
+              <w:bottom w:w="70" w:type="dxa"/>
+              <w:left w:w="100" w:type="dxa"/>
+              <w:right w:w="100" w:type="dxa"/>
+            </w:tcMar>
+            <w:shd w:fill="FFFFFF"/>
+          </w:tcPr>
+          <w:p>
+            <w:pPr>
+              <w:spacing w:before="0" w:after="0"/>
+            </w:pPr>
+            <w:r>
+              <w:rPr>
+                <w:rFonts w:ascii="Arial" w:hAnsi="Arial"/>
+                <w:color w:val="1E293B"/>
+                <w:sz w:val="18"/>
+              </w:rPr>
+              <w:t>1</w:t>
+            </w:r>
+          </w:p>
+        </w:tc>
+        <w:tc>
+          <w:tcPr>
+            <w:tcW w:type="dxa" w:w="2045"/>
+            <w:tcMar>
+              <w:top w:w="70" w:type="dxa"/>
+              <w:bottom w:w="70" w:type="dxa"/>
+              <w:left w:w="100" w:type="dxa"/>
+              <w:right w:w="100" w:type="dxa"/>
+            </w:tcMar>
+            <w:shd w:fill="FFFFFF"/>
+          </w:tcPr>
+          <w:p>
+            <w:pPr>
+              <w:spacing w:before="0" w:after="0"/>
+            </w:pPr>
+            <w:r>
+              <w:rPr>
+                <w:rFonts w:ascii="Arial" w:hAnsi="Arial"/>
+                <w:color w:val="1E293B"/>
+                <w:sz w:val="18"/>
+              </w:rPr>
+              <w:t>QR Order Web (PWA) cho Khách hàng</w:t>
+            </w:r>
+          </w:p>
+        </w:tc>
+        <w:tc>
+          <w:tcPr>
+            <w:tcW w:type="dxa" w:w="2045"/>
+            <w:tcMar>
+              <w:top w:w="70" w:type="dxa"/>
+              <w:bottom w:w="70" w:type="dxa"/>
+              <w:left w:w="100" w:type="dxa"/>
+              <w:right w:w="100" w:type="dxa"/>
+            </w:tcMar>
+            <w:shd w:fill="FFFFFF"/>
+          </w:tcPr>
+          <w:p>
+            <w:pPr>
+              <w:spacing w:before="0" w:after="0"/>
+            </w:pPr>
+            <w:r>
+              <w:rPr>
+                <w:rFonts w:ascii="Arial" w:hAnsi="Arial"/>
+                <w:color w:val="1E293B"/>
+                <w:sz w:val="18"/>
+              </w:rPr>
+              <w:t>Menu trực quan, đặt món, thanh toán VietQR, AI Chatbot gợi ý, CRM, Loyalty, Feedback</w:t>
+            </w:r>
+          </w:p>
+        </w:tc>
+        <w:tc>
+          <w:tcPr>
+            <w:tcW w:type="dxa" w:w="2045"/>
+            <w:tcMar>
+              <w:top w:w="70" w:type="dxa"/>
+              <w:bottom w:w="70" w:type="dxa"/>
+              <w:left w:w="100" w:type="dxa"/>
+              <w:right w:w="100" w:type="dxa"/>
+            </w:tcMar>
+            <w:shd w:fill="FFFFFF"/>
+          </w:tcPr>
+          <w:p>
+            <w:pPr>
+              <w:spacing w:before="0" w:after="0"/>
+            </w:pPr>
+            <w:r>
+              <w:rPr>
+                <w:rFonts w:ascii="Arial" w:hAnsi="Arial"/>
+                <w:color w:val="1E293B"/>
+                <w:sz w:val="18"/>
+              </w:rPr>
+              <w:t>5 tuần</w:t>
+            </w:r>
+          </w:p>
+        </w:tc>
+        <w:tc>
+          <w:tcPr>
+            <w:tcW w:type="dxa" w:w="2045"/>
+            <w:tcMar>
+              <w:top w:w="70" w:type="dxa"/>
+              <w:bottom w:w="70" w:type="dxa"/>
+              <w:left w:w="100" w:type="dxa"/>
+              <w:right w:w="100" w:type="dxa"/>
+            </w:tcMar>
+            <w:shd w:fill="FFFFFF"/>
+          </w:tcPr>
+          <w:p>
+            <w:pPr>
+              <w:spacing w:before="0" w:after="0"/>
+            </w:pPr>
+            <w:r>
+              <w:rPr>
+                <w:rFonts w:ascii="Arial" w:hAnsi="Arial"/>
+                <w:color w:val="1E293B"/>
+                <w:sz w:val="18"/>
+              </w:rPr>
+              <w:t>30.000.000</w:t>
+            </w:r>
+          </w:p>
+        </w:tc>
+      </w:tr>
+      <w:tr>
+        <w:tc>
+          <w:tcPr>
+            <w:tcW w:type="dxa" w:w="2045"/>
+            <w:tcMar>
+              <w:top w:w="70" w:type="dxa"/>
+              <w:bottom w:w="70" w:type="dxa"/>
+              <w:left w:w="100" w:type="dxa"/>
+              <w:right w:w="100" w:type="dxa"/>
+            </w:tcMar>
+            <w:shd w:fill="F8FAFC"/>
+          </w:tcPr>
+          <w:p>
+            <w:pPr>
+              <w:spacing w:before="0" w:after="0"/>
+            </w:pPr>
+            <w:r>
+              <w:rPr>
+                <w:rFonts w:ascii="Arial" w:hAnsi="Arial"/>
+                <w:color w:val="1E293B"/>
+                <w:sz w:val="18"/>
+              </w:rPr>
+              <w:t>2</w:t>
+            </w:r>
+          </w:p>
+        </w:tc>
+        <w:tc>
+          <w:tcPr>
+            <w:tcW w:type="dxa" w:w="2045"/>
+            <w:tcMar>
+              <w:top w:w="70" w:type="dxa"/>
+              <w:bottom w:w="70" w:type="dxa"/>
+              <w:left w:w="100" w:type="dxa"/>
+              <w:right w:w="100" w:type="dxa"/>
+            </w:tcMar>
+            <w:shd w:fill="F8FAFC"/>
+          </w:tcPr>
+          <w:p>
+            <w:pPr>
+              <w:spacing w:before="0" w:after="0"/>
+            </w:pPr>
+            <w:r>
+              <w:rPr>
+                <w:rFonts w:ascii="Arial" w:hAnsi="Arial"/>
+                <w:color w:val="1E293B"/>
+                <w:sz w:val="18"/>
+              </w:rPr>
+              <w:t>KDS &amp; Màn hình Khách (POS 2 màn hình)</w:t>
+            </w:r>
+          </w:p>
+        </w:tc>
+        <w:tc>
+          <w:tcPr>
+            <w:tcW w:type="dxa" w:w="2045"/>
+            <w:tcMar>
+              <w:top w:w="70" w:type="dxa"/>
+              <w:bottom w:w="70" w:type="dxa"/>
+              <w:left w:w="100" w:type="dxa"/>
+              <w:right w:w="100" w:type="dxa"/>
+            </w:tcMar>
+            <w:shd w:fill="F8FAFC"/>
+          </w:tcPr>
+          <w:p>
+            <w:pPr>
+              <w:spacing w:before="0" w:after="0"/>
+            </w:pPr>
+            <w:r>
+              <w:rPr>
+                <w:rFonts w:ascii="Arial" w:hAnsi="Arial"/>
+                <w:color w:val="1E293B"/>
+                <w:sz w:val="18"/>
+              </w:rPr>
+              <w:t>Nhận đơn real-time, công thức pha chế, hoàn thành đơn, báo hết món, chế độ Offline, hiển thị đơn + QR cho khách</w:t>
+            </w:r>
+          </w:p>
+        </w:tc>
+        <w:tc>
+          <w:tcPr>
+            <w:tcW w:type="dxa" w:w="2045"/>
+            <w:tcMar>
+              <w:top w:w="70" w:type="dxa"/>
+              <w:bottom w:w="70" w:type="dxa"/>
+              <w:left w:w="100" w:type="dxa"/>
+              <w:right w:w="100" w:type="dxa"/>
+            </w:tcMar>
+            <w:shd w:fill="F8FAFC"/>
+          </w:tcPr>
+          <w:p>
+            <w:pPr>
+              <w:spacing w:before="0" w:after="0"/>
+            </w:pPr>
+            <w:r>
+              <w:rPr>
+                <w:rFonts w:ascii="Arial" w:hAnsi="Arial"/>
+                <w:color w:val="1E293B"/>
+                <w:sz w:val="18"/>
+              </w:rPr>
+              <w:t>4 tuần</w:t>
+            </w:r>
+          </w:p>
+        </w:tc>
+        <w:tc>
+          <w:tcPr>
+            <w:tcW w:type="dxa" w:w="2045"/>
+            <w:tcMar>
+              <w:top w:w="70" w:type="dxa"/>
+              <w:bottom w:w="70" w:type="dxa"/>
+              <w:left w:w="100" w:type="dxa"/>
+              <w:right w:w="100" w:type="dxa"/>
+            </w:tcMar>
+            <w:shd w:fill="F8FAFC"/>
+          </w:tcPr>
+          <w:p>
+            <w:pPr>
+              <w:spacing w:before="0" w:after="0"/>
+            </w:pPr>
+            <w:r>
+              <w:rPr>
+                <w:rFonts w:ascii="Arial" w:hAnsi="Arial"/>
+                <w:color w:val="1E293B"/>
+                <w:sz w:val="18"/>
+              </w:rPr>
+              <w:t>25.000.000</w:t>
+            </w:r>
+          </w:p>
+        </w:tc>
+      </w:tr>
+      <w:tr>
+        <w:tc>
+          <w:tcPr>
+            <w:tcW w:type="dxa" w:w="2045"/>
+            <w:tcMar>
+              <w:top w:w="70" w:type="dxa"/>
+              <w:bottom w:w="70" w:type="dxa"/>
+              <w:left w:w="100" w:type="dxa"/>
+              <w:right w:w="100" w:type="dxa"/>
+            </w:tcMar>
+            <w:shd w:fill="FFFFFF"/>
+          </w:tcPr>
+          <w:p>
+            <w:pPr>
+              <w:spacing w:before="0" w:after="0"/>
+            </w:pPr>
+            <w:r>
+              <w:rPr>
+                <w:rFonts w:ascii="Arial" w:hAnsi="Arial"/>
+                <w:color w:val="1E293B"/>
+                <w:sz w:val="18"/>
+              </w:rPr>
+              <w:t>3</w:t>
+            </w:r>
+          </w:p>
+        </w:tc>
+        <w:tc>
+          <w:tcPr>
+            <w:tcW w:type="dxa" w:w="2045"/>
+            <w:tcMar>
+              <w:top w:w="70" w:type="dxa"/>
+              <w:bottom w:w="70" w:type="dxa"/>
+              <w:left w:w="100" w:type="dxa"/>
+              <w:right w:w="100" w:type="dxa"/>
+            </w:tcMar>
+            <w:shd w:fill="FFFFFF"/>
+          </w:tcPr>
+          <w:p>
+            <w:pPr>
+              <w:spacing w:before="0" w:after="0"/>
+            </w:pPr>
+            <w:r>
+              <w:rPr>
+                <w:rFonts w:ascii="Arial" w:hAnsi="Arial"/>
+                <w:color w:val="1E293B"/>
+                <w:sz w:val="18"/>
+              </w:rPr>
+              <w:t>App Quản lý Chi nhánh (Manager)</w:t>
+            </w:r>
+          </w:p>
+        </w:tc>
+        <w:tc>
+          <w:tcPr>
+            <w:tcW w:type="dxa" w:w="2045"/>
+            <w:tcMar>
+              <w:top w:w="70" w:type="dxa"/>
+              <w:bottom w:w="70" w:type="dxa"/>
+              <w:left w:w="100" w:type="dxa"/>
+              <w:right w:w="100" w:type="dxa"/>
+            </w:tcMar>
+            <w:shd w:fill="FFFFFF"/>
+          </w:tcPr>
+          <w:p>
+            <w:pPr>
+              <w:spacing w:before="0" w:after="0"/>
+            </w:pPr>
+            <w:r>
+              <w:rPr>
+                <w:rFonts w:ascii="Arial" w:hAnsi="Arial"/>
+                <w:color w:val="1E293B"/>
+                <w:sz w:val="18"/>
+              </w:rPr>
+              <w:t>Mở/kết ca, nhập xuất kho, kiểm kê, báo cáo, chấm công, AI thống kê</w:t>
+            </w:r>
+          </w:p>
+        </w:tc>
+        <w:tc>
+          <w:tcPr>
+            <w:tcW w:type="dxa" w:w="2045"/>
+            <w:tcMar>
+              <w:top w:w="70" w:type="dxa"/>
+              <w:bottom w:w="70" w:type="dxa"/>
+              <w:left w:w="100" w:type="dxa"/>
+              <w:right w:w="100" w:type="dxa"/>
+            </w:tcMar>
+            <w:shd w:fill="FFFFFF"/>
+          </w:tcPr>
+          <w:p>
+            <w:pPr>
+              <w:spacing w:before="0" w:after="0"/>
+            </w:pPr>
+            <w:r>
+              <w:rPr>
+                <w:rFonts w:ascii="Arial" w:hAnsi="Arial"/>
+                <w:color w:val="1E293B"/>
+                <w:sz w:val="18"/>
+              </w:rPr>
+              <w:t>4 tuần</w:t>
+            </w:r>
+          </w:p>
+        </w:tc>
+        <w:tc>
+          <w:tcPr>
+            <w:tcW w:type="dxa" w:w="2045"/>
+            <w:tcMar>
+              <w:top w:w="70" w:type="dxa"/>
+              <w:bottom w:w="70" w:type="dxa"/>
+              <w:left w:w="100" w:type="dxa"/>
+              <w:right w:w="100" w:type="dxa"/>
+            </w:tcMar>
+            <w:shd w:fill="FFFFFF"/>
+          </w:tcPr>
+          <w:p>
+            <w:pPr>
+              <w:spacing w:before="0" w:after="0"/>
+            </w:pPr>
+            <w:r>
+              <w:rPr>
+                <w:rFonts w:ascii="Arial" w:hAnsi="Arial"/>
+                <w:color w:val="1E293B"/>
+                <w:sz w:val="18"/>
+              </w:rPr>
+              <w:t>22.000.000</w:t>
+            </w:r>
+          </w:p>
+        </w:tc>
+      </w:tr>
+      <w:tr>
+        <w:tc>
+          <w:tcPr>
+            <w:tcW w:type="dxa" w:w="2045"/>
+            <w:tcMar>
+              <w:top w:w="70" w:type="dxa"/>
+              <w:bottom w:w="70" w:type="dxa"/>
+              <w:left w:w="100" w:type="dxa"/>
+              <w:right w:w="100" w:type="dxa"/>
+            </w:tcMar>
+            <w:shd w:fill="F8FAFC"/>
+          </w:tcPr>
+          <w:p>
+            <w:pPr>
+              <w:spacing w:before="0" w:after="0"/>
+            </w:pPr>
+            <w:r>
+              <w:rPr>
+                <w:rFonts w:ascii="Arial" w:hAnsi="Arial"/>
+                <w:color w:val="1E293B"/>
+                <w:sz w:val="18"/>
+              </w:rPr>
+              <w:t>4</w:t>
+            </w:r>
+          </w:p>
+        </w:tc>
+        <w:tc>
+          <w:tcPr>
+            <w:tcW w:type="dxa" w:w="2045"/>
+            <w:tcMar>
+              <w:top w:w="70" w:type="dxa"/>
+              <w:bottom w:w="70" w:type="dxa"/>
+              <w:left w:w="100" w:type="dxa"/>
+              <w:right w:w="100" w:type="dxa"/>
+            </w:tcMar>
+            <w:shd w:fill="F8FAFC"/>
+          </w:tcPr>
+          <w:p>
+            <w:pPr>
+              <w:spacing w:before="0" w:after="0"/>
+            </w:pPr>
+            <w:r>
+              <w:rPr>
+                <w:rFonts w:ascii="Arial" w:hAnsi="Arial"/>
+                <w:color w:val="1E293B"/>
+                <w:sz w:val="18"/>
+              </w:rPr>
+              <w:t>Web Dashboard Admin (Chủ chuỗi)</w:t>
+            </w:r>
+          </w:p>
+        </w:tc>
+        <w:tc>
+          <w:tcPr>
+            <w:tcW w:type="dxa" w:w="2045"/>
+            <w:tcMar>
+              <w:top w:w="70" w:type="dxa"/>
+              <w:bottom w:w="70" w:type="dxa"/>
+              <w:left w:w="100" w:type="dxa"/>
+              <w:right w:w="100" w:type="dxa"/>
+            </w:tcMar>
+            <w:shd w:fill="F8FAFC"/>
+          </w:tcPr>
+          <w:p>
+            <w:pPr>
+              <w:spacing w:before="0" w:after="0"/>
+            </w:pPr>
+            <w:r>
+              <w:rPr>
+                <w:rFonts w:ascii="Arial" w:hAnsi="Arial"/>
+                <w:color w:val="1E293B"/>
+                <w:sz w:val="18"/>
+              </w:rPr>
+              <w:t>Dashboard doanh thu toàn chuỗi, P&amp;L, quản lý menu/giá, RBAC phân quyền, Audit Log, Export</w:t>
+            </w:r>
+          </w:p>
+        </w:tc>
+        <w:tc>
+          <w:tcPr>
+            <w:tcW w:type="dxa" w:w="2045"/>
+            <w:tcMar>
+              <w:top w:w="70" w:type="dxa"/>
+              <w:bottom w:w="70" w:type="dxa"/>
+              <w:left w:w="100" w:type="dxa"/>
+              <w:right w:w="100" w:type="dxa"/>
+            </w:tcMar>
+            <w:shd w:fill="F8FAFC"/>
+          </w:tcPr>
+          <w:p>
+            <w:pPr>
+              <w:spacing w:before="0" w:after="0"/>
+            </w:pPr>
+            <w:r>
+              <w:rPr>
+                <w:rFonts w:ascii="Arial" w:hAnsi="Arial"/>
+                <w:color w:val="1E293B"/>
+                <w:sz w:val="18"/>
+              </w:rPr>
+              <w:t>5 tuần</w:t>
+            </w:r>
+          </w:p>
+        </w:tc>
+        <w:tc>
+          <w:tcPr>
+            <w:tcW w:type="dxa" w:w="2045"/>
+            <w:tcMar>
+              <w:top w:w="70" w:type="dxa"/>
+              <w:bottom w:w="70" w:type="dxa"/>
+              <w:left w:w="100" w:type="dxa"/>
+              <w:right w:w="100" w:type="dxa"/>
+            </w:tcMar>
+            <w:shd w:fill="F8FAFC"/>
+          </w:tcPr>
+          <w:p>
+            <w:pPr>
+              <w:spacing w:before="0" w:after="0"/>
+            </w:pPr>
+            <w:r>
+              <w:rPr>
+                <w:rFonts w:ascii="Arial" w:hAnsi="Arial"/>
+                <w:color w:val="1E293B"/>
+                <w:sz w:val="18"/>
+              </w:rPr>
+              <w:t>28.000.000</w:t>
+            </w:r>
+          </w:p>
+        </w:tc>
+      </w:tr>
+      <w:tr>
+        <w:tc>
+          <w:tcPr>
+            <w:tcW w:type="dxa" w:w="2045"/>
+            <w:tcMar>
+              <w:top w:w="70" w:type="dxa"/>
+              <w:bottom w:w="70" w:type="dxa"/>
+              <w:left w:w="100" w:type="dxa"/>
+              <w:right w:w="100" w:type="dxa"/>
+            </w:tcMar>
+            <w:shd w:fill="FFFFFF"/>
+          </w:tcPr>
+          <w:p>
+            <w:pPr>
+              <w:spacing w:before="0" w:after="0"/>
+            </w:pPr>
+            <w:r>
+              <w:rPr>
+                <w:rFonts w:ascii="Arial" w:hAnsi="Arial"/>
+                <w:color w:val="1E293B"/>
+                <w:sz w:val="18"/>
+              </w:rPr>
+              <w:t>5</w:t>
+            </w:r>
+          </w:p>
+        </w:tc>
+        <w:tc>
+          <w:tcPr>
+            <w:tcW w:type="dxa" w:w="2045"/>
+            <w:tcMar>
+              <w:top w:w="70" w:type="dxa"/>
+              <w:bottom w:w="70" w:type="dxa"/>
+              <w:left w:w="100" w:type="dxa"/>
+              <w:right w:w="100" w:type="dxa"/>
+            </w:tcMar>
+            <w:shd w:fill="FFFFFF"/>
+          </w:tcPr>
+          <w:p>
+            <w:pPr>
+              <w:spacing w:before="0" w:after="0"/>
+            </w:pPr>
+            <w:r>
+              <w:rPr>
+                <w:rFonts w:ascii="Arial" w:hAnsi="Arial"/>
+                <w:color w:val="1E293B"/>
+                <w:sz w:val="18"/>
+              </w:rPr>
+              <w:t>Backend API &amp; Hạ tầng</w:t>
+            </w:r>
+          </w:p>
+        </w:tc>
+        <w:tc>
+          <w:tcPr>
+            <w:tcW w:type="dxa" w:w="2045"/>
+            <w:tcMar>
+              <w:top w:w="70" w:type="dxa"/>
+              <w:bottom w:w="70" w:type="dxa"/>
+              <w:left w:w="100" w:type="dxa"/>
+              <w:right w:w="100" w:type="dxa"/>
+            </w:tcMar>
+            <w:shd w:fill="FFFFFF"/>
+          </w:tcPr>
+          <w:p>
+            <w:pPr>
+              <w:spacing w:before="0" w:after="0"/>
+            </w:pPr>
+            <w:r>
+              <w:rPr>
+                <w:rFonts w:ascii="Arial" w:hAnsi="Arial"/>
+                <w:color w:val="1E293B"/>
+                <w:sz w:val="18"/>
+              </w:rPr>
+              <w:t>REST API, WebSocket real-time, Auth/RBAC, VietQR, Database, Redis, Docker, Deploy, Backup, Offline Sync</w:t>
+            </w:r>
+          </w:p>
+        </w:tc>
+        <w:tc>
+          <w:tcPr>
+            <w:tcW w:type="dxa" w:w="2045"/>
+            <w:tcMar>
+              <w:top w:w="70" w:type="dxa"/>
+              <w:bottom w:w="70" w:type="dxa"/>
+              <w:left w:w="100" w:type="dxa"/>
+              <w:right w:w="100" w:type="dxa"/>
+            </w:tcMar>
+            <w:shd w:fill="FFFFFF"/>
+          </w:tcPr>
+          <w:p>
+            <w:pPr>
+              <w:spacing w:before="0" w:after="0"/>
+            </w:pPr>
+            <w:r>
+              <w:rPr>
+                <w:rFonts w:ascii="Arial" w:hAnsi="Arial"/>
+                <w:color w:val="1E293B"/>
+                <w:sz w:val="18"/>
+              </w:rPr>
+              <w:t>6 tuần</w:t>
+            </w:r>
+          </w:p>
+        </w:tc>
+        <w:tc>
+          <w:tcPr>
+            <w:tcW w:type="dxa" w:w="2045"/>
+            <w:tcMar>
+              <w:top w:w="70" w:type="dxa"/>
+              <w:bottom w:w="70" w:type="dxa"/>
+              <w:left w:w="100" w:type="dxa"/>
+              <w:right w:w="100" w:type="dxa"/>
+            </w:tcMar>
+            <w:shd w:fill="FFFFFF"/>
+          </w:tcPr>
+          <w:p>
+            <w:pPr>
+              <w:spacing w:before="0" w:after="0"/>
+            </w:pPr>
+            <w:r>
+              <w:rPr>
+                <w:rFonts w:ascii="Arial" w:hAnsi="Arial"/>
+                <w:color w:val="1E293B"/>
+                <w:sz w:val="18"/>
+              </w:rPr>
+              <w:t>35.000.000</w:t>
+            </w:r>
+          </w:p>
+        </w:tc>
+      </w:tr>
+      <w:tr>
+        <w:tc>
+          <w:tcPr>
+            <w:tcW w:type="dxa" w:w="2045"/>
+            <w:tcMar>
+              <w:top w:w="70" w:type="dxa"/>
+              <w:bottom w:w="70" w:type="dxa"/>
+              <w:left w:w="100" w:type="dxa"/>
+              <w:right w:w="100" w:type="dxa"/>
+            </w:tcMar>
+            <w:shd w:fill="F8FAFC"/>
+          </w:tcPr>
+          <w:p>
+            <w:pPr>
+              <w:spacing w:before="0" w:after="0"/>
+            </w:pPr>
+            <w:r>
+              <w:rPr>
+                <w:rFonts w:ascii="Arial" w:hAnsi="Arial"/>
+                <w:color w:val="1E293B"/>
+                <w:sz w:val="18"/>
+              </w:rPr>
+              <w:t>6</w:t>
+            </w:r>
+          </w:p>
+        </w:tc>
+        <w:tc>
+          <w:tcPr>
+            <w:tcW w:type="dxa" w:w="2045"/>
+            <w:tcMar>
+              <w:top w:w="70" w:type="dxa"/>
+              <w:bottom w:w="70" w:type="dxa"/>
+              <w:left w:w="100" w:type="dxa"/>
+              <w:right w:w="100" w:type="dxa"/>
+            </w:tcMar>
+            <w:shd w:fill="F8FAFC"/>
+          </w:tcPr>
+          <w:p>
+            <w:pPr>
+              <w:spacing w:before="0" w:after="0"/>
+            </w:pPr>
+            <w:r>
+              <w:rPr>
+                <w:rFonts w:ascii="Arial" w:hAnsi="Arial"/>
+                <w:color w:val="1E293B"/>
+                <w:sz w:val="18"/>
+              </w:rPr>
+              <w:t>AI Engine (5 module)</w:t>
+            </w:r>
+          </w:p>
+        </w:tc>
+        <w:tc>
+          <w:tcPr>
+            <w:tcW w:type="dxa" w:w="2045"/>
+            <w:tcMar>
+              <w:top w:w="70" w:type="dxa"/>
+              <w:bottom w:w="70" w:type="dxa"/>
+              <w:left w:w="100" w:type="dxa"/>
+              <w:right w:w="100" w:type="dxa"/>
+            </w:tcMar>
+            <w:shd w:fill="F8FAFC"/>
+          </w:tcPr>
+          <w:p>
+            <w:pPr>
+              <w:spacing w:before="0" w:after="0"/>
+            </w:pPr>
+            <w:r>
+              <w:rPr>
+                <w:rFonts w:ascii="Arial" w:hAnsi="Arial"/>
+                <w:color w:val="1E293B"/>
+                <w:sz w:val="18"/>
+              </w:rPr>
+              <w:t>AI-1: Thống kê doanh thu, AI-2: Gợi ý combo, AI-3: Churn Prediction, AI-4: Menu Intelligence, AI-5: Chatbot RAG</w:t>
+            </w:r>
+          </w:p>
+        </w:tc>
+        <w:tc>
+          <w:tcPr>
+            <w:tcW w:type="dxa" w:w="2045"/>
+            <w:tcMar>
+              <w:top w:w="70" w:type="dxa"/>
+              <w:bottom w:w="70" w:type="dxa"/>
+              <w:left w:w="100" w:type="dxa"/>
+              <w:right w:w="100" w:type="dxa"/>
+            </w:tcMar>
+            <w:shd w:fill="F8FAFC"/>
+          </w:tcPr>
+          <w:p>
+            <w:pPr>
+              <w:spacing w:before="0" w:after="0"/>
+            </w:pPr>
+            <w:r>
+              <w:rPr>
+                <w:rFonts w:ascii="Arial" w:hAnsi="Arial"/>
+                <w:color w:val="1E293B"/>
+                <w:sz w:val="18"/>
+              </w:rPr>
+              <w:t>4 tuần</w:t>
+            </w:r>
+          </w:p>
+        </w:tc>
+        <w:tc>
+          <w:tcPr>
+            <w:tcW w:type="dxa" w:w="2045"/>
+            <w:tcMar>
+              <w:top w:w="70" w:type="dxa"/>
+              <w:bottom w:w="70" w:type="dxa"/>
+              <w:left w:w="100" w:type="dxa"/>
+              <w:right w:w="100" w:type="dxa"/>
+            </w:tcMar>
+            <w:shd w:fill="F8FAFC"/>
+          </w:tcPr>
+          <w:p>
+            <w:pPr>
+              <w:spacing w:before="0" w:after="0"/>
+            </w:pPr>
+            <w:r>
+              <w:rPr>
+                <w:rFonts w:ascii="Arial" w:hAnsi="Arial"/>
+                <w:color w:val="1E293B"/>
+                <w:sz w:val="18"/>
+              </w:rPr>
+              <w:t>25.000.000</w:t>
+            </w:r>
+          </w:p>
+        </w:tc>
+      </w:tr>
+      <w:tr>
+        <w:tc>
+          <w:tcPr>
+            <w:tcW w:type="dxa" w:w="2045"/>
+            <w:tcMar>
+              <w:top w:w="70" w:type="dxa"/>
+              <w:bottom w:w="70" w:type="dxa"/>
+              <w:left w:w="100" w:type="dxa"/>
+              <w:right w:w="100" w:type="dxa"/>
+            </w:tcMar>
+            <w:shd w:fill="FFFFFF"/>
+          </w:tcPr>
+          <w:p>
+            <w:pPr>
+              <w:spacing w:before="0" w:after="0"/>
+            </w:pPr>
+            <w:r>
+              <w:rPr>
+                <w:rFonts w:ascii="Arial" w:hAnsi="Arial"/>
+                <w:color w:val="1E293B"/>
+                <w:sz w:val="18"/>
+              </w:rPr>
+              <w:t>7</w:t>
+            </w:r>
+          </w:p>
+        </w:tc>
+        <w:tc>
+          <w:tcPr>
+            <w:tcW w:type="dxa" w:w="2045"/>
+            <w:tcMar>
+              <w:top w:w="70" w:type="dxa"/>
+              <w:bottom w:w="70" w:type="dxa"/>
+              <w:left w:w="100" w:type="dxa"/>
+              <w:right w:w="100" w:type="dxa"/>
+            </w:tcMar>
+            <w:shd w:fill="FFFFFF"/>
+          </w:tcPr>
+          <w:p>
+            <w:pPr>
+              <w:spacing w:before="0" w:after="0"/>
+            </w:pPr>
+            <w:r>
+              <w:rPr>
+                <w:rFonts w:ascii="Arial" w:hAnsi="Arial"/>
+                <w:color w:val="1E293B"/>
+                <w:sz w:val="18"/>
+              </w:rPr>
+              <w:t>Kiểm thử &amp; Triển khai</w:t>
+            </w:r>
+          </w:p>
+        </w:tc>
+        <w:tc>
+          <w:tcPr>
+            <w:tcW w:type="dxa" w:w="2045"/>
+            <w:tcMar>
+              <w:top w:w="70" w:type="dxa"/>
+              <w:bottom w:w="70" w:type="dxa"/>
+              <w:left w:w="100" w:type="dxa"/>
+              <w:right w:w="100" w:type="dxa"/>
+            </w:tcMar>
+            <w:shd w:fill="FFFFFF"/>
+          </w:tcPr>
+          <w:p>
+            <w:pPr>
+              <w:spacing w:before="0" w:after="0"/>
+            </w:pPr>
+            <w:r>
+              <w:rPr>
+                <w:rFonts w:ascii="Arial" w:hAnsi="Arial"/>
+                <w:color w:val="1E293B"/>
+                <w:sz w:val="18"/>
+              </w:rPr>
+              <w:t>Testing toàn bộ hệ thống, sửa lỗi, tối ưu hiệu năng, deploy production, hướng dẫn sử dụng</w:t>
+            </w:r>
+          </w:p>
+        </w:tc>
+        <w:tc>
+          <w:tcPr>
+            <w:tcW w:type="dxa" w:w="2045"/>
+            <w:tcMar>
+              <w:top w:w="70" w:type="dxa"/>
+              <w:bottom w:w="70" w:type="dxa"/>
+              <w:left w:w="100" w:type="dxa"/>
+              <w:right w:w="100" w:type="dxa"/>
+            </w:tcMar>
+            <w:shd w:fill="FFFFFF"/>
+          </w:tcPr>
+          <w:p>
+            <w:pPr>
+              <w:spacing w:before="0" w:after="0"/>
+            </w:pPr>
+            <w:r>
+              <w:rPr>
+                <w:rFonts w:ascii="Arial" w:hAnsi="Arial"/>
+                <w:color w:val="1E293B"/>
+                <w:sz w:val="18"/>
+              </w:rPr>
+              <w:t>2 tuần</w:t>
+            </w:r>
+          </w:p>
+        </w:tc>
+        <w:tc>
+          <w:tcPr>
+            <w:tcW w:type="dxa" w:w="2045"/>
+            <w:tcMar>
+              <w:top w:w="70" w:type="dxa"/>
+              <w:bottom w:w="70" w:type="dxa"/>
+              <w:left w:w="100" w:type="dxa"/>
+              <w:right w:w="100" w:type="dxa"/>
+            </w:tcMar>
+            <w:shd w:fill="FFFFFF"/>
+          </w:tcPr>
+          <w:p>
+            <w:pPr>
+              <w:spacing w:before="0" w:after="0"/>
+            </w:pPr>
+            <w:r>
+              <w:rPr>
+                <w:rFonts w:ascii="Arial" w:hAnsi="Arial"/>
+                <w:color w:val="1E293B"/>
+                <w:sz w:val="18"/>
+              </w:rPr>
+              <w:t>10.000.000</w:t>
+            </w:r>
+          </w:p>
+        </w:tc>
+      </w:tr>
+      <w:tr>
+        <w:tc>
+          <w:tcPr>
+            <w:tcW w:type="dxa" w:w="2045"/>
+            <w:tcMar>
+              <w:top w:w="70" w:type="dxa"/>
+              <w:bottom w:w="70" w:type="dxa"/>
+              <w:left w:w="100" w:type="dxa"/>
+              <w:right w:w="100" w:type="dxa"/>
+            </w:tcMar>
+            <w:shd w:fill="F8FAFC"/>
+          </w:tcPr>
+          <w:p>
+            <w:pPr>
+              <w:spacing w:before="0" w:after="0"/>
+            </w:pPr>
+          </w:p>
+        </w:tc>
+        <w:tc>
+          <w:tcPr>
+            <w:tcW w:type="dxa" w:w="2045"/>
+            <w:tcMar>
+              <w:top w:w="70" w:type="dxa"/>
+              <w:bottom w:w="70" w:type="dxa"/>
+              <w:left w:w="100" w:type="dxa"/>
+              <w:right w:w="100" w:type="dxa"/>
+            </w:tcMar>
+            <w:shd w:fill="F8FAFC"/>
+          </w:tcPr>
+          <w:p>
+            <w:pPr>
+              <w:spacing w:before="0" w:after="0"/>
+            </w:pPr>
+          </w:p>
+        </w:tc>
+        <w:tc>
+          <w:tcPr>
+            <w:tcW w:type="dxa" w:w="2045"/>
+            <w:tcMar>
+              <w:top w:w="70" w:type="dxa"/>
+              <w:bottom w:w="70" w:type="dxa"/>
+              <w:left w:w="100" w:type="dxa"/>
+              <w:right w:w="100" w:type="dxa"/>
+            </w:tcMar>
+            <w:shd w:fill="F8FAFC"/>
+          </w:tcPr>
+          <w:p>
+            <w:pPr>
+              <w:spacing w:before="0" w:after="0"/>
+            </w:pPr>
+          </w:p>
+        </w:tc>
+        <w:tc>
+          <w:tcPr>
+            <w:tcW w:type="dxa" w:w="2045"/>
+            <w:tcMar>
+              <w:top w:w="70" w:type="dxa"/>
+              <w:bottom w:w="70" w:type="dxa"/>
+              <w:left w:w="100" w:type="dxa"/>
+              <w:right w:w="100" w:type="dxa"/>
+            </w:tcMar>
+            <w:shd w:fill="F8FAFC"/>
+          </w:tcPr>
+          <w:p>
+            <w:pPr>
+              <w:spacing w:before="0" w:after="0"/>
+            </w:pPr>
+          </w:p>
+        </w:tc>
+        <w:tc>
+          <w:tcPr>
+            <w:tcW w:type="dxa" w:w="2045"/>
+            <w:tcMar>
+              <w:top w:w="70" w:type="dxa"/>
+              <w:bottom w:w="70" w:type="dxa"/>
+              <w:left w:w="100" w:type="dxa"/>
+              <w:right w:w="100" w:type="dxa"/>
+            </w:tcMar>
+            <w:shd w:fill="F8FAFC"/>
+          </w:tcPr>
+          <w:p>
+            <w:pPr>
+              <w:spacing w:before="0" w:after="0"/>
+            </w:pPr>
+          </w:p>
+        </w:tc>
+      </w:tr>
+      <w:tr>
+        <w:tc>
+          <w:tcPr>
+            <w:tcW w:type="dxa" w:w="2045"/>
+            <w:tcMar>
+              <w:top w:w="70" w:type="dxa"/>
+              <w:bottom w:w="70" w:type="dxa"/>
+              <w:left w:w="100" w:type="dxa"/>
+              <w:right w:w="100" w:type="dxa"/>
+            </w:tcMar>
+            <w:shd w:fill="FFFFFF"/>
+          </w:tcPr>
+          <w:p>
+            <w:pPr>
+              <w:spacing w:before="0" w:after="0"/>
+            </w:pPr>
+          </w:p>
+        </w:tc>
+        <w:tc>
+          <w:tcPr>
+            <w:tcW w:type="dxa" w:w="2045"/>
+            <w:tcMar>
+              <w:top w:w="70" w:type="dxa"/>
+              <w:bottom w:w="70" w:type="dxa"/>
+              <w:left w:w="100" w:type="dxa"/>
+              <w:right w:w="100" w:type="dxa"/>
+            </w:tcMar>
+            <w:shd w:fill="FFFFFF"/>
+          </w:tcPr>
+          <w:p>
+            <w:pPr>
+              <w:spacing w:before="0" w:after="0"/>
+            </w:pPr>
+            <w:r>
+              <w:rPr>
+                <w:rFonts w:ascii="Arial" w:hAnsi="Arial"/>
+                <w:b/>
+                <w:color w:val="1E293B"/>
+                <w:sz w:val="18"/>
+              </w:rPr>
+              <w:t>TỔNG PHÁT TRIỂN PHẦN MỀM</w:t>
+            </w:r>
+          </w:p>
+        </w:tc>
+        <w:tc>
+          <w:tcPr>
+            <w:tcW w:type="dxa" w:w="2045"/>
+            <w:tcMar>
+              <w:top w:w="70" w:type="dxa"/>
+              <w:bottom w:w="70" w:type="dxa"/>
+              <w:left w:w="100" w:type="dxa"/>
+              <w:right w:w="100" w:type="dxa"/>
+            </w:tcMar>
+            <w:shd w:fill="FFFFFF"/>
+          </w:tcPr>
+          <w:p>
+            <w:pPr>
+              <w:spacing w:before="0" w:after="0"/>
+            </w:pPr>
+            <w:r>
+              <w:rPr>
+                <w:rFonts w:ascii="Arial" w:hAnsi="Arial"/>
+                <w:b/>
+                <w:color w:val="1E293B"/>
+                <w:sz w:val="18"/>
+              </w:rPr>
+              <w:t>71 tính năng, 5 AI module</w:t>
+            </w:r>
+          </w:p>
+        </w:tc>
+        <w:tc>
+          <w:tcPr>
+            <w:tcW w:type="dxa" w:w="2045"/>
+            <w:tcMar>
+              <w:top w:w="70" w:type="dxa"/>
+              <w:bottom w:w="70" w:type="dxa"/>
+              <w:left w:w="100" w:type="dxa"/>
+              <w:right w:w="100" w:type="dxa"/>
+            </w:tcMar>
+            <w:shd w:fill="FFFFFF"/>
+          </w:tcPr>
+          <w:p>
+            <w:pPr>
+              <w:spacing w:before="0" w:after="0"/>
+            </w:pPr>
+            <w:r>
+              <w:rPr>
+                <w:rFonts w:ascii="Arial" w:hAnsi="Arial"/>
+                <w:b/>
+                <w:color w:val="1E293B"/>
+                <w:sz w:val="18"/>
+              </w:rPr>
+              <w:t>~4-5 tháng</w:t>
+            </w:r>
+          </w:p>
+        </w:tc>
+        <w:tc>
+          <w:tcPr>
+            <w:tcW w:type="dxa" w:w="2045"/>
+            <w:tcMar>
+              <w:top w:w="70" w:type="dxa"/>
+              <w:bottom w:w="70" w:type="dxa"/>
+              <w:left w:w="100" w:type="dxa"/>
+              <w:right w:w="100" w:type="dxa"/>
+            </w:tcMar>
+            <w:shd w:fill="FFFFFF"/>
+          </w:tcPr>
+          <w:p>
+            <w:pPr>
+              <w:spacing w:before="0" w:after="0"/>
+            </w:pPr>
+            <w:r>
+              <w:rPr>
+                <w:rFonts w:ascii="Arial" w:hAnsi="Arial"/>
+                <w:b/>
+                <w:color w:val="1E293B"/>
+                <w:sz w:val="18"/>
+              </w:rPr>
+              <w:t>175.000.000</w:t>
+            </w:r>
+          </w:p>
+        </w:tc>
+      </w:tr>
+    </w:tbl>
+    <w:p>
+      <w:pPr>
+        <w:spacing w:after="40"/>
+      </w:pPr>
+    </w:p>
+    <w:p>
+      <w:pPr>
+        <w:keepNext/>
+        <w:spacing w:before="200" w:after="80"/>
+      </w:pPr>
+      <w:r>
+        <w:rPr>
+          <w:rFonts w:ascii="Arial" w:hAnsi="Arial"/>
+          <w:b/>
+          <w:color w:val="2563EB"/>
+          <w:sz w:val="22"/>
+        </w:rPr>
+        <w:t>Lịch trình phát triển &amp; thanh toán theo giai đoạn</w:t>
+      </w:r>
+    </w:p>
+    <w:tbl>
+      <w:tblPr>
+        <w:tblW w:type="auto" w:w="0"/>
+        <w:jc w:val="center"/>
+        <w:tblLook w:firstColumn="1" w:firstRow="1" w:lastColumn="0" w:lastRow="0" w:noHBand="0" w:noVBand="1" w:val="04A0"/>
+        <w:tblBorders>
+          <w:top w:val="single" w:sz="6" w:space="0" w:color="CBD5E1"/>
+          <w:bottom w:val="single" w:sz="6" w:space="0" w:color="CBD5E1"/>
+          <w:left w:val="single" w:sz="6" w:space="0" w:color="CBD5E1"/>
+          <w:right w:val="single" w:sz="6" w:space="0" w:color="CBD5E1"/>
+          <w:insideH w:val="single" w:sz="4" w:space="0" w:color="E2E8F0"/>
+          <w:insideV w:val="single" w:sz="4" w:space="0" w:color="E2E8F0"/>
+        </w:tblBorders>
+      </w:tblPr>
+      <w:tblGrid>
+        <w:gridCol w:w="2556"/>
+        <w:gridCol w:w="2556"/>
+        <w:gridCol w:w="2556"/>
+        <w:gridCol w:w="2556"/>
+      </w:tblGrid>
+      <w:tr>
+        <w:tc>
+          <w:tcPr>
+            <w:tcW w:type="dxa" w:w="2556"/>
+            <w:tcMar>
+              <w:top w:w="70" w:type="dxa"/>
+              <w:bottom w:w="70" w:type="dxa"/>
+              <w:left w:w="100" w:type="dxa"/>
+              <w:right w:w="100" w:type="dxa"/>
+            </w:tcMar>
+            <w:shd w:fill="0F172A"/>
+          </w:tcPr>
+          <w:p>
+            <w:pPr>
+              <w:spacing w:before="0" w:after="0"/>
+            </w:pPr>
+            <w:r>
+              <w:rPr>
+                <w:rFonts w:ascii="Arial" w:hAnsi="Arial"/>
+                <w:b/>
+                <w:color w:val="FFFFFF"/>
+                <w:sz w:val="18"/>
+              </w:rPr>
+              <w:t>Giai đoạn</w:t>
+            </w:r>
+          </w:p>
+        </w:tc>
+        <w:tc>
+          <w:tcPr>
+            <w:tcW w:type="dxa" w:w="2556"/>
+            <w:tcMar>
+              <w:top w:w="70" w:type="dxa"/>
+              <w:bottom w:w="70" w:type="dxa"/>
+              <w:left w:w="100" w:type="dxa"/>
+              <w:right w:w="100" w:type="dxa"/>
+            </w:tcMar>
+            <w:shd w:fill="0F172A"/>
+          </w:tcPr>
+          <w:p>
+            <w:pPr>
+              <w:spacing w:before="0" w:after="0"/>
+            </w:pPr>
+            <w:r>
+              <w:rPr>
+                <w:rFonts w:ascii="Arial" w:hAnsi="Arial"/>
+                <w:b/>
+                <w:color w:val="FFFFFF"/>
+                <w:sz w:val="18"/>
+              </w:rPr>
+              <w:t>Nội dung bàn giao</w:t>
+            </w:r>
+          </w:p>
+        </w:tc>
+        <w:tc>
+          <w:tcPr>
+            <w:tcW w:type="dxa" w:w="2556"/>
+            <w:tcMar>
+              <w:top w:w="70" w:type="dxa"/>
+              <w:bottom w:w="70" w:type="dxa"/>
+              <w:left w:w="100" w:type="dxa"/>
+              <w:right w:w="100" w:type="dxa"/>
+            </w:tcMar>
+            <w:shd w:fill="0F172A"/>
+          </w:tcPr>
+          <w:p>
+            <w:pPr>
+              <w:spacing w:before="0" w:after="0"/>
+            </w:pPr>
+            <w:r>
+              <w:rPr>
+                <w:rFonts w:ascii="Arial" w:hAnsi="Arial"/>
+                <w:b/>
+                <w:color w:val="FFFFFF"/>
+                <w:sz w:val="18"/>
+              </w:rPr>
+              <w:t>Thời gian</w:t>
+            </w:r>
+          </w:p>
+        </w:tc>
+        <w:tc>
+          <w:tcPr>
+            <w:tcW w:type="dxa" w:w="2556"/>
+            <w:tcMar>
+              <w:top w:w="70" w:type="dxa"/>
+              <w:bottom w:w="70" w:type="dxa"/>
+              <w:left w:w="100" w:type="dxa"/>
+              <w:right w:w="100" w:type="dxa"/>
+            </w:tcMar>
+            <w:shd w:fill="0F172A"/>
+          </w:tcPr>
+          <w:p>
+            <w:pPr>
+              <w:spacing w:before="0" w:after="0"/>
+            </w:pPr>
+            <w:r>
+              <w:rPr>
+                <w:rFonts w:ascii="Arial" w:hAnsi="Arial"/>
+                <w:b/>
+                <w:color w:val="FFFFFF"/>
+                <w:sz w:val="18"/>
+              </w:rPr>
+              <w:t>Thanh toán</w:t>
+            </w:r>
+          </w:p>
+        </w:tc>
+      </w:tr>
+      <w:tr>
+        <w:tc>
+          <w:tcPr>
+            <w:tcW w:type="dxa" w:w="2556"/>
+            <w:tcMar>
+              <w:top w:w="70" w:type="dxa"/>
+              <w:bottom w:w="70" w:type="dxa"/>
+              <w:left w:w="100" w:type="dxa"/>
+              <w:right w:w="100" w:type="dxa"/>
+            </w:tcMar>
+            <w:shd w:fill="FFFFFF"/>
+          </w:tcPr>
+          <w:p>
+            <w:pPr>
+              <w:spacing w:before="0" w:after="0"/>
+            </w:pPr>
+            <w:r>
+              <w:rPr>
+                <w:rFonts w:ascii="Arial" w:hAnsi="Arial"/>
+                <w:color w:val="1E293B"/>
+                <w:sz w:val="18"/>
+              </w:rPr>
+              <w:t>GĐ 1: Nền tảng (Tháng 1-2)</w:t>
+            </w:r>
+          </w:p>
+        </w:tc>
+        <w:tc>
+          <w:tcPr>
+            <w:tcW w:type="dxa" w:w="2556"/>
+            <w:tcMar>
+              <w:top w:w="70" w:type="dxa"/>
+              <w:bottom w:w="70" w:type="dxa"/>
+              <w:left w:w="100" w:type="dxa"/>
+              <w:right w:w="100" w:type="dxa"/>
+            </w:tcMar>
+            <w:shd w:fill="FFFFFF"/>
+          </w:tcPr>
+          <w:p>
+            <w:pPr>
+              <w:spacing w:before="0" w:after="0"/>
+            </w:pPr>
+            <w:r>
+              <w:rPr>
+                <w:rFonts w:ascii="Arial" w:hAnsi="Arial"/>
+                <w:color w:val="1E293B"/>
+                <w:sz w:val="18"/>
+              </w:rPr>
+              <w:t>Backend API + Database + QR Order cơ bản + KDS cơ bản, chạy thử được luồng đặt-pha-xong</w:t>
+            </w:r>
+          </w:p>
+        </w:tc>
+        <w:tc>
+          <w:tcPr>
+            <w:tcW w:type="dxa" w:w="2556"/>
+            <w:tcMar>
+              <w:top w:w="70" w:type="dxa"/>
+              <w:bottom w:w="70" w:type="dxa"/>
+              <w:left w:w="100" w:type="dxa"/>
+              <w:right w:w="100" w:type="dxa"/>
+            </w:tcMar>
+            <w:shd w:fill="FFFFFF"/>
+          </w:tcPr>
+          <w:p>
+            <w:pPr>
+              <w:spacing w:before="0" w:after="0"/>
+            </w:pPr>
+            <w:r>
+              <w:rPr>
+                <w:rFonts w:ascii="Arial" w:hAnsi="Arial"/>
+                <w:color w:val="1E293B"/>
+                <w:sz w:val="18"/>
+              </w:rPr>
+              <w:t>8 tuần</w:t>
+            </w:r>
+          </w:p>
+        </w:tc>
+        <w:tc>
+          <w:tcPr>
+            <w:tcW w:type="dxa" w:w="2556"/>
+            <w:tcMar>
+              <w:top w:w="70" w:type="dxa"/>
+              <w:bottom w:w="70" w:type="dxa"/>
+              <w:left w:w="100" w:type="dxa"/>
+              <w:right w:w="100" w:type="dxa"/>
+            </w:tcMar>
+            <w:shd w:fill="FFFFFF"/>
+          </w:tcPr>
+          <w:p>
+            <w:pPr>
+              <w:spacing w:before="0" w:after="0"/>
+            </w:pPr>
+            <w:r>
+              <w:rPr>
+                <w:rFonts w:ascii="Arial" w:hAnsi="Arial"/>
+                <w:color w:val="1E293B"/>
+                <w:sz w:val="18"/>
+              </w:rPr>
+              <w:t>70.000.000 (40%)</w:t>
+            </w:r>
+          </w:p>
+        </w:tc>
+      </w:tr>
+      <w:tr>
+        <w:tc>
+          <w:tcPr>
+            <w:tcW w:type="dxa" w:w="2556"/>
+            <w:tcMar>
+              <w:top w:w="70" w:type="dxa"/>
+              <w:bottom w:w="70" w:type="dxa"/>
+              <w:left w:w="100" w:type="dxa"/>
+              <w:right w:w="100" w:type="dxa"/>
+            </w:tcMar>
+            <w:shd w:fill="F8FAFC"/>
+          </w:tcPr>
+          <w:p>
+            <w:pPr>
+              <w:spacing w:before="0" w:after="0"/>
+            </w:pPr>
+            <w:r>
+              <w:rPr>
+                <w:rFonts w:ascii="Arial" w:hAnsi="Arial"/>
+                <w:color w:val="1E293B"/>
+                <w:sz w:val="18"/>
+              </w:rPr>
+              <w:t>GĐ 2: Hoàn thiện (Tháng 3-4)</w:t>
+            </w:r>
+          </w:p>
+        </w:tc>
+        <w:tc>
+          <w:tcPr>
+            <w:tcW w:type="dxa" w:w="2556"/>
+            <w:tcMar>
+              <w:top w:w="70" w:type="dxa"/>
+              <w:bottom w:w="70" w:type="dxa"/>
+              <w:left w:w="100" w:type="dxa"/>
+              <w:right w:w="100" w:type="dxa"/>
+            </w:tcMar>
+            <w:shd w:fill="F8FAFC"/>
+          </w:tcPr>
+          <w:p>
+            <w:pPr>
+              <w:spacing w:before="0" w:after="0"/>
+            </w:pPr>
+            <w:r>
+              <w:rPr>
+                <w:rFonts w:ascii="Arial" w:hAnsi="Arial"/>
+                <w:color w:val="1E293B"/>
+                <w:sz w:val="18"/>
+              </w:rPr>
+              <w:t>Manager App + Admin Dashboard + thanh toán VietQR + CRM + Loyalty + Offline Mode</w:t>
+            </w:r>
+          </w:p>
+        </w:tc>
+        <w:tc>
+          <w:tcPr>
+            <w:tcW w:type="dxa" w:w="2556"/>
+            <w:tcMar>
+              <w:top w:w="70" w:type="dxa"/>
+              <w:bottom w:w="70" w:type="dxa"/>
+              <w:left w:w="100" w:type="dxa"/>
+              <w:right w:w="100" w:type="dxa"/>
+            </w:tcMar>
+            <w:shd w:fill="F8FAFC"/>
+          </w:tcPr>
+          <w:p>
+            <w:pPr>
+              <w:spacing w:before="0" w:after="0"/>
+            </w:pPr>
+            <w:r>
+              <w:rPr>
+                <w:rFonts w:ascii="Arial" w:hAnsi="Arial"/>
+                <w:color w:val="1E293B"/>
+                <w:sz w:val="18"/>
+              </w:rPr>
+              <w:t>8 tuần</w:t>
+            </w:r>
+          </w:p>
+        </w:tc>
+        <w:tc>
+          <w:tcPr>
+            <w:tcW w:type="dxa" w:w="2556"/>
+            <w:tcMar>
+              <w:top w:w="70" w:type="dxa"/>
+              <w:bottom w:w="70" w:type="dxa"/>
+              <w:left w:w="100" w:type="dxa"/>
+              <w:right w:w="100" w:type="dxa"/>
+            </w:tcMar>
+            <w:shd w:fill="F8FAFC"/>
+          </w:tcPr>
+          <w:p>
+            <w:pPr>
+              <w:spacing w:before="0" w:after="0"/>
+            </w:pPr>
+            <w:r>
+              <w:rPr>
+                <w:rFonts w:ascii="Arial" w:hAnsi="Arial"/>
+                <w:color w:val="1E293B"/>
+                <w:sz w:val="18"/>
+              </w:rPr>
+              <w:t>60.000.000 (34%)</w:t>
+            </w:r>
+          </w:p>
+        </w:tc>
+      </w:tr>
+      <w:tr>
+        <w:tc>
+          <w:tcPr>
+            <w:tcW w:type="dxa" w:w="2556"/>
+            <w:tcMar>
+              <w:top w:w="70" w:type="dxa"/>
+              <w:bottom w:w="70" w:type="dxa"/>
+              <w:left w:w="100" w:type="dxa"/>
+              <w:right w:w="100" w:type="dxa"/>
+            </w:tcMar>
+            <w:shd w:fill="FFFFFF"/>
+          </w:tcPr>
+          <w:p>
+            <w:pPr>
+              <w:spacing w:before="0" w:after="0"/>
+            </w:pPr>
+            <w:r>
+              <w:rPr>
+                <w:rFonts w:ascii="Arial" w:hAnsi="Arial"/>
+                <w:color w:val="1E293B"/>
+                <w:sz w:val="18"/>
+              </w:rPr>
+              <w:t>GĐ 3: AI &amp; Golive (Tháng 4-5)</w:t>
+            </w:r>
+          </w:p>
+        </w:tc>
+        <w:tc>
+          <w:tcPr>
+            <w:tcW w:type="dxa" w:w="2556"/>
+            <w:tcMar>
+              <w:top w:w="70" w:type="dxa"/>
+              <w:bottom w:w="70" w:type="dxa"/>
+              <w:left w:w="100" w:type="dxa"/>
+              <w:right w:w="100" w:type="dxa"/>
+            </w:tcMar>
+            <w:shd w:fill="FFFFFF"/>
+          </w:tcPr>
+          <w:p>
+            <w:pPr>
+              <w:spacing w:before="0" w:after="0"/>
+            </w:pPr>
+            <w:r>
+              <w:rPr>
+                <w:rFonts w:ascii="Arial" w:hAnsi="Arial"/>
+                <w:color w:val="1E293B"/>
+                <w:sz w:val="18"/>
+              </w:rPr>
+              <w:t>5 AI module + Chatbot + Testing + Deploy production + Đào tạo + Nghiệm thu</w:t>
+            </w:r>
+          </w:p>
+        </w:tc>
+        <w:tc>
+          <w:tcPr>
+            <w:tcW w:type="dxa" w:w="2556"/>
+            <w:tcMar>
+              <w:top w:w="70" w:type="dxa"/>
+              <w:bottom w:w="70" w:type="dxa"/>
+              <w:left w:w="100" w:type="dxa"/>
+              <w:right w:w="100" w:type="dxa"/>
+            </w:tcMar>
+            <w:shd w:fill="FFFFFF"/>
+          </w:tcPr>
+          <w:p>
+            <w:pPr>
+              <w:spacing w:before="0" w:after="0"/>
+            </w:pPr>
+            <w:r>
+              <w:rPr>
+                <w:rFonts w:ascii="Arial" w:hAnsi="Arial"/>
+                <w:color w:val="1E293B"/>
+                <w:sz w:val="18"/>
+              </w:rPr>
+              <w:t>4 tuần</w:t>
+            </w:r>
+          </w:p>
+        </w:tc>
+        <w:tc>
+          <w:tcPr>
+            <w:tcW w:type="dxa" w:w="2556"/>
+            <w:tcMar>
+              <w:top w:w="70" w:type="dxa"/>
+              <w:bottom w:w="70" w:type="dxa"/>
+              <w:left w:w="100" w:type="dxa"/>
+              <w:right w:w="100" w:type="dxa"/>
+            </w:tcMar>
+            <w:shd w:fill="FFFFFF"/>
+          </w:tcPr>
+          <w:p>
+            <w:pPr>
+              <w:spacing w:before="0" w:after="0"/>
+            </w:pPr>
+            <w:r>
+              <w:rPr>
+                <w:rFonts w:ascii="Arial" w:hAnsi="Arial"/>
+                <w:color w:val="1E293B"/>
+                <w:sz w:val="18"/>
+              </w:rPr>
+              <w:t>45.000.000 (26%)</w:t>
+            </w:r>
+          </w:p>
+        </w:tc>
+      </w:tr>
+    </w:tbl>
+    <w:p>
+      <w:pPr>
+        <w:spacing w:after="40"/>
+      </w:pPr>
+    </w:p>
+    <w:p>
+      <w:pPr>
+        <w:keepNext/>
+        <w:spacing w:before="280" w:after="120"/>
+        <w:pBdr>
+          <w:bottom w:val="single" w:sz="8" w:space="4" w:color="CBD5E1"/>
+        </w:pBdr>
+      </w:pPr>
+      <w:r>
+        <w:rPr>
+          <w:rFonts w:ascii="Arial" w:hAnsi="Arial"/>
+          <w:b/>
+          <w:color w:val="0F172A"/>
+          <w:sz w:val="26"/>
+        </w:rPr>
+        <w:t>B. CHI PHÍ THIẾT BỊ PHẦN CỨNG (Thanh toán 1 lần)</w:t>
       </w:r>
     </w:p>
     <w:p>
@@ -211,18 +1967,6 @@
         <w:t>Mặt ngoài (Khách hàng): Màn hình phụ 10 inch — hiển thị chi tiết đơn hàng, giá tiền, tổng cộng và mã VietQR thanh toán.</w:t>
       </w:r>
     </w:p>
-    <w:p>
-      <w:pPr>
-        <w:spacing w:before="0" w:after="60"/>
-      </w:pPr>
-      <w:r>
-        <w:rPr>
-          <w:rFonts w:ascii="Arial" w:hAnsi="Arial"/>
-          <w:sz w:val="20"/>
-        </w:rPr>
-        <w:t>Thiết bị chạy liên tục cả ngày (16-18 tiếng), thiết kế chuyên dụng cho ngành F&amp;B, có quạt tản nhiệt và pin dự phòng khi mất điện.</w:t>
-      </w:r>
-    </w:p>
     <w:tbl>
       <w:tblPr>
         <w:tblW w:type="auto" w:w="0"/>
@@ -1158,7 +2902,7 @@
                 <w:color w:val="1E293B"/>
                 <w:sz w:val="18"/>
               </w:rPr>
-              <w:t>Tự chuyển sang 4G khi WiFi chết, không gián đoạn</w:t>
+              <w:t>Tự chuyển sang 4G khi WiFi chết</w:t>
             </w:r>
           </w:p>
         </w:tc>
@@ -1678,136 +3422,6 @@
       <w:pPr>
         <w:spacing w:after="40"/>
       </w:pPr>
-    </w:p>
-    <w:p>
-      <w:pPr>
-        <w:keepNext/>
-        <w:spacing w:before="200" w:after="80"/>
-      </w:pPr>
-      <w:r>
-        <w:rPr>
-          <w:rFonts w:ascii="Arial" w:hAnsi="Arial"/>
-          <w:b/>
-          <w:color w:val="2563EB"/>
-          <w:sz w:val="22"/>
-        </w:rPr>
-        <w:t>Máy POS 2 màn hình hoạt động như thế nào?</w:t>
-      </w:r>
-    </w:p>
-    <w:p>
-      <w:pPr>
-        <w:spacing w:before="0" w:after="60"/>
-      </w:pPr>
-      <w:r>
-        <w:rPr>
-          <w:rFonts w:ascii="Arial" w:hAnsi="Arial"/>
-          <w:sz w:val="20"/>
-        </w:rPr>
-        <w:t>Mặt nhân viên (15.6 inch cảm ứng):</w:t>
-      </w:r>
-    </w:p>
-    <w:p>
-      <w:pPr>
-        <w:spacing w:before="0" w:after="60"/>
-        <w:ind w:left="360"/>
-      </w:pPr>
-      <w:r>
-        <w:rPr>
-          <w:rFonts w:ascii="Arial" w:hAnsi="Arial"/>
-          <w:sz w:val="20"/>
-        </w:rPr>
-        <w:t>Hiển thị đơn hàng real-time từ QR Order của khách.</w:t>
-      </w:r>
-    </w:p>
-    <w:p>
-      <w:pPr>
-        <w:spacing w:before="0" w:after="60"/>
-        <w:ind w:left="360"/>
-      </w:pPr>
-      <w:r>
-        <w:rPr>
-          <w:rFonts w:ascii="Arial" w:hAnsi="Arial"/>
-          <w:sz w:val="20"/>
-        </w:rPr>
-        <w:t>Nhân viên bấm cảm ứng: hoàn thành đơn, báo hết món, xem sơ đồ bàn.</w:t>
-      </w:r>
-    </w:p>
-    <w:p>
-      <w:pPr>
-        <w:spacing w:before="0" w:after="60"/>
-        <w:ind w:left="360"/>
-      </w:pPr>
-      <w:r>
-        <w:rPr>
-          <w:rFonts w:ascii="Arial" w:hAnsi="Arial"/>
-          <w:sz w:val="20"/>
-        </w:rPr>
-        <w:t>Hiển thị công thức pha chi tiết kèm mỗi đơn.</w:t>
-      </w:r>
-    </w:p>
-    <w:p>
-      <w:pPr>
-        <w:spacing w:before="0" w:after="60"/>
-        <w:ind w:left="360"/>
-      </w:pPr>
-      <w:r>
-        <w:rPr>
-          <w:rFonts w:ascii="Arial" w:hAnsi="Arial"/>
-          <w:sz w:val="20"/>
-        </w:rPr>
-        <w:t>Tạo đơn thủ công cho khách order tại quầy (Takeaway).</w:t>
-      </w:r>
-    </w:p>
-    <w:p>
-      <w:pPr>
-        <w:spacing w:before="0" w:after="60"/>
-      </w:pPr>
-      <w:r>
-        <w:rPr>
-          <w:rFonts w:ascii="Arial" w:hAnsi="Arial"/>
-          <w:sz w:val="20"/>
-        </w:rPr>
-        <w:t>Mặt khách hàng (10 inch hiển thị):</w:t>
-      </w:r>
-    </w:p>
-    <w:p>
-      <w:pPr>
-        <w:spacing w:before="0" w:after="60"/>
-        <w:ind w:left="360"/>
-      </w:pPr>
-      <w:r>
-        <w:rPr>
-          <w:rFonts w:ascii="Arial" w:hAnsi="Arial"/>
-          <w:sz w:val="20"/>
-        </w:rPr>
-        <w:t>Hiển thị danh sách món đang order, số lượng, đơn giá và tổng tiền.</w:t>
-      </w:r>
-    </w:p>
-    <w:p>
-      <w:pPr>
-        <w:spacing w:before="0" w:after="60"/>
-        <w:ind w:left="360"/>
-      </w:pPr>
-      <w:r>
-        <w:rPr>
-          <w:rFonts w:ascii="Arial" w:hAnsi="Arial"/>
-          <w:sz w:val="20"/>
-        </w:rPr>
-        <w:t>Hiển thị mã VietQR để khách quét thanh toán chuyển khoản.</w:t>
-      </w:r>
-    </w:p>
-    <w:p>
-      <w:pPr>
-        <w:spacing w:before="0" w:after="60"/>
-        <w:ind w:left="360"/>
-      </w:pPr>
-      <w:r>
-        <w:rPr>
-          <w:rFonts w:ascii="Arial" w:hAnsi="Arial"/>
-          <w:sz w:val="20"/>
-        </w:rPr>
-        <w:t>Khách kiểm tra đơn hàng minh bạch trước khi thanh toán.</w:t>
-      </w:r>
     </w:p>
     <w:p>
       <w:pPr>
@@ -1824,7 +3438,7 @@
           <w:color w:val="0F172A"/>
           <w:sz w:val="26"/>
         </w:rPr>
-        <w:t>B. CHI PHÍ VẬN HÀNH HÀNG THÁNG (Cho cả 3 chi nhánh)</w:t>
+        <w:t>C. CHI PHÍ VẬN HÀNH HÀNG THÁNG (Cho cả 3 chi nhánh)</w:t>
       </w:r>
     </w:p>
     <w:tbl>
@@ -2356,7 +3970,7 @@
                 <w:color w:val="1E293B"/>
                 <w:sz w:val="18"/>
               </w:rPr>
-              <w:t>3 quán x 150.000/tháng, chỉ dùng khi WiFi chết</w:t>
+              <w:t>3 quán x 150.000/tháng</w:t>
             </w:r>
           </w:p>
         </w:tc>
@@ -2651,7 +4265,1337 @@
           <w:color w:val="0F172A"/>
           <w:sz w:val="26"/>
         </w:rPr>
-        <w:t>C. DỊCH VỤ MIỄN PHÍ ĐI KÈM (0 đ)</w:t>
+        <w:t>D. CHI PHÍ BẢO TRÌ PHẦN MỀM</w:t>
+      </w:r>
+    </w:p>
+    <w:p>
+      <w:pPr>
+        <w:keepNext/>
+        <w:spacing w:before="200" w:after="80"/>
+      </w:pPr>
+      <w:r>
+        <w:rPr>
+          <w:rFonts w:ascii="Arial" w:hAnsi="Arial"/>
+          <w:b/>
+          <w:color w:val="2563EB"/>
+          <w:sz w:val="22"/>
+        </w:rPr>
+        <w:t>Gói bảo trì cơ bản (Đề xuất)</w:t>
+      </w:r>
+    </w:p>
+    <w:tbl>
+      <w:tblPr>
+        <w:tblW w:type="auto" w:w="0"/>
+        <w:jc w:val="center"/>
+        <w:tblLook w:firstColumn="1" w:firstRow="1" w:lastColumn="0" w:lastRow="0" w:noHBand="0" w:noVBand="1" w:val="04A0"/>
+        <w:tblBorders>
+          <w:top w:val="single" w:sz="6" w:space="0" w:color="CBD5E1"/>
+          <w:bottom w:val="single" w:sz="6" w:space="0" w:color="CBD5E1"/>
+          <w:left w:val="single" w:sz="6" w:space="0" w:color="CBD5E1"/>
+          <w:right w:val="single" w:sz="6" w:space="0" w:color="CBD5E1"/>
+          <w:insideH w:val="single" w:sz="4" w:space="0" w:color="E2E8F0"/>
+          <w:insideV w:val="single" w:sz="4" w:space="0" w:color="E2E8F0"/>
+        </w:tblBorders>
+      </w:tblPr>
+      <w:tblGrid>
+        <w:gridCol w:w="3408"/>
+        <w:gridCol w:w="3408"/>
+        <w:gridCol w:w="3408"/>
+      </w:tblGrid>
+      <w:tr>
+        <w:tc>
+          <w:tcPr>
+            <w:tcW w:type="dxa" w:w="3408"/>
+            <w:tcMar>
+              <w:top w:w="70" w:type="dxa"/>
+              <w:bottom w:w="70" w:type="dxa"/>
+              <w:left w:w="100" w:type="dxa"/>
+              <w:right w:w="100" w:type="dxa"/>
+            </w:tcMar>
+            <w:shd w:fill="0F172A"/>
+          </w:tcPr>
+          <w:p>
+            <w:pPr>
+              <w:spacing w:before="0" w:after="0"/>
+            </w:pPr>
+            <w:r>
+              <w:rPr>
+                <w:rFonts w:ascii="Arial" w:hAnsi="Arial"/>
+                <w:b/>
+                <w:color w:val="FFFFFF"/>
+                <w:sz w:val="18"/>
+              </w:rPr>
+              <w:t>Hạng mục</w:t>
+            </w:r>
+          </w:p>
+        </w:tc>
+        <w:tc>
+          <w:tcPr>
+            <w:tcW w:type="dxa" w:w="3408"/>
+            <w:tcMar>
+              <w:top w:w="70" w:type="dxa"/>
+              <w:bottom w:w="70" w:type="dxa"/>
+              <w:left w:w="100" w:type="dxa"/>
+              <w:right w:w="100" w:type="dxa"/>
+            </w:tcMar>
+            <w:shd w:fill="0F172A"/>
+          </w:tcPr>
+          <w:p>
+            <w:pPr>
+              <w:spacing w:before="0" w:after="0"/>
+            </w:pPr>
+            <w:r>
+              <w:rPr>
+                <w:rFonts w:ascii="Arial" w:hAnsi="Arial"/>
+                <w:b/>
+                <w:color w:val="FFFFFF"/>
+                <w:sz w:val="18"/>
+              </w:rPr>
+              <w:t>Nội dung</w:t>
+            </w:r>
+          </w:p>
+        </w:tc>
+        <w:tc>
+          <w:tcPr>
+            <w:tcW w:type="dxa" w:w="3408"/>
+            <w:tcMar>
+              <w:top w:w="70" w:type="dxa"/>
+              <w:bottom w:w="70" w:type="dxa"/>
+              <w:left w:w="100" w:type="dxa"/>
+              <w:right w:w="100" w:type="dxa"/>
+            </w:tcMar>
+            <w:shd w:fill="0F172A"/>
+          </w:tcPr>
+          <w:p>
+            <w:pPr>
+              <w:spacing w:before="0" w:after="0"/>
+            </w:pPr>
+            <w:r>
+              <w:rPr>
+                <w:rFonts w:ascii="Arial" w:hAnsi="Arial"/>
+                <w:b/>
+                <w:color w:val="FFFFFF"/>
+                <w:sz w:val="18"/>
+              </w:rPr>
+              <w:t>Chi phí/tháng</w:t>
+            </w:r>
+          </w:p>
+        </w:tc>
+      </w:tr>
+      <w:tr>
+        <w:tc>
+          <w:tcPr>
+            <w:tcW w:type="dxa" w:w="3408"/>
+            <w:tcMar>
+              <w:top w:w="70" w:type="dxa"/>
+              <w:bottom w:w="70" w:type="dxa"/>
+              <w:left w:w="100" w:type="dxa"/>
+              <w:right w:w="100" w:type="dxa"/>
+            </w:tcMar>
+            <w:shd w:fill="FFFFFF"/>
+          </w:tcPr>
+          <w:p>
+            <w:pPr>
+              <w:spacing w:before="0" w:after="0"/>
+            </w:pPr>
+            <w:r>
+              <w:rPr>
+                <w:rFonts w:ascii="Arial" w:hAnsi="Arial"/>
+                <w:color w:val="1E293B"/>
+                <w:sz w:val="18"/>
+              </w:rPr>
+              <w:t>Sửa lỗi phần mềm (Bug fix)</w:t>
+            </w:r>
+          </w:p>
+        </w:tc>
+        <w:tc>
+          <w:tcPr>
+            <w:tcW w:type="dxa" w:w="3408"/>
+            <w:tcMar>
+              <w:top w:w="70" w:type="dxa"/>
+              <w:bottom w:w="70" w:type="dxa"/>
+              <w:left w:w="100" w:type="dxa"/>
+              <w:right w:w="100" w:type="dxa"/>
+            </w:tcMar>
+            <w:shd w:fill="FFFFFF"/>
+          </w:tcPr>
+          <w:p>
+            <w:pPr>
+              <w:spacing w:before="0" w:after="0"/>
+            </w:pPr>
+            <w:r>
+              <w:rPr>
+                <w:rFonts w:ascii="Arial" w:hAnsi="Arial"/>
+                <w:color w:val="1E293B"/>
+                <w:sz w:val="18"/>
+              </w:rPr>
+              <w:t>Xử lý lỗi phát sinh trong quá trình vận hành, thời gian phản hồi trong 24 giờ làm việc</w:t>
+            </w:r>
+          </w:p>
+        </w:tc>
+        <w:tc>
+          <w:tcPr>
+            <w:tcW w:type="dxa" w:w="3408"/>
+            <w:tcMar>
+              <w:top w:w="70" w:type="dxa"/>
+              <w:bottom w:w="70" w:type="dxa"/>
+              <w:left w:w="100" w:type="dxa"/>
+              <w:right w:w="100" w:type="dxa"/>
+            </w:tcMar>
+            <w:shd w:fill="FFFFFF"/>
+          </w:tcPr>
+          <w:p>
+            <w:pPr>
+              <w:spacing w:before="0" w:after="0"/>
+            </w:pPr>
+            <w:r>
+              <w:rPr>
+                <w:rFonts w:ascii="Arial" w:hAnsi="Arial"/>
+                <w:color w:val="1E293B"/>
+                <w:sz w:val="18"/>
+              </w:rPr>
+              <w:t>Bao gồm</w:t>
+            </w:r>
+          </w:p>
+        </w:tc>
+      </w:tr>
+      <w:tr>
+        <w:tc>
+          <w:tcPr>
+            <w:tcW w:type="dxa" w:w="3408"/>
+            <w:tcMar>
+              <w:top w:w="70" w:type="dxa"/>
+              <w:bottom w:w="70" w:type="dxa"/>
+              <w:left w:w="100" w:type="dxa"/>
+              <w:right w:w="100" w:type="dxa"/>
+            </w:tcMar>
+            <w:shd w:fill="F8FAFC"/>
+          </w:tcPr>
+          <w:p>
+            <w:pPr>
+              <w:spacing w:before="0" w:after="0"/>
+            </w:pPr>
+            <w:r>
+              <w:rPr>
+                <w:rFonts w:ascii="Arial" w:hAnsi="Arial"/>
+                <w:color w:val="1E293B"/>
+                <w:sz w:val="18"/>
+              </w:rPr>
+              <w:t>Cập nhật bảo mật</w:t>
+            </w:r>
+          </w:p>
+        </w:tc>
+        <w:tc>
+          <w:tcPr>
+            <w:tcW w:type="dxa" w:w="3408"/>
+            <w:tcMar>
+              <w:top w:w="70" w:type="dxa"/>
+              <w:bottom w:w="70" w:type="dxa"/>
+              <w:left w:w="100" w:type="dxa"/>
+              <w:right w:w="100" w:type="dxa"/>
+            </w:tcMar>
+            <w:shd w:fill="F8FAFC"/>
+          </w:tcPr>
+          <w:p>
+            <w:pPr>
+              <w:spacing w:before="0" w:after="0"/>
+            </w:pPr>
+            <w:r>
+              <w:rPr>
+                <w:rFonts w:ascii="Arial" w:hAnsi="Arial"/>
+                <w:color w:val="1E293B"/>
+                <w:sz w:val="18"/>
+              </w:rPr>
+              <w:t>Vá lỗ hổng bảo mật, cập nhật thư viện, chống tấn công</w:t>
+            </w:r>
+          </w:p>
+        </w:tc>
+        <w:tc>
+          <w:tcPr>
+            <w:tcW w:type="dxa" w:w="3408"/>
+            <w:tcMar>
+              <w:top w:w="70" w:type="dxa"/>
+              <w:bottom w:w="70" w:type="dxa"/>
+              <w:left w:w="100" w:type="dxa"/>
+              <w:right w:w="100" w:type="dxa"/>
+            </w:tcMar>
+            <w:shd w:fill="F8FAFC"/>
+          </w:tcPr>
+          <w:p>
+            <w:pPr>
+              <w:spacing w:before="0" w:after="0"/>
+            </w:pPr>
+            <w:r>
+              <w:rPr>
+                <w:rFonts w:ascii="Arial" w:hAnsi="Arial"/>
+                <w:color w:val="1E293B"/>
+                <w:sz w:val="18"/>
+              </w:rPr>
+              <w:t>Bao gồm</w:t>
+            </w:r>
+          </w:p>
+        </w:tc>
+      </w:tr>
+      <w:tr>
+        <w:tc>
+          <w:tcPr>
+            <w:tcW w:type="dxa" w:w="3408"/>
+            <w:tcMar>
+              <w:top w:w="70" w:type="dxa"/>
+              <w:bottom w:w="70" w:type="dxa"/>
+              <w:left w:w="100" w:type="dxa"/>
+              <w:right w:w="100" w:type="dxa"/>
+            </w:tcMar>
+            <w:shd w:fill="FFFFFF"/>
+          </w:tcPr>
+          <w:p>
+            <w:pPr>
+              <w:spacing w:before="0" w:after="0"/>
+            </w:pPr>
+            <w:r>
+              <w:rPr>
+                <w:rFonts w:ascii="Arial" w:hAnsi="Arial"/>
+                <w:color w:val="1E293B"/>
+                <w:sz w:val="18"/>
+              </w:rPr>
+              <w:t>Giám sát server</w:t>
+            </w:r>
+          </w:p>
+        </w:tc>
+        <w:tc>
+          <w:tcPr>
+            <w:tcW w:type="dxa" w:w="3408"/>
+            <w:tcMar>
+              <w:top w:w="70" w:type="dxa"/>
+              <w:bottom w:w="70" w:type="dxa"/>
+              <w:left w:w="100" w:type="dxa"/>
+              <w:right w:w="100" w:type="dxa"/>
+            </w:tcMar>
+            <w:shd w:fill="FFFFFF"/>
+          </w:tcPr>
+          <w:p>
+            <w:pPr>
+              <w:spacing w:before="0" w:after="0"/>
+            </w:pPr>
+            <w:r>
+              <w:rPr>
+                <w:rFonts w:ascii="Arial" w:hAnsi="Arial"/>
+                <w:color w:val="1E293B"/>
+                <w:sz w:val="18"/>
+              </w:rPr>
+              <w:t>Theo dõi uptime, cảnh báo khi server quá tải hoặc sập</w:t>
+            </w:r>
+          </w:p>
+        </w:tc>
+        <w:tc>
+          <w:tcPr>
+            <w:tcW w:type="dxa" w:w="3408"/>
+            <w:tcMar>
+              <w:top w:w="70" w:type="dxa"/>
+              <w:bottom w:w="70" w:type="dxa"/>
+              <w:left w:w="100" w:type="dxa"/>
+              <w:right w:w="100" w:type="dxa"/>
+            </w:tcMar>
+            <w:shd w:fill="FFFFFF"/>
+          </w:tcPr>
+          <w:p>
+            <w:pPr>
+              <w:spacing w:before="0" w:after="0"/>
+            </w:pPr>
+            <w:r>
+              <w:rPr>
+                <w:rFonts w:ascii="Arial" w:hAnsi="Arial"/>
+                <w:color w:val="1E293B"/>
+                <w:sz w:val="18"/>
+              </w:rPr>
+              <w:t>Bao gồm</w:t>
+            </w:r>
+          </w:p>
+        </w:tc>
+      </w:tr>
+      <w:tr>
+        <w:tc>
+          <w:tcPr>
+            <w:tcW w:type="dxa" w:w="3408"/>
+            <w:tcMar>
+              <w:top w:w="70" w:type="dxa"/>
+              <w:bottom w:w="70" w:type="dxa"/>
+              <w:left w:w="100" w:type="dxa"/>
+              <w:right w:w="100" w:type="dxa"/>
+            </w:tcMar>
+            <w:shd w:fill="F8FAFC"/>
+          </w:tcPr>
+          <w:p>
+            <w:pPr>
+              <w:spacing w:before="0" w:after="0"/>
+            </w:pPr>
+            <w:r>
+              <w:rPr>
+                <w:rFonts w:ascii="Arial" w:hAnsi="Arial"/>
+                <w:color w:val="1E293B"/>
+                <w:sz w:val="18"/>
+              </w:rPr>
+              <w:t>Backup &amp; phục hồi</w:t>
+            </w:r>
+          </w:p>
+        </w:tc>
+        <w:tc>
+          <w:tcPr>
+            <w:tcW w:type="dxa" w:w="3408"/>
+            <w:tcMar>
+              <w:top w:w="70" w:type="dxa"/>
+              <w:bottom w:w="70" w:type="dxa"/>
+              <w:left w:w="100" w:type="dxa"/>
+              <w:right w:w="100" w:type="dxa"/>
+            </w:tcMar>
+            <w:shd w:fill="F8FAFC"/>
+          </w:tcPr>
+          <w:p>
+            <w:pPr>
+              <w:spacing w:before="0" w:after="0"/>
+            </w:pPr>
+            <w:r>
+              <w:rPr>
+                <w:rFonts w:ascii="Arial" w:hAnsi="Arial"/>
+                <w:color w:val="1E293B"/>
+                <w:sz w:val="18"/>
+              </w:rPr>
+              <w:t>Sao lưu hàng ngày, hỗ trợ phục hồi khi có sự cố</w:t>
+            </w:r>
+          </w:p>
+        </w:tc>
+        <w:tc>
+          <w:tcPr>
+            <w:tcW w:type="dxa" w:w="3408"/>
+            <w:tcMar>
+              <w:top w:w="70" w:type="dxa"/>
+              <w:bottom w:w="70" w:type="dxa"/>
+              <w:left w:w="100" w:type="dxa"/>
+              <w:right w:w="100" w:type="dxa"/>
+            </w:tcMar>
+            <w:shd w:fill="F8FAFC"/>
+          </w:tcPr>
+          <w:p>
+            <w:pPr>
+              <w:spacing w:before="0" w:after="0"/>
+            </w:pPr>
+            <w:r>
+              <w:rPr>
+                <w:rFonts w:ascii="Arial" w:hAnsi="Arial"/>
+                <w:color w:val="1E293B"/>
+                <w:sz w:val="18"/>
+              </w:rPr>
+              <w:t>Bao gồm</w:t>
+            </w:r>
+          </w:p>
+        </w:tc>
+      </w:tr>
+      <w:tr>
+        <w:tc>
+          <w:tcPr>
+            <w:tcW w:type="dxa" w:w="3408"/>
+            <w:tcMar>
+              <w:top w:w="70" w:type="dxa"/>
+              <w:bottom w:w="70" w:type="dxa"/>
+              <w:left w:w="100" w:type="dxa"/>
+              <w:right w:w="100" w:type="dxa"/>
+            </w:tcMar>
+            <w:shd w:fill="FFFFFF"/>
+          </w:tcPr>
+          <w:p>
+            <w:pPr>
+              <w:spacing w:before="0" w:after="0"/>
+            </w:pPr>
+            <w:r>
+              <w:rPr>
+                <w:rFonts w:ascii="Arial" w:hAnsi="Arial"/>
+                <w:color w:val="1E293B"/>
+                <w:sz w:val="18"/>
+              </w:rPr>
+              <w:t>Hỗ trợ kỹ thuật</w:t>
+            </w:r>
+          </w:p>
+        </w:tc>
+        <w:tc>
+          <w:tcPr>
+            <w:tcW w:type="dxa" w:w="3408"/>
+            <w:tcMar>
+              <w:top w:w="70" w:type="dxa"/>
+              <w:bottom w:w="70" w:type="dxa"/>
+              <w:left w:w="100" w:type="dxa"/>
+              <w:right w:w="100" w:type="dxa"/>
+            </w:tcMar>
+            <w:shd w:fill="FFFFFF"/>
+          </w:tcPr>
+          <w:p>
+            <w:pPr>
+              <w:spacing w:before="0" w:after="0"/>
+            </w:pPr>
+            <w:r>
+              <w:rPr>
+                <w:rFonts w:ascii="Arial" w:hAnsi="Arial"/>
+                <w:color w:val="1E293B"/>
+                <w:sz w:val="18"/>
+              </w:rPr>
+              <w:t>Hotline/Zalo hỗ trợ Quản lý &amp; NV trong giờ hành chính (T2-T7)</w:t>
+            </w:r>
+          </w:p>
+        </w:tc>
+        <w:tc>
+          <w:tcPr>
+            <w:tcW w:type="dxa" w:w="3408"/>
+            <w:tcMar>
+              <w:top w:w="70" w:type="dxa"/>
+              <w:bottom w:w="70" w:type="dxa"/>
+              <w:left w:w="100" w:type="dxa"/>
+              <w:right w:w="100" w:type="dxa"/>
+            </w:tcMar>
+            <w:shd w:fill="FFFFFF"/>
+          </w:tcPr>
+          <w:p>
+            <w:pPr>
+              <w:spacing w:before="0" w:after="0"/>
+            </w:pPr>
+            <w:r>
+              <w:rPr>
+                <w:rFonts w:ascii="Arial" w:hAnsi="Arial"/>
+                <w:color w:val="1E293B"/>
+                <w:sz w:val="18"/>
+              </w:rPr>
+              <w:t>Bao gồm</w:t>
+            </w:r>
+          </w:p>
+        </w:tc>
+      </w:tr>
+      <w:tr>
+        <w:tc>
+          <w:tcPr>
+            <w:tcW w:type="dxa" w:w="3408"/>
+            <w:tcMar>
+              <w:top w:w="70" w:type="dxa"/>
+              <w:bottom w:w="70" w:type="dxa"/>
+              <w:left w:w="100" w:type="dxa"/>
+              <w:right w:w="100" w:type="dxa"/>
+            </w:tcMar>
+            <w:shd w:fill="F8FAFC"/>
+          </w:tcPr>
+          <w:p>
+            <w:pPr>
+              <w:spacing w:before="0" w:after="0"/>
+            </w:pPr>
+          </w:p>
+        </w:tc>
+        <w:tc>
+          <w:tcPr>
+            <w:tcW w:type="dxa" w:w="3408"/>
+            <w:tcMar>
+              <w:top w:w="70" w:type="dxa"/>
+              <w:bottom w:w="70" w:type="dxa"/>
+              <w:left w:w="100" w:type="dxa"/>
+              <w:right w:w="100" w:type="dxa"/>
+            </w:tcMar>
+            <w:shd w:fill="F8FAFC"/>
+          </w:tcPr>
+          <w:p>
+            <w:pPr>
+              <w:spacing w:before="0" w:after="0"/>
+            </w:pPr>
+          </w:p>
+        </w:tc>
+        <w:tc>
+          <w:tcPr>
+            <w:tcW w:type="dxa" w:w="3408"/>
+            <w:tcMar>
+              <w:top w:w="70" w:type="dxa"/>
+              <w:bottom w:w="70" w:type="dxa"/>
+              <w:left w:w="100" w:type="dxa"/>
+              <w:right w:w="100" w:type="dxa"/>
+            </w:tcMar>
+            <w:shd w:fill="F8FAFC"/>
+          </w:tcPr>
+          <w:p>
+            <w:pPr>
+              <w:spacing w:before="0" w:after="0"/>
+            </w:pPr>
+          </w:p>
+        </w:tc>
+      </w:tr>
+      <w:tr>
+        <w:tc>
+          <w:tcPr>
+            <w:tcW w:type="dxa" w:w="3408"/>
+            <w:tcMar>
+              <w:top w:w="70" w:type="dxa"/>
+              <w:bottom w:w="70" w:type="dxa"/>
+              <w:left w:w="100" w:type="dxa"/>
+              <w:right w:w="100" w:type="dxa"/>
+            </w:tcMar>
+            <w:shd w:fill="FFFFFF"/>
+          </w:tcPr>
+          <w:p>
+            <w:pPr>
+              <w:spacing w:before="0" w:after="0"/>
+            </w:pPr>
+          </w:p>
+        </w:tc>
+        <w:tc>
+          <w:tcPr>
+            <w:tcW w:type="dxa" w:w="3408"/>
+            <w:tcMar>
+              <w:top w:w="70" w:type="dxa"/>
+              <w:bottom w:w="70" w:type="dxa"/>
+              <w:left w:w="100" w:type="dxa"/>
+              <w:right w:w="100" w:type="dxa"/>
+            </w:tcMar>
+            <w:shd w:fill="FFFFFF"/>
+          </w:tcPr>
+          <w:p>
+            <w:pPr>
+              <w:spacing w:before="0" w:after="0"/>
+            </w:pPr>
+            <w:r>
+              <w:rPr>
+                <w:rFonts w:ascii="Arial" w:hAnsi="Arial"/>
+                <w:b/>
+                <w:color w:val="1E293B"/>
+                <w:sz w:val="18"/>
+              </w:rPr>
+              <w:t>TỔNG BẢO TRÌ CƠ BẢN</w:t>
+            </w:r>
+          </w:p>
+        </w:tc>
+        <w:tc>
+          <w:tcPr>
+            <w:tcW w:type="dxa" w:w="3408"/>
+            <w:tcMar>
+              <w:top w:w="70" w:type="dxa"/>
+              <w:bottom w:w="70" w:type="dxa"/>
+              <w:left w:w="100" w:type="dxa"/>
+              <w:right w:w="100" w:type="dxa"/>
+            </w:tcMar>
+            <w:shd w:fill="FFFFFF"/>
+          </w:tcPr>
+          <w:p>
+            <w:pPr>
+              <w:spacing w:before="0" w:after="0"/>
+            </w:pPr>
+            <w:r>
+              <w:rPr>
+                <w:rFonts w:ascii="Arial" w:hAnsi="Arial"/>
+                <w:b/>
+                <w:color w:val="1E293B"/>
+                <w:sz w:val="18"/>
+              </w:rPr>
+              <w:t>3.000.000/tháng</w:t>
+            </w:r>
+          </w:p>
+        </w:tc>
+      </w:tr>
+    </w:tbl>
+    <w:p>
+      <w:pPr>
+        <w:spacing w:after="40"/>
+      </w:pPr>
+    </w:p>
+    <w:p>
+      <w:pPr>
+        <w:keepNext/>
+        <w:spacing w:before="200" w:after="80"/>
+      </w:pPr>
+      <w:r>
+        <w:rPr>
+          <w:rFonts w:ascii="Arial" w:hAnsi="Arial"/>
+          <w:b/>
+          <w:color w:val="2563EB"/>
+          <w:sz w:val="22"/>
+        </w:rPr>
+        <w:t>Gói bảo trì nâng cao (Tùy chọn)</w:t>
+      </w:r>
+    </w:p>
+    <w:tbl>
+      <w:tblPr>
+        <w:tblW w:type="auto" w:w="0"/>
+        <w:jc w:val="center"/>
+        <w:tblLook w:firstColumn="1" w:firstRow="1" w:lastColumn="0" w:lastRow="0" w:noHBand="0" w:noVBand="1" w:val="04A0"/>
+        <w:tblBorders>
+          <w:top w:val="single" w:sz="6" w:space="0" w:color="CBD5E1"/>
+          <w:bottom w:val="single" w:sz="6" w:space="0" w:color="CBD5E1"/>
+          <w:left w:val="single" w:sz="6" w:space="0" w:color="CBD5E1"/>
+          <w:right w:val="single" w:sz="6" w:space="0" w:color="CBD5E1"/>
+          <w:insideH w:val="single" w:sz="4" w:space="0" w:color="E2E8F0"/>
+          <w:insideV w:val="single" w:sz="4" w:space="0" w:color="E2E8F0"/>
+        </w:tblBorders>
+      </w:tblPr>
+      <w:tblGrid>
+        <w:gridCol w:w="3408"/>
+        <w:gridCol w:w="3408"/>
+        <w:gridCol w:w="3408"/>
+      </w:tblGrid>
+      <w:tr>
+        <w:tc>
+          <w:tcPr>
+            <w:tcW w:type="dxa" w:w="3408"/>
+            <w:tcMar>
+              <w:top w:w="70" w:type="dxa"/>
+              <w:bottom w:w="70" w:type="dxa"/>
+              <w:left w:w="100" w:type="dxa"/>
+              <w:right w:w="100" w:type="dxa"/>
+            </w:tcMar>
+            <w:shd w:fill="0F172A"/>
+          </w:tcPr>
+          <w:p>
+            <w:pPr>
+              <w:spacing w:before="0" w:after="0"/>
+            </w:pPr>
+            <w:r>
+              <w:rPr>
+                <w:rFonts w:ascii="Arial" w:hAnsi="Arial"/>
+                <w:b/>
+                <w:color w:val="FFFFFF"/>
+                <w:sz w:val="18"/>
+              </w:rPr>
+              <w:t>Hạng mục</w:t>
+            </w:r>
+          </w:p>
+        </w:tc>
+        <w:tc>
+          <w:tcPr>
+            <w:tcW w:type="dxa" w:w="3408"/>
+            <w:tcMar>
+              <w:top w:w="70" w:type="dxa"/>
+              <w:bottom w:w="70" w:type="dxa"/>
+              <w:left w:w="100" w:type="dxa"/>
+              <w:right w:w="100" w:type="dxa"/>
+            </w:tcMar>
+            <w:shd w:fill="0F172A"/>
+          </w:tcPr>
+          <w:p>
+            <w:pPr>
+              <w:spacing w:before="0" w:after="0"/>
+            </w:pPr>
+            <w:r>
+              <w:rPr>
+                <w:rFonts w:ascii="Arial" w:hAnsi="Arial"/>
+                <w:b/>
+                <w:color w:val="FFFFFF"/>
+                <w:sz w:val="18"/>
+              </w:rPr>
+              <w:t>Nội dung</w:t>
+            </w:r>
+          </w:p>
+        </w:tc>
+        <w:tc>
+          <w:tcPr>
+            <w:tcW w:type="dxa" w:w="3408"/>
+            <w:tcMar>
+              <w:top w:w="70" w:type="dxa"/>
+              <w:bottom w:w="70" w:type="dxa"/>
+              <w:left w:w="100" w:type="dxa"/>
+              <w:right w:w="100" w:type="dxa"/>
+            </w:tcMar>
+            <w:shd w:fill="0F172A"/>
+          </w:tcPr>
+          <w:p>
+            <w:pPr>
+              <w:spacing w:before="0" w:after="0"/>
+            </w:pPr>
+            <w:r>
+              <w:rPr>
+                <w:rFonts w:ascii="Arial" w:hAnsi="Arial"/>
+                <w:b/>
+                <w:color w:val="FFFFFF"/>
+                <w:sz w:val="18"/>
+              </w:rPr>
+              <w:t>Chi phí/tháng</w:t>
+            </w:r>
+          </w:p>
+        </w:tc>
+      </w:tr>
+      <w:tr>
+        <w:tc>
+          <w:tcPr>
+            <w:tcW w:type="dxa" w:w="3408"/>
+            <w:tcMar>
+              <w:top w:w="70" w:type="dxa"/>
+              <w:bottom w:w="70" w:type="dxa"/>
+              <w:left w:w="100" w:type="dxa"/>
+              <w:right w:w="100" w:type="dxa"/>
+            </w:tcMar>
+            <w:shd w:fill="FFFFFF"/>
+          </w:tcPr>
+          <w:p>
+            <w:pPr>
+              <w:spacing w:before="0" w:after="0"/>
+            </w:pPr>
+            <w:r>
+              <w:rPr>
+                <w:rFonts w:ascii="Arial" w:hAnsi="Arial"/>
+                <w:color w:val="1E293B"/>
+                <w:sz w:val="18"/>
+              </w:rPr>
+              <w:t>Toàn bộ gói Cơ bản</w:t>
+            </w:r>
+          </w:p>
+        </w:tc>
+        <w:tc>
+          <w:tcPr>
+            <w:tcW w:type="dxa" w:w="3408"/>
+            <w:tcMar>
+              <w:top w:w="70" w:type="dxa"/>
+              <w:bottom w:w="70" w:type="dxa"/>
+              <w:left w:w="100" w:type="dxa"/>
+              <w:right w:w="100" w:type="dxa"/>
+            </w:tcMar>
+            <w:shd w:fill="FFFFFF"/>
+          </w:tcPr>
+          <w:p>
+            <w:pPr>
+              <w:spacing w:before="0" w:after="0"/>
+            </w:pPr>
+            <w:r>
+              <w:rPr>
+                <w:rFonts w:ascii="Arial" w:hAnsi="Arial"/>
+                <w:color w:val="1E293B"/>
+                <w:sz w:val="18"/>
+              </w:rPr>
+              <w:t>Như trên</w:t>
+            </w:r>
+          </w:p>
+        </w:tc>
+        <w:tc>
+          <w:tcPr>
+            <w:tcW w:type="dxa" w:w="3408"/>
+            <w:tcMar>
+              <w:top w:w="70" w:type="dxa"/>
+              <w:bottom w:w="70" w:type="dxa"/>
+              <w:left w:w="100" w:type="dxa"/>
+              <w:right w:w="100" w:type="dxa"/>
+            </w:tcMar>
+            <w:shd w:fill="FFFFFF"/>
+          </w:tcPr>
+          <w:p>
+            <w:pPr>
+              <w:spacing w:before="0" w:after="0"/>
+            </w:pPr>
+            <w:r>
+              <w:rPr>
+                <w:rFonts w:ascii="Arial" w:hAnsi="Arial"/>
+                <w:color w:val="1E293B"/>
+                <w:sz w:val="18"/>
+              </w:rPr>
+              <w:t>Bao gồm</w:t>
+            </w:r>
+          </w:p>
+        </w:tc>
+      </w:tr>
+      <w:tr>
+        <w:tc>
+          <w:tcPr>
+            <w:tcW w:type="dxa" w:w="3408"/>
+            <w:tcMar>
+              <w:top w:w="70" w:type="dxa"/>
+              <w:bottom w:w="70" w:type="dxa"/>
+              <w:left w:w="100" w:type="dxa"/>
+              <w:right w:w="100" w:type="dxa"/>
+            </w:tcMar>
+            <w:shd w:fill="F8FAFC"/>
+          </w:tcPr>
+          <w:p>
+            <w:pPr>
+              <w:spacing w:before="0" w:after="0"/>
+            </w:pPr>
+            <w:r>
+              <w:rPr>
+                <w:rFonts w:ascii="Arial" w:hAnsi="Arial"/>
+                <w:color w:val="1E293B"/>
+                <w:sz w:val="18"/>
+              </w:rPr>
+              <w:t>Phát triển tính năng mới</w:t>
+            </w:r>
+          </w:p>
+        </w:tc>
+        <w:tc>
+          <w:tcPr>
+            <w:tcW w:type="dxa" w:w="3408"/>
+            <w:tcMar>
+              <w:top w:w="70" w:type="dxa"/>
+              <w:bottom w:w="70" w:type="dxa"/>
+              <w:left w:w="100" w:type="dxa"/>
+              <w:right w:w="100" w:type="dxa"/>
+            </w:tcMar>
+            <w:shd w:fill="F8FAFC"/>
+          </w:tcPr>
+          <w:p>
+            <w:pPr>
+              <w:spacing w:before="0" w:after="0"/>
+            </w:pPr>
+            <w:r>
+              <w:rPr>
+                <w:rFonts w:ascii="Arial" w:hAnsi="Arial"/>
+                <w:color w:val="1E293B"/>
+                <w:sz w:val="18"/>
+              </w:rPr>
+              <w:t>Tối đa 2 tính năng nhỏ hoặc 1 tính năng vừa mỗi tháng</w:t>
+            </w:r>
+          </w:p>
+        </w:tc>
+        <w:tc>
+          <w:tcPr>
+            <w:tcW w:type="dxa" w:w="3408"/>
+            <w:tcMar>
+              <w:top w:w="70" w:type="dxa"/>
+              <w:bottom w:w="70" w:type="dxa"/>
+              <w:left w:w="100" w:type="dxa"/>
+              <w:right w:w="100" w:type="dxa"/>
+            </w:tcMar>
+            <w:shd w:fill="F8FAFC"/>
+          </w:tcPr>
+          <w:p>
+            <w:pPr>
+              <w:spacing w:before="0" w:after="0"/>
+            </w:pPr>
+            <w:r>
+              <w:rPr>
+                <w:rFonts w:ascii="Arial" w:hAnsi="Arial"/>
+                <w:color w:val="1E293B"/>
+                <w:sz w:val="18"/>
+              </w:rPr>
+              <w:t>Bao gồm</w:t>
+            </w:r>
+          </w:p>
+        </w:tc>
+      </w:tr>
+      <w:tr>
+        <w:tc>
+          <w:tcPr>
+            <w:tcW w:type="dxa" w:w="3408"/>
+            <w:tcMar>
+              <w:top w:w="70" w:type="dxa"/>
+              <w:bottom w:w="70" w:type="dxa"/>
+              <w:left w:w="100" w:type="dxa"/>
+              <w:right w:w="100" w:type="dxa"/>
+            </w:tcMar>
+            <w:shd w:fill="FFFFFF"/>
+          </w:tcPr>
+          <w:p>
+            <w:pPr>
+              <w:spacing w:before="0" w:after="0"/>
+            </w:pPr>
+            <w:r>
+              <w:rPr>
+                <w:rFonts w:ascii="Arial" w:hAnsi="Arial"/>
+                <w:color w:val="1E293B"/>
+                <w:sz w:val="18"/>
+              </w:rPr>
+              <w:t>Tối ưu hiệu năng</w:t>
+            </w:r>
+          </w:p>
+        </w:tc>
+        <w:tc>
+          <w:tcPr>
+            <w:tcW w:type="dxa" w:w="3408"/>
+            <w:tcMar>
+              <w:top w:w="70" w:type="dxa"/>
+              <w:bottom w:w="70" w:type="dxa"/>
+              <w:left w:w="100" w:type="dxa"/>
+              <w:right w:w="100" w:type="dxa"/>
+            </w:tcMar>
+            <w:shd w:fill="FFFFFF"/>
+          </w:tcPr>
+          <w:p>
+            <w:pPr>
+              <w:spacing w:before="0" w:after="0"/>
+            </w:pPr>
+            <w:r>
+              <w:rPr>
+                <w:rFonts w:ascii="Arial" w:hAnsi="Arial"/>
+                <w:color w:val="1E293B"/>
+                <w:sz w:val="18"/>
+              </w:rPr>
+              <w:t>Cải thiện tốc độ tải, tối ưu database khi dữ liệu lớn</w:t>
+            </w:r>
+          </w:p>
+        </w:tc>
+        <w:tc>
+          <w:tcPr>
+            <w:tcW w:type="dxa" w:w="3408"/>
+            <w:tcMar>
+              <w:top w:w="70" w:type="dxa"/>
+              <w:bottom w:w="70" w:type="dxa"/>
+              <w:left w:w="100" w:type="dxa"/>
+              <w:right w:w="100" w:type="dxa"/>
+            </w:tcMar>
+            <w:shd w:fill="FFFFFF"/>
+          </w:tcPr>
+          <w:p>
+            <w:pPr>
+              <w:spacing w:before="0" w:after="0"/>
+            </w:pPr>
+            <w:r>
+              <w:rPr>
+                <w:rFonts w:ascii="Arial" w:hAnsi="Arial"/>
+                <w:color w:val="1E293B"/>
+                <w:sz w:val="18"/>
+              </w:rPr>
+              <w:t>Bao gồm</w:t>
+            </w:r>
+          </w:p>
+        </w:tc>
+      </w:tr>
+      <w:tr>
+        <w:tc>
+          <w:tcPr>
+            <w:tcW w:type="dxa" w:w="3408"/>
+            <w:tcMar>
+              <w:top w:w="70" w:type="dxa"/>
+              <w:bottom w:w="70" w:type="dxa"/>
+              <w:left w:w="100" w:type="dxa"/>
+              <w:right w:w="100" w:type="dxa"/>
+            </w:tcMar>
+            <w:shd w:fill="F8FAFC"/>
+          </w:tcPr>
+          <w:p>
+            <w:pPr>
+              <w:spacing w:before="0" w:after="0"/>
+            </w:pPr>
+            <w:r>
+              <w:rPr>
+                <w:rFonts w:ascii="Arial" w:hAnsi="Arial"/>
+                <w:color w:val="1E293B"/>
+                <w:sz w:val="18"/>
+              </w:rPr>
+              <w:t>Nâng cấp AI model</w:t>
+            </w:r>
+          </w:p>
+        </w:tc>
+        <w:tc>
+          <w:tcPr>
+            <w:tcW w:type="dxa" w:w="3408"/>
+            <w:tcMar>
+              <w:top w:w="70" w:type="dxa"/>
+              <w:bottom w:w="70" w:type="dxa"/>
+              <w:left w:w="100" w:type="dxa"/>
+              <w:right w:w="100" w:type="dxa"/>
+            </w:tcMar>
+            <w:shd w:fill="F8FAFC"/>
+          </w:tcPr>
+          <w:p>
+            <w:pPr>
+              <w:spacing w:before="0" w:after="0"/>
+            </w:pPr>
+            <w:r>
+              <w:rPr>
+                <w:rFonts w:ascii="Arial" w:hAnsi="Arial"/>
+                <w:color w:val="1E293B"/>
+                <w:sz w:val="18"/>
+              </w:rPr>
+              <w:t>Cập nhật model AI mới, cải thiện độ chính xác chatbot</w:t>
+            </w:r>
+          </w:p>
+        </w:tc>
+        <w:tc>
+          <w:tcPr>
+            <w:tcW w:type="dxa" w:w="3408"/>
+            <w:tcMar>
+              <w:top w:w="70" w:type="dxa"/>
+              <w:bottom w:w="70" w:type="dxa"/>
+              <w:left w:w="100" w:type="dxa"/>
+              <w:right w:w="100" w:type="dxa"/>
+            </w:tcMar>
+            <w:shd w:fill="F8FAFC"/>
+          </w:tcPr>
+          <w:p>
+            <w:pPr>
+              <w:spacing w:before="0" w:after="0"/>
+            </w:pPr>
+            <w:r>
+              <w:rPr>
+                <w:rFonts w:ascii="Arial" w:hAnsi="Arial"/>
+                <w:color w:val="1E293B"/>
+                <w:sz w:val="18"/>
+              </w:rPr>
+              <w:t>Bao gồm</w:t>
+            </w:r>
+          </w:p>
+        </w:tc>
+      </w:tr>
+      <w:tr>
+        <w:tc>
+          <w:tcPr>
+            <w:tcW w:type="dxa" w:w="3408"/>
+            <w:tcMar>
+              <w:top w:w="70" w:type="dxa"/>
+              <w:bottom w:w="70" w:type="dxa"/>
+              <w:left w:w="100" w:type="dxa"/>
+              <w:right w:w="100" w:type="dxa"/>
+            </w:tcMar>
+            <w:shd w:fill="FFFFFF"/>
+          </w:tcPr>
+          <w:p>
+            <w:pPr>
+              <w:spacing w:before="0" w:after="0"/>
+            </w:pPr>
+            <w:r>
+              <w:rPr>
+                <w:rFonts w:ascii="Arial" w:hAnsi="Arial"/>
+                <w:color w:val="1E293B"/>
+                <w:sz w:val="18"/>
+              </w:rPr>
+              <w:t>Hỗ trợ 24/7</w:t>
+            </w:r>
+          </w:p>
+        </w:tc>
+        <w:tc>
+          <w:tcPr>
+            <w:tcW w:type="dxa" w:w="3408"/>
+            <w:tcMar>
+              <w:top w:w="70" w:type="dxa"/>
+              <w:bottom w:w="70" w:type="dxa"/>
+              <w:left w:w="100" w:type="dxa"/>
+              <w:right w:w="100" w:type="dxa"/>
+            </w:tcMar>
+            <w:shd w:fill="FFFFFF"/>
+          </w:tcPr>
+          <w:p>
+            <w:pPr>
+              <w:spacing w:before="0" w:after="0"/>
+            </w:pPr>
+            <w:r>
+              <w:rPr>
+                <w:rFonts w:ascii="Arial" w:hAnsi="Arial"/>
+                <w:color w:val="1E293B"/>
+                <w:sz w:val="18"/>
+              </w:rPr>
+              <w:t>Hỗ trợ ngoài giờ hành chính, xử lý sự cố khẩn cấp</w:t>
+            </w:r>
+          </w:p>
+        </w:tc>
+        <w:tc>
+          <w:tcPr>
+            <w:tcW w:type="dxa" w:w="3408"/>
+            <w:tcMar>
+              <w:top w:w="70" w:type="dxa"/>
+              <w:bottom w:w="70" w:type="dxa"/>
+              <w:left w:w="100" w:type="dxa"/>
+              <w:right w:w="100" w:type="dxa"/>
+            </w:tcMar>
+            <w:shd w:fill="FFFFFF"/>
+          </w:tcPr>
+          <w:p>
+            <w:pPr>
+              <w:spacing w:before="0" w:after="0"/>
+            </w:pPr>
+            <w:r>
+              <w:rPr>
+                <w:rFonts w:ascii="Arial" w:hAnsi="Arial"/>
+                <w:color w:val="1E293B"/>
+                <w:sz w:val="18"/>
+              </w:rPr>
+              <w:t>Bao gồm</w:t>
+            </w:r>
+          </w:p>
+        </w:tc>
+      </w:tr>
+      <w:tr>
+        <w:tc>
+          <w:tcPr>
+            <w:tcW w:type="dxa" w:w="3408"/>
+            <w:tcMar>
+              <w:top w:w="70" w:type="dxa"/>
+              <w:bottom w:w="70" w:type="dxa"/>
+              <w:left w:w="100" w:type="dxa"/>
+              <w:right w:w="100" w:type="dxa"/>
+            </w:tcMar>
+            <w:shd w:fill="F8FAFC"/>
+          </w:tcPr>
+          <w:p>
+            <w:pPr>
+              <w:spacing w:before="0" w:after="0"/>
+            </w:pPr>
+          </w:p>
+        </w:tc>
+        <w:tc>
+          <w:tcPr>
+            <w:tcW w:type="dxa" w:w="3408"/>
+            <w:tcMar>
+              <w:top w:w="70" w:type="dxa"/>
+              <w:bottom w:w="70" w:type="dxa"/>
+              <w:left w:w="100" w:type="dxa"/>
+              <w:right w:w="100" w:type="dxa"/>
+            </w:tcMar>
+            <w:shd w:fill="F8FAFC"/>
+          </w:tcPr>
+          <w:p>
+            <w:pPr>
+              <w:spacing w:before="0" w:after="0"/>
+            </w:pPr>
+          </w:p>
+        </w:tc>
+        <w:tc>
+          <w:tcPr>
+            <w:tcW w:type="dxa" w:w="3408"/>
+            <w:tcMar>
+              <w:top w:w="70" w:type="dxa"/>
+              <w:bottom w:w="70" w:type="dxa"/>
+              <w:left w:w="100" w:type="dxa"/>
+              <w:right w:w="100" w:type="dxa"/>
+            </w:tcMar>
+            <w:shd w:fill="F8FAFC"/>
+          </w:tcPr>
+          <w:p>
+            <w:pPr>
+              <w:spacing w:before="0" w:after="0"/>
+            </w:pPr>
+          </w:p>
+        </w:tc>
+      </w:tr>
+      <w:tr>
+        <w:tc>
+          <w:tcPr>
+            <w:tcW w:type="dxa" w:w="3408"/>
+            <w:tcMar>
+              <w:top w:w="70" w:type="dxa"/>
+              <w:bottom w:w="70" w:type="dxa"/>
+              <w:left w:w="100" w:type="dxa"/>
+              <w:right w:w="100" w:type="dxa"/>
+            </w:tcMar>
+            <w:shd w:fill="FFFFFF"/>
+          </w:tcPr>
+          <w:p>
+            <w:pPr>
+              <w:spacing w:before="0" w:after="0"/>
+            </w:pPr>
+          </w:p>
+        </w:tc>
+        <w:tc>
+          <w:tcPr>
+            <w:tcW w:type="dxa" w:w="3408"/>
+            <w:tcMar>
+              <w:top w:w="70" w:type="dxa"/>
+              <w:bottom w:w="70" w:type="dxa"/>
+              <w:left w:w="100" w:type="dxa"/>
+              <w:right w:w="100" w:type="dxa"/>
+            </w:tcMar>
+            <w:shd w:fill="FFFFFF"/>
+          </w:tcPr>
+          <w:p>
+            <w:pPr>
+              <w:spacing w:before="0" w:after="0"/>
+            </w:pPr>
+            <w:r>
+              <w:rPr>
+                <w:rFonts w:ascii="Arial" w:hAnsi="Arial"/>
+                <w:b/>
+                <w:color w:val="1E293B"/>
+                <w:sz w:val="18"/>
+              </w:rPr>
+              <w:t>TỔNG BẢO TRÌ NÂNG CAO</w:t>
+            </w:r>
+          </w:p>
+        </w:tc>
+        <w:tc>
+          <w:tcPr>
+            <w:tcW w:type="dxa" w:w="3408"/>
+            <w:tcMar>
+              <w:top w:w="70" w:type="dxa"/>
+              <w:bottom w:w="70" w:type="dxa"/>
+              <w:left w:w="100" w:type="dxa"/>
+              <w:right w:w="100" w:type="dxa"/>
+            </w:tcMar>
+            <w:shd w:fill="FFFFFF"/>
+          </w:tcPr>
+          <w:p>
+            <w:pPr>
+              <w:spacing w:before="0" w:after="0"/>
+            </w:pPr>
+            <w:r>
+              <w:rPr>
+                <w:rFonts w:ascii="Arial" w:hAnsi="Arial"/>
+                <w:b/>
+                <w:color w:val="1E293B"/>
+                <w:sz w:val="18"/>
+              </w:rPr>
+              <w:t>6.000.000/tháng</w:t>
+            </w:r>
+          </w:p>
+        </w:tc>
+      </w:tr>
+    </w:tbl>
+    <w:p>
+      <w:pPr>
+        <w:spacing w:after="40"/>
+      </w:pPr>
+    </w:p>
+    <w:p>
+      <w:pPr>
+        <w:keepNext/>
+        <w:spacing w:before="200" w:after="80"/>
+      </w:pPr>
+      <w:r>
+        <w:rPr>
+          <w:rFonts w:ascii="Arial" w:hAnsi="Arial"/>
+          <w:b/>
+          <w:color w:val="2563EB"/>
+          <w:sz w:val="22"/>
+        </w:rPr>
+        <w:t>Chính sách bảo hành phần mềm</w:t>
+      </w:r>
+    </w:p>
+    <w:p>
+      <w:pPr>
+        <w:spacing w:before="0" w:after="60"/>
+        <w:ind w:left="360"/>
+      </w:pPr>
+      <w:r>
+        <w:rPr>
+          <w:rFonts w:ascii="Arial" w:hAnsi="Arial"/>
+          <w:sz w:val="20"/>
+        </w:rPr>
+        <w:t>Bảo hành miễn phí 3 tháng sau khi nghiệm thu (sửa lỗi + hỗ trợ kỹ thuật, không tốn phí).</w:t>
+      </w:r>
+    </w:p>
+    <w:p>
+      <w:pPr>
+        <w:spacing w:before="0" w:after="60"/>
+        <w:ind w:left="360"/>
+      </w:pPr>
+      <w:r>
+        <w:rPr>
+          <w:rFonts w:ascii="Arial" w:hAnsi="Arial"/>
+          <w:sz w:val="20"/>
+        </w:rPr>
+        <w:t>Sau 3 tháng bảo hành, khách hàng chọn 1 trong 2 gói bảo trì hoặc tự vận hành.</w:t>
+      </w:r>
+    </w:p>
+    <w:p>
+      <w:pPr>
+        <w:spacing w:before="0" w:after="60"/>
+        <w:ind w:left="360"/>
+      </w:pPr>
+      <w:r>
+        <w:rPr>
+          <w:rFonts w:ascii="Arial" w:hAnsi="Arial"/>
+          <w:sz w:val="20"/>
+        </w:rPr>
+        <w:t>Nếu không ký bảo trì: Hỗ trợ sửa lỗi theo vụ việc, tính phí 500.000 - 2.000.000/lần tùy mức độ.</w:t>
+      </w:r>
+    </w:p>
+    <w:p>
+      <w:pPr>
+        <w:keepNext/>
+        <w:spacing w:before="280" w:after="120"/>
+        <w:pBdr>
+          <w:bottom w:val="single" w:sz="8" w:space="4" w:color="CBD5E1"/>
+        </w:pBdr>
+      </w:pPr>
+      <w:r>
+        <w:rPr>
+          <w:rFonts w:ascii="Arial" w:hAnsi="Arial"/>
+          <w:b/>
+          <w:color w:val="0F172A"/>
+          <w:sz w:val="26"/>
+        </w:rPr>
+        <w:t>E. DỊCH VỤ MIỄN PHÍ ĐI KÈM (0 đ)</w:t>
       </w:r>
     </w:p>
     <w:tbl>
@@ -3494,108 +6438,6 @@
           </w:p>
         </w:tc>
       </w:tr>
-      <w:tr>
-        <w:tc>
-          <w:tcPr>
-            <w:tcW w:type="dxa" w:w="2556"/>
-            <w:tcMar>
-              <w:top w:w="70" w:type="dxa"/>
-              <w:bottom w:w="70" w:type="dxa"/>
-              <w:left w:w="100" w:type="dxa"/>
-              <w:right w:w="100" w:type="dxa"/>
-            </w:tcMar>
-            <w:shd w:fill="F8FAFC"/>
-          </w:tcPr>
-          <w:p>
-            <w:pPr>
-              <w:spacing w:before="0" w:after="0"/>
-            </w:pPr>
-            <w:r>
-              <w:rPr>
-                <w:rFonts w:ascii="Arial" w:hAnsi="Arial"/>
-                <w:color w:val="1E293B"/>
-                <w:sz w:val="18"/>
-              </w:rPr>
-              <w:t>8</w:t>
-            </w:r>
-          </w:p>
-        </w:tc>
-        <w:tc>
-          <w:tcPr>
-            <w:tcW w:type="dxa" w:w="2556"/>
-            <w:tcMar>
-              <w:top w:w="70" w:type="dxa"/>
-              <w:bottom w:w="70" w:type="dxa"/>
-              <w:left w:w="100" w:type="dxa"/>
-              <w:right w:w="100" w:type="dxa"/>
-            </w:tcMar>
-            <w:shd w:fill="F8FAFC"/>
-          </w:tcPr>
-          <w:p>
-            <w:pPr>
-              <w:spacing w:before="0" w:after="0"/>
-            </w:pPr>
-            <w:r>
-              <w:rPr>
-                <w:rFonts w:ascii="Arial" w:hAnsi="Arial"/>
-                <w:color w:val="1E293B"/>
-                <w:sz w:val="18"/>
-              </w:rPr>
-              <w:t>Dữ liệu thời tiết (cho AI)</w:t>
-            </w:r>
-          </w:p>
-        </w:tc>
-        <w:tc>
-          <w:tcPr>
-            <w:tcW w:type="dxa" w:w="2556"/>
-            <w:tcMar>
-              <w:top w:w="70" w:type="dxa"/>
-              <w:bottom w:w="70" w:type="dxa"/>
-              <w:left w:w="100" w:type="dxa"/>
-              <w:right w:w="100" w:type="dxa"/>
-            </w:tcMar>
-            <w:shd w:fill="F8FAFC"/>
-          </w:tcPr>
-          <w:p>
-            <w:pPr>
-              <w:spacing w:before="0" w:after="0"/>
-            </w:pPr>
-            <w:r>
-              <w:rPr>
-                <w:rFonts w:ascii="Arial" w:hAnsi="Arial"/>
-                <w:color w:val="1E293B"/>
-                <w:sz w:val="18"/>
-              </w:rPr>
-              <w:t>OpenWeatherMap</w:t>
-            </w:r>
-          </w:p>
-        </w:tc>
-        <w:tc>
-          <w:tcPr>
-            <w:tcW w:type="dxa" w:w="2556"/>
-            <w:tcMar>
-              <w:top w:w="70" w:type="dxa"/>
-              <w:bottom w:w="70" w:type="dxa"/>
-              <w:left w:w="100" w:type="dxa"/>
-              <w:right w:w="100" w:type="dxa"/>
-            </w:tcMar>
-            <w:shd w:fill="F8FAFC"/>
-          </w:tcPr>
-          <w:p>
-            <w:pPr>
-              <w:spacing w:before="0" w:after="0"/>
-            </w:pPr>
-            <w:r>
-              <w:rPr>
-                <w:rFonts w:ascii="Arial" w:hAnsi="Arial"/>
-                <w:color w:val="1E293B"/>
-                <w:sz w:val="18"/>
-              </w:rPr>
-              <w:t>AI Chatbot tham khảo thời tiết gợi ý đồ uống</w:t>
-            </w:r>
-          </w:p>
-        </w:tc>
-      </w:tr>
     </w:tbl>
     <w:p>
       <w:pPr>
@@ -3617,7 +6459,7 @@
           <w:color w:val="0F172A"/>
           <w:sz w:val="26"/>
         </w:rPr>
-        <w:t>D. CHI PHÍ PHÁT SINH CÓ THỂ XẢY RA</w:t>
+        <w:t>F. CHI PHÍ PHÁT SINH CÓ THỂ XẢY RA</w:t>
       </w:r>
     </w:p>
     <w:tbl>
@@ -4201,7 +7043,7 @@
                 <w:color w:val="1E293B"/>
                 <w:sz w:val="18"/>
               </w:rPr>
-              <w:t>Bảo trì &amp; cập nhật phần mềm</w:t>
+              <w:t>Phát triển tính năng lớn mới</w:t>
             </w:r>
           </w:p>
         </w:tc>
@@ -4226,7 +7068,7 @@
                 <w:color w:val="1E293B"/>
                 <w:sz w:val="18"/>
               </w:rPr>
-              <w:t>Nếu ký hợp đồng bảo trì riêng</w:t>
+              <w:t>Ngoài phạm vi 71 tính năng ban đầu</w:t>
             </w:r>
           </w:p>
         </w:tc>
@@ -4251,109 +7093,7 @@
                 <w:color w:val="1E293B"/>
                 <w:sz w:val="18"/>
               </w:rPr>
-              <w:t>Thỏa thuận riêng</w:t>
-            </w:r>
-          </w:p>
-        </w:tc>
-      </w:tr>
-      <w:tr>
-        <w:tc>
-          <w:tcPr>
-            <w:tcW w:type="dxa" w:w="2556"/>
-            <w:tcMar>
-              <w:top w:w="70" w:type="dxa"/>
-              <w:bottom w:w="70" w:type="dxa"/>
-              <w:left w:w="100" w:type="dxa"/>
-              <w:right w:w="100" w:type="dxa"/>
-            </w:tcMar>
-            <w:shd w:fill="F8FAFC"/>
-          </w:tcPr>
-          <w:p>
-            <w:pPr>
-              <w:spacing w:before="0" w:after="0"/>
-            </w:pPr>
-            <w:r>
-              <w:rPr>
-                <w:rFonts w:ascii="Arial" w:hAnsi="Arial"/>
-                <w:color w:val="1E293B"/>
-                <w:sz w:val="18"/>
-              </w:rPr>
-              <w:t>6</w:t>
-            </w:r>
-          </w:p>
-        </w:tc>
-        <w:tc>
-          <w:tcPr>
-            <w:tcW w:type="dxa" w:w="2556"/>
-            <w:tcMar>
-              <w:top w:w="70" w:type="dxa"/>
-              <w:bottom w:w="70" w:type="dxa"/>
-              <w:left w:w="100" w:type="dxa"/>
-              <w:right w:w="100" w:type="dxa"/>
-            </w:tcMar>
-            <w:shd w:fill="F8FAFC"/>
-          </w:tcPr>
-          <w:p>
-            <w:pPr>
-              <w:spacing w:before="0" w:after="0"/>
-            </w:pPr>
-            <w:r>
-              <w:rPr>
-                <w:rFonts w:ascii="Arial" w:hAnsi="Arial"/>
-                <w:color w:val="1E293B"/>
-                <w:sz w:val="18"/>
-              </w:rPr>
-              <w:t>Đào tạo nhân viên mới</w:t>
-            </w:r>
-          </w:p>
-        </w:tc>
-        <w:tc>
-          <w:tcPr>
-            <w:tcW w:type="dxa" w:w="2556"/>
-            <w:tcMar>
-              <w:top w:w="70" w:type="dxa"/>
-              <w:bottom w:w="70" w:type="dxa"/>
-              <w:left w:w="100" w:type="dxa"/>
-              <w:right w:w="100" w:type="dxa"/>
-            </w:tcMar>
-            <w:shd w:fill="F8FAFC"/>
-          </w:tcPr>
-          <w:p>
-            <w:pPr>
-              <w:spacing w:before="0" w:after="0"/>
-            </w:pPr>
-            <w:r>
-              <w:rPr>
-                <w:rFonts w:ascii="Arial" w:hAnsi="Arial"/>
-                <w:color w:val="1E293B"/>
-                <w:sz w:val="18"/>
-              </w:rPr>
-              <w:t>Tuyển NV mới cần hướng dẫn</w:t>
-            </w:r>
-          </w:p>
-        </w:tc>
-        <w:tc>
-          <w:tcPr>
-            <w:tcW w:type="dxa" w:w="2556"/>
-            <w:tcMar>
-              <w:top w:w="70" w:type="dxa"/>
-              <w:bottom w:w="70" w:type="dxa"/>
-              <w:left w:w="100" w:type="dxa"/>
-              <w:right w:w="100" w:type="dxa"/>
-            </w:tcMar>
-            <w:shd w:fill="F8FAFC"/>
-          </w:tcPr>
-          <w:p>
-            <w:pPr>
-              <w:spacing w:before="0" w:after="0"/>
-            </w:pPr>
-            <w:r>
-              <w:rPr>
-                <w:rFonts w:ascii="Arial" w:hAnsi="Arial"/>
-                <w:color w:val="1E293B"/>
-                <w:sz w:val="18"/>
-              </w:rPr>
-              <w:t>Miễn phí (đào tạo nội bộ)</w:t>
+              <w:t>Báo giá riêng theo yêu cầu</w:t>
             </w:r>
           </w:p>
         </w:tc>
@@ -4379,7 +7119,633 @@
           <w:color w:val="0F172A"/>
           <w:sz w:val="26"/>
         </w:rPr>
-        <w:t>E. TỔNG HỢP CHI PHÍ THEO THỜI GIAN</w:t>
+        <w:t>G. TỔNG HỢP CHI PHÍ ĐẦU TƯ</w:t>
+      </w:r>
+    </w:p>
+    <w:p>
+      <w:pPr>
+        <w:keepNext/>
+        <w:spacing w:before="200" w:after="80"/>
+      </w:pPr>
+      <w:r>
+        <w:rPr>
+          <w:rFonts w:ascii="Arial" w:hAnsi="Arial"/>
+          <w:b/>
+          <w:color w:val="2563EB"/>
+          <w:sz w:val="22"/>
+        </w:rPr>
+        <w:t>Tổng chi phí ban đầu (Thanh toán 1 lần)</w:t>
+      </w:r>
+    </w:p>
+    <w:tbl>
+      <w:tblPr>
+        <w:tblW w:type="auto" w:w="0"/>
+        <w:jc w:val="center"/>
+        <w:tblLook w:firstColumn="1" w:firstRow="1" w:lastColumn="0" w:lastRow="0" w:noHBand="0" w:noVBand="1" w:val="04A0"/>
+        <w:tblBorders>
+          <w:top w:val="single" w:sz="6" w:space="0" w:color="CBD5E1"/>
+          <w:bottom w:val="single" w:sz="6" w:space="0" w:color="CBD5E1"/>
+          <w:left w:val="single" w:sz="6" w:space="0" w:color="CBD5E1"/>
+          <w:right w:val="single" w:sz="6" w:space="0" w:color="CBD5E1"/>
+          <w:insideH w:val="single" w:sz="4" w:space="0" w:color="E2E8F0"/>
+          <w:insideV w:val="single" w:sz="4" w:space="0" w:color="E2E8F0"/>
+        </w:tblBorders>
+      </w:tblPr>
+      <w:tblGrid>
+        <w:gridCol w:w="5112"/>
+        <w:gridCol w:w="5112"/>
+      </w:tblGrid>
+      <w:tr>
+        <w:tc>
+          <w:tcPr>
+            <w:tcW w:type="dxa" w:w="5112"/>
+            <w:tcMar>
+              <w:top w:w="70" w:type="dxa"/>
+              <w:bottom w:w="70" w:type="dxa"/>
+              <w:left w:w="100" w:type="dxa"/>
+              <w:right w:w="100" w:type="dxa"/>
+            </w:tcMar>
+            <w:shd w:fill="0F172A"/>
+          </w:tcPr>
+          <w:p>
+            <w:pPr>
+              <w:spacing w:before="0" w:after="0"/>
+            </w:pPr>
+            <w:r>
+              <w:rPr>
+                <w:rFonts w:ascii="Arial" w:hAnsi="Arial"/>
+                <w:b/>
+                <w:color w:val="FFFFFF"/>
+                <w:sz w:val="18"/>
+              </w:rPr>
+              <w:t>Hạng mục</w:t>
+            </w:r>
+          </w:p>
+        </w:tc>
+        <w:tc>
+          <w:tcPr>
+            <w:tcW w:type="dxa" w:w="5112"/>
+            <w:tcMar>
+              <w:top w:w="70" w:type="dxa"/>
+              <w:bottom w:w="70" w:type="dxa"/>
+              <w:left w:w="100" w:type="dxa"/>
+              <w:right w:w="100" w:type="dxa"/>
+            </w:tcMar>
+            <w:shd w:fill="0F172A"/>
+          </w:tcPr>
+          <w:p>
+            <w:pPr>
+              <w:spacing w:before="0" w:after="0"/>
+            </w:pPr>
+            <w:r>
+              <w:rPr>
+                <w:rFonts w:ascii="Arial" w:hAnsi="Arial"/>
+                <w:b/>
+                <w:color w:val="FFFFFF"/>
+                <w:sz w:val="18"/>
+              </w:rPr>
+              <w:t>Chi phí</w:t>
+            </w:r>
+          </w:p>
+        </w:tc>
+      </w:tr>
+      <w:tr>
+        <w:tc>
+          <w:tcPr>
+            <w:tcW w:type="dxa" w:w="5112"/>
+            <w:tcMar>
+              <w:top w:w="70" w:type="dxa"/>
+              <w:bottom w:w="70" w:type="dxa"/>
+              <w:left w:w="100" w:type="dxa"/>
+              <w:right w:w="100" w:type="dxa"/>
+            </w:tcMar>
+            <w:shd w:fill="FFFFFF"/>
+          </w:tcPr>
+          <w:p>
+            <w:pPr>
+              <w:spacing w:before="0" w:after="0"/>
+            </w:pPr>
+            <w:r>
+              <w:rPr>
+                <w:rFonts w:ascii="Arial" w:hAnsi="Arial"/>
+                <w:color w:val="1E293B"/>
+                <w:sz w:val="18"/>
+              </w:rPr>
+              <w:t>Phát triển phần mềm (71 tính năng + 5 AI)</w:t>
+            </w:r>
+          </w:p>
+        </w:tc>
+        <w:tc>
+          <w:tcPr>
+            <w:tcW w:type="dxa" w:w="5112"/>
+            <w:tcMar>
+              <w:top w:w="70" w:type="dxa"/>
+              <w:bottom w:w="70" w:type="dxa"/>
+              <w:left w:w="100" w:type="dxa"/>
+              <w:right w:w="100" w:type="dxa"/>
+            </w:tcMar>
+            <w:shd w:fill="FFFFFF"/>
+          </w:tcPr>
+          <w:p>
+            <w:pPr>
+              <w:spacing w:before="0" w:after="0"/>
+            </w:pPr>
+            <w:r>
+              <w:rPr>
+                <w:rFonts w:ascii="Arial" w:hAnsi="Arial"/>
+                <w:color w:val="1E293B"/>
+                <w:sz w:val="18"/>
+              </w:rPr>
+              <w:t>175.000.000</w:t>
+            </w:r>
+          </w:p>
+        </w:tc>
+      </w:tr>
+      <w:tr>
+        <w:tc>
+          <w:tcPr>
+            <w:tcW w:type="dxa" w:w="5112"/>
+            <w:tcMar>
+              <w:top w:w="70" w:type="dxa"/>
+              <w:bottom w:w="70" w:type="dxa"/>
+              <w:left w:w="100" w:type="dxa"/>
+              <w:right w:w="100" w:type="dxa"/>
+            </w:tcMar>
+            <w:shd w:fill="F8FAFC"/>
+          </w:tcPr>
+          <w:p>
+            <w:pPr>
+              <w:spacing w:before="0" w:after="0"/>
+            </w:pPr>
+            <w:r>
+              <w:rPr>
+                <w:rFonts w:ascii="Arial" w:hAnsi="Arial"/>
+                <w:color w:val="1E293B"/>
+                <w:sz w:val="18"/>
+              </w:rPr>
+              <w:t>Thiết bị phần cứng (3 chi nhánh)</w:t>
+            </w:r>
+          </w:p>
+        </w:tc>
+        <w:tc>
+          <w:tcPr>
+            <w:tcW w:type="dxa" w:w="5112"/>
+            <w:tcMar>
+              <w:top w:w="70" w:type="dxa"/>
+              <w:bottom w:w="70" w:type="dxa"/>
+              <w:left w:w="100" w:type="dxa"/>
+              <w:right w:w="100" w:type="dxa"/>
+            </w:tcMar>
+            <w:shd w:fill="F8FAFC"/>
+          </w:tcPr>
+          <w:p>
+            <w:pPr>
+              <w:spacing w:before="0" w:after="0"/>
+            </w:pPr>
+            <w:r>
+              <w:rPr>
+                <w:rFonts w:ascii="Arial" w:hAnsi="Arial"/>
+                <w:color w:val="1E293B"/>
+                <w:sz w:val="18"/>
+              </w:rPr>
+              <w:t>41.490.000</w:t>
+            </w:r>
+          </w:p>
+        </w:tc>
+      </w:tr>
+      <w:tr>
+        <w:tc>
+          <w:tcPr>
+            <w:tcW w:type="dxa" w:w="5112"/>
+            <w:tcMar>
+              <w:top w:w="70" w:type="dxa"/>
+              <w:bottom w:w="70" w:type="dxa"/>
+              <w:left w:w="100" w:type="dxa"/>
+              <w:right w:w="100" w:type="dxa"/>
+            </w:tcMar>
+            <w:shd w:fill="FFFFFF"/>
+          </w:tcPr>
+          <w:p>
+            <w:pPr>
+              <w:spacing w:before="0" w:after="0"/>
+            </w:pPr>
+            <w:r>
+              <w:rPr>
+                <w:rFonts w:ascii="Arial" w:hAnsi="Arial"/>
+                <w:b/>
+                <w:color w:val="1E293B"/>
+                <w:sz w:val="18"/>
+              </w:rPr>
+              <w:t>TỔNG ĐẦU TƯ BAN ĐẦU</w:t>
+            </w:r>
+          </w:p>
+        </w:tc>
+        <w:tc>
+          <w:tcPr>
+            <w:tcW w:type="dxa" w:w="5112"/>
+            <w:tcMar>
+              <w:top w:w="70" w:type="dxa"/>
+              <w:bottom w:w="70" w:type="dxa"/>
+              <w:left w:w="100" w:type="dxa"/>
+              <w:right w:w="100" w:type="dxa"/>
+            </w:tcMar>
+            <w:shd w:fill="FFFFFF"/>
+          </w:tcPr>
+          <w:p>
+            <w:pPr>
+              <w:spacing w:before="0" w:after="0"/>
+            </w:pPr>
+            <w:r>
+              <w:rPr>
+                <w:rFonts w:ascii="Arial" w:hAnsi="Arial"/>
+                <w:b/>
+                <w:color w:val="1E293B"/>
+                <w:sz w:val="18"/>
+              </w:rPr>
+              <w:t>216.490.000</w:t>
+            </w:r>
+          </w:p>
+        </w:tc>
+      </w:tr>
+      <w:tr>
+        <w:tc>
+          <w:tcPr>
+            <w:tcW w:type="dxa" w:w="5112"/>
+            <w:tcMar>
+              <w:top w:w="70" w:type="dxa"/>
+              <w:bottom w:w="70" w:type="dxa"/>
+              <w:left w:w="100" w:type="dxa"/>
+              <w:right w:w="100" w:type="dxa"/>
+            </w:tcMar>
+            <w:shd w:fill="F8FAFC"/>
+          </w:tcPr>
+          <w:p>
+            <w:pPr>
+              <w:spacing w:before="0" w:after="0"/>
+            </w:pPr>
+            <w:r>
+              <w:rPr>
+                <w:rFonts w:ascii="Arial" w:hAnsi="Arial"/>
+                <w:b/>
+                <w:i/>
+                <w:color w:val="1E293B"/>
+                <w:sz w:val="18"/>
+              </w:rPr>
+              <w:t>Nếu dùng lại máy in cũ</w:t>
+            </w:r>
+          </w:p>
+        </w:tc>
+        <w:tc>
+          <w:tcPr>
+            <w:tcW w:type="dxa" w:w="5112"/>
+            <w:tcMar>
+              <w:top w:w="70" w:type="dxa"/>
+              <w:bottom w:w="70" w:type="dxa"/>
+              <w:left w:w="100" w:type="dxa"/>
+              <w:right w:w="100" w:type="dxa"/>
+            </w:tcMar>
+            <w:shd w:fill="F8FAFC"/>
+          </w:tcPr>
+          <w:p>
+            <w:pPr>
+              <w:spacing w:before="0" w:after="0"/>
+            </w:pPr>
+            <w:r>
+              <w:rPr>
+                <w:rFonts w:ascii="Arial" w:hAnsi="Arial"/>
+                <w:i/>
+                <w:color w:val="1E293B"/>
+                <w:sz w:val="18"/>
+              </w:rPr>
+              <w:t>210.490.000</w:t>
+            </w:r>
+          </w:p>
+        </w:tc>
+      </w:tr>
+    </w:tbl>
+    <w:p>
+      <w:pPr>
+        <w:spacing w:after="40"/>
+      </w:pPr>
+    </w:p>
+    <w:p>
+      <w:pPr>
+        <w:keepNext/>
+        <w:spacing w:before="200" w:after="80"/>
+      </w:pPr>
+      <w:r>
+        <w:rPr>
+          <w:rFonts w:ascii="Arial" w:hAnsi="Arial"/>
+          <w:b/>
+          <w:color w:val="2563EB"/>
+          <w:sz w:val="22"/>
+        </w:rPr>
+        <w:t>Chi phí vận hành hàng tháng</w:t>
+      </w:r>
+    </w:p>
+    <w:tbl>
+      <w:tblPr>
+        <w:tblW w:type="auto" w:w="0"/>
+        <w:jc w:val="center"/>
+        <w:tblLook w:firstColumn="1" w:firstRow="1" w:lastColumn="0" w:lastRow="0" w:noHBand="0" w:noVBand="1" w:val="04A0"/>
+        <w:tblBorders>
+          <w:top w:val="single" w:sz="6" w:space="0" w:color="CBD5E1"/>
+          <w:bottom w:val="single" w:sz="6" w:space="0" w:color="CBD5E1"/>
+          <w:left w:val="single" w:sz="6" w:space="0" w:color="CBD5E1"/>
+          <w:right w:val="single" w:sz="6" w:space="0" w:color="CBD5E1"/>
+          <w:insideH w:val="single" w:sz="4" w:space="0" w:color="E2E8F0"/>
+          <w:insideV w:val="single" w:sz="4" w:space="0" w:color="E2E8F0"/>
+        </w:tblBorders>
+      </w:tblPr>
+      <w:tblGrid>
+        <w:gridCol w:w="5112"/>
+        <w:gridCol w:w="5112"/>
+      </w:tblGrid>
+      <w:tr>
+        <w:tc>
+          <w:tcPr>
+            <w:tcW w:type="dxa" w:w="5112"/>
+            <w:tcMar>
+              <w:top w:w="70" w:type="dxa"/>
+              <w:bottom w:w="70" w:type="dxa"/>
+              <w:left w:w="100" w:type="dxa"/>
+              <w:right w:w="100" w:type="dxa"/>
+            </w:tcMar>
+            <w:shd w:fill="0F172A"/>
+          </w:tcPr>
+          <w:p>
+            <w:pPr>
+              <w:spacing w:before="0" w:after="0"/>
+            </w:pPr>
+            <w:r>
+              <w:rPr>
+                <w:rFonts w:ascii="Arial" w:hAnsi="Arial"/>
+                <w:b/>
+                <w:color w:val="FFFFFF"/>
+                <w:sz w:val="18"/>
+              </w:rPr>
+              <w:t>Hạng mục</w:t>
+            </w:r>
+          </w:p>
+        </w:tc>
+        <w:tc>
+          <w:tcPr>
+            <w:tcW w:type="dxa" w:w="5112"/>
+            <w:tcMar>
+              <w:top w:w="70" w:type="dxa"/>
+              <w:bottom w:w="70" w:type="dxa"/>
+              <w:left w:w="100" w:type="dxa"/>
+              <w:right w:w="100" w:type="dxa"/>
+            </w:tcMar>
+            <w:shd w:fill="0F172A"/>
+          </w:tcPr>
+          <w:p>
+            <w:pPr>
+              <w:spacing w:before="0" w:after="0"/>
+            </w:pPr>
+            <w:r>
+              <w:rPr>
+                <w:rFonts w:ascii="Arial" w:hAnsi="Arial"/>
+                <w:b/>
+                <w:color w:val="FFFFFF"/>
+                <w:sz w:val="18"/>
+              </w:rPr>
+              <w:t>Chi phí/tháng</w:t>
+            </w:r>
+          </w:p>
+        </w:tc>
+      </w:tr>
+      <w:tr>
+        <w:tc>
+          <w:tcPr>
+            <w:tcW w:type="dxa" w:w="5112"/>
+            <w:tcMar>
+              <w:top w:w="70" w:type="dxa"/>
+              <w:bottom w:w="70" w:type="dxa"/>
+              <w:left w:w="100" w:type="dxa"/>
+              <w:right w:w="100" w:type="dxa"/>
+            </w:tcMar>
+            <w:shd w:fill="FFFFFF"/>
+          </w:tcPr>
+          <w:p>
+            <w:pPr>
+              <w:spacing w:before="0" w:after="0"/>
+            </w:pPr>
+            <w:r>
+              <w:rPr>
+                <w:rFonts w:ascii="Arial" w:hAnsi="Arial"/>
+                <w:color w:val="1E293B"/>
+                <w:sz w:val="18"/>
+              </w:rPr>
+              <w:t>Vận hành hạ tầng (Server + AI + 4G + tiêu hao)</w:t>
+            </w:r>
+          </w:p>
+        </w:tc>
+        <w:tc>
+          <w:tcPr>
+            <w:tcW w:type="dxa" w:w="5112"/>
+            <w:tcMar>
+              <w:top w:w="70" w:type="dxa"/>
+              <w:bottom w:w="70" w:type="dxa"/>
+              <w:left w:w="100" w:type="dxa"/>
+              <w:right w:w="100" w:type="dxa"/>
+            </w:tcMar>
+            <w:shd w:fill="FFFFFF"/>
+          </w:tcPr>
+          <w:p>
+            <w:pPr>
+              <w:spacing w:before="0" w:after="0"/>
+            </w:pPr>
+            <w:r>
+              <w:rPr>
+                <w:rFonts w:ascii="Arial" w:hAnsi="Arial"/>
+                <w:color w:val="1E293B"/>
+                <w:sz w:val="18"/>
+              </w:rPr>
+              <w:t>1.860.000</w:t>
+            </w:r>
+          </w:p>
+        </w:tc>
+      </w:tr>
+      <w:tr>
+        <w:tc>
+          <w:tcPr>
+            <w:tcW w:type="dxa" w:w="5112"/>
+            <w:tcMar>
+              <w:top w:w="70" w:type="dxa"/>
+              <w:bottom w:w="70" w:type="dxa"/>
+              <w:left w:w="100" w:type="dxa"/>
+              <w:right w:w="100" w:type="dxa"/>
+            </w:tcMar>
+            <w:shd w:fill="F8FAFC"/>
+          </w:tcPr>
+          <w:p>
+            <w:pPr>
+              <w:spacing w:before="0" w:after="0"/>
+            </w:pPr>
+            <w:r>
+              <w:rPr>
+                <w:rFonts w:ascii="Arial" w:hAnsi="Arial"/>
+                <w:color w:val="1E293B"/>
+                <w:sz w:val="18"/>
+              </w:rPr>
+              <w:t>Bảo trì phần mềm (Gói cơ bản)</w:t>
+            </w:r>
+          </w:p>
+        </w:tc>
+        <w:tc>
+          <w:tcPr>
+            <w:tcW w:type="dxa" w:w="5112"/>
+            <w:tcMar>
+              <w:top w:w="70" w:type="dxa"/>
+              <w:bottom w:w="70" w:type="dxa"/>
+              <w:left w:w="100" w:type="dxa"/>
+              <w:right w:w="100" w:type="dxa"/>
+            </w:tcMar>
+            <w:shd w:fill="F8FAFC"/>
+          </w:tcPr>
+          <w:p>
+            <w:pPr>
+              <w:spacing w:before="0" w:after="0"/>
+            </w:pPr>
+            <w:r>
+              <w:rPr>
+                <w:rFonts w:ascii="Arial" w:hAnsi="Arial"/>
+                <w:color w:val="1E293B"/>
+                <w:sz w:val="18"/>
+              </w:rPr>
+              <w:t>3.000.000</w:t>
+            </w:r>
+          </w:p>
+        </w:tc>
+      </w:tr>
+      <w:tr>
+        <w:tc>
+          <w:tcPr>
+            <w:tcW w:type="dxa" w:w="5112"/>
+            <w:tcMar>
+              <w:top w:w="70" w:type="dxa"/>
+              <w:bottom w:w="70" w:type="dxa"/>
+              <w:left w:w="100" w:type="dxa"/>
+              <w:right w:w="100" w:type="dxa"/>
+            </w:tcMar>
+            <w:shd w:fill="FFFFFF"/>
+          </w:tcPr>
+          <w:p>
+            <w:pPr>
+              <w:spacing w:before="0" w:after="0"/>
+            </w:pPr>
+            <w:r>
+              <w:rPr>
+                <w:rFonts w:ascii="Arial" w:hAnsi="Arial"/>
+                <w:b/>
+                <w:color w:val="1E293B"/>
+                <w:sz w:val="18"/>
+              </w:rPr>
+              <w:t>TỔNG HÀNG THÁNG</w:t>
+            </w:r>
+          </w:p>
+        </w:tc>
+        <w:tc>
+          <w:tcPr>
+            <w:tcW w:type="dxa" w:w="5112"/>
+            <w:tcMar>
+              <w:top w:w="70" w:type="dxa"/>
+              <w:bottom w:w="70" w:type="dxa"/>
+              <w:left w:w="100" w:type="dxa"/>
+              <w:right w:w="100" w:type="dxa"/>
+            </w:tcMar>
+            <w:shd w:fill="FFFFFF"/>
+          </w:tcPr>
+          <w:p>
+            <w:pPr>
+              <w:spacing w:before="0" w:after="0"/>
+            </w:pPr>
+            <w:r>
+              <w:rPr>
+                <w:rFonts w:ascii="Arial" w:hAnsi="Arial"/>
+                <w:b/>
+                <w:color w:val="1E293B"/>
+                <w:sz w:val="18"/>
+              </w:rPr>
+              <w:t>4.860.000</w:t>
+            </w:r>
+          </w:p>
+        </w:tc>
+      </w:tr>
+      <w:tr>
+        <w:tc>
+          <w:tcPr>
+            <w:tcW w:type="dxa" w:w="5112"/>
+            <w:tcMar>
+              <w:top w:w="70" w:type="dxa"/>
+              <w:bottom w:w="70" w:type="dxa"/>
+              <w:left w:w="100" w:type="dxa"/>
+              <w:right w:w="100" w:type="dxa"/>
+            </w:tcMar>
+            <w:shd w:fill="F8FAFC"/>
+          </w:tcPr>
+          <w:p>
+            <w:pPr>
+              <w:spacing w:before="0" w:after="0"/>
+            </w:pPr>
+            <w:r>
+              <w:rPr>
+                <w:rFonts w:ascii="Arial" w:hAnsi="Arial"/>
+                <w:i/>
+                <w:color w:val="1E293B"/>
+                <w:sz w:val="18"/>
+              </w:rPr>
+              <w:t>Nếu chọn gói bảo trì nâng cao</w:t>
+            </w:r>
+          </w:p>
+        </w:tc>
+        <w:tc>
+          <w:tcPr>
+            <w:tcW w:type="dxa" w:w="5112"/>
+            <w:tcMar>
+              <w:top w:w="70" w:type="dxa"/>
+              <w:bottom w:w="70" w:type="dxa"/>
+              <w:left w:w="100" w:type="dxa"/>
+              <w:right w:w="100" w:type="dxa"/>
+            </w:tcMar>
+            <w:shd w:fill="F8FAFC"/>
+          </w:tcPr>
+          <w:p>
+            <w:pPr>
+              <w:spacing w:before="0" w:after="0"/>
+            </w:pPr>
+            <w:r>
+              <w:rPr>
+                <w:rFonts w:ascii="Arial" w:hAnsi="Arial"/>
+                <w:i/>
+                <w:color w:val="1E293B"/>
+                <w:sz w:val="18"/>
+              </w:rPr>
+              <w:t>7.860.000</w:t>
+            </w:r>
+          </w:p>
+        </w:tc>
+      </w:tr>
+    </w:tbl>
+    <w:p>
+      <w:pPr>
+        <w:spacing w:after="40"/>
+      </w:pPr>
+    </w:p>
+    <w:p>
+      <w:pPr>
+        <w:keepNext/>
+        <w:spacing w:before="200" w:after="80"/>
+      </w:pPr>
+      <w:r>
+        <w:rPr>
+          <w:rFonts w:ascii="Arial" w:hAnsi="Arial"/>
+          <w:b/>
+          <w:color w:val="2563EB"/>
+          <w:sz w:val="22"/>
+        </w:rPr>
+        <w:t>Tổng theo thời gian</w:t>
       </w:r>
     </w:p>
     <w:tbl>
@@ -4504,7 +7870,7 @@
                 <w:color w:val="1E293B"/>
                 <w:sz w:val="18"/>
               </w:rPr>
-              <w:t>Ban đầu (thiết bị)</w:t>
+              <w:t>Ban đầu</w:t>
             </w:r>
           </w:p>
         </w:tc>
@@ -4530,7 +7896,7 @@
                 <w:color w:val="1E293B"/>
                 <w:sz w:val="18"/>
               </w:rPr>
-              <w:t>41.490.000</w:t>
+              <w:t>216.490.000</w:t>
             </w:r>
           </w:p>
         </w:tc>
@@ -4555,7 +7921,7 @@
                 <w:color w:val="1E293B"/>
                 <w:sz w:val="18"/>
               </w:rPr>
-              <w:t>Thanh toán 1 lần. Dùng lại máy in cũ: 35.490.000</w:t>
+              <w:t>Phần mềm + thiết bị, thanh toán theo giai đoạn</w:t>
             </w:r>
           </w:p>
         </w:tc>
@@ -4583,7 +7949,7 @@
                 <w:color w:val="1E293B"/>
                 <w:sz w:val="18"/>
               </w:rPr>
-              <w:t>Mỗi tháng (vận hành)</w:t>
+              <w:t>Mỗi tháng</w:t>
             </w:r>
           </w:p>
         </w:tc>
@@ -4609,7 +7975,7 @@
                 <w:color w:val="1E293B"/>
                 <w:sz w:val="18"/>
               </w:rPr>
-              <w:t>1.860.000</w:t>
+              <w:t>4.860.000</w:t>
             </w:r>
           </w:p>
         </w:tc>
@@ -4634,7 +8000,7 @@
                 <w:color w:val="1E293B"/>
                 <w:sz w:val="18"/>
               </w:rPr>
-              <w:t>Trung bình 620.000/chi nhánh/tháng</w:t>
+              <w:t>Vận hành + Bảo trì cơ bản</w:t>
             </w:r>
           </w:p>
         </w:tc>
@@ -4688,7 +8054,7 @@
                 <w:color w:val="1E293B"/>
                 <w:sz w:val="18"/>
               </w:rPr>
-              <w:t>~63.800.000</w:t>
+              <w:t>~274.800.000</w:t>
             </w:r>
           </w:p>
         </w:tc>
@@ -4713,7 +8079,7 @@
                 <w:color w:val="1E293B"/>
                 <w:sz w:val="18"/>
               </w:rPr>
-              <w:t>Thiết bị + 12 tháng vận hành</w:t>
+              <w:t>Ban đầu + 12 tháng vận hành (gồm 3 tháng BH miễn phí + 9 tháng bảo trì)</w:t>
             </w:r>
           </w:p>
         </w:tc>
@@ -4767,7 +8133,7 @@
                 <w:color w:val="1E293B"/>
                 <w:sz w:val="18"/>
               </w:rPr>
-              <w:t>~22.300.000/năm</w:t>
+              <w:t>~58.300.000/năm</w:t>
             </w:r>
           </w:p>
         </w:tc>
@@ -4792,7 +8158,7 @@
                 <w:color w:val="1E293B"/>
                 <w:sz w:val="18"/>
               </w:rPr>
-              <w:t>Chỉ còn chi phí vận hành hàng tháng</w:t>
+              <w:t>Chỉ vận hành + bảo trì hàng tháng</w:t>
             </w:r>
           </w:p>
         </w:tc>
@@ -4818,7 +8184,7 @@
           <w:color w:val="0F172A"/>
           <w:sz w:val="26"/>
         </w:rPr>
-        <w:t>F. SO SÁNH CHI PHÍ: CÂY POS CŨ vs SMART F&amp;B OS</w:t>
+        <w:t>H. SO SÁNH CHI PHÍ: CÂY POS CŨ vs SMART F&amp;B OS</w:t>
       </w:r>
     </w:p>
     <w:tbl>
@@ -5275,7 +8641,7 @@
                 <w:color w:val="1E293B"/>
                 <w:sz w:val="18"/>
               </w:rPr>
-              <w:t>Chi phí duy trì hệ thống</w:t>
+              <w:t>Chi phí vận hành + bảo trì</w:t>
             </w:r>
           </w:p>
         </w:tc>
@@ -5325,7 +8691,7 @@
                 <w:color w:val="1E293B"/>
                 <w:sz w:val="18"/>
               </w:rPr>
-              <w:t>1.860.000</w:t>
+              <w:t>4.860.000</w:t>
             </w:r>
           </w:p>
         </w:tc>
@@ -5350,7 +8716,7 @@
                 <w:color w:val="1E293B"/>
                 <w:sz w:val="18"/>
               </w:rPr>
-              <w:t>Tương đương</w:t>
+              <w:t>+3.360.000</w:t>
             </w:r>
           </w:p>
         </w:tc>
@@ -5500,7 +8866,7 @@
                 <w:color w:val="1E293B"/>
                 <w:sz w:val="18"/>
               </w:rPr>
-              <w:t>~4.860.000</w:t>
+              <w:t>~7.860.000</w:t>
             </w:r>
           </w:p>
         </w:tc>
@@ -5526,7 +8892,7 @@
                 <w:color w:val="1E293B"/>
                 <w:sz w:val="18"/>
               </w:rPr>
-              <w:t>Tiết kiệm ~30 - 37 triệu</w:t>
+              <w:t>Tiết kiệm ~27 - 34 triệu</w:t>
             </w:r>
           </w:p>
         </w:tc>
@@ -5574,26 +8940,8 @@
                 <w:color w:val="1E293B"/>
                 <w:sz w:val="19"/>
               </w:rPr>
-              <w:t>Lương thu ngân: Ước tính 6 - 7 triệu/NV (gồm phụ cấp &amp; BHXH), tùy khu vực.</w:t>
+              <w:t xml:space="preserve">Tiết kiệm ròng hàng tháng khoảng </w:t>
             </w:r>
-          </w:p>
-          <w:p>
-            <w:pPr>
-              <w:spacing w:before="0" w:after="20"/>
-            </w:pPr>
-            <w:r>
-              <w:rPr>
-                <w:rFonts w:ascii="Arial" w:hAnsi="Arial"/>
-                <w:color w:val="1E293B"/>
-                <w:sz w:val="19"/>
-              </w:rPr>
-              <w:t>Phí POS cũ: Tùy nhà cung cấp đang dùng (iPOS, KiotViet, CukCuk,...).</w:t>
-            </w:r>
-          </w:p>
-          <w:p>
-            <w:pPr>
-              <w:spacing w:before="0" w:after="20"/>
-            </w:pPr>
             <w:r>
               <w:rPr>
                 <w:rFonts w:ascii="Arial" w:hAnsi="Arial"/>
@@ -5601,7 +8949,7 @@
                 <w:color w:val="1E293B"/>
                 <w:sz w:val="19"/>
               </w:rPr>
-              <w:t>Thời gian hoàn vốn thiết bị:</w:t>
+              <w:t>27 - 34 triệu VNĐ</w:t>
             </w:r>
             <w:r>
               <w:rPr>
@@ -5609,7 +8957,59 @@
                 <w:color w:val="1E293B"/>
                 <w:sz w:val="19"/>
               </w:rPr>
-              <w:t xml:space="preserve"> Khoảng 1.5 - 2 tháng vận hành.</w:t>
+              <w:t>.</w:t>
+            </w:r>
+          </w:p>
+          <w:p>
+            <w:pPr>
+              <w:spacing w:before="0" w:after="20"/>
+            </w:pPr>
+            <w:r>
+              <w:rPr>
+                <w:rFonts w:ascii="Arial" w:hAnsi="Arial"/>
+                <w:b/>
+                <w:color w:val="1E293B"/>
+                <w:sz w:val="19"/>
+              </w:rPr>
+              <w:t>Thời gian hoàn vốn toàn bộ</w:t>
+            </w:r>
+            <w:r>
+              <w:rPr>
+                <w:rFonts w:ascii="Arial" w:hAnsi="Arial"/>
+                <w:color w:val="1E293B"/>
+                <w:sz w:val="19"/>
+              </w:rPr>
+              <w:t xml:space="preserve"> (phần mềm + thiết bị): Khoảng </w:t>
+            </w:r>
+            <w:r>
+              <w:rPr>
+                <w:rFonts w:ascii="Arial" w:hAnsi="Arial"/>
+                <w:b/>
+                <w:color w:val="1E293B"/>
+                <w:sz w:val="19"/>
+              </w:rPr>
+              <w:t>7 - 8 tháng</w:t>
+            </w:r>
+            <w:r>
+              <w:rPr>
+                <w:rFonts w:ascii="Arial" w:hAnsi="Arial"/>
+                <w:color w:val="1E293B"/>
+                <w:sz w:val="19"/>
+              </w:rPr>
+              <w:t xml:space="preserve"> vận hành.</w:t>
+            </w:r>
+          </w:p>
+          <w:p>
+            <w:pPr>
+              <w:spacing w:before="0" w:after="20"/>
+            </w:pPr>
+            <w:r>
+              <w:rPr>
+                <w:rFonts w:ascii="Arial" w:hAnsi="Arial"/>
+                <w:color w:val="1E293B"/>
+                <w:sz w:val="19"/>
+              </w:rPr>
+              <w:t>Từ tháng thứ 9 trở đi, toàn bộ khoản tiết kiệm là lợi nhuận ròng.</w:t>
             </w:r>
           </w:p>
         </w:tc>
@@ -5635,7 +9035,7 @@
           <w:color w:val="0F172A"/>
           <w:sz w:val="26"/>
         </w:rPr>
-        <w:t>G. ĐIỀU KHOẢN THANH TOÁN</w:t>
+        <w:t>I. ĐIỀU KHOẢN THANH TOÁN</w:t>
       </w:r>
     </w:p>
     <w:tbl>
@@ -5811,7 +9211,7 @@
                 <w:color w:val="1E293B"/>
                 <w:sz w:val="18"/>
               </w:rPr>
-              <w:t>Thanh toán thiết bị &amp; lắp đặt</w:t>
+              <w:t>Ký hợp đồng + Khởi động phát triển (GĐ 1)</w:t>
             </w:r>
           </w:p>
         </w:tc>
@@ -5836,7 +9236,7 @@
                 <w:color w:val="1E293B"/>
                 <w:sz w:val="18"/>
               </w:rPr>
-              <w:t>41.490.000</w:t>
+              <w:t>70.000.000</w:t>
             </w:r>
           </w:p>
         </w:tc>
@@ -5861,7 +9261,7 @@
                 <w:color w:val="1E293B"/>
                 <w:sz w:val="18"/>
               </w:rPr>
-              <w:t>Trước khi triển khai</w:t>
+              <w:t>Ngày ký hợp đồng</w:t>
             </w:r>
           </w:p>
         </w:tc>
@@ -5877,6 +9277,312 @@
               <w:right w:w="100" w:type="dxa"/>
             </w:tcMar>
             <w:shd w:fill="F8FAFC"/>
+          </w:tcPr>
+          <w:p>
+            <w:pPr>
+              <w:spacing w:before="0" w:after="0"/>
+            </w:pPr>
+            <w:r>
+              <w:rPr>
+                <w:rFonts w:ascii="Arial" w:hAnsi="Arial"/>
+                <w:color w:val="1E293B"/>
+                <w:sz w:val="18"/>
+              </w:rPr>
+              <w:t>Đợt 2</w:t>
+            </w:r>
+          </w:p>
+        </w:tc>
+        <w:tc>
+          <w:tcPr>
+            <w:tcW w:type="dxa" w:w="2556"/>
+            <w:tcMar>
+              <w:top w:w="70" w:type="dxa"/>
+              <w:bottom w:w="70" w:type="dxa"/>
+              <w:left w:w="100" w:type="dxa"/>
+              <w:right w:w="100" w:type="dxa"/>
+            </w:tcMar>
+            <w:shd w:fill="F8FAFC"/>
+          </w:tcPr>
+          <w:p>
+            <w:pPr>
+              <w:spacing w:before="0" w:after="0"/>
+            </w:pPr>
+            <w:r>
+              <w:rPr>
+                <w:rFonts w:ascii="Arial" w:hAnsi="Arial"/>
+                <w:color w:val="1E293B"/>
+                <w:sz w:val="18"/>
+              </w:rPr>
+              <w:t>Bàn giao GĐ 1 (Backend + QR + KDS chạy thử)</w:t>
+            </w:r>
+          </w:p>
+        </w:tc>
+        <w:tc>
+          <w:tcPr>
+            <w:tcW w:type="dxa" w:w="2556"/>
+            <w:tcMar>
+              <w:top w:w="70" w:type="dxa"/>
+              <w:bottom w:w="70" w:type="dxa"/>
+              <w:left w:w="100" w:type="dxa"/>
+              <w:right w:w="100" w:type="dxa"/>
+            </w:tcMar>
+            <w:shd w:fill="F8FAFC"/>
+          </w:tcPr>
+          <w:p>
+            <w:pPr>
+              <w:spacing w:before="0" w:after="0"/>
+            </w:pPr>
+            <w:r>
+              <w:rPr>
+                <w:rFonts w:ascii="Arial" w:hAnsi="Arial"/>
+                <w:color w:val="1E293B"/>
+                <w:sz w:val="18"/>
+              </w:rPr>
+              <w:t>41.490.000 (thiết bị)</w:t>
+            </w:r>
+          </w:p>
+        </w:tc>
+        <w:tc>
+          <w:tcPr>
+            <w:tcW w:type="dxa" w:w="2556"/>
+            <w:tcMar>
+              <w:top w:w="70" w:type="dxa"/>
+              <w:bottom w:w="70" w:type="dxa"/>
+              <w:left w:w="100" w:type="dxa"/>
+              <w:right w:w="100" w:type="dxa"/>
+            </w:tcMar>
+            <w:shd w:fill="F8FAFC"/>
+          </w:tcPr>
+          <w:p>
+            <w:pPr>
+              <w:spacing w:before="0" w:after="0"/>
+            </w:pPr>
+            <w:r>
+              <w:rPr>
+                <w:rFonts w:ascii="Arial" w:hAnsi="Arial"/>
+                <w:color w:val="1E293B"/>
+                <w:sz w:val="18"/>
+              </w:rPr>
+              <w:t>Sau 2 tháng</w:t>
+            </w:r>
+          </w:p>
+        </w:tc>
+      </w:tr>
+      <w:tr>
+        <w:tc>
+          <w:tcPr>
+            <w:tcW w:type="dxa" w:w="2556"/>
+            <w:tcMar>
+              <w:top w:w="70" w:type="dxa"/>
+              <w:bottom w:w="70" w:type="dxa"/>
+              <w:left w:w="100" w:type="dxa"/>
+              <w:right w:w="100" w:type="dxa"/>
+            </w:tcMar>
+            <w:shd w:fill="FFFFFF"/>
+          </w:tcPr>
+          <w:p>
+            <w:pPr>
+              <w:spacing w:before="0" w:after="0"/>
+            </w:pPr>
+            <w:r>
+              <w:rPr>
+                <w:rFonts w:ascii="Arial" w:hAnsi="Arial"/>
+                <w:color w:val="1E293B"/>
+                <w:sz w:val="18"/>
+              </w:rPr>
+              <w:t>Đợt 3</w:t>
+            </w:r>
+          </w:p>
+        </w:tc>
+        <w:tc>
+          <w:tcPr>
+            <w:tcW w:type="dxa" w:w="2556"/>
+            <w:tcMar>
+              <w:top w:w="70" w:type="dxa"/>
+              <w:bottom w:w="70" w:type="dxa"/>
+              <w:left w:w="100" w:type="dxa"/>
+              <w:right w:w="100" w:type="dxa"/>
+            </w:tcMar>
+            <w:shd w:fill="FFFFFF"/>
+          </w:tcPr>
+          <w:p>
+            <w:pPr>
+              <w:spacing w:before="0" w:after="0"/>
+            </w:pPr>
+            <w:r>
+              <w:rPr>
+                <w:rFonts w:ascii="Arial" w:hAnsi="Arial"/>
+                <w:color w:val="1E293B"/>
+                <w:sz w:val="18"/>
+              </w:rPr>
+              <w:t>Bàn giao GĐ 2 (Manager + Admin + Offline)</w:t>
+            </w:r>
+          </w:p>
+        </w:tc>
+        <w:tc>
+          <w:tcPr>
+            <w:tcW w:type="dxa" w:w="2556"/>
+            <w:tcMar>
+              <w:top w:w="70" w:type="dxa"/>
+              <w:bottom w:w="70" w:type="dxa"/>
+              <w:left w:w="100" w:type="dxa"/>
+              <w:right w:w="100" w:type="dxa"/>
+            </w:tcMar>
+            <w:shd w:fill="FFFFFF"/>
+          </w:tcPr>
+          <w:p>
+            <w:pPr>
+              <w:spacing w:before="0" w:after="0"/>
+            </w:pPr>
+            <w:r>
+              <w:rPr>
+                <w:rFonts w:ascii="Arial" w:hAnsi="Arial"/>
+                <w:color w:val="1E293B"/>
+                <w:sz w:val="18"/>
+              </w:rPr>
+              <w:t>60.000.000</w:t>
+            </w:r>
+          </w:p>
+        </w:tc>
+        <w:tc>
+          <w:tcPr>
+            <w:tcW w:type="dxa" w:w="2556"/>
+            <w:tcMar>
+              <w:top w:w="70" w:type="dxa"/>
+              <w:bottom w:w="70" w:type="dxa"/>
+              <w:left w:w="100" w:type="dxa"/>
+              <w:right w:w="100" w:type="dxa"/>
+            </w:tcMar>
+            <w:shd w:fill="FFFFFF"/>
+          </w:tcPr>
+          <w:p>
+            <w:pPr>
+              <w:spacing w:before="0" w:after="0"/>
+            </w:pPr>
+            <w:r>
+              <w:rPr>
+                <w:rFonts w:ascii="Arial" w:hAnsi="Arial"/>
+                <w:color w:val="1E293B"/>
+                <w:sz w:val="18"/>
+              </w:rPr>
+              <w:t>Sau 4 tháng</w:t>
+            </w:r>
+          </w:p>
+        </w:tc>
+      </w:tr>
+      <w:tr>
+        <w:tc>
+          <w:tcPr>
+            <w:tcW w:type="dxa" w:w="2556"/>
+            <w:tcMar>
+              <w:top w:w="70" w:type="dxa"/>
+              <w:bottom w:w="70" w:type="dxa"/>
+              <w:left w:w="100" w:type="dxa"/>
+              <w:right w:w="100" w:type="dxa"/>
+            </w:tcMar>
+            <w:shd w:fill="F8FAFC"/>
+          </w:tcPr>
+          <w:p>
+            <w:pPr>
+              <w:spacing w:before="0" w:after="0"/>
+            </w:pPr>
+            <w:r>
+              <w:rPr>
+                <w:rFonts w:ascii="Arial" w:hAnsi="Arial"/>
+                <w:color w:val="1E293B"/>
+                <w:sz w:val="18"/>
+              </w:rPr>
+              <w:t>Đợt 4</w:t>
+            </w:r>
+          </w:p>
+        </w:tc>
+        <w:tc>
+          <w:tcPr>
+            <w:tcW w:type="dxa" w:w="2556"/>
+            <w:tcMar>
+              <w:top w:w="70" w:type="dxa"/>
+              <w:bottom w:w="70" w:type="dxa"/>
+              <w:left w:w="100" w:type="dxa"/>
+              <w:right w:w="100" w:type="dxa"/>
+            </w:tcMar>
+            <w:shd w:fill="F8FAFC"/>
+          </w:tcPr>
+          <w:p>
+            <w:pPr>
+              <w:spacing w:before="0" w:after="0"/>
+            </w:pPr>
+            <w:r>
+              <w:rPr>
+                <w:rFonts w:ascii="Arial" w:hAnsi="Arial"/>
+                <w:color w:val="1E293B"/>
+                <w:sz w:val="18"/>
+              </w:rPr>
+              <w:t>Nghiệm thu toàn bộ + Golive (GĐ 3)</w:t>
+            </w:r>
+          </w:p>
+        </w:tc>
+        <w:tc>
+          <w:tcPr>
+            <w:tcW w:type="dxa" w:w="2556"/>
+            <w:tcMar>
+              <w:top w:w="70" w:type="dxa"/>
+              <w:bottom w:w="70" w:type="dxa"/>
+              <w:left w:w="100" w:type="dxa"/>
+              <w:right w:w="100" w:type="dxa"/>
+            </w:tcMar>
+            <w:shd w:fill="F8FAFC"/>
+          </w:tcPr>
+          <w:p>
+            <w:pPr>
+              <w:spacing w:before="0" w:after="0"/>
+            </w:pPr>
+            <w:r>
+              <w:rPr>
+                <w:rFonts w:ascii="Arial" w:hAnsi="Arial"/>
+                <w:color w:val="1E293B"/>
+                <w:sz w:val="18"/>
+              </w:rPr>
+              <w:t>45.000.000</w:t>
+            </w:r>
+          </w:p>
+        </w:tc>
+        <w:tc>
+          <w:tcPr>
+            <w:tcW w:type="dxa" w:w="2556"/>
+            <w:tcMar>
+              <w:top w:w="70" w:type="dxa"/>
+              <w:bottom w:w="70" w:type="dxa"/>
+              <w:left w:w="100" w:type="dxa"/>
+              <w:right w:w="100" w:type="dxa"/>
+            </w:tcMar>
+            <w:shd w:fill="F8FAFC"/>
+          </w:tcPr>
+          <w:p>
+            <w:pPr>
+              <w:spacing w:before="0" w:after="0"/>
+            </w:pPr>
+            <w:r>
+              <w:rPr>
+                <w:rFonts w:ascii="Arial" w:hAnsi="Arial"/>
+                <w:color w:val="1E293B"/>
+                <w:sz w:val="18"/>
+              </w:rPr>
+              <w:t>Sau 5 tháng</w:t>
+            </w:r>
+          </w:p>
+        </w:tc>
+      </w:tr>
+      <w:tr>
+        <w:tc>
+          <w:tcPr>
+            <w:tcW w:type="dxa" w:w="2556"/>
+            <w:tcMar>
+              <w:top w:w="70" w:type="dxa"/>
+              <w:bottom w:w="70" w:type="dxa"/>
+              <w:left w:w="100" w:type="dxa"/>
+              <w:right w:w="100" w:type="dxa"/>
+            </w:tcMar>
+            <w:shd w:fill="FFFFFF"/>
           </w:tcPr>
           <w:p>
             <w:pPr>
@@ -5901,7 +9607,7 @@
               <w:left w:w="100" w:type="dxa"/>
               <w:right w:w="100" w:type="dxa"/>
             </w:tcMar>
-            <w:shd w:fill="F8FAFC"/>
+            <w:shd w:fill="FFFFFF"/>
           </w:tcPr>
           <w:p>
             <w:pPr>
@@ -5913,7 +9619,7 @@
                 <w:color w:val="1E293B"/>
                 <w:sz w:val="18"/>
               </w:rPr>
-              <w:t>Chi phí vận hành hạ tầng</w:t>
+              <w:t>Vận hành + Bảo trì (sau 3 tháng BH miễn phí)</w:t>
             </w:r>
           </w:p>
         </w:tc>
@@ -5926,7 +9632,7 @@
               <w:left w:w="100" w:type="dxa"/>
               <w:right w:w="100" w:type="dxa"/>
             </w:tcMar>
-            <w:shd w:fill="F8FAFC"/>
+            <w:shd w:fill="FFFFFF"/>
           </w:tcPr>
           <w:p>
             <w:pPr>
@@ -5938,7 +9644,7 @@
                 <w:color w:val="1E293B"/>
                 <w:sz w:val="18"/>
               </w:rPr>
-              <w:t>1.860.000</w:t>
+              <w:t>4.860.000</w:t>
             </w:r>
           </w:p>
         </w:tc>
@@ -5951,7 +9657,7 @@
               <w:left w:w="100" w:type="dxa"/>
               <w:right w:w="100" w:type="dxa"/>
             </w:tcMar>
-            <w:shd w:fill="F8FAFC"/>
+            <w:shd w:fill="FFFFFF"/>
           </w:tcPr>
           <w:p>
             <w:pPr>
@@ -5963,7 +9669,7 @@
                 <w:color w:val="1E293B"/>
                 <w:sz w:val="18"/>
               </w:rPr>
-              <w:t>Đầu mỗi tháng</w:t>
+              <w:t>Từ tháng thứ 8</w:t>
             </w:r>
           </w:p>
         </w:tc>
@@ -5989,7 +9695,7 @@
           <w:color w:val="0F172A"/>
           <w:sz w:val="26"/>
         </w:rPr>
-        <w:t>H. GHI CHÚ QUAN TRỌNG</w:t>
+        <w:t>J. GHI CHÚ QUAN TRỌNG</w:t>
       </w:r>
     </w:p>
     <w:p>
@@ -6028,7 +9734,7 @@
           <w:rFonts w:ascii="Arial" w:hAnsi="Arial"/>
           <w:sz w:val="20"/>
         </w:rPr>
-        <w:t>3. Chi phí phát sinh (Mục D) chỉ phát sinh khi có nhu cầu thực tế, không bắt buộc.</w:t>
+        <w:t>3. Phần mềm thuộc sở hữu 100% của khách hàng sau khi thanh toán đầy đủ, bao gồm toàn bộ mã nguồn.</w:t>
       </w:r>
     </w:p>
     <w:p>
@@ -6041,7 +9747,7 @@
           <w:rFonts w:ascii="Arial" w:hAnsi="Arial"/>
           <w:sz w:val="20"/>
         </w:rPr>
-        <w:t>4. Hệ thống có cơ chế dự phòng mất mạng 3 lớp: Router 4G tự chuyển, chế độ Offline trên POS, và PWA cache menu cho khách.</w:t>
+        <w:t>4. Bảo hành phần mềm miễn phí 3 tháng sau nghiệm thu. Sau đó khách hàng chọn gói bảo trì hoặc tự vận hành.</w:t>
       </w:r>
     </w:p>
     <w:p>
@@ -6054,7 +9760,7 @@
           <w:rFonts w:ascii="Arial" w:hAnsi="Arial"/>
           <w:sz w:val="20"/>
         </w:rPr>
-        <w:t>5. Máy in hóa đơn cũ của cây POS (chuẩn ESC/POS, khổ 80mm) có thể tái sử dụng, giảm 6.000.000 trong tổng chi phí.</w:t>
+        <w:t>5. Hệ thống có cơ chế dự phòng mất mạng 3 lớp: Router 4G tự chuyển, chế độ Offline trên POS, và PWA cache menu.</w:t>
       </w:r>
     </w:p>
     <w:p>
@@ -6067,7 +9773,7 @@
           <w:rFonts w:ascii="Arial" w:hAnsi="Arial"/>
           <w:sz w:val="20"/>
         </w:rPr>
-        <w:t>6. Dữ liệu hệ thống (khách hàng, doanh thu, kho) được sao lưu tự động hàng ngày.</w:t>
+        <w:t>6. Máy in hóa đơn cũ của cây POS (chuẩn ESC/POS, khổ 80mm) có thể tái sử dụng, giảm 6.000.000 trong tổng chi phí.</w:t>
       </w:r>
     </w:p>
     <w:p>
@@ -6080,7 +9786,7 @@
           <w:rFonts w:ascii="Arial" w:hAnsi="Arial"/>
           <w:sz w:val="20"/>
         </w:rPr>
-        <w:t>7. Máy POS cảm ứng Sunmi T2s/D2s là thiết bị chuyên dụng F&amp;B, bảo hành chính hãng 12 tháng, tuổi thọ trung bình 3-5 năm sử dụng liên tục.</w:t>
+        <w:t>7. Dữ liệu hệ thống được sao lưu tự động hàng ngày, cam kết không mất data.</w:t>
       </w:r>
     </w:p>
     <w:p>
@@ -6093,7 +9799,20 @@
           <w:rFonts w:ascii="Arial" w:hAnsi="Arial"/>
           <w:sz w:val="20"/>
         </w:rPr>
-        <w:t>8. Khi mất mạng hoàn toàn, quán vẫn hoạt động bình thường: NV tạo đơn trên POS, thu tiền mặt. Khi có mạng lại, dữ liệu tự đồng bộ lên Cloud.</w:t>
+        <w:t>8. Máy POS cảm ứng Sunmi T2s/D2s bảo hành chính hãng 12 tháng, tuổi thọ 3-5 năm sử dụng liên tục.</w:t>
+      </w:r>
+    </w:p>
+    <w:p>
+      <w:pPr>
+        <w:spacing w:before="0" w:after="60"/>
+        <w:ind w:left="360"/>
+      </w:pPr>
+      <w:r>
+        <w:rPr>
+          <w:rFonts w:ascii="Arial" w:hAnsi="Arial"/>
+          <w:sz w:val="20"/>
+        </w:rPr>
+        <w:t>9. Khi mất mạng hoàn toàn, quán vẫn hoạt động: NV tạo đơn trên POS, thu tiền mặt. Có mạng lại, dữ liệu tự đồng bộ.</w:t>
       </w:r>
     </w:p>
     <w:p>

</xml_diff>

<commit_message>
docs: reduce dev cost to 35M, add back incidental costs section, total initial 76.5M with 2-3 month payback
</commit_message>
<xml_diff>
--- a/BaoGia_KhachHang.docx
+++ b/BaoGia_KhachHang.docx
@@ -167,7 +167,7 @@
           <w:rFonts w:ascii="Arial" w:hAnsi="Arial"/>
           <w:sz w:val="20"/>
         </w:rPr>
-        <w:t>Toàn bộ hệ thống phát triển trên nền tảng Web, không cần cài đặt app riêng. Quản lý và Admin truy cập qua trình duyệt trên điện thoại hoặc máy tính.</w:t>
+        <w:t>Toàn bộ hệ thống phát triển trên nền tảng Web, truy cập qua trình duyệt, không cần cài app.</w:t>
       </w:r>
     </w:p>
     <w:tbl>
@@ -185,15 +185,13 @@
         </w:tblBorders>
       </w:tblPr>
       <w:tblGrid>
-        <w:gridCol w:w="2556"/>
-        <w:gridCol w:w="2556"/>
-        <w:gridCol w:w="2556"/>
-        <w:gridCol w:w="2556"/>
+        <w:gridCol w:w="5112"/>
+        <w:gridCol w:w="5112"/>
       </w:tblGrid>
       <w:tr>
         <w:tc>
           <w:tcPr>
-            <w:tcW w:type="dxa" w:w="2556"/>
+            <w:tcW w:type="dxa" w:w="5112"/>
             <w:tcMar>
               <w:top w:w="70" w:type="dxa"/>
               <w:bottom w:w="70" w:type="dxa"/>
@@ -213,13 +211,13 @@
                 <w:color w:val="FFFFFF"/>
                 <w:sz w:val="18"/>
               </w:rPr>
-              <w:t>STT</w:t>
+              <w:t>Hạng mục</w:t>
             </w:r>
           </w:p>
         </w:tc>
         <w:tc>
           <w:tcPr>
-            <w:tcW w:type="dxa" w:w="2556"/>
+            <w:tcW w:type="dxa" w:w="5112"/>
             <w:tcMar>
               <w:top w:w="70" w:type="dxa"/>
               <w:bottom w:w="70" w:type="dxa"/>
@@ -239,59 +237,7 @@
                 <w:color w:val="FFFFFF"/>
                 <w:sz w:val="18"/>
               </w:rPr>
-              <w:t>Module</w:t>
-            </w:r>
-          </w:p>
-        </w:tc>
-        <w:tc>
-          <w:tcPr>
-            <w:tcW w:type="dxa" w:w="2556"/>
-            <w:tcMar>
-              <w:top w:w="70" w:type="dxa"/>
-              <w:bottom w:w="70" w:type="dxa"/>
-              <w:left w:w="100" w:type="dxa"/>
-              <w:right w:w="100" w:type="dxa"/>
-            </w:tcMar>
-            <w:shd w:fill="0F172A"/>
-          </w:tcPr>
-          <w:p>
-            <w:pPr>
-              <w:spacing w:before="0" w:after="0"/>
-            </w:pPr>
-            <w:r>
-              <w:rPr>
-                <w:rFonts w:ascii="Arial" w:hAnsi="Arial"/>
-                <w:b/>
-                <w:color w:val="FFFFFF"/>
-                <w:sz w:val="18"/>
-              </w:rPr>
-              <w:t>Mô tả</w:t>
-            </w:r>
-          </w:p>
-        </w:tc>
-        <w:tc>
-          <w:tcPr>
-            <w:tcW w:type="dxa" w:w="2556"/>
-            <w:tcMar>
-              <w:top w:w="70" w:type="dxa"/>
-              <w:bottom w:w="70" w:type="dxa"/>
-              <w:left w:w="100" w:type="dxa"/>
-              <w:right w:w="100" w:type="dxa"/>
-            </w:tcMar>
-            <w:shd w:fill="0F172A"/>
-          </w:tcPr>
-          <w:p>
-            <w:pPr>
-              <w:spacing w:before="0" w:after="0"/>
-            </w:pPr>
-            <w:r>
-              <w:rPr>
-                <w:rFonts w:ascii="Arial" w:hAnsi="Arial"/>
-                <w:b/>
-                <w:color w:val="FFFFFF"/>
-                <w:sz w:val="18"/>
-              </w:rPr>
-              <w:t>Chi phí</w:t>
+              <w:t>Nội dung</w:t>
             </w:r>
           </w:p>
         </w:tc>
@@ -299,7 +245,7 @@
       <w:tr>
         <w:tc>
           <w:tcPr>
-            <w:tcW w:type="dxa" w:w="2556"/>
+            <w:tcW w:type="dxa" w:w="5112"/>
             <w:tcMar>
               <w:top w:w="70" w:type="dxa"/>
               <w:bottom w:w="70" w:type="dxa"/>
@@ -318,13 +264,13 @@
                 <w:color w:val="1E293B"/>
                 <w:sz w:val="18"/>
               </w:rPr>
-              <w:t>1</w:t>
+              <w:t>Giao diện Khách hàng</w:t>
             </w:r>
           </w:p>
         </w:tc>
         <w:tc>
           <w:tcPr>
-            <w:tcW w:type="dxa" w:w="2556"/>
+            <w:tcW w:type="dxa" w:w="5112"/>
             <w:tcMar>
               <w:top w:w="70" w:type="dxa"/>
               <w:bottom w:w="70" w:type="dxa"/>
@@ -343,13 +289,67 @@
                 <w:color w:val="1E293B"/>
                 <w:sz w:val="18"/>
               </w:rPr>
-              <w:t>QR Order Web (Khách hàng)</w:t>
+              <w:t>QR Order Web: menu, đặt món, thanh toán VietQR, Chatbot AI gợi ý, tích điểm, feedback</w:t>
+            </w:r>
+          </w:p>
+        </w:tc>
+      </w:tr>
+      <w:tr>
+        <w:tc>
+          <w:tcPr>
+            <w:tcW w:type="dxa" w:w="5112"/>
+            <w:tcMar>
+              <w:top w:w="70" w:type="dxa"/>
+              <w:bottom w:w="70" w:type="dxa"/>
+              <w:left w:w="100" w:type="dxa"/>
+              <w:right w:w="100" w:type="dxa"/>
+            </w:tcMar>
+            <w:shd w:fill="F8FAFC"/>
+          </w:tcPr>
+          <w:p>
+            <w:pPr>
+              <w:spacing w:before="0" w:after="0"/>
+            </w:pPr>
+            <w:r>
+              <w:rPr>
+                <w:rFonts w:ascii="Arial" w:hAnsi="Arial"/>
+                <w:color w:val="1E293B"/>
+                <w:sz w:val="18"/>
+              </w:rPr>
+              <w:t>Giao diện Nhân viên</w:t>
             </w:r>
           </w:p>
         </w:tc>
         <w:tc>
           <w:tcPr>
-            <w:tcW w:type="dxa" w:w="2556"/>
+            <w:tcW w:type="dxa" w:w="5112"/>
+            <w:tcMar>
+              <w:top w:w="70" w:type="dxa"/>
+              <w:bottom w:w="70" w:type="dxa"/>
+              <w:left w:w="100" w:type="dxa"/>
+              <w:right w:w="100" w:type="dxa"/>
+            </w:tcMar>
+            <w:shd w:fill="F8FAFC"/>
+          </w:tcPr>
+          <w:p>
+            <w:pPr>
+              <w:spacing w:before="0" w:after="0"/>
+            </w:pPr>
+            <w:r>
+              <w:rPr>
+                <w:rFonts w:ascii="Arial" w:hAnsi="Arial"/>
+                <w:color w:val="1E293B"/>
+                <w:sz w:val="18"/>
+              </w:rPr>
+              <w:t>KDS cảm ứng: nhận đơn real-time, công thức pha, hoàn thành đơn, báo hết món, Offline Mode</w:t>
+            </w:r>
+          </w:p>
+        </w:tc>
+      </w:tr>
+      <w:tr>
+        <w:tc>
+          <w:tcPr>
+            <w:tcW w:type="dxa" w:w="5112"/>
             <w:tcMar>
               <w:top w:w="70" w:type="dxa"/>
               <w:bottom w:w="70" w:type="dxa"/>
@@ -368,13 +368,13 @@
                 <w:color w:val="1E293B"/>
                 <w:sz w:val="18"/>
               </w:rPr>
-              <w:t>Menu, đặt món, thanh toán VietQR, Chatbot AI gợi ý, CRM, Loyalty, Feedback</w:t>
+              <w:t>Màn hình Khách tại quầy</w:t>
             </w:r>
           </w:p>
         </w:tc>
         <w:tc>
           <w:tcPr>
-            <w:tcW w:type="dxa" w:w="2556"/>
+            <w:tcW w:type="dxa" w:w="5112"/>
             <w:tcMar>
               <w:top w:w="70" w:type="dxa"/>
               <w:bottom w:w="70" w:type="dxa"/>
@@ -393,7 +393,7 @@
                 <w:color w:val="1E293B"/>
                 <w:sz w:val="18"/>
               </w:rPr>
-              <w:t>12.000.000</w:t>
+              <w:t>Hiển thị đơn hàng, giá, tổng tiền, mã VietQR cho khách xem khi thanh toán tại quầy</w:t>
             </w:r>
           </w:p>
         </w:tc>
@@ -401,7 +401,7 @@
       <w:tr>
         <w:tc>
           <w:tcPr>
-            <w:tcW w:type="dxa" w:w="2556"/>
+            <w:tcW w:type="dxa" w:w="5112"/>
             <w:tcMar>
               <w:top w:w="70" w:type="dxa"/>
               <w:bottom w:w="70" w:type="dxa"/>
@@ -420,13 +420,13 @@
                 <w:color w:val="1E293B"/>
                 <w:sz w:val="18"/>
               </w:rPr>
-              <w:t>2</w:t>
+              <w:t>Giao diện Quản lý</w:t>
             </w:r>
           </w:p>
         </w:tc>
         <w:tc>
           <w:tcPr>
-            <w:tcW w:type="dxa" w:w="2556"/>
+            <w:tcW w:type="dxa" w:w="5112"/>
             <w:tcMar>
               <w:top w:w="70" w:type="dxa"/>
               <w:bottom w:w="70" w:type="dxa"/>
@@ -445,13 +445,67 @@
                 <w:color w:val="1E293B"/>
                 <w:sz w:val="18"/>
               </w:rPr>
-              <w:t>KDS &amp; Màn hình Khách (POS 2 màn hình)</w:t>
+              <w:t>Web quản lý chi nhánh: mở/kết ca, kho, kiểm kê, chấm công, báo cáo</w:t>
+            </w:r>
+          </w:p>
+        </w:tc>
+      </w:tr>
+      <w:tr>
+        <w:tc>
+          <w:tcPr>
+            <w:tcW w:type="dxa" w:w="5112"/>
+            <w:tcMar>
+              <w:top w:w="70" w:type="dxa"/>
+              <w:bottom w:w="70" w:type="dxa"/>
+              <w:left w:w="100" w:type="dxa"/>
+              <w:right w:w="100" w:type="dxa"/>
+            </w:tcMar>
+            <w:shd w:fill="FFFFFF"/>
+          </w:tcPr>
+          <w:p>
+            <w:pPr>
+              <w:spacing w:before="0" w:after="0"/>
+            </w:pPr>
+            <w:r>
+              <w:rPr>
+                <w:rFonts w:ascii="Arial" w:hAnsi="Arial"/>
+                <w:color w:val="1E293B"/>
+                <w:sz w:val="18"/>
+              </w:rPr>
+              <w:t>Giao diện Admin</w:t>
             </w:r>
           </w:p>
         </w:tc>
         <w:tc>
           <w:tcPr>
-            <w:tcW w:type="dxa" w:w="2556"/>
+            <w:tcW w:type="dxa" w:w="5112"/>
+            <w:tcMar>
+              <w:top w:w="70" w:type="dxa"/>
+              <w:bottom w:w="70" w:type="dxa"/>
+              <w:left w:w="100" w:type="dxa"/>
+              <w:right w:w="100" w:type="dxa"/>
+            </w:tcMar>
+            <w:shd w:fill="FFFFFF"/>
+          </w:tcPr>
+          <w:p>
+            <w:pPr>
+              <w:spacing w:before="0" w:after="0"/>
+            </w:pPr>
+            <w:r>
+              <w:rPr>
+                <w:rFonts w:ascii="Arial" w:hAnsi="Arial"/>
+                <w:color w:val="1E293B"/>
+                <w:sz w:val="18"/>
+              </w:rPr>
+              <w:t>Web dashboard chủ chuỗi: doanh thu, quản lý menu/giá, phân quyền</w:t>
+            </w:r>
+          </w:p>
+        </w:tc>
+      </w:tr>
+      <w:tr>
+        <w:tc>
+          <w:tcPr>
+            <w:tcW w:type="dxa" w:w="5112"/>
             <w:tcMar>
               <w:top w:w="70" w:type="dxa"/>
               <w:bottom w:w="70" w:type="dxa"/>
@@ -470,13 +524,13 @@
                 <w:color w:val="1E293B"/>
                 <w:sz w:val="18"/>
               </w:rPr>
-              <w:t>Nhận đơn real-time, công thức pha chế, hoàn thành đơn, báo hết món, Offline Mode, hiển thị đơn + QR cho khách</w:t>
+              <w:t>Backend &amp; Hạ tầng</w:t>
             </w:r>
           </w:p>
         </w:tc>
         <w:tc>
           <w:tcPr>
-            <w:tcW w:type="dxa" w:w="2556"/>
+            <w:tcW w:type="dxa" w:w="5112"/>
             <w:tcMar>
               <w:top w:w="70" w:type="dxa"/>
               <w:bottom w:w="70" w:type="dxa"/>
@@ -495,7 +549,7 @@
                 <w:color w:val="1E293B"/>
                 <w:sz w:val="18"/>
               </w:rPr>
-              <w:t>10.000.000</w:t>
+              <w:t>API, WebSocket real-time, Database, Docker, Deploy, Backup, Offline Sync</w:t>
             </w:r>
           </w:p>
         </w:tc>
@@ -503,7 +557,7 @@
       <w:tr>
         <w:tc>
           <w:tcPr>
-            <w:tcW w:type="dxa" w:w="2556"/>
+            <w:tcW w:type="dxa" w:w="5112"/>
             <w:tcMar>
               <w:top w:w="70" w:type="dxa"/>
               <w:bottom w:w="70" w:type="dxa"/>
@@ -522,13 +576,13 @@
                 <w:color w:val="1E293B"/>
                 <w:sz w:val="18"/>
               </w:rPr>
-              <w:t>3</w:t>
+              <w:t>AI Engine</w:t>
             </w:r>
           </w:p>
         </w:tc>
         <w:tc>
           <w:tcPr>
-            <w:tcW w:type="dxa" w:w="2556"/>
+            <w:tcW w:type="dxa" w:w="5112"/>
             <w:tcMar>
               <w:top w:w="70" w:type="dxa"/>
               <w:bottom w:w="70" w:type="dxa"/>
@@ -547,57 +601,7 @@
                 <w:color w:val="1E293B"/>
                 <w:sz w:val="18"/>
               </w:rPr>
-              <w:t>Web Quản lý Chi nhánh (Manager)</w:t>
-            </w:r>
-          </w:p>
-        </w:tc>
-        <w:tc>
-          <w:tcPr>
-            <w:tcW w:type="dxa" w:w="2556"/>
-            <w:tcMar>
-              <w:top w:w="70" w:type="dxa"/>
-              <w:bottom w:w="70" w:type="dxa"/>
-              <w:left w:w="100" w:type="dxa"/>
-              <w:right w:w="100" w:type="dxa"/>
-            </w:tcMar>
-            <w:shd w:fill="FFFFFF"/>
-          </w:tcPr>
-          <w:p>
-            <w:pPr>
-              <w:spacing w:before="0" w:after="0"/>
-            </w:pPr>
-            <w:r>
-              <w:rPr>
-                <w:rFonts w:ascii="Arial" w:hAnsi="Arial"/>
-                <w:color w:val="1E293B"/>
-                <w:sz w:val="18"/>
-              </w:rPr>
-              <w:t>Mở/kết ca, nhập xuất kho, kiểm kê, chấm công, báo cáo chi nhánh</w:t>
-            </w:r>
-          </w:p>
-        </w:tc>
-        <w:tc>
-          <w:tcPr>
-            <w:tcW w:type="dxa" w:w="2556"/>
-            <w:tcMar>
-              <w:top w:w="70" w:type="dxa"/>
-              <w:bottom w:w="70" w:type="dxa"/>
-              <w:left w:w="100" w:type="dxa"/>
-              <w:right w:w="100" w:type="dxa"/>
-            </w:tcMar>
-            <w:shd w:fill="FFFFFF"/>
-          </w:tcPr>
-          <w:p>
-            <w:pPr>
-              <w:spacing w:before="0" w:after="0"/>
-            </w:pPr>
-            <w:r>
-              <w:rPr>
-                <w:rFonts w:ascii="Arial" w:hAnsi="Arial"/>
-                <w:color w:val="1E293B"/>
-                <w:sz w:val="18"/>
-              </w:rPr>
-              <w:t>8.000.000</w:t>
+              <w:t>Chatbot gợi ý món, thống kê doanh thu, gợi ý combo, dự đoán khách rời</w:t>
             </w:r>
           </w:p>
         </w:tc>
@@ -605,383 +609,7 @@
       <w:tr>
         <w:tc>
           <w:tcPr>
-            <w:tcW w:type="dxa" w:w="2556"/>
-            <w:tcMar>
-              <w:top w:w="70" w:type="dxa"/>
-              <w:bottom w:w="70" w:type="dxa"/>
-              <w:left w:w="100" w:type="dxa"/>
-              <w:right w:w="100" w:type="dxa"/>
-            </w:tcMar>
-            <w:shd w:fill="F8FAFC"/>
-          </w:tcPr>
-          <w:p>
-            <w:pPr>
-              <w:spacing w:before="0" w:after="0"/>
-            </w:pPr>
-            <w:r>
-              <w:rPr>
-                <w:rFonts w:ascii="Arial" w:hAnsi="Arial"/>
-                <w:color w:val="1E293B"/>
-                <w:sz w:val="18"/>
-              </w:rPr>
-              <w:t>4</w:t>
-            </w:r>
-          </w:p>
-        </w:tc>
-        <w:tc>
-          <w:tcPr>
-            <w:tcW w:type="dxa" w:w="2556"/>
-            <w:tcMar>
-              <w:top w:w="70" w:type="dxa"/>
-              <w:bottom w:w="70" w:type="dxa"/>
-              <w:left w:w="100" w:type="dxa"/>
-              <w:right w:w="100" w:type="dxa"/>
-            </w:tcMar>
-            <w:shd w:fill="F8FAFC"/>
-          </w:tcPr>
-          <w:p>
-            <w:pPr>
-              <w:spacing w:before="0" w:after="0"/>
-            </w:pPr>
-            <w:r>
-              <w:rPr>
-                <w:rFonts w:ascii="Arial" w:hAnsi="Arial"/>
-                <w:color w:val="1E293B"/>
-                <w:sz w:val="18"/>
-              </w:rPr>
-              <w:t>Web Dashboard Admin (Chủ chuỗi)</w:t>
-            </w:r>
-          </w:p>
-        </w:tc>
-        <w:tc>
-          <w:tcPr>
-            <w:tcW w:type="dxa" w:w="2556"/>
-            <w:tcMar>
-              <w:top w:w="70" w:type="dxa"/>
-              <w:bottom w:w="70" w:type="dxa"/>
-              <w:left w:w="100" w:type="dxa"/>
-              <w:right w:w="100" w:type="dxa"/>
-            </w:tcMar>
-            <w:shd w:fill="F8FAFC"/>
-          </w:tcPr>
-          <w:p>
-            <w:pPr>
-              <w:spacing w:before="0" w:after="0"/>
-            </w:pPr>
-            <w:r>
-              <w:rPr>
-                <w:rFonts w:ascii="Arial" w:hAnsi="Arial"/>
-                <w:color w:val="1E293B"/>
-                <w:sz w:val="18"/>
-              </w:rPr>
-              <w:t>Dashboard doanh thu, quản lý menu/giá, phân quyền, Audit Log</w:t>
-            </w:r>
-          </w:p>
-        </w:tc>
-        <w:tc>
-          <w:tcPr>
-            <w:tcW w:type="dxa" w:w="2556"/>
-            <w:tcMar>
-              <w:top w:w="70" w:type="dxa"/>
-              <w:bottom w:w="70" w:type="dxa"/>
-              <w:left w:w="100" w:type="dxa"/>
-              <w:right w:w="100" w:type="dxa"/>
-            </w:tcMar>
-            <w:shd w:fill="F8FAFC"/>
-          </w:tcPr>
-          <w:p>
-            <w:pPr>
-              <w:spacing w:before="0" w:after="0"/>
-            </w:pPr>
-            <w:r>
-              <w:rPr>
-                <w:rFonts w:ascii="Arial" w:hAnsi="Arial"/>
-                <w:color w:val="1E293B"/>
-                <w:sz w:val="18"/>
-              </w:rPr>
-              <w:t>10.000.000</w:t>
-            </w:r>
-          </w:p>
-        </w:tc>
-      </w:tr>
-      <w:tr>
-        <w:tc>
-          <w:tcPr>
-            <w:tcW w:type="dxa" w:w="2556"/>
-            <w:tcMar>
-              <w:top w:w="70" w:type="dxa"/>
-              <w:bottom w:w="70" w:type="dxa"/>
-              <w:left w:w="100" w:type="dxa"/>
-              <w:right w:w="100" w:type="dxa"/>
-            </w:tcMar>
-            <w:shd w:fill="FFFFFF"/>
-          </w:tcPr>
-          <w:p>
-            <w:pPr>
-              <w:spacing w:before="0" w:after="0"/>
-            </w:pPr>
-            <w:r>
-              <w:rPr>
-                <w:rFonts w:ascii="Arial" w:hAnsi="Arial"/>
-                <w:color w:val="1E293B"/>
-                <w:sz w:val="18"/>
-              </w:rPr>
-              <w:t>5</w:t>
-            </w:r>
-          </w:p>
-        </w:tc>
-        <w:tc>
-          <w:tcPr>
-            <w:tcW w:type="dxa" w:w="2556"/>
-            <w:tcMar>
-              <w:top w:w="70" w:type="dxa"/>
-              <w:bottom w:w="70" w:type="dxa"/>
-              <w:left w:w="100" w:type="dxa"/>
-              <w:right w:w="100" w:type="dxa"/>
-            </w:tcMar>
-            <w:shd w:fill="FFFFFF"/>
-          </w:tcPr>
-          <w:p>
-            <w:pPr>
-              <w:spacing w:before="0" w:after="0"/>
-            </w:pPr>
-            <w:r>
-              <w:rPr>
-                <w:rFonts w:ascii="Arial" w:hAnsi="Arial"/>
-                <w:color w:val="1E293B"/>
-                <w:sz w:val="18"/>
-              </w:rPr>
-              <w:t>Backend API &amp; Hạ tầng</w:t>
-            </w:r>
-          </w:p>
-        </w:tc>
-        <w:tc>
-          <w:tcPr>
-            <w:tcW w:type="dxa" w:w="2556"/>
-            <w:tcMar>
-              <w:top w:w="70" w:type="dxa"/>
-              <w:bottom w:w="70" w:type="dxa"/>
-              <w:left w:w="100" w:type="dxa"/>
-              <w:right w:w="100" w:type="dxa"/>
-            </w:tcMar>
-            <w:shd w:fill="FFFFFF"/>
-          </w:tcPr>
-          <w:p>
-            <w:pPr>
-              <w:spacing w:before="0" w:after="0"/>
-            </w:pPr>
-            <w:r>
-              <w:rPr>
-                <w:rFonts w:ascii="Arial" w:hAnsi="Arial"/>
-                <w:color w:val="1E293B"/>
-                <w:sz w:val="18"/>
-              </w:rPr>
-              <w:t>API, WebSocket real-time, Database, thanh toán VietQR, Docker, Deploy, Backup, Offline Sync</w:t>
-            </w:r>
-          </w:p>
-        </w:tc>
-        <w:tc>
-          <w:tcPr>
-            <w:tcW w:type="dxa" w:w="2556"/>
-            <w:tcMar>
-              <w:top w:w="70" w:type="dxa"/>
-              <w:bottom w:w="70" w:type="dxa"/>
-              <w:left w:w="100" w:type="dxa"/>
-              <w:right w:w="100" w:type="dxa"/>
-            </w:tcMar>
-            <w:shd w:fill="FFFFFF"/>
-          </w:tcPr>
-          <w:p>
-            <w:pPr>
-              <w:spacing w:before="0" w:after="0"/>
-            </w:pPr>
-            <w:r>
-              <w:rPr>
-                <w:rFonts w:ascii="Arial" w:hAnsi="Arial"/>
-                <w:color w:val="1E293B"/>
-                <w:sz w:val="18"/>
-              </w:rPr>
-              <w:t>12.000.000</w:t>
-            </w:r>
-          </w:p>
-        </w:tc>
-      </w:tr>
-      <w:tr>
-        <w:tc>
-          <w:tcPr>
-            <w:tcW w:type="dxa" w:w="2556"/>
-            <w:tcMar>
-              <w:top w:w="70" w:type="dxa"/>
-              <w:bottom w:w="70" w:type="dxa"/>
-              <w:left w:w="100" w:type="dxa"/>
-              <w:right w:w="100" w:type="dxa"/>
-            </w:tcMar>
-            <w:shd w:fill="F8FAFC"/>
-          </w:tcPr>
-          <w:p>
-            <w:pPr>
-              <w:spacing w:before="0" w:after="0"/>
-            </w:pPr>
-            <w:r>
-              <w:rPr>
-                <w:rFonts w:ascii="Arial" w:hAnsi="Arial"/>
-                <w:color w:val="1E293B"/>
-                <w:sz w:val="18"/>
-              </w:rPr>
-              <w:t>6</w:t>
-            </w:r>
-          </w:p>
-        </w:tc>
-        <w:tc>
-          <w:tcPr>
-            <w:tcW w:type="dxa" w:w="2556"/>
-            <w:tcMar>
-              <w:top w:w="70" w:type="dxa"/>
-              <w:bottom w:w="70" w:type="dxa"/>
-              <w:left w:w="100" w:type="dxa"/>
-              <w:right w:w="100" w:type="dxa"/>
-            </w:tcMar>
-            <w:shd w:fill="F8FAFC"/>
-          </w:tcPr>
-          <w:p>
-            <w:pPr>
-              <w:spacing w:before="0" w:after="0"/>
-            </w:pPr>
-            <w:r>
-              <w:rPr>
-                <w:rFonts w:ascii="Arial" w:hAnsi="Arial"/>
-                <w:color w:val="1E293B"/>
-                <w:sz w:val="18"/>
-              </w:rPr>
-              <w:t>AI Engine</w:t>
-            </w:r>
-          </w:p>
-        </w:tc>
-        <w:tc>
-          <w:tcPr>
-            <w:tcW w:type="dxa" w:w="2556"/>
-            <w:tcMar>
-              <w:top w:w="70" w:type="dxa"/>
-              <w:bottom w:w="70" w:type="dxa"/>
-              <w:left w:w="100" w:type="dxa"/>
-              <w:right w:w="100" w:type="dxa"/>
-            </w:tcMar>
-            <w:shd w:fill="F8FAFC"/>
-          </w:tcPr>
-          <w:p>
-            <w:pPr>
-              <w:spacing w:before="0" w:after="0"/>
-            </w:pPr>
-            <w:r>
-              <w:rPr>
-                <w:rFonts w:ascii="Arial" w:hAnsi="Arial"/>
-                <w:color w:val="1E293B"/>
-                <w:sz w:val="18"/>
-              </w:rPr>
-              <w:t>Thống kê doanh thu, Gợi ý combo, Chatbot gợi ý món, Dự đoán khách rời</w:t>
-            </w:r>
-          </w:p>
-        </w:tc>
-        <w:tc>
-          <w:tcPr>
-            <w:tcW w:type="dxa" w:w="2556"/>
-            <w:tcMar>
-              <w:top w:w="70" w:type="dxa"/>
-              <w:bottom w:w="70" w:type="dxa"/>
-              <w:left w:w="100" w:type="dxa"/>
-              <w:right w:w="100" w:type="dxa"/>
-            </w:tcMar>
-            <w:shd w:fill="F8FAFC"/>
-          </w:tcPr>
-          <w:p>
-            <w:pPr>
-              <w:spacing w:before="0" w:after="0"/>
-            </w:pPr>
-            <w:r>
-              <w:rPr>
-                <w:rFonts w:ascii="Arial" w:hAnsi="Arial"/>
-                <w:color w:val="1E293B"/>
-                <w:sz w:val="18"/>
-              </w:rPr>
-              <w:t>8.000.000</w:t>
-            </w:r>
-          </w:p>
-        </w:tc>
-      </w:tr>
-      <w:tr>
-        <w:tc>
-          <w:tcPr>
-            <w:tcW w:type="dxa" w:w="2556"/>
-            <w:tcMar>
-              <w:top w:w="70" w:type="dxa"/>
-              <w:bottom w:w="70" w:type="dxa"/>
-              <w:left w:w="100" w:type="dxa"/>
-              <w:right w:w="100" w:type="dxa"/>
-            </w:tcMar>
-            <w:shd w:fill="FFFFFF"/>
-          </w:tcPr>
-          <w:p>
-            <w:pPr>
-              <w:spacing w:before="0" w:after="0"/>
-            </w:pPr>
-          </w:p>
-        </w:tc>
-        <w:tc>
-          <w:tcPr>
-            <w:tcW w:type="dxa" w:w="2556"/>
-            <w:tcMar>
-              <w:top w:w="70" w:type="dxa"/>
-              <w:bottom w:w="70" w:type="dxa"/>
-              <w:left w:w="100" w:type="dxa"/>
-              <w:right w:w="100" w:type="dxa"/>
-            </w:tcMar>
-            <w:shd w:fill="FFFFFF"/>
-          </w:tcPr>
-          <w:p>
-            <w:pPr>
-              <w:spacing w:before="0" w:after="0"/>
-            </w:pPr>
-          </w:p>
-        </w:tc>
-        <w:tc>
-          <w:tcPr>
-            <w:tcW w:type="dxa" w:w="2556"/>
-            <w:tcMar>
-              <w:top w:w="70" w:type="dxa"/>
-              <w:bottom w:w="70" w:type="dxa"/>
-              <w:left w:w="100" w:type="dxa"/>
-              <w:right w:w="100" w:type="dxa"/>
-            </w:tcMar>
-            <w:shd w:fill="FFFFFF"/>
-          </w:tcPr>
-          <w:p>
-            <w:pPr>
-              <w:spacing w:before="0" w:after="0"/>
-            </w:pPr>
-          </w:p>
-        </w:tc>
-        <w:tc>
-          <w:tcPr>
-            <w:tcW w:type="dxa" w:w="2556"/>
-            <w:tcMar>
-              <w:top w:w="70" w:type="dxa"/>
-              <w:bottom w:w="70" w:type="dxa"/>
-              <w:left w:w="100" w:type="dxa"/>
-              <w:right w:w="100" w:type="dxa"/>
-            </w:tcMar>
-            <w:shd w:fill="FFFFFF"/>
-          </w:tcPr>
-          <w:p>
-            <w:pPr>
-              <w:spacing w:before="0" w:after="0"/>
-            </w:pPr>
-          </w:p>
-        </w:tc>
-      </w:tr>
-      <w:tr>
-        <w:tc>
-          <w:tcPr>
-            <w:tcW w:type="dxa" w:w="2556"/>
+            <w:tcW w:type="dxa" w:w="5112"/>
             <w:tcMar>
               <w:top w:w="70" w:type="dxa"/>
               <w:bottom w:w="70" w:type="dxa"/>
@@ -998,7 +626,80 @@
         </w:tc>
         <w:tc>
           <w:tcPr>
-            <w:tcW w:type="dxa" w:w="2556"/>
+            <w:tcW w:type="dxa" w:w="5112"/>
+            <w:tcMar>
+              <w:top w:w="70" w:type="dxa"/>
+              <w:bottom w:w="70" w:type="dxa"/>
+              <w:left w:w="100" w:type="dxa"/>
+              <w:right w:w="100" w:type="dxa"/>
+            </w:tcMar>
+            <w:shd w:fill="F8FAFC"/>
+          </w:tcPr>
+          <w:p>
+            <w:pPr>
+              <w:spacing w:before="0" w:after="0"/>
+            </w:pPr>
+          </w:p>
+        </w:tc>
+      </w:tr>
+      <w:tr>
+        <w:tc>
+          <w:tcPr>
+            <w:tcW w:type="dxa" w:w="5112"/>
+            <w:tcMar>
+              <w:top w:w="70" w:type="dxa"/>
+              <w:bottom w:w="70" w:type="dxa"/>
+              <w:left w:w="100" w:type="dxa"/>
+              <w:right w:w="100" w:type="dxa"/>
+            </w:tcMar>
+            <w:shd w:fill="FFFFFF"/>
+          </w:tcPr>
+          <w:p>
+            <w:pPr>
+              <w:spacing w:before="0" w:after="0"/>
+            </w:pPr>
+            <w:r>
+              <w:rPr>
+                <w:rFonts w:ascii="Arial" w:hAnsi="Arial"/>
+                <w:b/>
+                <w:color w:val="1E293B"/>
+                <w:sz w:val="18"/>
+              </w:rPr>
+              <w:t>Thời gian phát triển</w:t>
+            </w:r>
+          </w:p>
+        </w:tc>
+        <w:tc>
+          <w:tcPr>
+            <w:tcW w:type="dxa" w:w="5112"/>
+            <w:tcMar>
+              <w:top w:w="70" w:type="dxa"/>
+              <w:bottom w:w="70" w:type="dxa"/>
+              <w:left w:w="100" w:type="dxa"/>
+              <w:right w:w="100" w:type="dxa"/>
+            </w:tcMar>
+            <w:shd w:fill="FFFFFF"/>
+          </w:tcPr>
+          <w:p>
+            <w:pPr>
+              <w:spacing w:before="0" w:after="0"/>
+            </w:pPr>
+            <w:r>
+              <w:rPr>
+                <w:rFonts w:ascii="Arial" w:hAnsi="Arial"/>
+                <w:b/>
+                <w:color w:val="1E293B"/>
+                <w:sz w:val="18"/>
+              </w:rPr>
+              <w:t>3 - 4 tháng</w:t>
+            </w:r>
+          </w:p>
+        </w:tc>
+      </w:tr>
+      <w:tr>
+        <w:tc>
+          <w:tcPr>
+            <w:tcW w:type="dxa" w:w="5112"/>
             <w:tcMar>
               <w:top w:w="70" w:type="dxa"/>
               <w:bottom w:w="70" w:type="dxa"/>
@@ -1018,13 +719,13 @@
                 <w:color w:val="1E293B"/>
                 <w:sz w:val="18"/>
               </w:rPr>
-              <w:t>TỔNG PHÁT TRIỂN</w:t>
+              <w:t>Chi phí trọn gói</w:t>
             </w:r>
           </w:p>
         </w:tc>
         <w:tc>
           <w:tcPr>
-            <w:tcW w:type="dxa" w:w="2556"/>
+            <w:tcW w:type="dxa" w:w="5112"/>
             <w:tcMar>
               <w:top w:w="70" w:type="dxa"/>
               <w:bottom w:w="70" w:type="dxa"/>
@@ -1044,33 +745,7 @@
                 <w:color w:val="1E293B"/>
                 <w:sz w:val="18"/>
               </w:rPr>
-              <w:t>Thời gian: ~3-4 tháng</w:t>
-            </w:r>
-          </w:p>
-        </w:tc>
-        <w:tc>
-          <w:tcPr>
-            <w:tcW w:type="dxa" w:w="2556"/>
-            <w:tcMar>
-              <w:top w:w="70" w:type="dxa"/>
-              <w:bottom w:w="70" w:type="dxa"/>
-              <w:left w:w="100" w:type="dxa"/>
-              <w:right w:w="100" w:type="dxa"/>
-            </w:tcMar>
-            <w:shd w:fill="F8FAFC"/>
-          </w:tcPr>
-          <w:p>
-            <w:pPr>
-              <w:spacing w:before="0" w:after="0"/>
-            </w:pPr>
-            <w:r>
-              <w:rPr>
-                <w:rFonts w:ascii="Arial" w:hAnsi="Arial"/>
-                <w:b/>
-                <w:color w:val="1E293B"/>
-                <w:sz w:val="18"/>
-              </w:rPr>
-              <w:t>60.000.000</w:t>
+              <w:t>35.000.000</w:t>
             </w:r>
           </w:p>
         </w:tc>
@@ -1267,7 +942,7 @@
                 <w:color w:val="1E293B"/>
                 <w:sz w:val="18"/>
               </w:rPr>
-              <w:t>25.000.000 (42%)</w:t>
+              <w:t>15.000.000</w:t>
             </w:r>
           </w:p>
         </w:tc>
@@ -1319,7 +994,7 @@
                 <w:color w:val="1E293B"/>
                 <w:sz w:val="18"/>
               </w:rPr>
-              <w:t>Manager Web + Admin Web + VietQR + Offline Mode</w:t>
+              <w:t>Quản lý + Admin + VietQR + Offline Mode</w:t>
             </w:r>
           </w:p>
         </w:tc>
@@ -1344,7 +1019,7 @@
                 <w:color w:val="1E293B"/>
                 <w:sz w:val="18"/>
               </w:rPr>
-              <w:t>20.000.000 (33%)</w:t>
+              <w:t>12.000.000</w:t>
             </w:r>
           </w:p>
         </w:tc>
@@ -1396,7 +1071,7 @@
                 <w:color w:val="1E293B"/>
                 <w:sz w:val="18"/>
               </w:rPr>
-              <w:t>AI Engine + Testing + Deploy + Đào tạo + Nghiệm thu</w:t>
+              <w:t>AI + Testing + Deploy + Đào tạo + Nghiệm thu</w:t>
             </w:r>
           </w:p>
         </w:tc>
@@ -1421,7 +1096,7 @@
                 <w:color w:val="1E293B"/>
                 <w:sz w:val="18"/>
               </w:rPr>
-              <w:t>15.000.000 (25%)</w:t>
+              <w:t>8.000.000</w:t>
             </w:r>
           </w:p>
         </w:tc>
@@ -2233,7 +1908,7 @@
                 <w:color w:val="1E293B"/>
                 <w:sz w:val="18"/>
               </w:rPr>
-              <w:t>Khách mang đi quét QR đặt món tại quầy</w:t>
+              <w:t>Khách mang đi quét QR đặt món</w:t>
             </w:r>
           </w:p>
         </w:tc>
@@ -4713,7 +4388,769 @@
           <w:color w:val="0F172A"/>
           <w:sz w:val="26"/>
         </w:rPr>
-        <w:t>F. TỔNG HỢP CHI PHÍ ĐẦU TƯ</w:t>
+        <w:t>F. CHI PHÍ PHÁT SINH CÓ THỂ XẢY RA</w:t>
+      </w:r>
+    </w:p>
+    <w:tbl>
+      <w:tblPr>
+        <w:tblW w:type="auto" w:w="0"/>
+        <w:jc w:val="center"/>
+        <w:tblLook w:firstColumn="1" w:firstRow="1" w:lastColumn="0" w:lastRow="0" w:noHBand="0" w:noVBand="1" w:val="04A0"/>
+        <w:tblBorders>
+          <w:top w:val="single" w:sz="6" w:space="0" w:color="CBD5E1"/>
+          <w:bottom w:val="single" w:sz="6" w:space="0" w:color="CBD5E1"/>
+          <w:left w:val="single" w:sz="6" w:space="0" w:color="CBD5E1"/>
+          <w:right w:val="single" w:sz="6" w:space="0" w:color="CBD5E1"/>
+          <w:insideH w:val="single" w:sz="4" w:space="0" w:color="E2E8F0"/>
+          <w:insideV w:val="single" w:sz="4" w:space="0" w:color="E2E8F0"/>
+        </w:tblBorders>
+      </w:tblPr>
+      <w:tblGrid>
+        <w:gridCol w:w="2556"/>
+        <w:gridCol w:w="2556"/>
+        <w:gridCol w:w="2556"/>
+        <w:gridCol w:w="2556"/>
+      </w:tblGrid>
+      <w:tr>
+        <w:tc>
+          <w:tcPr>
+            <w:tcW w:type="dxa" w:w="2556"/>
+            <w:tcMar>
+              <w:top w:w="70" w:type="dxa"/>
+              <w:bottom w:w="70" w:type="dxa"/>
+              <w:left w:w="100" w:type="dxa"/>
+              <w:right w:w="100" w:type="dxa"/>
+            </w:tcMar>
+            <w:shd w:fill="0F172A"/>
+          </w:tcPr>
+          <w:p>
+            <w:pPr>
+              <w:spacing w:before="0" w:after="0"/>
+            </w:pPr>
+            <w:r>
+              <w:rPr>
+                <w:rFonts w:ascii="Arial" w:hAnsi="Arial"/>
+                <w:b/>
+                <w:color w:val="FFFFFF"/>
+                <w:sz w:val="18"/>
+              </w:rPr>
+              <w:t>STT</w:t>
+            </w:r>
+          </w:p>
+        </w:tc>
+        <w:tc>
+          <w:tcPr>
+            <w:tcW w:type="dxa" w:w="2556"/>
+            <w:tcMar>
+              <w:top w:w="70" w:type="dxa"/>
+              <w:bottom w:w="70" w:type="dxa"/>
+              <w:left w:w="100" w:type="dxa"/>
+              <w:right w:w="100" w:type="dxa"/>
+            </w:tcMar>
+            <w:shd w:fill="0F172A"/>
+          </w:tcPr>
+          <w:p>
+            <w:pPr>
+              <w:spacing w:before="0" w:after="0"/>
+            </w:pPr>
+            <w:r>
+              <w:rPr>
+                <w:rFonts w:ascii="Arial" w:hAnsi="Arial"/>
+                <w:b/>
+                <w:color w:val="FFFFFF"/>
+                <w:sz w:val="18"/>
+              </w:rPr>
+              <w:t>Hạng mục</w:t>
+            </w:r>
+          </w:p>
+        </w:tc>
+        <w:tc>
+          <w:tcPr>
+            <w:tcW w:type="dxa" w:w="2556"/>
+            <w:tcMar>
+              <w:top w:w="70" w:type="dxa"/>
+              <w:bottom w:w="70" w:type="dxa"/>
+              <w:left w:w="100" w:type="dxa"/>
+              <w:right w:w="100" w:type="dxa"/>
+            </w:tcMar>
+            <w:shd w:fill="0F172A"/>
+          </w:tcPr>
+          <w:p>
+            <w:pPr>
+              <w:spacing w:before="0" w:after="0"/>
+            </w:pPr>
+            <w:r>
+              <w:rPr>
+                <w:rFonts w:ascii="Arial" w:hAnsi="Arial"/>
+                <w:b/>
+                <w:color w:val="FFFFFF"/>
+                <w:sz w:val="18"/>
+              </w:rPr>
+              <w:t>Khi nào phát sinh</w:t>
+            </w:r>
+          </w:p>
+        </w:tc>
+        <w:tc>
+          <w:tcPr>
+            <w:tcW w:type="dxa" w:w="2556"/>
+            <w:tcMar>
+              <w:top w:w="70" w:type="dxa"/>
+              <w:bottom w:w="70" w:type="dxa"/>
+              <w:left w:w="100" w:type="dxa"/>
+              <w:right w:w="100" w:type="dxa"/>
+            </w:tcMar>
+            <w:shd w:fill="0F172A"/>
+          </w:tcPr>
+          <w:p>
+            <w:pPr>
+              <w:spacing w:before="0" w:after="0"/>
+            </w:pPr>
+            <w:r>
+              <w:rPr>
+                <w:rFonts w:ascii="Arial" w:hAnsi="Arial"/>
+                <w:b/>
+                <w:color w:val="FFFFFF"/>
+                <w:sz w:val="18"/>
+              </w:rPr>
+              <w:t>Chi phí ước tính</w:t>
+            </w:r>
+          </w:p>
+        </w:tc>
+      </w:tr>
+      <w:tr>
+        <w:tc>
+          <w:tcPr>
+            <w:tcW w:type="dxa" w:w="2556"/>
+            <w:tcMar>
+              <w:top w:w="70" w:type="dxa"/>
+              <w:bottom w:w="70" w:type="dxa"/>
+              <w:left w:w="100" w:type="dxa"/>
+              <w:right w:w="100" w:type="dxa"/>
+            </w:tcMar>
+            <w:shd w:fill="FFFFFF"/>
+          </w:tcPr>
+          <w:p>
+            <w:pPr>
+              <w:spacing w:before="0" w:after="0"/>
+            </w:pPr>
+            <w:r>
+              <w:rPr>
+                <w:rFonts w:ascii="Arial" w:hAnsi="Arial"/>
+                <w:color w:val="1E293B"/>
+                <w:sz w:val="18"/>
+              </w:rPr>
+              <w:t>1</w:t>
+            </w:r>
+          </w:p>
+        </w:tc>
+        <w:tc>
+          <w:tcPr>
+            <w:tcW w:type="dxa" w:w="2556"/>
+            <w:tcMar>
+              <w:top w:w="70" w:type="dxa"/>
+              <w:bottom w:w="70" w:type="dxa"/>
+              <w:left w:w="100" w:type="dxa"/>
+              <w:right w:w="100" w:type="dxa"/>
+            </w:tcMar>
+            <w:shd w:fill="FFFFFF"/>
+          </w:tcPr>
+          <w:p>
+            <w:pPr>
+              <w:spacing w:before="0" w:after="0"/>
+            </w:pPr>
+            <w:r>
+              <w:rPr>
+                <w:rFonts w:ascii="Arial" w:hAnsi="Arial"/>
+                <w:color w:val="1E293B"/>
+                <w:sz w:val="18"/>
+              </w:rPr>
+              <w:t>Thay bảng QR Acrylic hư/mất</w:t>
+            </w:r>
+          </w:p>
+        </w:tc>
+        <w:tc>
+          <w:tcPr>
+            <w:tcW w:type="dxa" w:w="2556"/>
+            <w:tcMar>
+              <w:top w:w="70" w:type="dxa"/>
+              <w:bottom w:w="70" w:type="dxa"/>
+              <w:left w:w="100" w:type="dxa"/>
+              <w:right w:w="100" w:type="dxa"/>
+            </w:tcMar>
+            <w:shd w:fill="FFFFFF"/>
+          </w:tcPr>
+          <w:p>
+            <w:pPr>
+              <w:spacing w:before="0" w:after="0"/>
+            </w:pPr>
+            <w:r>
+              <w:rPr>
+                <w:rFonts w:ascii="Arial" w:hAnsi="Arial"/>
+                <w:color w:val="1E293B"/>
+                <w:sz w:val="18"/>
+              </w:rPr>
+              <w:t>Khách làm hư hoặc mất</w:t>
+            </w:r>
+          </w:p>
+        </w:tc>
+        <w:tc>
+          <w:tcPr>
+            <w:tcW w:type="dxa" w:w="2556"/>
+            <w:tcMar>
+              <w:top w:w="70" w:type="dxa"/>
+              <w:bottom w:w="70" w:type="dxa"/>
+              <w:left w:w="100" w:type="dxa"/>
+              <w:right w:w="100" w:type="dxa"/>
+            </w:tcMar>
+            <w:shd w:fill="FFFFFF"/>
+          </w:tcPr>
+          <w:p>
+            <w:pPr>
+              <w:spacing w:before="0" w:after="0"/>
+            </w:pPr>
+            <w:r>
+              <w:rPr>
+                <w:rFonts w:ascii="Arial" w:hAnsi="Arial"/>
+                <w:color w:val="1E293B"/>
+                <w:sz w:val="18"/>
+              </w:rPr>
+              <w:t>30.000/bảng</w:t>
+            </w:r>
+          </w:p>
+        </w:tc>
+      </w:tr>
+      <w:tr>
+        <w:tc>
+          <w:tcPr>
+            <w:tcW w:type="dxa" w:w="2556"/>
+            <w:tcMar>
+              <w:top w:w="70" w:type="dxa"/>
+              <w:bottom w:w="70" w:type="dxa"/>
+              <w:left w:w="100" w:type="dxa"/>
+              <w:right w:w="100" w:type="dxa"/>
+            </w:tcMar>
+            <w:shd w:fill="F8FAFC"/>
+          </w:tcPr>
+          <w:p>
+            <w:pPr>
+              <w:spacing w:before="0" w:after="0"/>
+            </w:pPr>
+            <w:r>
+              <w:rPr>
+                <w:rFonts w:ascii="Arial" w:hAnsi="Arial"/>
+                <w:color w:val="1E293B"/>
+                <w:sz w:val="18"/>
+              </w:rPr>
+              <w:t>2</w:t>
+            </w:r>
+          </w:p>
+        </w:tc>
+        <w:tc>
+          <w:tcPr>
+            <w:tcW w:type="dxa" w:w="2556"/>
+            <w:tcMar>
+              <w:top w:w="70" w:type="dxa"/>
+              <w:bottom w:w="70" w:type="dxa"/>
+              <w:left w:w="100" w:type="dxa"/>
+              <w:right w:w="100" w:type="dxa"/>
+            </w:tcMar>
+            <w:shd w:fill="F8FAFC"/>
+          </w:tcPr>
+          <w:p>
+            <w:pPr>
+              <w:spacing w:before="0" w:after="0"/>
+            </w:pPr>
+            <w:r>
+              <w:rPr>
+                <w:rFonts w:ascii="Arial" w:hAnsi="Arial"/>
+                <w:color w:val="1E293B"/>
+                <w:sz w:val="18"/>
+              </w:rPr>
+              <w:t>Nâng cấp Zalo OA trả phí</w:t>
+            </w:r>
+          </w:p>
+        </w:tc>
+        <w:tc>
+          <w:tcPr>
+            <w:tcW w:type="dxa" w:w="2556"/>
+            <w:tcMar>
+              <w:top w:w="70" w:type="dxa"/>
+              <w:bottom w:w="70" w:type="dxa"/>
+              <w:left w:w="100" w:type="dxa"/>
+              <w:right w:w="100" w:type="dxa"/>
+            </w:tcMar>
+            <w:shd w:fill="F8FAFC"/>
+          </w:tcPr>
+          <w:p>
+            <w:pPr>
+              <w:spacing w:before="0" w:after="0"/>
+            </w:pPr>
+            <w:r>
+              <w:rPr>
+                <w:rFonts w:ascii="Arial" w:hAnsi="Arial"/>
+                <w:color w:val="1E293B"/>
+                <w:sz w:val="18"/>
+              </w:rPr>
+              <w:t>Gửi voucher &gt; 500 tin/tháng</w:t>
+            </w:r>
+          </w:p>
+        </w:tc>
+        <w:tc>
+          <w:tcPr>
+            <w:tcW w:type="dxa" w:w="2556"/>
+            <w:tcMar>
+              <w:top w:w="70" w:type="dxa"/>
+              <w:bottom w:w="70" w:type="dxa"/>
+              <w:left w:w="100" w:type="dxa"/>
+              <w:right w:w="100" w:type="dxa"/>
+            </w:tcMar>
+            <w:shd w:fill="F8FAFC"/>
+          </w:tcPr>
+          <w:p>
+            <w:pPr>
+              <w:spacing w:before="0" w:after="0"/>
+            </w:pPr>
+            <w:r>
+              <w:rPr>
+                <w:rFonts w:ascii="Arial" w:hAnsi="Arial"/>
+                <w:color w:val="1E293B"/>
+                <w:sz w:val="18"/>
+              </w:rPr>
+              <w:t>200.000 - 500.000/tháng</w:t>
+            </w:r>
+          </w:p>
+        </w:tc>
+      </w:tr>
+      <w:tr>
+        <w:tc>
+          <w:tcPr>
+            <w:tcW w:type="dxa" w:w="2556"/>
+            <w:tcMar>
+              <w:top w:w="70" w:type="dxa"/>
+              <w:bottom w:w="70" w:type="dxa"/>
+              <w:left w:w="100" w:type="dxa"/>
+              <w:right w:w="100" w:type="dxa"/>
+            </w:tcMar>
+            <w:shd w:fill="FFFFFF"/>
+          </w:tcPr>
+          <w:p>
+            <w:pPr>
+              <w:spacing w:before="0" w:after="0"/>
+            </w:pPr>
+            <w:r>
+              <w:rPr>
+                <w:rFonts w:ascii="Arial" w:hAnsi="Arial"/>
+                <w:color w:val="1E293B"/>
+                <w:sz w:val="18"/>
+              </w:rPr>
+              <w:t>3</w:t>
+            </w:r>
+          </w:p>
+        </w:tc>
+        <w:tc>
+          <w:tcPr>
+            <w:tcW w:type="dxa" w:w="2556"/>
+            <w:tcMar>
+              <w:top w:w="70" w:type="dxa"/>
+              <w:bottom w:w="70" w:type="dxa"/>
+              <w:left w:w="100" w:type="dxa"/>
+              <w:right w:w="100" w:type="dxa"/>
+            </w:tcMar>
+            <w:shd w:fill="FFFFFF"/>
+          </w:tcPr>
+          <w:p>
+            <w:pPr>
+              <w:spacing w:before="0" w:after="0"/>
+            </w:pPr>
+            <w:r>
+              <w:rPr>
+                <w:rFonts w:ascii="Arial" w:hAnsi="Arial"/>
+                <w:color w:val="1E293B"/>
+                <w:sz w:val="18"/>
+              </w:rPr>
+              <w:t>Nâng cấp cấu hình Server</w:t>
+            </w:r>
+          </w:p>
+        </w:tc>
+        <w:tc>
+          <w:tcPr>
+            <w:tcW w:type="dxa" w:w="2556"/>
+            <w:tcMar>
+              <w:top w:w="70" w:type="dxa"/>
+              <w:bottom w:w="70" w:type="dxa"/>
+              <w:left w:w="100" w:type="dxa"/>
+              <w:right w:w="100" w:type="dxa"/>
+            </w:tcMar>
+            <w:shd w:fill="FFFFFF"/>
+          </w:tcPr>
+          <w:p>
+            <w:pPr>
+              <w:spacing w:before="0" w:after="0"/>
+            </w:pPr>
+            <w:r>
+              <w:rPr>
+                <w:rFonts w:ascii="Arial" w:hAnsi="Arial"/>
+                <w:color w:val="1E293B"/>
+                <w:sz w:val="18"/>
+              </w:rPr>
+              <w:t>Mở rộng &gt; 5 chi nhánh</w:t>
+            </w:r>
+          </w:p>
+        </w:tc>
+        <w:tc>
+          <w:tcPr>
+            <w:tcW w:type="dxa" w:w="2556"/>
+            <w:tcMar>
+              <w:top w:w="70" w:type="dxa"/>
+              <w:bottom w:w="70" w:type="dxa"/>
+              <w:left w:w="100" w:type="dxa"/>
+              <w:right w:w="100" w:type="dxa"/>
+            </w:tcMar>
+            <w:shd w:fill="FFFFFF"/>
+          </w:tcPr>
+          <w:p>
+            <w:pPr>
+              <w:spacing w:before="0" w:after="0"/>
+            </w:pPr>
+            <w:r>
+              <w:rPr>
+                <w:rFonts w:ascii="Arial" w:hAnsi="Arial"/>
+                <w:color w:val="1E293B"/>
+                <w:sz w:val="18"/>
+              </w:rPr>
+              <w:t>+400.000 - 800.000/tháng</w:t>
+            </w:r>
+          </w:p>
+        </w:tc>
+      </w:tr>
+      <w:tr>
+        <w:tc>
+          <w:tcPr>
+            <w:tcW w:type="dxa" w:w="2556"/>
+            <w:tcMar>
+              <w:top w:w="70" w:type="dxa"/>
+              <w:bottom w:w="70" w:type="dxa"/>
+              <w:left w:w="100" w:type="dxa"/>
+              <w:right w:w="100" w:type="dxa"/>
+            </w:tcMar>
+            <w:shd w:fill="F8FAFC"/>
+          </w:tcPr>
+          <w:p>
+            <w:pPr>
+              <w:spacing w:before="0" w:after="0"/>
+            </w:pPr>
+            <w:r>
+              <w:rPr>
+                <w:rFonts w:ascii="Arial" w:hAnsi="Arial"/>
+                <w:color w:val="1E293B"/>
+                <w:sz w:val="18"/>
+              </w:rPr>
+              <w:t>4</w:t>
+            </w:r>
+          </w:p>
+        </w:tc>
+        <w:tc>
+          <w:tcPr>
+            <w:tcW w:type="dxa" w:w="2556"/>
+            <w:tcMar>
+              <w:top w:w="70" w:type="dxa"/>
+              <w:bottom w:w="70" w:type="dxa"/>
+              <w:left w:w="100" w:type="dxa"/>
+              <w:right w:w="100" w:type="dxa"/>
+            </w:tcMar>
+            <w:shd w:fill="F8FAFC"/>
+          </w:tcPr>
+          <w:p>
+            <w:pPr>
+              <w:spacing w:before="0" w:after="0"/>
+            </w:pPr>
+            <w:r>
+              <w:rPr>
+                <w:rFonts w:ascii="Arial" w:hAnsi="Arial"/>
+                <w:color w:val="1E293B"/>
+                <w:sz w:val="18"/>
+              </w:rPr>
+              <w:t>Sửa chữa/thay thế máy POS</w:t>
+            </w:r>
+          </w:p>
+        </w:tc>
+        <w:tc>
+          <w:tcPr>
+            <w:tcW w:type="dxa" w:w="2556"/>
+            <w:tcMar>
+              <w:top w:w="70" w:type="dxa"/>
+              <w:bottom w:w="70" w:type="dxa"/>
+              <w:left w:w="100" w:type="dxa"/>
+              <w:right w:w="100" w:type="dxa"/>
+            </w:tcMar>
+            <w:shd w:fill="F8FAFC"/>
+          </w:tcPr>
+          <w:p>
+            <w:pPr>
+              <w:spacing w:before="0" w:after="0"/>
+            </w:pPr>
+            <w:r>
+              <w:rPr>
+                <w:rFonts w:ascii="Arial" w:hAnsi="Arial"/>
+                <w:color w:val="1E293B"/>
+                <w:sz w:val="18"/>
+              </w:rPr>
+              <w:t>Sau 3-5 năm hoặc hư hỏng</w:t>
+            </w:r>
+          </w:p>
+        </w:tc>
+        <w:tc>
+          <w:tcPr>
+            <w:tcW w:type="dxa" w:w="2556"/>
+            <w:tcMar>
+              <w:top w:w="70" w:type="dxa"/>
+              <w:bottom w:w="70" w:type="dxa"/>
+              <w:left w:w="100" w:type="dxa"/>
+              <w:right w:w="100" w:type="dxa"/>
+            </w:tcMar>
+            <w:shd w:fill="F8FAFC"/>
+          </w:tcPr>
+          <w:p>
+            <w:pPr>
+              <w:spacing w:before="0" w:after="0"/>
+            </w:pPr>
+            <w:r>
+              <w:rPr>
+                <w:rFonts w:ascii="Arial" w:hAnsi="Arial"/>
+                <w:color w:val="1E293B"/>
+                <w:sz w:val="18"/>
+              </w:rPr>
+              <w:t>5.000.000 - 9.000.000/máy</w:t>
+            </w:r>
+          </w:p>
+        </w:tc>
+      </w:tr>
+      <w:tr>
+        <w:tc>
+          <w:tcPr>
+            <w:tcW w:type="dxa" w:w="2556"/>
+            <w:tcMar>
+              <w:top w:w="70" w:type="dxa"/>
+              <w:bottom w:w="70" w:type="dxa"/>
+              <w:left w:w="100" w:type="dxa"/>
+              <w:right w:w="100" w:type="dxa"/>
+            </w:tcMar>
+            <w:shd w:fill="FFFFFF"/>
+          </w:tcPr>
+          <w:p>
+            <w:pPr>
+              <w:spacing w:before="0" w:after="0"/>
+            </w:pPr>
+            <w:r>
+              <w:rPr>
+                <w:rFonts w:ascii="Arial" w:hAnsi="Arial"/>
+                <w:color w:val="1E293B"/>
+                <w:sz w:val="18"/>
+              </w:rPr>
+              <w:t>5</w:t>
+            </w:r>
+          </w:p>
+        </w:tc>
+        <w:tc>
+          <w:tcPr>
+            <w:tcW w:type="dxa" w:w="2556"/>
+            <w:tcMar>
+              <w:top w:w="70" w:type="dxa"/>
+              <w:bottom w:w="70" w:type="dxa"/>
+              <w:left w:w="100" w:type="dxa"/>
+              <w:right w:w="100" w:type="dxa"/>
+            </w:tcMar>
+            <w:shd w:fill="FFFFFF"/>
+          </w:tcPr>
+          <w:p>
+            <w:pPr>
+              <w:spacing w:before="0" w:after="0"/>
+            </w:pPr>
+            <w:r>
+              <w:rPr>
+                <w:rFonts w:ascii="Arial" w:hAnsi="Arial"/>
+                <w:color w:val="1E293B"/>
+                <w:sz w:val="18"/>
+              </w:rPr>
+              <w:t>Phát triển tính năng lớn mới</w:t>
+            </w:r>
+          </w:p>
+        </w:tc>
+        <w:tc>
+          <w:tcPr>
+            <w:tcW w:type="dxa" w:w="2556"/>
+            <w:tcMar>
+              <w:top w:w="70" w:type="dxa"/>
+              <w:bottom w:w="70" w:type="dxa"/>
+              <w:left w:w="100" w:type="dxa"/>
+              <w:right w:w="100" w:type="dxa"/>
+            </w:tcMar>
+            <w:shd w:fill="FFFFFF"/>
+          </w:tcPr>
+          <w:p>
+            <w:pPr>
+              <w:spacing w:before="0" w:after="0"/>
+            </w:pPr>
+            <w:r>
+              <w:rPr>
+                <w:rFonts w:ascii="Arial" w:hAnsi="Arial"/>
+                <w:color w:val="1E293B"/>
+                <w:sz w:val="18"/>
+              </w:rPr>
+              <w:t>Yêu cầu ngoài phạm vi ban đầu</w:t>
+            </w:r>
+          </w:p>
+        </w:tc>
+        <w:tc>
+          <w:tcPr>
+            <w:tcW w:type="dxa" w:w="2556"/>
+            <w:tcMar>
+              <w:top w:w="70" w:type="dxa"/>
+              <w:bottom w:w="70" w:type="dxa"/>
+              <w:left w:w="100" w:type="dxa"/>
+              <w:right w:w="100" w:type="dxa"/>
+            </w:tcMar>
+            <w:shd w:fill="FFFFFF"/>
+          </w:tcPr>
+          <w:p>
+            <w:pPr>
+              <w:spacing w:before="0" w:after="0"/>
+            </w:pPr>
+            <w:r>
+              <w:rPr>
+                <w:rFonts w:ascii="Arial" w:hAnsi="Arial"/>
+                <w:color w:val="1E293B"/>
+                <w:sz w:val="18"/>
+              </w:rPr>
+              <w:t>Báo giá riêng</w:t>
+            </w:r>
+          </w:p>
+        </w:tc>
+      </w:tr>
+      <w:tr>
+        <w:tc>
+          <w:tcPr>
+            <w:tcW w:type="dxa" w:w="2556"/>
+            <w:tcMar>
+              <w:top w:w="70" w:type="dxa"/>
+              <w:bottom w:w="70" w:type="dxa"/>
+              <w:left w:w="100" w:type="dxa"/>
+              <w:right w:w="100" w:type="dxa"/>
+            </w:tcMar>
+            <w:shd w:fill="F8FAFC"/>
+          </w:tcPr>
+          <w:p>
+            <w:pPr>
+              <w:spacing w:before="0" w:after="0"/>
+            </w:pPr>
+            <w:r>
+              <w:rPr>
+                <w:rFonts w:ascii="Arial" w:hAnsi="Arial"/>
+                <w:color w:val="1E293B"/>
+                <w:sz w:val="18"/>
+              </w:rPr>
+              <w:t>6</w:t>
+            </w:r>
+          </w:p>
+        </w:tc>
+        <w:tc>
+          <w:tcPr>
+            <w:tcW w:type="dxa" w:w="2556"/>
+            <w:tcMar>
+              <w:top w:w="70" w:type="dxa"/>
+              <w:bottom w:w="70" w:type="dxa"/>
+              <w:left w:w="100" w:type="dxa"/>
+              <w:right w:w="100" w:type="dxa"/>
+            </w:tcMar>
+            <w:shd w:fill="F8FAFC"/>
+          </w:tcPr>
+          <w:p>
+            <w:pPr>
+              <w:spacing w:before="0" w:after="0"/>
+            </w:pPr>
+            <w:r>
+              <w:rPr>
+                <w:rFonts w:ascii="Arial" w:hAnsi="Arial"/>
+                <w:color w:val="1E293B"/>
+                <w:sz w:val="18"/>
+              </w:rPr>
+              <w:t>Đào tạo nhân viên mới</w:t>
+            </w:r>
+          </w:p>
+        </w:tc>
+        <w:tc>
+          <w:tcPr>
+            <w:tcW w:type="dxa" w:w="2556"/>
+            <w:tcMar>
+              <w:top w:w="70" w:type="dxa"/>
+              <w:bottom w:w="70" w:type="dxa"/>
+              <w:left w:w="100" w:type="dxa"/>
+              <w:right w:w="100" w:type="dxa"/>
+            </w:tcMar>
+            <w:shd w:fill="F8FAFC"/>
+          </w:tcPr>
+          <w:p>
+            <w:pPr>
+              <w:spacing w:before="0" w:after="0"/>
+            </w:pPr>
+            <w:r>
+              <w:rPr>
+                <w:rFonts w:ascii="Arial" w:hAnsi="Arial"/>
+                <w:color w:val="1E293B"/>
+                <w:sz w:val="18"/>
+              </w:rPr>
+              <w:t>Tuyển NV mới cần hướng dẫn</w:t>
+            </w:r>
+          </w:p>
+        </w:tc>
+        <w:tc>
+          <w:tcPr>
+            <w:tcW w:type="dxa" w:w="2556"/>
+            <w:tcMar>
+              <w:top w:w="70" w:type="dxa"/>
+              <w:bottom w:w="70" w:type="dxa"/>
+              <w:left w:w="100" w:type="dxa"/>
+              <w:right w:w="100" w:type="dxa"/>
+            </w:tcMar>
+            <w:shd w:fill="F8FAFC"/>
+          </w:tcPr>
+          <w:p>
+            <w:pPr>
+              <w:spacing w:before="0" w:after="0"/>
+            </w:pPr>
+            <w:r>
+              <w:rPr>
+                <w:rFonts w:ascii="Arial" w:hAnsi="Arial"/>
+                <w:color w:val="1E293B"/>
+                <w:sz w:val="18"/>
+              </w:rPr>
+              <w:t>Miễn phí (đào tạo nội bộ)</w:t>
+            </w:r>
+          </w:p>
+        </w:tc>
+      </w:tr>
+    </w:tbl>
+    <w:p>
+      <w:pPr>
+        <w:spacing w:after="40"/>
+      </w:pPr>
+    </w:p>
+    <w:p>
+      <w:pPr>
+        <w:keepNext/>
+        <w:spacing w:before="280" w:after="120"/>
+        <w:pBdr>
+          <w:bottom w:val="single" w:sz="8" w:space="4" w:color="CBD5E1"/>
+        </w:pBdr>
+      </w:pPr>
+      <w:r>
+        <w:rPr>
+          <w:rFonts w:ascii="Arial" w:hAnsi="Arial"/>
+          <w:b/>
+          <w:color w:val="0F172A"/>
+          <w:sz w:val="26"/>
+        </w:rPr>
+        <w:t>G. TỔNG HỢP CHI PHÍ ĐẦU TƯ</w:t>
       </w:r>
     </w:p>
     <w:p>
@@ -4850,7 +5287,7 @@
                 <w:color w:val="1E293B"/>
                 <w:sz w:val="18"/>
               </w:rPr>
-              <w:t>60.000.000</w:t>
+              <w:t>35.000.000</w:t>
             </w:r>
           </w:p>
         </w:tc>
@@ -4956,7 +5393,7 @@
                 <w:color w:val="1E293B"/>
                 <w:sz w:val="18"/>
               </w:rPr>
-              <w:t>101.490.000</w:t>
+              <w:t>76.490.000</w:t>
             </w:r>
           </w:p>
         </w:tc>
@@ -5010,7 +5447,7 @@
                 <w:color w:val="1E293B"/>
                 <w:sz w:val="18"/>
               </w:rPr>
-              <w:t>95.490.000</w:t>
+              <w:t>70.490.000</w:t>
             </w:r>
           </w:p>
         </w:tc>
@@ -5435,7 +5872,7 @@
                 <w:color w:val="1E293B"/>
                 <w:sz w:val="18"/>
               </w:rPr>
-              <w:t>101.490.000</w:t>
+              <w:t>76.490.000</w:t>
             </w:r>
           </w:p>
         </w:tc>
@@ -5593,7 +6030,7 @@
                 <w:color w:val="1E293B"/>
                 <w:sz w:val="18"/>
               </w:rPr>
-              <w:t>~136.200.000</w:t>
+              <w:t>~111.200.000</w:t>
             </w:r>
           </w:p>
         </w:tc>
@@ -5723,7 +6160,7 @@
           <w:color w:val="0F172A"/>
           <w:sz w:val="26"/>
         </w:rPr>
-        <w:t>G. SO SÁNH CHI PHÍ: CÂY POS CŨ vs SMART F&amp;B OS</w:t>
+        <w:t>H. SO SÁNH CHI PHÍ: CÂY POS CŨ vs SMART F&amp;B OS</w:t>
       </w:r>
     </w:p>
     <w:tbl>
@@ -6527,7 +6964,7 @@
                 <w:color w:val="1E293B"/>
                 <w:sz w:val="19"/>
               </w:rPr>
-              <w:t>3 - 4 tháng</w:t>
+              <w:t>2 - 3 tháng</w:t>
             </w:r>
             <w:r>
               <w:rPr>
@@ -6548,7 +6985,7 @@
                 <w:color w:val="1E293B"/>
                 <w:sz w:val="19"/>
               </w:rPr>
-              <w:t>Từ tháng thứ 5 trở đi, toàn bộ khoản tiết kiệm là lợi nhuận ròng.</w:t>
+              <w:t>Từ tháng thứ 4 trở đi, toàn bộ khoản tiết kiệm là lợi nhuận ròng.</w:t>
             </w:r>
           </w:p>
         </w:tc>
@@ -6574,7 +7011,7 @@
           <w:color w:val="0F172A"/>
           <w:sz w:val="26"/>
         </w:rPr>
-        <w:t>H. ĐIỀU KHOẢN THANH TOÁN</w:t>
+        <w:t>I. ĐIỀU KHOẢN THANH TOÁN</w:t>
       </w:r>
     </w:p>
     <w:tbl>
@@ -6775,7 +7212,7 @@
                 <w:color w:val="1E293B"/>
                 <w:sz w:val="18"/>
               </w:rPr>
-              <w:t>25.000.000</w:t>
+              <w:t>15.000.000</w:t>
             </w:r>
           </w:p>
         </w:tc>
@@ -6877,7 +7314,7 @@
                 <w:color w:val="1E293B"/>
                 <w:sz w:val="18"/>
               </w:rPr>
-              <w:t>20.000.000 + 41.490.000</w:t>
+              <w:t>12.000.000 + 41.490.000</w:t>
             </w:r>
           </w:p>
         </w:tc>
@@ -6979,7 +7416,7 @@
                 <w:color w:val="1E293B"/>
                 <w:sz w:val="18"/>
               </w:rPr>
-              <w:t>15.000.000</w:t>
+              <w:t>8.000.000</w:t>
             </w:r>
           </w:p>
         </w:tc>
@@ -7132,7 +7569,7 @@
           <w:color w:val="0F172A"/>
           <w:sz w:val="26"/>
         </w:rPr>
-        <w:t>I. GHI CHÚ QUAN TRỌNG</w:t>
+        <w:t>J. GHI CHÚ QUAN TRỌNG</w:t>
       </w:r>
     </w:p>
     <w:p>
@@ -7171,7 +7608,7 @@
           <w:rFonts w:ascii="Arial" w:hAnsi="Arial"/>
           <w:sz w:val="20"/>
         </w:rPr>
-        <w:t>3. Toàn bộ giao diện Quản lý và Admin là Web, truy cập trên điện thoại hoặc máy tính qua trình duyệt, không cần cài đặt app.</w:t>
+        <w:t>3. Toàn bộ giao diện Quản lý và Admin là Web, truy cập trên điện thoại hoặc máy tính, không cần cài app.</w:t>
       </w:r>
     </w:p>
     <w:p>
@@ -7237,6 +7674,19 @@
           <w:sz w:val="20"/>
         </w:rPr>
         <w:t>8. Khi mất mạng hoàn toàn, quán vẫn hoạt động: NV tạo đơn trên POS, thu tiền mặt, dữ liệu tự đồng bộ khi có mạng.</w:t>
+      </w:r>
+    </w:p>
+    <w:p>
+      <w:pPr>
+        <w:spacing w:before="0" w:after="60"/>
+        <w:ind w:left="360"/>
+      </w:pPr>
+      <w:r>
+        <w:rPr>
+          <w:rFonts w:ascii="Arial" w:hAnsi="Arial"/>
+          <w:sz w:val="20"/>
+        </w:rPr>
+        <w:t>9. Chi phí phát sinh (Mục F) chỉ phát sinh khi có nhu cầu thực tế, không bắt buộc.</w:t>
       </w:r>
     </w:p>
     <w:p>

</xml_diff>

<commit_message>
docs: add 1-branch pilot option (48.9M) alongside 3-branch (76.5M), dual payment schedules, expansion cost per branch
</commit_message>
<xml_diff>
--- a/BaoGia_KhachHang.docx
+++ b/BaoGia_KhachHang.docx
@@ -5165,7 +5165,7 @@
           <w:color w:val="2563EB"/>
           <w:sz w:val="22"/>
         </w:rPr>
-        <w:t>Chi phí ban đầu</w:t>
+        <w:t>Phương án 1: Triển khai thí điểm 1 chi nhánh trước</w:t>
       </w:r>
     </w:p>
     <w:tbl>
@@ -5262,7 +5262,7 @@
                 <w:color w:val="1E293B"/>
                 <w:sz w:val="18"/>
               </w:rPr>
-              <w:t>Phát triển phần mềm</w:t>
+              <w:t>Phát triển phần mềm (trọn gói, dùng chung cho mọi chi nhánh)</w:t>
             </w:r>
           </w:p>
         </w:tc>
@@ -5314,7 +5314,7 @@
                 <w:color w:val="1E293B"/>
                 <w:sz w:val="18"/>
               </w:rPr>
-              <w:t>Thiết bị phần cứng (3 chi nhánh)</w:t>
+              <w:t>Thiết bị 1 chi nhánh (POS + Máy in + QR 20 bàn + Router 4G + Lắp đặt)</w:t>
             </w:r>
           </w:p>
         </w:tc>
@@ -5339,7 +5339,7 @@
                 <w:color w:val="1E293B"/>
                 <w:sz w:val="18"/>
               </w:rPr>
-              <w:t>41.490.000</w:t>
+              <w:t>13.890.000</w:t>
             </w:r>
           </w:p>
         </w:tc>
@@ -5367,7 +5367,7 @@
                 <w:color w:val="1E293B"/>
                 <w:sz w:val="18"/>
               </w:rPr>
-              <w:t>TỔNG BAN ĐẦU</w:t>
+              <w:t>TỔNG BAN ĐẦU (1 CHI NHÁNH)</w:t>
             </w:r>
           </w:p>
         </w:tc>
@@ -5393,7 +5393,7 @@
                 <w:color w:val="1E293B"/>
                 <w:sz w:val="18"/>
               </w:rPr>
-              <w:t>76.490.000</w:t>
+              <w:t>48.890.000</w:t>
             </w:r>
           </w:p>
         </w:tc>
@@ -5447,7 +5447,243 @@
                 <w:color w:val="1E293B"/>
                 <w:sz w:val="18"/>
               </w:rPr>
-              <w:t>70.490.000</w:t>
+              <w:t>46.890.000</w:t>
+            </w:r>
+          </w:p>
+        </w:tc>
+      </w:tr>
+    </w:tbl>
+    <w:p>
+      <w:pPr>
+        <w:spacing w:after="40"/>
+      </w:pPr>
+    </w:p>
+    <w:tbl>
+      <w:tblPr>
+        <w:tblW w:type="auto" w:w="0"/>
+        <w:jc w:val="center"/>
+        <w:tblLook w:firstColumn="1" w:firstRow="1" w:lastColumn="0" w:lastRow="0" w:noHBand="0" w:noVBand="1" w:val="04A0"/>
+        <w:tblBorders>
+          <w:top w:val="single" w:sz="6" w:space="0" w:color="CBD5E1"/>
+          <w:bottom w:val="single" w:sz="6" w:space="0" w:color="CBD5E1"/>
+          <w:left w:val="single" w:sz="6" w:space="0" w:color="CBD5E1"/>
+          <w:right w:val="single" w:sz="6" w:space="0" w:color="CBD5E1"/>
+          <w:insideH w:val="single" w:sz="4" w:space="0" w:color="E2E8F0"/>
+          <w:insideV w:val="single" w:sz="4" w:space="0" w:color="E2E8F0"/>
+        </w:tblBorders>
+      </w:tblPr>
+      <w:tblGrid>
+        <w:gridCol w:w="5112"/>
+        <w:gridCol w:w="5112"/>
+      </w:tblGrid>
+      <w:tr>
+        <w:tc>
+          <w:tcPr>
+            <w:tcW w:type="dxa" w:w="5112"/>
+            <w:tcMar>
+              <w:top w:w="70" w:type="dxa"/>
+              <w:bottom w:w="70" w:type="dxa"/>
+              <w:left w:w="100" w:type="dxa"/>
+              <w:right w:w="100" w:type="dxa"/>
+            </w:tcMar>
+            <w:shd w:fill="0F172A"/>
+          </w:tcPr>
+          <w:p>
+            <w:pPr>
+              <w:spacing w:before="0" w:after="0"/>
+            </w:pPr>
+            <w:r>
+              <w:rPr>
+                <w:rFonts w:ascii="Arial" w:hAnsi="Arial"/>
+                <w:b/>
+                <w:color w:val="FFFFFF"/>
+                <w:sz w:val="18"/>
+              </w:rPr>
+              <w:t>Hạng mục</w:t>
+            </w:r>
+          </w:p>
+        </w:tc>
+        <w:tc>
+          <w:tcPr>
+            <w:tcW w:type="dxa" w:w="5112"/>
+            <w:tcMar>
+              <w:top w:w="70" w:type="dxa"/>
+              <w:bottom w:w="70" w:type="dxa"/>
+              <w:left w:w="100" w:type="dxa"/>
+              <w:right w:w="100" w:type="dxa"/>
+            </w:tcMar>
+            <w:shd w:fill="0F172A"/>
+          </w:tcPr>
+          <w:p>
+            <w:pPr>
+              <w:spacing w:before="0" w:after="0"/>
+            </w:pPr>
+            <w:r>
+              <w:rPr>
+                <w:rFonts w:ascii="Arial" w:hAnsi="Arial"/>
+                <w:b/>
+                <w:color w:val="FFFFFF"/>
+                <w:sz w:val="18"/>
+              </w:rPr>
+              <w:t>Chi phí/tháng</w:t>
+            </w:r>
+          </w:p>
+        </w:tc>
+      </w:tr>
+      <w:tr>
+        <w:tc>
+          <w:tcPr>
+            <w:tcW w:type="dxa" w:w="5112"/>
+            <w:tcMar>
+              <w:top w:w="70" w:type="dxa"/>
+              <w:bottom w:w="70" w:type="dxa"/>
+              <w:left w:w="100" w:type="dxa"/>
+              <w:right w:w="100" w:type="dxa"/>
+            </w:tcMar>
+            <w:shd w:fill="FFFFFF"/>
+          </w:tcPr>
+          <w:p>
+            <w:pPr>
+              <w:spacing w:before="0" w:after="0"/>
+            </w:pPr>
+            <w:r>
+              <w:rPr>
+                <w:rFonts w:ascii="Arial" w:hAnsi="Arial"/>
+                <w:color w:val="1E293B"/>
+                <w:sz w:val="18"/>
+              </w:rPr>
+              <w:t>Vận hành (Server + Domain + AI + SIM 4G + Giấy in)</w:t>
+            </w:r>
+          </w:p>
+        </w:tc>
+        <w:tc>
+          <w:tcPr>
+            <w:tcW w:type="dxa" w:w="5112"/>
+            <w:tcMar>
+              <w:top w:w="70" w:type="dxa"/>
+              <w:bottom w:w="70" w:type="dxa"/>
+              <w:left w:w="100" w:type="dxa"/>
+              <w:right w:w="100" w:type="dxa"/>
+            </w:tcMar>
+            <w:shd w:fill="FFFFFF"/>
+          </w:tcPr>
+          <w:p>
+            <w:pPr>
+              <w:spacing w:before="0" w:after="0"/>
+            </w:pPr>
+            <w:r>
+              <w:rPr>
+                <w:rFonts w:ascii="Arial" w:hAnsi="Arial"/>
+                <w:color w:val="1E293B"/>
+                <w:sz w:val="18"/>
+              </w:rPr>
+              <w:t>1.440.000</w:t>
+            </w:r>
+          </w:p>
+        </w:tc>
+      </w:tr>
+      <w:tr>
+        <w:tc>
+          <w:tcPr>
+            <w:tcW w:type="dxa" w:w="5112"/>
+            <w:tcMar>
+              <w:top w:w="70" w:type="dxa"/>
+              <w:bottom w:w="70" w:type="dxa"/>
+              <w:left w:w="100" w:type="dxa"/>
+              <w:right w:w="100" w:type="dxa"/>
+            </w:tcMar>
+            <w:shd w:fill="F8FAFC"/>
+          </w:tcPr>
+          <w:p>
+            <w:pPr>
+              <w:spacing w:before="0" w:after="0"/>
+            </w:pPr>
+            <w:r>
+              <w:rPr>
+                <w:rFonts w:ascii="Arial" w:hAnsi="Arial"/>
+                <w:color w:val="1E293B"/>
+                <w:sz w:val="18"/>
+              </w:rPr>
+              <w:t>Bảo trì phần mềm (gói cơ bản)</w:t>
+            </w:r>
+          </w:p>
+        </w:tc>
+        <w:tc>
+          <w:tcPr>
+            <w:tcW w:type="dxa" w:w="5112"/>
+            <w:tcMar>
+              <w:top w:w="70" w:type="dxa"/>
+              <w:bottom w:w="70" w:type="dxa"/>
+              <w:left w:w="100" w:type="dxa"/>
+              <w:right w:w="100" w:type="dxa"/>
+            </w:tcMar>
+            <w:shd w:fill="F8FAFC"/>
+          </w:tcPr>
+          <w:p>
+            <w:pPr>
+              <w:spacing w:before="0" w:after="0"/>
+            </w:pPr>
+            <w:r>
+              <w:rPr>
+                <w:rFonts w:ascii="Arial" w:hAnsi="Arial"/>
+                <w:color w:val="1E293B"/>
+                <w:sz w:val="18"/>
+              </w:rPr>
+              <w:t>2.000.000</w:t>
+            </w:r>
+          </w:p>
+        </w:tc>
+      </w:tr>
+      <w:tr>
+        <w:tc>
+          <w:tcPr>
+            <w:tcW w:type="dxa" w:w="5112"/>
+            <w:tcMar>
+              <w:top w:w="70" w:type="dxa"/>
+              <w:bottom w:w="70" w:type="dxa"/>
+              <w:left w:w="100" w:type="dxa"/>
+              <w:right w:w="100" w:type="dxa"/>
+            </w:tcMar>
+            <w:shd w:fill="FFFFFF"/>
+          </w:tcPr>
+          <w:p>
+            <w:pPr>
+              <w:spacing w:before="0" w:after="0"/>
+            </w:pPr>
+            <w:r>
+              <w:rPr>
+                <w:rFonts w:ascii="Arial" w:hAnsi="Arial"/>
+                <w:b/>
+                <w:color w:val="1E293B"/>
+                <w:sz w:val="18"/>
+              </w:rPr>
+              <w:t>TỔNG HÀNG THÁNG (1 CHI NHÁNH)</w:t>
+            </w:r>
+          </w:p>
+        </w:tc>
+        <w:tc>
+          <w:tcPr>
+            <w:tcW w:type="dxa" w:w="5112"/>
+            <w:tcMar>
+              <w:top w:w="70" w:type="dxa"/>
+              <w:bottom w:w="70" w:type="dxa"/>
+              <w:left w:w="100" w:type="dxa"/>
+              <w:right w:w="100" w:type="dxa"/>
+            </w:tcMar>
+            <w:shd w:fill="FFFFFF"/>
+          </w:tcPr>
+          <w:p>
+            <w:pPr>
+              <w:spacing w:before="0" w:after="0"/>
+            </w:pPr>
+            <w:r>
+              <w:rPr>
+                <w:rFonts w:ascii="Arial" w:hAnsi="Arial"/>
+                <w:b/>
+                <w:color w:val="1E293B"/>
+                <w:sz w:val="18"/>
+              </w:rPr>
+              <w:t>3.440.000</w:t>
             </w:r>
           </w:p>
         </w:tc>
@@ -5460,17 +5696,14 @@
     </w:p>
     <w:p>
       <w:pPr>
-        <w:keepNext/>
-        <w:spacing w:before="200" w:after="80"/>
+        <w:spacing w:before="0" w:after="60"/>
       </w:pPr>
       <w:r>
         <w:rPr>
           <w:rFonts w:ascii="Arial" w:hAnsi="Arial"/>
-          <w:b/>
-          <w:color w:val="2563EB"/>
-          <w:sz w:val="22"/>
+          <w:sz w:val="20"/>
         </w:rPr>
-        <w:t>Chi phí hàng tháng</w:t>
+        <w:t>Chi phí mở rộng thêm mỗi chi nhánh sau thí điểm:</w:t>
       </w:r>
     </w:p>
     <w:tbl>
@@ -5540,7 +5773,7 @@
                 <w:color w:val="FFFFFF"/>
                 <w:sz w:val="18"/>
               </w:rPr>
-              <w:t>Chi phí/tháng</w:t>
+              <w:t>Chi phí/chi nhánh</w:t>
             </w:r>
           </w:p>
         </w:tc>
@@ -5567,7 +5800,7 @@
                 <w:color w:val="1E293B"/>
                 <w:sz w:val="18"/>
               </w:rPr>
-              <w:t>Vận hành hạ tầng</w:t>
+              <w:t>Thiết bị (POS + Máy in + QR + Router + Lắp đặt)</w:t>
             </w:r>
           </w:p>
         </w:tc>
@@ -5592,7 +5825,7 @@
                 <w:color w:val="1E293B"/>
                 <w:sz w:val="18"/>
               </w:rPr>
-              <w:t>1.860.000</w:t>
+              <w:t>13.890.000</w:t>
             </w:r>
           </w:p>
         </w:tc>
@@ -5619,7 +5852,7 @@
                 <w:color w:val="1E293B"/>
                 <w:sz w:val="18"/>
               </w:rPr>
-              <w:t>Bảo trì phần mềm (gói cơ bản)</w:t>
+              <w:t>Vận hành thêm hàng tháng (SIM 4G + Giấy in)</w:t>
             </w:r>
           </w:p>
         </w:tc>
@@ -5644,7 +5877,7 @@
                 <w:color w:val="1E293B"/>
                 <w:sz w:val="18"/>
               </w:rPr>
-              <w:t>2.000.000</w:t>
+              <w:t>210.000</w:t>
             </w:r>
           </w:p>
         </w:tc>
@@ -5668,11 +5901,10 @@
             <w:r>
               <w:rPr>
                 <w:rFonts w:ascii="Arial" w:hAnsi="Arial"/>
-                <w:b/>
                 <w:color w:val="1E293B"/>
                 <w:sz w:val="18"/>
               </w:rPr>
-              <w:t>TỔNG HÀNG THÁNG</w:t>
+              <w:t>Phần mềm</w:t>
             </w:r>
           </w:p>
         </w:tc>
@@ -5694,11 +5926,10 @@
             <w:r>
               <w:rPr>
                 <w:rFonts w:ascii="Arial" w:hAnsi="Arial"/>
-                <w:b/>
                 <w:color w:val="1E293B"/>
                 <w:sz w:val="18"/>
               </w:rPr>
-              <w:t>3.860.000</w:t>
+              <w:t>0 (đã phát triển, dùng chung)</w:t>
             </w:r>
           </w:p>
         </w:tc>
@@ -5721,7 +5952,548 @@
           <w:color w:val="2563EB"/>
           <w:sz w:val="22"/>
         </w:rPr>
-        <w:t>Tổng theo thời gian</w:t>
+        <w:t>Phương án 2: Triển khai đồng loạt 3 chi nhánh</w:t>
+      </w:r>
+    </w:p>
+    <w:tbl>
+      <w:tblPr>
+        <w:tblW w:type="auto" w:w="0"/>
+        <w:jc w:val="center"/>
+        <w:tblLook w:firstColumn="1" w:firstRow="1" w:lastColumn="0" w:lastRow="0" w:noHBand="0" w:noVBand="1" w:val="04A0"/>
+        <w:tblBorders>
+          <w:top w:val="single" w:sz="6" w:space="0" w:color="CBD5E1"/>
+          <w:bottom w:val="single" w:sz="6" w:space="0" w:color="CBD5E1"/>
+          <w:left w:val="single" w:sz="6" w:space="0" w:color="CBD5E1"/>
+          <w:right w:val="single" w:sz="6" w:space="0" w:color="CBD5E1"/>
+          <w:insideH w:val="single" w:sz="4" w:space="0" w:color="E2E8F0"/>
+          <w:insideV w:val="single" w:sz="4" w:space="0" w:color="E2E8F0"/>
+        </w:tblBorders>
+      </w:tblPr>
+      <w:tblGrid>
+        <w:gridCol w:w="5112"/>
+        <w:gridCol w:w="5112"/>
+      </w:tblGrid>
+      <w:tr>
+        <w:tc>
+          <w:tcPr>
+            <w:tcW w:type="dxa" w:w="5112"/>
+            <w:tcMar>
+              <w:top w:w="70" w:type="dxa"/>
+              <w:bottom w:w="70" w:type="dxa"/>
+              <w:left w:w="100" w:type="dxa"/>
+              <w:right w:w="100" w:type="dxa"/>
+            </w:tcMar>
+            <w:shd w:fill="0F172A"/>
+          </w:tcPr>
+          <w:p>
+            <w:pPr>
+              <w:spacing w:before="0" w:after="0"/>
+            </w:pPr>
+            <w:r>
+              <w:rPr>
+                <w:rFonts w:ascii="Arial" w:hAnsi="Arial"/>
+                <w:b/>
+                <w:color w:val="FFFFFF"/>
+                <w:sz w:val="18"/>
+              </w:rPr>
+              <w:t>Hạng mục</w:t>
+            </w:r>
+          </w:p>
+        </w:tc>
+        <w:tc>
+          <w:tcPr>
+            <w:tcW w:type="dxa" w:w="5112"/>
+            <w:tcMar>
+              <w:top w:w="70" w:type="dxa"/>
+              <w:bottom w:w="70" w:type="dxa"/>
+              <w:left w:w="100" w:type="dxa"/>
+              <w:right w:w="100" w:type="dxa"/>
+            </w:tcMar>
+            <w:shd w:fill="0F172A"/>
+          </w:tcPr>
+          <w:p>
+            <w:pPr>
+              <w:spacing w:before="0" w:after="0"/>
+            </w:pPr>
+            <w:r>
+              <w:rPr>
+                <w:rFonts w:ascii="Arial" w:hAnsi="Arial"/>
+                <w:b/>
+                <w:color w:val="FFFFFF"/>
+                <w:sz w:val="18"/>
+              </w:rPr>
+              <w:t>Chi phí</w:t>
+            </w:r>
+          </w:p>
+        </w:tc>
+      </w:tr>
+      <w:tr>
+        <w:tc>
+          <w:tcPr>
+            <w:tcW w:type="dxa" w:w="5112"/>
+            <w:tcMar>
+              <w:top w:w="70" w:type="dxa"/>
+              <w:bottom w:w="70" w:type="dxa"/>
+              <w:left w:w="100" w:type="dxa"/>
+              <w:right w:w="100" w:type="dxa"/>
+            </w:tcMar>
+            <w:shd w:fill="FFFFFF"/>
+          </w:tcPr>
+          <w:p>
+            <w:pPr>
+              <w:spacing w:before="0" w:after="0"/>
+            </w:pPr>
+            <w:r>
+              <w:rPr>
+                <w:rFonts w:ascii="Arial" w:hAnsi="Arial"/>
+                <w:color w:val="1E293B"/>
+                <w:sz w:val="18"/>
+              </w:rPr>
+              <w:t>Phát triển phần mềm</w:t>
+            </w:r>
+          </w:p>
+        </w:tc>
+        <w:tc>
+          <w:tcPr>
+            <w:tcW w:type="dxa" w:w="5112"/>
+            <w:tcMar>
+              <w:top w:w="70" w:type="dxa"/>
+              <w:bottom w:w="70" w:type="dxa"/>
+              <w:left w:w="100" w:type="dxa"/>
+              <w:right w:w="100" w:type="dxa"/>
+            </w:tcMar>
+            <w:shd w:fill="FFFFFF"/>
+          </w:tcPr>
+          <w:p>
+            <w:pPr>
+              <w:spacing w:before="0" w:after="0"/>
+            </w:pPr>
+            <w:r>
+              <w:rPr>
+                <w:rFonts w:ascii="Arial" w:hAnsi="Arial"/>
+                <w:color w:val="1E293B"/>
+                <w:sz w:val="18"/>
+              </w:rPr>
+              <w:t>35.000.000</w:t>
+            </w:r>
+          </w:p>
+        </w:tc>
+      </w:tr>
+      <w:tr>
+        <w:tc>
+          <w:tcPr>
+            <w:tcW w:type="dxa" w:w="5112"/>
+            <w:tcMar>
+              <w:top w:w="70" w:type="dxa"/>
+              <w:bottom w:w="70" w:type="dxa"/>
+              <w:left w:w="100" w:type="dxa"/>
+              <w:right w:w="100" w:type="dxa"/>
+            </w:tcMar>
+            <w:shd w:fill="F8FAFC"/>
+          </w:tcPr>
+          <w:p>
+            <w:pPr>
+              <w:spacing w:before="0" w:after="0"/>
+            </w:pPr>
+            <w:r>
+              <w:rPr>
+                <w:rFonts w:ascii="Arial" w:hAnsi="Arial"/>
+                <w:color w:val="1E293B"/>
+                <w:sz w:val="18"/>
+              </w:rPr>
+              <w:t>Thiết bị phần cứng (3 chi nhánh)</w:t>
+            </w:r>
+          </w:p>
+        </w:tc>
+        <w:tc>
+          <w:tcPr>
+            <w:tcW w:type="dxa" w:w="5112"/>
+            <w:tcMar>
+              <w:top w:w="70" w:type="dxa"/>
+              <w:bottom w:w="70" w:type="dxa"/>
+              <w:left w:w="100" w:type="dxa"/>
+              <w:right w:w="100" w:type="dxa"/>
+            </w:tcMar>
+            <w:shd w:fill="F8FAFC"/>
+          </w:tcPr>
+          <w:p>
+            <w:pPr>
+              <w:spacing w:before="0" w:after="0"/>
+            </w:pPr>
+            <w:r>
+              <w:rPr>
+                <w:rFonts w:ascii="Arial" w:hAnsi="Arial"/>
+                <w:color w:val="1E293B"/>
+                <w:sz w:val="18"/>
+              </w:rPr>
+              <w:t>41.490.000</w:t>
+            </w:r>
+          </w:p>
+        </w:tc>
+      </w:tr>
+      <w:tr>
+        <w:tc>
+          <w:tcPr>
+            <w:tcW w:type="dxa" w:w="5112"/>
+            <w:tcMar>
+              <w:top w:w="70" w:type="dxa"/>
+              <w:bottom w:w="70" w:type="dxa"/>
+              <w:left w:w="100" w:type="dxa"/>
+              <w:right w:w="100" w:type="dxa"/>
+            </w:tcMar>
+            <w:shd w:fill="FFFFFF"/>
+          </w:tcPr>
+          <w:p>
+            <w:pPr>
+              <w:spacing w:before="0" w:after="0"/>
+            </w:pPr>
+            <w:r>
+              <w:rPr>
+                <w:rFonts w:ascii="Arial" w:hAnsi="Arial"/>
+                <w:b/>
+                <w:color w:val="1E293B"/>
+                <w:sz w:val="18"/>
+              </w:rPr>
+              <w:t>TỔNG BAN ĐẦU (3 CHI NHÁNH)</w:t>
+            </w:r>
+          </w:p>
+        </w:tc>
+        <w:tc>
+          <w:tcPr>
+            <w:tcW w:type="dxa" w:w="5112"/>
+            <w:tcMar>
+              <w:top w:w="70" w:type="dxa"/>
+              <w:bottom w:w="70" w:type="dxa"/>
+              <w:left w:w="100" w:type="dxa"/>
+              <w:right w:w="100" w:type="dxa"/>
+            </w:tcMar>
+            <w:shd w:fill="FFFFFF"/>
+          </w:tcPr>
+          <w:p>
+            <w:pPr>
+              <w:spacing w:before="0" w:after="0"/>
+            </w:pPr>
+            <w:r>
+              <w:rPr>
+                <w:rFonts w:ascii="Arial" w:hAnsi="Arial"/>
+                <w:b/>
+                <w:color w:val="1E293B"/>
+                <w:sz w:val="18"/>
+              </w:rPr>
+              <w:t>76.490.000</w:t>
+            </w:r>
+          </w:p>
+        </w:tc>
+      </w:tr>
+      <w:tr>
+        <w:tc>
+          <w:tcPr>
+            <w:tcW w:type="dxa" w:w="5112"/>
+            <w:tcMar>
+              <w:top w:w="70" w:type="dxa"/>
+              <w:bottom w:w="70" w:type="dxa"/>
+              <w:left w:w="100" w:type="dxa"/>
+              <w:right w:w="100" w:type="dxa"/>
+            </w:tcMar>
+            <w:shd w:fill="F8FAFC"/>
+          </w:tcPr>
+          <w:p>
+            <w:pPr>
+              <w:spacing w:before="0" w:after="0"/>
+            </w:pPr>
+            <w:r>
+              <w:rPr>
+                <w:rFonts w:ascii="Arial" w:hAnsi="Arial"/>
+                <w:i/>
+                <w:color w:val="1E293B"/>
+                <w:sz w:val="18"/>
+              </w:rPr>
+              <w:t>Dùng lại máy in cũ</w:t>
+            </w:r>
+          </w:p>
+        </w:tc>
+        <w:tc>
+          <w:tcPr>
+            <w:tcW w:type="dxa" w:w="5112"/>
+            <w:tcMar>
+              <w:top w:w="70" w:type="dxa"/>
+              <w:bottom w:w="70" w:type="dxa"/>
+              <w:left w:w="100" w:type="dxa"/>
+              <w:right w:w="100" w:type="dxa"/>
+            </w:tcMar>
+            <w:shd w:fill="F8FAFC"/>
+          </w:tcPr>
+          <w:p>
+            <w:pPr>
+              <w:spacing w:before="0" w:after="0"/>
+            </w:pPr>
+            <w:r>
+              <w:rPr>
+                <w:rFonts w:ascii="Arial" w:hAnsi="Arial"/>
+                <w:i/>
+                <w:color w:val="1E293B"/>
+                <w:sz w:val="18"/>
+              </w:rPr>
+              <w:t>70.490.000</w:t>
+            </w:r>
+          </w:p>
+        </w:tc>
+      </w:tr>
+    </w:tbl>
+    <w:p>
+      <w:pPr>
+        <w:spacing w:after="40"/>
+      </w:pPr>
+    </w:p>
+    <w:tbl>
+      <w:tblPr>
+        <w:tblW w:type="auto" w:w="0"/>
+        <w:jc w:val="center"/>
+        <w:tblLook w:firstColumn="1" w:firstRow="1" w:lastColumn="0" w:lastRow="0" w:noHBand="0" w:noVBand="1" w:val="04A0"/>
+        <w:tblBorders>
+          <w:top w:val="single" w:sz="6" w:space="0" w:color="CBD5E1"/>
+          <w:bottom w:val="single" w:sz="6" w:space="0" w:color="CBD5E1"/>
+          <w:left w:val="single" w:sz="6" w:space="0" w:color="CBD5E1"/>
+          <w:right w:val="single" w:sz="6" w:space="0" w:color="CBD5E1"/>
+          <w:insideH w:val="single" w:sz="4" w:space="0" w:color="E2E8F0"/>
+          <w:insideV w:val="single" w:sz="4" w:space="0" w:color="E2E8F0"/>
+        </w:tblBorders>
+      </w:tblPr>
+      <w:tblGrid>
+        <w:gridCol w:w="5112"/>
+        <w:gridCol w:w="5112"/>
+      </w:tblGrid>
+      <w:tr>
+        <w:tc>
+          <w:tcPr>
+            <w:tcW w:type="dxa" w:w="5112"/>
+            <w:tcMar>
+              <w:top w:w="70" w:type="dxa"/>
+              <w:bottom w:w="70" w:type="dxa"/>
+              <w:left w:w="100" w:type="dxa"/>
+              <w:right w:w="100" w:type="dxa"/>
+            </w:tcMar>
+            <w:shd w:fill="0F172A"/>
+          </w:tcPr>
+          <w:p>
+            <w:pPr>
+              <w:spacing w:before="0" w:after="0"/>
+            </w:pPr>
+            <w:r>
+              <w:rPr>
+                <w:rFonts w:ascii="Arial" w:hAnsi="Arial"/>
+                <w:b/>
+                <w:color w:val="FFFFFF"/>
+                <w:sz w:val="18"/>
+              </w:rPr>
+              <w:t>Hạng mục</w:t>
+            </w:r>
+          </w:p>
+        </w:tc>
+        <w:tc>
+          <w:tcPr>
+            <w:tcW w:type="dxa" w:w="5112"/>
+            <w:tcMar>
+              <w:top w:w="70" w:type="dxa"/>
+              <w:bottom w:w="70" w:type="dxa"/>
+              <w:left w:w="100" w:type="dxa"/>
+              <w:right w:w="100" w:type="dxa"/>
+            </w:tcMar>
+            <w:shd w:fill="0F172A"/>
+          </w:tcPr>
+          <w:p>
+            <w:pPr>
+              <w:spacing w:before="0" w:after="0"/>
+            </w:pPr>
+            <w:r>
+              <w:rPr>
+                <w:rFonts w:ascii="Arial" w:hAnsi="Arial"/>
+                <w:b/>
+                <w:color w:val="FFFFFF"/>
+                <w:sz w:val="18"/>
+              </w:rPr>
+              <w:t>Chi phí/tháng</w:t>
+            </w:r>
+          </w:p>
+        </w:tc>
+      </w:tr>
+      <w:tr>
+        <w:tc>
+          <w:tcPr>
+            <w:tcW w:type="dxa" w:w="5112"/>
+            <w:tcMar>
+              <w:top w:w="70" w:type="dxa"/>
+              <w:bottom w:w="70" w:type="dxa"/>
+              <w:left w:w="100" w:type="dxa"/>
+              <w:right w:w="100" w:type="dxa"/>
+            </w:tcMar>
+            <w:shd w:fill="FFFFFF"/>
+          </w:tcPr>
+          <w:p>
+            <w:pPr>
+              <w:spacing w:before="0" w:after="0"/>
+            </w:pPr>
+            <w:r>
+              <w:rPr>
+                <w:rFonts w:ascii="Arial" w:hAnsi="Arial"/>
+                <w:color w:val="1E293B"/>
+                <w:sz w:val="18"/>
+              </w:rPr>
+              <w:t>Vận hành hạ tầng</w:t>
+            </w:r>
+          </w:p>
+        </w:tc>
+        <w:tc>
+          <w:tcPr>
+            <w:tcW w:type="dxa" w:w="5112"/>
+            <w:tcMar>
+              <w:top w:w="70" w:type="dxa"/>
+              <w:bottom w:w="70" w:type="dxa"/>
+              <w:left w:w="100" w:type="dxa"/>
+              <w:right w:w="100" w:type="dxa"/>
+            </w:tcMar>
+            <w:shd w:fill="FFFFFF"/>
+          </w:tcPr>
+          <w:p>
+            <w:pPr>
+              <w:spacing w:before="0" w:after="0"/>
+            </w:pPr>
+            <w:r>
+              <w:rPr>
+                <w:rFonts w:ascii="Arial" w:hAnsi="Arial"/>
+                <w:color w:val="1E293B"/>
+                <w:sz w:val="18"/>
+              </w:rPr>
+              <w:t>1.860.000</w:t>
+            </w:r>
+          </w:p>
+        </w:tc>
+      </w:tr>
+      <w:tr>
+        <w:tc>
+          <w:tcPr>
+            <w:tcW w:type="dxa" w:w="5112"/>
+            <w:tcMar>
+              <w:top w:w="70" w:type="dxa"/>
+              <w:bottom w:w="70" w:type="dxa"/>
+              <w:left w:w="100" w:type="dxa"/>
+              <w:right w:w="100" w:type="dxa"/>
+            </w:tcMar>
+            <w:shd w:fill="F8FAFC"/>
+          </w:tcPr>
+          <w:p>
+            <w:pPr>
+              <w:spacing w:before="0" w:after="0"/>
+            </w:pPr>
+            <w:r>
+              <w:rPr>
+                <w:rFonts w:ascii="Arial" w:hAnsi="Arial"/>
+                <w:color w:val="1E293B"/>
+                <w:sz w:val="18"/>
+              </w:rPr>
+              <w:t>Bảo trì phần mềm (gói cơ bản)</w:t>
+            </w:r>
+          </w:p>
+        </w:tc>
+        <w:tc>
+          <w:tcPr>
+            <w:tcW w:type="dxa" w:w="5112"/>
+            <w:tcMar>
+              <w:top w:w="70" w:type="dxa"/>
+              <w:bottom w:w="70" w:type="dxa"/>
+              <w:left w:w="100" w:type="dxa"/>
+              <w:right w:w="100" w:type="dxa"/>
+            </w:tcMar>
+            <w:shd w:fill="F8FAFC"/>
+          </w:tcPr>
+          <w:p>
+            <w:pPr>
+              <w:spacing w:before="0" w:after="0"/>
+            </w:pPr>
+            <w:r>
+              <w:rPr>
+                <w:rFonts w:ascii="Arial" w:hAnsi="Arial"/>
+                <w:color w:val="1E293B"/>
+                <w:sz w:val="18"/>
+              </w:rPr>
+              <w:t>2.000.000</w:t>
+            </w:r>
+          </w:p>
+        </w:tc>
+      </w:tr>
+      <w:tr>
+        <w:tc>
+          <w:tcPr>
+            <w:tcW w:type="dxa" w:w="5112"/>
+            <w:tcMar>
+              <w:top w:w="70" w:type="dxa"/>
+              <w:bottom w:w="70" w:type="dxa"/>
+              <w:left w:w="100" w:type="dxa"/>
+              <w:right w:w="100" w:type="dxa"/>
+            </w:tcMar>
+            <w:shd w:fill="FFFFFF"/>
+          </w:tcPr>
+          <w:p>
+            <w:pPr>
+              <w:spacing w:before="0" w:after="0"/>
+            </w:pPr>
+            <w:r>
+              <w:rPr>
+                <w:rFonts w:ascii="Arial" w:hAnsi="Arial"/>
+                <w:b/>
+                <w:color w:val="1E293B"/>
+                <w:sz w:val="18"/>
+              </w:rPr>
+              <w:t>TỔNG HÀNG THÁNG (3 CHI NHÁNH)</w:t>
+            </w:r>
+          </w:p>
+        </w:tc>
+        <w:tc>
+          <w:tcPr>
+            <w:tcW w:type="dxa" w:w="5112"/>
+            <w:tcMar>
+              <w:top w:w="70" w:type="dxa"/>
+              <w:bottom w:w="70" w:type="dxa"/>
+              <w:left w:w="100" w:type="dxa"/>
+              <w:right w:w="100" w:type="dxa"/>
+            </w:tcMar>
+            <w:shd w:fill="FFFFFF"/>
+          </w:tcPr>
+          <w:p>
+            <w:pPr>
+              <w:spacing w:before="0" w:after="0"/>
+            </w:pPr>
+            <w:r>
+              <w:rPr>
+                <w:rFonts w:ascii="Arial" w:hAnsi="Arial"/>
+                <w:b/>
+                <w:color w:val="1E293B"/>
+                <w:sz w:val="18"/>
+              </w:rPr>
+              <w:t>3.860.000</w:t>
+            </w:r>
+          </w:p>
+        </w:tc>
+      </w:tr>
+    </w:tbl>
+    <w:p>
+      <w:pPr>
+        <w:spacing w:after="40"/>
+      </w:pPr>
+    </w:p>
+    <w:p>
+      <w:pPr>
+        <w:keepNext/>
+        <w:spacing w:before="200" w:after="80"/>
+      </w:pPr>
+      <w:r>
+        <w:rPr>
+          <w:rFonts w:ascii="Arial" w:hAnsi="Arial"/>
+          <w:b/>
+          <w:color w:val="2563EB"/>
+          <w:sz w:val="22"/>
+        </w:rPr>
+        <w:t>So sánh 2 phương án</w:t>
       </w:r>
     </w:p>
     <w:tbl>
@@ -5766,7 +6538,7 @@
                 <w:color w:val="FFFFFF"/>
                 <w:sz w:val="18"/>
               </w:rPr>
-              <w:t>Mốc thời gian</w:t>
+              <w:t>Tiêu chí</w:t>
             </w:r>
           </w:p>
         </w:tc>
@@ -5792,7 +6564,7 @@
                 <w:color w:val="FFFFFF"/>
                 <w:sz w:val="18"/>
               </w:rPr>
-              <w:t>Chi phí</w:t>
+              <w:t>1 chi nhánh thí điểm</w:t>
             </w:r>
           </w:p>
         </w:tc>
@@ -5818,7 +6590,7 @@
                 <w:color w:val="FFFFFF"/>
                 <w:sz w:val="18"/>
               </w:rPr>
-              <w:t>Ghi chú</w:t>
+              <w:t>3 chi nhánh đồng loạt</w:t>
             </w:r>
           </w:p>
         </w:tc>
@@ -5842,11 +6614,10 @@
             <w:r>
               <w:rPr>
                 <w:rFonts w:ascii="Arial" w:hAnsi="Arial"/>
-                <w:b/>
                 <w:color w:val="1E293B"/>
                 <w:sz w:val="18"/>
               </w:rPr>
-              <w:t>Ban đầu</w:t>
+              <w:t>Đầu tư ban đầu</w:t>
             </w:r>
           </w:p>
         </w:tc>
@@ -5872,7 +6643,7 @@
                 <w:color w:val="1E293B"/>
                 <w:sz w:val="18"/>
               </w:rPr>
-              <w:t>76.490.000</w:t>
+              <w:t>48.890.000</w:t>
             </w:r>
           </w:p>
         </w:tc>
@@ -5894,10 +6665,11 @@
             <w:r>
               <w:rPr>
                 <w:rFonts w:ascii="Arial" w:hAnsi="Arial"/>
+                <w:b/>
                 <w:color w:val="1E293B"/>
                 <w:sz w:val="18"/>
               </w:rPr>
-              <w:t>Phần mềm + thiết bị</w:t>
+              <w:t>76.490.000</w:t>
             </w:r>
           </w:p>
         </w:tc>
@@ -5921,11 +6693,10 @@
             <w:r>
               <w:rPr>
                 <w:rFonts w:ascii="Arial" w:hAnsi="Arial"/>
-                <w:b/>
                 <w:color w:val="1E293B"/>
                 <w:sz w:val="18"/>
               </w:rPr>
-              <w:t>Mỗi tháng</w:t>
+              <w:t>Hàng tháng</w:t>
             </w:r>
           </w:p>
         </w:tc>
@@ -5947,11 +6718,10 @@
             <w:r>
               <w:rPr>
                 <w:rFonts w:ascii="Arial" w:hAnsi="Arial"/>
-                <w:b/>
                 <w:color w:val="1E293B"/>
                 <w:sz w:val="18"/>
               </w:rPr>
-              <w:t>3.860.000</w:t>
+              <w:t>3.440.000</w:t>
             </w:r>
           </w:p>
         </w:tc>
@@ -5976,7 +6746,7 @@
                 <w:color w:val="1E293B"/>
                 <w:sz w:val="18"/>
               </w:rPr>
-              <w:t>Vận hành + bảo trì cơ bản</w:t>
+              <w:t>3.860.000</w:t>
             </w:r>
           </w:p>
         </w:tc>
@@ -6000,11 +6770,10 @@
             <w:r>
               <w:rPr>
                 <w:rFonts w:ascii="Arial" w:hAnsi="Arial"/>
-                <w:b/>
                 <w:color w:val="1E293B"/>
                 <w:sz w:val="18"/>
               </w:rPr>
-              <w:t>Năm đầu tiên</w:t>
+              <w:t>Rủi ro</w:t>
             </w:r>
           </w:p>
         </w:tc>
@@ -6026,11 +6795,10 @@
             <w:r>
               <w:rPr>
                 <w:rFonts w:ascii="Arial" w:hAnsi="Arial"/>
-                <w:b/>
                 <w:color w:val="1E293B"/>
                 <w:sz w:val="18"/>
               </w:rPr>
-              <w:t>~111.200.000</w:t>
+              <w:t>Thấp — thử trước, mở rộng sau</w:t>
             </w:r>
           </w:p>
         </w:tc>
@@ -6055,7 +6823,7 @@
                 <w:color w:val="1E293B"/>
                 <w:sz w:val="18"/>
               </w:rPr>
-              <w:t>Ban đầu + 9 tháng vận hành (3 tháng BH miễn phí)</w:t>
+              <w:t>Trung bình — triển khai cùng lúc</w:t>
             </w:r>
           </w:p>
         </w:tc>
@@ -6079,11 +6847,10 @@
             <w:r>
               <w:rPr>
                 <w:rFonts w:ascii="Arial" w:hAnsi="Arial"/>
-                <w:b/>
                 <w:color w:val="1E293B"/>
                 <w:sz w:val="18"/>
               </w:rPr>
-              <w:t>Từ năm thứ 2</w:t>
+              <w:t>Hoàn vốn</w:t>
             </w:r>
           </w:p>
         </w:tc>
@@ -6105,11 +6872,10 @@
             <w:r>
               <w:rPr>
                 <w:rFonts w:ascii="Arial" w:hAnsi="Arial"/>
-                <w:b/>
                 <w:color w:val="1E293B"/>
                 <w:sz w:val="18"/>
               </w:rPr>
-              <w:t>~46.300.000/năm</w:t>
+              <w:t>~2 tháng (tiết kiệm lương 1 thu ngân)</w:t>
             </w:r>
           </w:p>
         </w:tc>
@@ -6134,7 +6900,520 @@
                 <w:color w:val="1E293B"/>
                 <w:sz w:val="18"/>
               </w:rPr>
+              <w:t>~2-3 tháng (tiết kiệm lương 3 thu ngân)</w:t>
+            </w:r>
+          </w:p>
+        </w:tc>
+      </w:tr>
+      <w:tr>
+        <w:tc>
+          <w:tcPr>
+            <w:tcW w:type="dxa" w:w="3408"/>
+            <w:tcMar>
+              <w:top w:w="70" w:type="dxa"/>
+              <w:bottom w:w="70" w:type="dxa"/>
+              <w:left w:w="100" w:type="dxa"/>
+              <w:right w:w="100" w:type="dxa"/>
+            </w:tcMar>
+            <w:shd w:fill="FFFFFF"/>
+          </w:tcPr>
+          <w:p>
+            <w:pPr>
+              <w:spacing w:before="0" w:after="0"/>
+            </w:pPr>
+            <w:r>
+              <w:rPr>
+                <w:rFonts w:ascii="Arial" w:hAnsi="Arial"/>
+                <w:color w:val="1E293B"/>
+                <w:sz w:val="18"/>
+              </w:rPr>
+              <w:t>Thời gian mở rộng</w:t>
+            </w:r>
+          </w:p>
+        </w:tc>
+        <w:tc>
+          <w:tcPr>
+            <w:tcW w:type="dxa" w:w="3408"/>
+            <w:tcMar>
+              <w:top w:w="70" w:type="dxa"/>
+              <w:bottom w:w="70" w:type="dxa"/>
+              <w:left w:w="100" w:type="dxa"/>
+              <w:right w:w="100" w:type="dxa"/>
+            </w:tcMar>
+            <w:shd w:fill="FFFFFF"/>
+          </w:tcPr>
+          <w:p>
+            <w:pPr>
+              <w:spacing w:before="0" w:after="0"/>
+            </w:pPr>
+            <w:r>
+              <w:rPr>
+                <w:rFonts w:ascii="Arial" w:hAnsi="Arial"/>
+                <w:color w:val="1E293B"/>
+                <w:sz w:val="18"/>
+              </w:rPr>
+              <w:t>Thêm chi nhánh bất kỳ lúc nào</w:t>
+            </w:r>
+          </w:p>
+        </w:tc>
+        <w:tc>
+          <w:tcPr>
+            <w:tcW w:type="dxa" w:w="3408"/>
+            <w:tcMar>
+              <w:top w:w="70" w:type="dxa"/>
+              <w:bottom w:w="70" w:type="dxa"/>
+              <w:left w:w="100" w:type="dxa"/>
+              <w:right w:w="100" w:type="dxa"/>
+            </w:tcMar>
+            <w:shd w:fill="FFFFFF"/>
+          </w:tcPr>
+          <w:p>
+            <w:pPr>
+              <w:spacing w:before="0" w:after="0"/>
+            </w:pPr>
+            <w:r>
+              <w:rPr>
+                <w:rFonts w:ascii="Arial" w:hAnsi="Arial"/>
+                <w:color w:val="1E293B"/>
+                <w:sz w:val="18"/>
+              </w:rPr>
+              <w:t>Không cần — đã triển khai đủ</w:t>
+            </w:r>
+          </w:p>
+        </w:tc>
+      </w:tr>
+    </w:tbl>
+    <w:p>
+      <w:pPr>
+        <w:spacing w:after="40"/>
+      </w:pPr>
+    </w:p>
+    <w:p>
+      <w:pPr>
+        <w:keepNext/>
+        <w:spacing w:before="200" w:after="80"/>
+      </w:pPr>
+      <w:r>
+        <w:rPr>
+          <w:rFonts w:ascii="Arial" w:hAnsi="Arial"/>
+          <w:b/>
+          <w:color w:val="2563EB"/>
+          <w:sz w:val="22"/>
+        </w:rPr>
+        <w:t>Tổng theo thời gian (Phương án 1 chi nhánh)</w:t>
+      </w:r>
+    </w:p>
+    <w:tbl>
+      <w:tblPr>
+        <w:tblW w:type="auto" w:w="0"/>
+        <w:jc w:val="center"/>
+        <w:tblLook w:firstColumn="1" w:firstRow="1" w:lastColumn="0" w:lastRow="0" w:noHBand="0" w:noVBand="1" w:val="04A0"/>
+        <w:tblBorders>
+          <w:top w:val="single" w:sz="6" w:space="0" w:color="CBD5E1"/>
+          <w:bottom w:val="single" w:sz="6" w:space="0" w:color="CBD5E1"/>
+          <w:left w:val="single" w:sz="6" w:space="0" w:color="CBD5E1"/>
+          <w:right w:val="single" w:sz="6" w:space="0" w:color="CBD5E1"/>
+          <w:insideH w:val="single" w:sz="4" w:space="0" w:color="E2E8F0"/>
+          <w:insideV w:val="single" w:sz="4" w:space="0" w:color="E2E8F0"/>
+        </w:tblBorders>
+      </w:tblPr>
+      <w:tblGrid>
+        <w:gridCol w:w="3408"/>
+        <w:gridCol w:w="3408"/>
+        <w:gridCol w:w="3408"/>
+      </w:tblGrid>
+      <w:tr>
+        <w:tc>
+          <w:tcPr>
+            <w:tcW w:type="dxa" w:w="3408"/>
+            <w:tcMar>
+              <w:top w:w="70" w:type="dxa"/>
+              <w:bottom w:w="70" w:type="dxa"/>
+              <w:left w:w="100" w:type="dxa"/>
+              <w:right w:w="100" w:type="dxa"/>
+            </w:tcMar>
+            <w:shd w:fill="0F172A"/>
+          </w:tcPr>
+          <w:p>
+            <w:pPr>
+              <w:spacing w:before="0" w:after="0"/>
+            </w:pPr>
+            <w:r>
+              <w:rPr>
+                <w:rFonts w:ascii="Arial" w:hAnsi="Arial"/>
+                <w:b/>
+                <w:color w:val="FFFFFF"/>
+                <w:sz w:val="18"/>
+              </w:rPr>
+              <w:t>Mốc thời gian</w:t>
+            </w:r>
+          </w:p>
+        </w:tc>
+        <w:tc>
+          <w:tcPr>
+            <w:tcW w:type="dxa" w:w="3408"/>
+            <w:tcMar>
+              <w:top w:w="70" w:type="dxa"/>
+              <w:bottom w:w="70" w:type="dxa"/>
+              <w:left w:w="100" w:type="dxa"/>
+              <w:right w:w="100" w:type="dxa"/>
+            </w:tcMar>
+            <w:shd w:fill="0F172A"/>
+          </w:tcPr>
+          <w:p>
+            <w:pPr>
+              <w:spacing w:before="0" w:after="0"/>
+            </w:pPr>
+            <w:r>
+              <w:rPr>
+                <w:rFonts w:ascii="Arial" w:hAnsi="Arial"/>
+                <w:b/>
+                <w:color w:val="FFFFFF"/>
+                <w:sz w:val="18"/>
+              </w:rPr>
+              <w:t>Chi phí</w:t>
+            </w:r>
+          </w:p>
+        </w:tc>
+        <w:tc>
+          <w:tcPr>
+            <w:tcW w:type="dxa" w:w="3408"/>
+            <w:tcMar>
+              <w:top w:w="70" w:type="dxa"/>
+              <w:bottom w:w="70" w:type="dxa"/>
+              <w:left w:w="100" w:type="dxa"/>
+              <w:right w:w="100" w:type="dxa"/>
+            </w:tcMar>
+            <w:shd w:fill="0F172A"/>
+          </w:tcPr>
+          <w:p>
+            <w:pPr>
+              <w:spacing w:before="0" w:after="0"/>
+            </w:pPr>
+            <w:r>
+              <w:rPr>
+                <w:rFonts w:ascii="Arial" w:hAnsi="Arial"/>
+                <w:b/>
+                <w:color w:val="FFFFFF"/>
+                <w:sz w:val="18"/>
+              </w:rPr>
+              <w:t>Ghi chú</w:t>
+            </w:r>
+          </w:p>
+        </w:tc>
+      </w:tr>
+      <w:tr>
+        <w:tc>
+          <w:tcPr>
+            <w:tcW w:type="dxa" w:w="3408"/>
+            <w:tcMar>
+              <w:top w:w="70" w:type="dxa"/>
+              <w:bottom w:w="70" w:type="dxa"/>
+              <w:left w:w="100" w:type="dxa"/>
+              <w:right w:w="100" w:type="dxa"/>
+            </w:tcMar>
+            <w:shd w:fill="FFFFFF"/>
+          </w:tcPr>
+          <w:p>
+            <w:pPr>
+              <w:spacing w:before="0" w:after="0"/>
+            </w:pPr>
+            <w:r>
+              <w:rPr>
+                <w:rFonts w:ascii="Arial" w:hAnsi="Arial"/>
+                <w:b/>
+                <w:color w:val="1E293B"/>
+                <w:sz w:val="18"/>
+              </w:rPr>
+              <w:t>Ban đầu</w:t>
+            </w:r>
+          </w:p>
+        </w:tc>
+        <w:tc>
+          <w:tcPr>
+            <w:tcW w:type="dxa" w:w="3408"/>
+            <w:tcMar>
+              <w:top w:w="70" w:type="dxa"/>
+              <w:bottom w:w="70" w:type="dxa"/>
+              <w:left w:w="100" w:type="dxa"/>
+              <w:right w:w="100" w:type="dxa"/>
+            </w:tcMar>
+            <w:shd w:fill="FFFFFF"/>
+          </w:tcPr>
+          <w:p>
+            <w:pPr>
+              <w:spacing w:before="0" w:after="0"/>
+            </w:pPr>
+            <w:r>
+              <w:rPr>
+                <w:rFonts w:ascii="Arial" w:hAnsi="Arial"/>
+                <w:b/>
+                <w:color w:val="1E293B"/>
+                <w:sz w:val="18"/>
+              </w:rPr>
+              <w:t>48.890.000</w:t>
+            </w:r>
+          </w:p>
+        </w:tc>
+        <w:tc>
+          <w:tcPr>
+            <w:tcW w:type="dxa" w:w="3408"/>
+            <w:tcMar>
+              <w:top w:w="70" w:type="dxa"/>
+              <w:bottom w:w="70" w:type="dxa"/>
+              <w:left w:w="100" w:type="dxa"/>
+              <w:right w:w="100" w:type="dxa"/>
+            </w:tcMar>
+            <w:shd w:fill="FFFFFF"/>
+          </w:tcPr>
+          <w:p>
+            <w:pPr>
+              <w:spacing w:before="0" w:after="0"/>
+            </w:pPr>
+            <w:r>
+              <w:rPr>
+                <w:rFonts w:ascii="Arial" w:hAnsi="Arial"/>
+                <w:color w:val="1E293B"/>
+                <w:sz w:val="18"/>
+              </w:rPr>
+              <w:t>Phần mềm + thiết bị 1 quán</w:t>
+            </w:r>
+          </w:p>
+        </w:tc>
+      </w:tr>
+      <w:tr>
+        <w:tc>
+          <w:tcPr>
+            <w:tcW w:type="dxa" w:w="3408"/>
+            <w:tcMar>
+              <w:top w:w="70" w:type="dxa"/>
+              <w:bottom w:w="70" w:type="dxa"/>
+              <w:left w:w="100" w:type="dxa"/>
+              <w:right w:w="100" w:type="dxa"/>
+            </w:tcMar>
+            <w:shd w:fill="F8FAFC"/>
+          </w:tcPr>
+          <w:p>
+            <w:pPr>
+              <w:spacing w:before="0" w:after="0"/>
+            </w:pPr>
+            <w:r>
+              <w:rPr>
+                <w:rFonts w:ascii="Arial" w:hAnsi="Arial"/>
+                <w:b/>
+                <w:color w:val="1E293B"/>
+                <w:sz w:val="18"/>
+              </w:rPr>
+              <w:t>Mỗi tháng</w:t>
+            </w:r>
+          </w:p>
+        </w:tc>
+        <w:tc>
+          <w:tcPr>
+            <w:tcW w:type="dxa" w:w="3408"/>
+            <w:tcMar>
+              <w:top w:w="70" w:type="dxa"/>
+              <w:bottom w:w="70" w:type="dxa"/>
+              <w:left w:w="100" w:type="dxa"/>
+              <w:right w:w="100" w:type="dxa"/>
+            </w:tcMar>
+            <w:shd w:fill="F8FAFC"/>
+          </w:tcPr>
+          <w:p>
+            <w:pPr>
+              <w:spacing w:before="0" w:after="0"/>
+            </w:pPr>
+            <w:r>
+              <w:rPr>
+                <w:rFonts w:ascii="Arial" w:hAnsi="Arial"/>
+                <w:b/>
+                <w:color w:val="1E293B"/>
+                <w:sz w:val="18"/>
+              </w:rPr>
+              <w:t>3.440.000</w:t>
+            </w:r>
+          </w:p>
+        </w:tc>
+        <w:tc>
+          <w:tcPr>
+            <w:tcW w:type="dxa" w:w="3408"/>
+            <w:tcMar>
+              <w:top w:w="70" w:type="dxa"/>
+              <w:bottom w:w="70" w:type="dxa"/>
+              <w:left w:w="100" w:type="dxa"/>
+              <w:right w:w="100" w:type="dxa"/>
+            </w:tcMar>
+            <w:shd w:fill="F8FAFC"/>
+          </w:tcPr>
+          <w:p>
+            <w:pPr>
+              <w:spacing w:before="0" w:after="0"/>
+            </w:pPr>
+            <w:r>
+              <w:rPr>
+                <w:rFonts w:ascii="Arial" w:hAnsi="Arial"/>
+                <w:color w:val="1E293B"/>
+                <w:sz w:val="18"/>
+              </w:rPr>
               <w:t>Vận hành + bảo trì</w:t>
+            </w:r>
+          </w:p>
+        </w:tc>
+      </w:tr>
+      <w:tr>
+        <w:tc>
+          <w:tcPr>
+            <w:tcW w:type="dxa" w:w="3408"/>
+            <w:tcMar>
+              <w:top w:w="70" w:type="dxa"/>
+              <w:bottom w:w="70" w:type="dxa"/>
+              <w:left w:w="100" w:type="dxa"/>
+              <w:right w:w="100" w:type="dxa"/>
+            </w:tcMar>
+            <w:shd w:fill="FFFFFF"/>
+          </w:tcPr>
+          <w:p>
+            <w:pPr>
+              <w:spacing w:before="0" w:after="0"/>
+            </w:pPr>
+            <w:r>
+              <w:rPr>
+                <w:rFonts w:ascii="Arial" w:hAnsi="Arial"/>
+                <w:b/>
+                <w:color w:val="1E293B"/>
+                <w:sz w:val="18"/>
+              </w:rPr>
+              <w:t>Năm đầu tiên</w:t>
+            </w:r>
+          </w:p>
+        </w:tc>
+        <w:tc>
+          <w:tcPr>
+            <w:tcW w:type="dxa" w:w="3408"/>
+            <w:tcMar>
+              <w:top w:w="70" w:type="dxa"/>
+              <w:bottom w:w="70" w:type="dxa"/>
+              <w:left w:w="100" w:type="dxa"/>
+              <w:right w:w="100" w:type="dxa"/>
+            </w:tcMar>
+            <w:shd w:fill="FFFFFF"/>
+          </w:tcPr>
+          <w:p>
+            <w:pPr>
+              <w:spacing w:before="0" w:after="0"/>
+            </w:pPr>
+            <w:r>
+              <w:rPr>
+                <w:rFonts w:ascii="Arial" w:hAnsi="Arial"/>
+                <w:b/>
+                <w:color w:val="1E293B"/>
+                <w:sz w:val="18"/>
+              </w:rPr>
+              <w:t>~79.850.000</w:t>
+            </w:r>
+          </w:p>
+        </w:tc>
+        <w:tc>
+          <w:tcPr>
+            <w:tcW w:type="dxa" w:w="3408"/>
+            <w:tcMar>
+              <w:top w:w="70" w:type="dxa"/>
+              <w:bottom w:w="70" w:type="dxa"/>
+              <w:left w:w="100" w:type="dxa"/>
+              <w:right w:w="100" w:type="dxa"/>
+            </w:tcMar>
+            <w:shd w:fill="FFFFFF"/>
+          </w:tcPr>
+          <w:p>
+            <w:pPr>
+              <w:spacing w:before="0" w:after="0"/>
+            </w:pPr>
+            <w:r>
+              <w:rPr>
+                <w:rFonts w:ascii="Arial" w:hAnsi="Arial"/>
+                <w:color w:val="1E293B"/>
+                <w:sz w:val="18"/>
+              </w:rPr>
+              <w:t>Ban đầu + 9 tháng (3 tháng BH miễn phí)</w:t>
+            </w:r>
+          </w:p>
+        </w:tc>
+      </w:tr>
+      <w:tr>
+        <w:tc>
+          <w:tcPr>
+            <w:tcW w:type="dxa" w:w="3408"/>
+            <w:tcMar>
+              <w:top w:w="70" w:type="dxa"/>
+              <w:bottom w:w="70" w:type="dxa"/>
+              <w:left w:w="100" w:type="dxa"/>
+              <w:right w:w="100" w:type="dxa"/>
+            </w:tcMar>
+            <w:shd w:fill="F8FAFC"/>
+          </w:tcPr>
+          <w:p>
+            <w:pPr>
+              <w:spacing w:before="0" w:after="0"/>
+            </w:pPr>
+            <w:r>
+              <w:rPr>
+                <w:rFonts w:ascii="Arial" w:hAnsi="Arial"/>
+                <w:b/>
+                <w:color w:val="1E293B"/>
+                <w:sz w:val="18"/>
+              </w:rPr>
+              <w:t>Mở rộng thêm 1 quán</w:t>
+            </w:r>
+          </w:p>
+        </w:tc>
+        <w:tc>
+          <w:tcPr>
+            <w:tcW w:type="dxa" w:w="3408"/>
+            <w:tcMar>
+              <w:top w:w="70" w:type="dxa"/>
+              <w:bottom w:w="70" w:type="dxa"/>
+              <w:left w:w="100" w:type="dxa"/>
+              <w:right w:w="100" w:type="dxa"/>
+            </w:tcMar>
+            <w:shd w:fill="F8FAFC"/>
+          </w:tcPr>
+          <w:p>
+            <w:pPr>
+              <w:spacing w:before="0" w:after="0"/>
+            </w:pPr>
+            <w:r>
+              <w:rPr>
+                <w:rFonts w:ascii="Arial" w:hAnsi="Arial"/>
+                <w:b/>
+                <w:color w:val="1E293B"/>
+                <w:sz w:val="18"/>
+              </w:rPr>
+              <w:t>+13.890.000</w:t>
+            </w:r>
+          </w:p>
+        </w:tc>
+        <w:tc>
+          <w:tcPr>
+            <w:tcW w:type="dxa" w:w="3408"/>
+            <w:tcMar>
+              <w:top w:w="70" w:type="dxa"/>
+              <w:bottom w:w="70" w:type="dxa"/>
+              <w:left w:w="100" w:type="dxa"/>
+              <w:right w:w="100" w:type="dxa"/>
+            </w:tcMar>
+            <w:shd w:fill="F8FAFC"/>
+          </w:tcPr>
+          <w:p>
+            <w:pPr>
+              <w:spacing w:before="0" w:after="0"/>
+            </w:pPr>
+            <w:r>
+              <w:rPr>
+                <w:rFonts w:ascii="Arial" w:hAnsi="Arial"/>
+                <w:color w:val="1E293B"/>
+                <w:sz w:val="18"/>
+              </w:rPr>
+              <w:t>Chỉ mua thiết bị, phần mềm dùng chung</w:t>
             </w:r>
           </w:p>
         </w:tc>
@@ -7014,6 +8293,21 @@
         <w:t>I. ĐIỀU KHOẢN THANH TOÁN</w:t>
       </w:r>
     </w:p>
+    <w:p>
+      <w:pPr>
+        <w:keepNext/>
+        <w:spacing w:before="200" w:after="80"/>
+      </w:pPr>
+      <w:r>
+        <w:rPr>
+          <w:rFonts w:ascii="Arial" w:hAnsi="Arial"/>
+          <w:b/>
+          <w:color w:val="2563EB"/>
+          <w:sz w:val="22"/>
+        </w:rPr>
+        <w:t>Thanh toán Phương án 1 (1 chi nhánh thí điểm)</w:t>
+      </w:r>
+    </w:p>
     <w:tbl>
       <w:tblPr>
         <w:tblW w:type="auto" w:w="0"/>
@@ -7289,7 +8583,562 @@
                 <w:color w:val="1E293B"/>
                 <w:sz w:val="18"/>
               </w:rPr>
-              <w:t>Bàn giao GĐ 1 + Mua thiết bị</w:t>
+              <w:t>Bàn giao GĐ 1 + Mua thiết bị 1 quán</w:t>
+            </w:r>
+          </w:p>
+        </w:tc>
+        <w:tc>
+          <w:tcPr>
+            <w:tcW w:type="dxa" w:w="2556"/>
+            <w:tcMar>
+              <w:top w:w="70" w:type="dxa"/>
+              <w:bottom w:w="70" w:type="dxa"/>
+              <w:left w:w="100" w:type="dxa"/>
+              <w:right w:w="100" w:type="dxa"/>
+            </w:tcMar>
+            <w:shd w:fill="F8FAFC"/>
+          </w:tcPr>
+          <w:p>
+            <w:pPr>
+              <w:spacing w:before="0" w:after="0"/>
+            </w:pPr>
+            <w:r>
+              <w:rPr>
+                <w:rFonts w:ascii="Arial" w:hAnsi="Arial"/>
+                <w:color w:val="1E293B"/>
+                <w:sz w:val="18"/>
+              </w:rPr>
+              <w:t>12.000.000 + 13.890.000</w:t>
+            </w:r>
+          </w:p>
+        </w:tc>
+        <w:tc>
+          <w:tcPr>
+            <w:tcW w:type="dxa" w:w="2556"/>
+            <w:tcMar>
+              <w:top w:w="70" w:type="dxa"/>
+              <w:bottom w:w="70" w:type="dxa"/>
+              <w:left w:w="100" w:type="dxa"/>
+              <w:right w:w="100" w:type="dxa"/>
+            </w:tcMar>
+            <w:shd w:fill="F8FAFC"/>
+          </w:tcPr>
+          <w:p>
+            <w:pPr>
+              <w:spacing w:before="0" w:after="0"/>
+            </w:pPr>
+            <w:r>
+              <w:rPr>
+                <w:rFonts w:ascii="Arial" w:hAnsi="Arial"/>
+                <w:color w:val="1E293B"/>
+                <w:sz w:val="18"/>
+              </w:rPr>
+              <w:t>Sau 2 tháng</w:t>
+            </w:r>
+          </w:p>
+        </w:tc>
+      </w:tr>
+      <w:tr>
+        <w:tc>
+          <w:tcPr>
+            <w:tcW w:type="dxa" w:w="2556"/>
+            <w:tcMar>
+              <w:top w:w="70" w:type="dxa"/>
+              <w:bottom w:w="70" w:type="dxa"/>
+              <w:left w:w="100" w:type="dxa"/>
+              <w:right w:w="100" w:type="dxa"/>
+            </w:tcMar>
+            <w:shd w:fill="FFFFFF"/>
+          </w:tcPr>
+          <w:p>
+            <w:pPr>
+              <w:spacing w:before="0" w:after="0"/>
+            </w:pPr>
+            <w:r>
+              <w:rPr>
+                <w:rFonts w:ascii="Arial" w:hAnsi="Arial"/>
+                <w:color w:val="1E293B"/>
+                <w:sz w:val="18"/>
+              </w:rPr>
+              <w:t>Đợt 3</w:t>
+            </w:r>
+          </w:p>
+        </w:tc>
+        <w:tc>
+          <w:tcPr>
+            <w:tcW w:type="dxa" w:w="2556"/>
+            <w:tcMar>
+              <w:top w:w="70" w:type="dxa"/>
+              <w:bottom w:w="70" w:type="dxa"/>
+              <w:left w:w="100" w:type="dxa"/>
+              <w:right w:w="100" w:type="dxa"/>
+            </w:tcMar>
+            <w:shd w:fill="FFFFFF"/>
+          </w:tcPr>
+          <w:p>
+            <w:pPr>
+              <w:spacing w:before="0" w:after="0"/>
+            </w:pPr>
+            <w:r>
+              <w:rPr>
+                <w:rFonts w:ascii="Arial" w:hAnsi="Arial"/>
+                <w:color w:val="1E293B"/>
+                <w:sz w:val="18"/>
+              </w:rPr>
+              <w:t>Nghiệm thu + Golive</w:t>
+            </w:r>
+          </w:p>
+        </w:tc>
+        <w:tc>
+          <w:tcPr>
+            <w:tcW w:type="dxa" w:w="2556"/>
+            <w:tcMar>
+              <w:top w:w="70" w:type="dxa"/>
+              <w:bottom w:w="70" w:type="dxa"/>
+              <w:left w:w="100" w:type="dxa"/>
+              <w:right w:w="100" w:type="dxa"/>
+            </w:tcMar>
+            <w:shd w:fill="FFFFFF"/>
+          </w:tcPr>
+          <w:p>
+            <w:pPr>
+              <w:spacing w:before="0" w:after="0"/>
+            </w:pPr>
+            <w:r>
+              <w:rPr>
+                <w:rFonts w:ascii="Arial" w:hAnsi="Arial"/>
+                <w:color w:val="1E293B"/>
+                <w:sz w:val="18"/>
+              </w:rPr>
+              <w:t>8.000.000</w:t>
+            </w:r>
+          </w:p>
+        </w:tc>
+        <w:tc>
+          <w:tcPr>
+            <w:tcW w:type="dxa" w:w="2556"/>
+            <w:tcMar>
+              <w:top w:w="70" w:type="dxa"/>
+              <w:bottom w:w="70" w:type="dxa"/>
+              <w:left w:w="100" w:type="dxa"/>
+              <w:right w:w="100" w:type="dxa"/>
+            </w:tcMar>
+            <w:shd w:fill="FFFFFF"/>
+          </w:tcPr>
+          <w:p>
+            <w:pPr>
+              <w:spacing w:before="0" w:after="0"/>
+            </w:pPr>
+            <w:r>
+              <w:rPr>
+                <w:rFonts w:ascii="Arial" w:hAnsi="Arial"/>
+                <w:color w:val="1E293B"/>
+                <w:sz w:val="18"/>
+              </w:rPr>
+              <w:t>Sau 3-4 tháng</w:t>
+            </w:r>
+          </w:p>
+        </w:tc>
+      </w:tr>
+      <w:tr>
+        <w:tc>
+          <w:tcPr>
+            <w:tcW w:type="dxa" w:w="2556"/>
+            <w:tcMar>
+              <w:top w:w="70" w:type="dxa"/>
+              <w:bottom w:w="70" w:type="dxa"/>
+              <w:left w:w="100" w:type="dxa"/>
+              <w:right w:w="100" w:type="dxa"/>
+            </w:tcMar>
+            <w:shd w:fill="F8FAFC"/>
+          </w:tcPr>
+          <w:p>
+            <w:pPr>
+              <w:spacing w:before="0" w:after="0"/>
+            </w:pPr>
+            <w:r>
+              <w:rPr>
+                <w:rFonts w:ascii="Arial" w:hAnsi="Arial"/>
+                <w:color w:val="1E293B"/>
+                <w:sz w:val="18"/>
+              </w:rPr>
+              <w:t>Hàng tháng</w:t>
+            </w:r>
+          </w:p>
+        </w:tc>
+        <w:tc>
+          <w:tcPr>
+            <w:tcW w:type="dxa" w:w="2556"/>
+            <w:tcMar>
+              <w:top w:w="70" w:type="dxa"/>
+              <w:bottom w:w="70" w:type="dxa"/>
+              <w:left w:w="100" w:type="dxa"/>
+              <w:right w:w="100" w:type="dxa"/>
+            </w:tcMar>
+            <w:shd w:fill="F8FAFC"/>
+          </w:tcPr>
+          <w:p>
+            <w:pPr>
+              <w:spacing w:before="0" w:after="0"/>
+            </w:pPr>
+            <w:r>
+              <w:rPr>
+                <w:rFonts w:ascii="Arial" w:hAnsi="Arial"/>
+                <w:color w:val="1E293B"/>
+                <w:sz w:val="18"/>
+              </w:rPr>
+              <w:t>Vận hành + Bảo trì (sau 3 tháng BH miễn phí)</w:t>
+            </w:r>
+          </w:p>
+        </w:tc>
+        <w:tc>
+          <w:tcPr>
+            <w:tcW w:type="dxa" w:w="2556"/>
+            <w:tcMar>
+              <w:top w:w="70" w:type="dxa"/>
+              <w:bottom w:w="70" w:type="dxa"/>
+              <w:left w:w="100" w:type="dxa"/>
+              <w:right w:w="100" w:type="dxa"/>
+            </w:tcMar>
+            <w:shd w:fill="F8FAFC"/>
+          </w:tcPr>
+          <w:p>
+            <w:pPr>
+              <w:spacing w:before="0" w:after="0"/>
+            </w:pPr>
+            <w:r>
+              <w:rPr>
+                <w:rFonts w:ascii="Arial" w:hAnsi="Arial"/>
+                <w:color w:val="1E293B"/>
+                <w:sz w:val="18"/>
+              </w:rPr>
+              <w:t>3.440.000</w:t>
+            </w:r>
+          </w:p>
+        </w:tc>
+        <w:tc>
+          <w:tcPr>
+            <w:tcW w:type="dxa" w:w="2556"/>
+            <w:tcMar>
+              <w:top w:w="70" w:type="dxa"/>
+              <w:bottom w:w="70" w:type="dxa"/>
+              <w:left w:w="100" w:type="dxa"/>
+              <w:right w:w="100" w:type="dxa"/>
+            </w:tcMar>
+            <w:shd w:fill="F8FAFC"/>
+          </w:tcPr>
+          <w:p>
+            <w:pPr>
+              <w:spacing w:before="0" w:after="0"/>
+            </w:pPr>
+            <w:r>
+              <w:rPr>
+                <w:rFonts w:ascii="Arial" w:hAnsi="Arial"/>
+                <w:color w:val="1E293B"/>
+                <w:sz w:val="18"/>
+              </w:rPr>
+              <w:t>Từ tháng thứ 7</w:t>
+            </w:r>
+          </w:p>
+        </w:tc>
+      </w:tr>
+    </w:tbl>
+    <w:p>
+      <w:pPr>
+        <w:spacing w:after="40"/>
+      </w:pPr>
+    </w:p>
+    <w:p>
+      <w:pPr>
+        <w:keepNext/>
+        <w:spacing w:before="200" w:after="80"/>
+      </w:pPr>
+      <w:r>
+        <w:rPr>
+          <w:rFonts w:ascii="Arial" w:hAnsi="Arial"/>
+          <w:b/>
+          <w:color w:val="2563EB"/>
+          <w:sz w:val="22"/>
+        </w:rPr>
+        <w:t>Thanh toán Phương án 2 (3 chi nhánh đồng loạt)</w:t>
+      </w:r>
+    </w:p>
+    <w:tbl>
+      <w:tblPr>
+        <w:tblW w:type="auto" w:w="0"/>
+        <w:jc w:val="center"/>
+        <w:tblLook w:firstColumn="1" w:firstRow="1" w:lastColumn="0" w:lastRow="0" w:noHBand="0" w:noVBand="1" w:val="04A0"/>
+        <w:tblBorders>
+          <w:top w:val="single" w:sz="6" w:space="0" w:color="CBD5E1"/>
+          <w:bottom w:val="single" w:sz="6" w:space="0" w:color="CBD5E1"/>
+          <w:left w:val="single" w:sz="6" w:space="0" w:color="CBD5E1"/>
+          <w:right w:val="single" w:sz="6" w:space="0" w:color="CBD5E1"/>
+          <w:insideH w:val="single" w:sz="4" w:space="0" w:color="E2E8F0"/>
+          <w:insideV w:val="single" w:sz="4" w:space="0" w:color="E2E8F0"/>
+        </w:tblBorders>
+      </w:tblPr>
+      <w:tblGrid>
+        <w:gridCol w:w="2556"/>
+        <w:gridCol w:w="2556"/>
+        <w:gridCol w:w="2556"/>
+        <w:gridCol w:w="2556"/>
+      </w:tblGrid>
+      <w:tr>
+        <w:tc>
+          <w:tcPr>
+            <w:tcW w:type="dxa" w:w="2556"/>
+            <w:tcMar>
+              <w:top w:w="70" w:type="dxa"/>
+              <w:bottom w:w="70" w:type="dxa"/>
+              <w:left w:w="100" w:type="dxa"/>
+              <w:right w:w="100" w:type="dxa"/>
+            </w:tcMar>
+            <w:shd w:fill="0F172A"/>
+          </w:tcPr>
+          <w:p>
+            <w:pPr>
+              <w:spacing w:before="0" w:after="0"/>
+            </w:pPr>
+            <w:r>
+              <w:rPr>
+                <w:rFonts w:ascii="Arial" w:hAnsi="Arial"/>
+                <w:b/>
+                <w:color w:val="FFFFFF"/>
+                <w:sz w:val="18"/>
+              </w:rPr>
+              <w:t>Đợt</w:t>
+            </w:r>
+          </w:p>
+        </w:tc>
+        <w:tc>
+          <w:tcPr>
+            <w:tcW w:type="dxa" w:w="2556"/>
+            <w:tcMar>
+              <w:top w:w="70" w:type="dxa"/>
+              <w:bottom w:w="70" w:type="dxa"/>
+              <w:left w:w="100" w:type="dxa"/>
+              <w:right w:w="100" w:type="dxa"/>
+            </w:tcMar>
+            <w:shd w:fill="0F172A"/>
+          </w:tcPr>
+          <w:p>
+            <w:pPr>
+              <w:spacing w:before="0" w:after="0"/>
+            </w:pPr>
+            <w:r>
+              <w:rPr>
+                <w:rFonts w:ascii="Arial" w:hAnsi="Arial"/>
+                <w:b/>
+                <w:color w:val="FFFFFF"/>
+                <w:sz w:val="18"/>
+              </w:rPr>
+              <w:t>Nội dung</w:t>
+            </w:r>
+          </w:p>
+        </w:tc>
+        <w:tc>
+          <w:tcPr>
+            <w:tcW w:type="dxa" w:w="2556"/>
+            <w:tcMar>
+              <w:top w:w="70" w:type="dxa"/>
+              <w:bottom w:w="70" w:type="dxa"/>
+              <w:left w:w="100" w:type="dxa"/>
+              <w:right w:w="100" w:type="dxa"/>
+            </w:tcMar>
+            <w:shd w:fill="0F172A"/>
+          </w:tcPr>
+          <w:p>
+            <w:pPr>
+              <w:spacing w:before="0" w:after="0"/>
+            </w:pPr>
+            <w:r>
+              <w:rPr>
+                <w:rFonts w:ascii="Arial" w:hAnsi="Arial"/>
+                <w:b/>
+                <w:color w:val="FFFFFF"/>
+                <w:sz w:val="18"/>
+              </w:rPr>
+              <w:t>Số tiền</w:t>
+            </w:r>
+          </w:p>
+        </w:tc>
+        <w:tc>
+          <w:tcPr>
+            <w:tcW w:type="dxa" w:w="2556"/>
+            <w:tcMar>
+              <w:top w:w="70" w:type="dxa"/>
+              <w:bottom w:w="70" w:type="dxa"/>
+              <w:left w:w="100" w:type="dxa"/>
+              <w:right w:w="100" w:type="dxa"/>
+            </w:tcMar>
+            <w:shd w:fill="0F172A"/>
+          </w:tcPr>
+          <w:p>
+            <w:pPr>
+              <w:spacing w:before="0" w:after="0"/>
+            </w:pPr>
+            <w:r>
+              <w:rPr>
+                <w:rFonts w:ascii="Arial" w:hAnsi="Arial"/>
+                <w:b/>
+                <w:color w:val="FFFFFF"/>
+                <w:sz w:val="18"/>
+              </w:rPr>
+              <w:t>Thời điểm</w:t>
+            </w:r>
+          </w:p>
+        </w:tc>
+      </w:tr>
+      <w:tr>
+        <w:tc>
+          <w:tcPr>
+            <w:tcW w:type="dxa" w:w="2556"/>
+            <w:tcMar>
+              <w:top w:w="70" w:type="dxa"/>
+              <w:bottom w:w="70" w:type="dxa"/>
+              <w:left w:w="100" w:type="dxa"/>
+              <w:right w:w="100" w:type="dxa"/>
+            </w:tcMar>
+            <w:shd w:fill="FFFFFF"/>
+          </w:tcPr>
+          <w:p>
+            <w:pPr>
+              <w:spacing w:before="0" w:after="0"/>
+            </w:pPr>
+            <w:r>
+              <w:rPr>
+                <w:rFonts w:ascii="Arial" w:hAnsi="Arial"/>
+                <w:color w:val="1E293B"/>
+                <w:sz w:val="18"/>
+              </w:rPr>
+              <w:t>Đợt 1</w:t>
+            </w:r>
+          </w:p>
+        </w:tc>
+        <w:tc>
+          <w:tcPr>
+            <w:tcW w:type="dxa" w:w="2556"/>
+            <w:tcMar>
+              <w:top w:w="70" w:type="dxa"/>
+              <w:bottom w:w="70" w:type="dxa"/>
+              <w:left w:w="100" w:type="dxa"/>
+              <w:right w:w="100" w:type="dxa"/>
+            </w:tcMar>
+            <w:shd w:fill="FFFFFF"/>
+          </w:tcPr>
+          <w:p>
+            <w:pPr>
+              <w:spacing w:before="0" w:after="0"/>
+            </w:pPr>
+            <w:r>
+              <w:rPr>
+                <w:rFonts w:ascii="Arial" w:hAnsi="Arial"/>
+                <w:color w:val="1E293B"/>
+                <w:sz w:val="18"/>
+              </w:rPr>
+              <w:t>Ký hợp đồng + Khởi động phát triển</w:t>
+            </w:r>
+          </w:p>
+        </w:tc>
+        <w:tc>
+          <w:tcPr>
+            <w:tcW w:type="dxa" w:w="2556"/>
+            <w:tcMar>
+              <w:top w:w="70" w:type="dxa"/>
+              <w:bottom w:w="70" w:type="dxa"/>
+              <w:left w:w="100" w:type="dxa"/>
+              <w:right w:w="100" w:type="dxa"/>
+            </w:tcMar>
+            <w:shd w:fill="FFFFFF"/>
+          </w:tcPr>
+          <w:p>
+            <w:pPr>
+              <w:spacing w:before="0" w:after="0"/>
+            </w:pPr>
+            <w:r>
+              <w:rPr>
+                <w:rFonts w:ascii="Arial" w:hAnsi="Arial"/>
+                <w:color w:val="1E293B"/>
+                <w:sz w:val="18"/>
+              </w:rPr>
+              <w:t>15.000.000</w:t>
+            </w:r>
+          </w:p>
+        </w:tc>
+        <w:tc>
+          <w:tcPr>
+            <w:tcW w:type="dxa" w:w="2556"/>
+            <w:tcMar>
+              <w:top w:w="70" w:type="dxa"/>
+              <w:bottom w:w="70" w:type="dxa"/>
+              <w:left w:w="100" w:type="dxa"/>
+              <w:right w:w="100" w:type="dxa"/>
+            </w:tcMar>
+            <w:shd w:fill="FFFFFF"/>
+          </w:tcPr>
+          <w:p>
+            <w:pPr>
+              <w:spacing w:before="0" w:after="0"/>
+            </w:pPr>
+            <w:r>
+              <w:rPr>
+                <w:rFonts w:ascii="Arial" w:hAnsi="Arial"/>
+                <w:color w:val="1E293B"/>
+                <w:sz w:val="18"/>
+              </w:rPr>
+              <w:t>Ngày ký</w:t>
+            </w:r>
+          </w:p>
+        </w:tc>
+      </w:tr>
+      <w:tr>
+        <w:tc>
+          <w:tcPr>
+            <w:tcW w:type="dxa" w:w="2556"/>
+            <w:tcMar>
+              <w:top w:w="70" w:type="dxa"/>
+              <w:bottom w:w="70" w:type="dxa"/>
+              <w:left w:w="100" w:type="dxa"/>
+              <w:right w:w="100" w:type="dxa"/>
+            </w:tcMar>
+            <w:shd w:fill="F8FAFC"/>
+          </w:tcPr>
+          <w:p>
+            <w:pPr>
+              <w:spacing w:before="0" w:after="0"/>
+            </w:pPr>
+            <w:r>
+              <w:rPr>
+                <w:rFonts w:ascii="Arial" w:hAnsi="Arial"/>
+                <w:color w:val="1E293B"/>
+                <w:sz w:val="18"/>
+              </w:rPr>
+              <w:t>Đợt 2</w:t>
+            </w:r>
+          </w:p>
+        </w:tc>
+        <w:tc>
+          <w:tcPr>
+            <w:tcW w:type="dxa" w:w="2556"/>
+            <w:tcMar>
+              <w:top w:w="70" w:type="dxa"/>
+              <w:bottom w:w="70" w:type="dxa"/>
+              <w:left w:w="100" w:type="dxa"/>
+              <w:right w:w="100" w:type="dxa"/>
+            </w:tcMar>
+            <w:shd w:fill="F8FAFC"/>
+          </w:tcPr>
+          <w:p>
+            <w:pPr>
+              <w:spacing w:before="0" w:after="0"/>
+            </w:pPr>
+            <w:r>
+              <w:rPr>
+                <w:rFonts w:ascii="Arial" w:hAnsi="Arial"/>
+                <w:color w:val="1E293B"/>
+                <w:sz w:val="18"/>
+              </w:rPr>
+              <w:t>Bàn giao GĐ 1 + Mua thiết bị 3 quán</w:t>
             </w:r>
           </w:p>
         </w:tc>

</xml_diff>

<commit_message>
docs: update quotation - dev 15M, POS reuse saves 27M (optional), Router 4G moved to negotiable section, updated all totals
</commit_message>
<xml_diff>
--- a/BaoGia_KhachHang.docx
+++ b/BaoGia_KhachHang.docx
@@ -745,7 +745,7 @@
                 <w:color w:val="1E293B"/>
                 <w:sz w:val="18"/>
               </w:rPr>
-              <w:t>35.000.000</w:t>
+              <w:t>15.000.000</w:t>
             </w:r>
           </w:p>
         </w:tc>
@@ -942,7 +942,7 @@
                 <w:color w:val="1E293B"/>
                 <w:sz w:val="18"/>
               </w:rPr>
-              <w:t>15.000.000</w:t>
+              <w:t>7.000.000</w:t>
             </w:r>
           </w:p>
         </w:tc>
@@ -1019,7 +1019,7 @@
                 <w:color w:val="1E293B"/>
                 <w:sz w:val="18"/>
               </w:rPr>
-              <w:t>12.000.000</w:t>
+              <w:t>5.000.000</w:t>
             </w:r>
           </w:p>
         </w:tc>
@@ -1096,7 +1096,7 @@
                 <w:color w:val="1E293B"/>
                 <w:sz w:val="18"/>
               </w:rPr>
-              <w:t>8.000.000</w:t>
+              <w:t>3.000.000</w:t>
             </w:r>
           </w:p>
         </w:tc>
@@ -1960,7 +1960,7 @@
                 <w:color w:val="1E293B"/>
                 <w:sz w:val="18"/>
               </w:rPr>
-              <w:t>Router WiFi + 4G Backup</w:t>
+              <w:t>Lắp đặt, cấu hình &amp; chạy thử</w:t>
             </w:r>
           </w:p>
         </w:tc>
@@ -1985,7 +1985,7 @@
                 <w:color w:val="1E293B"/>
                 <w:sz w:val="18"/>
               </w:rPr>
-              <w:t>1.200.000</w:t>
+              <w:t>1.000.000</w:t>
             </w:r>
           </w:p>
         </w:tc>
@@ -2035,7 +2035,7 @@
                 <w:color w:val="1E293B"/>
                 <w:sz w:val="18"/>
               </w:rPr>
-              <w:t>3.600.000</w:t>
+              <w:t>3.000.000</w:t>
             </w:r>
           </w:p>
         </w:tc>
@@ -2060,7 +2060,7 @@
                 <w:color w:val="1E293B"/>
                 <w:sz w:val="18"/>
               </w:rPr>
-              <w:t>Tự chuyển sang 4G khi WiFi chết</w:t>
+              <w:t>Trọn gói 3 chi nhánh</w:t>
             </w:r>
           </w:p>
         </w:tc>
@@ -2081,14 +2081,6 @@
             <w:pPr>
               <w:spacing w:before="0" w:after="0"/>
             </w:pPr>
-            <w:r>
-              <w:rPr>
-                <w:rFonts w:ascii="Arial" w:hAnsi="Arial"/>
-                <w:color w:val="1E293B"/>
-                <w:sz w:val="18"/>
-              </w:rPr>
-              <w:t>6</w:t>
-            </w:r>
           </w:p>
         </w:tc>
         <w:tc>
@@ -2106,14 +2098,6 @@
             <w:pPr>
               <w:spacing w:before="0" w:after="0"/>
             </w:pPr>
-            <w:r>
-              <w:rPr>
-                <w:rFonts w:ascii="Arial" w:hAnsi="Arial"/>
-                <w:color w:val="1E293B"/>
-                <w:sz w:val="18"/>
-              </w:rPr>
-              <w:t>Lắp đặt, cấu hình &amp; chạy thử</w:t>
-            </w:r>
           </w:p>
         </w:tc>
         <w:tc>
@@ -2131,14 +2115,6 @@
             <w:pPr>
               <w:spacing w:before="0" w:after="0"/>
             </w:pPr>
-            <w:r>
-              <w:rPr>
-                <w:rFonts w:ascii="Arial" w:hAnsi="Arial"/>
-                <w:color w:val="1E293B"/>
-                <w:sz w:val="18"/>
-              </w:rPr>
-              <w:t>1.000.000</w:t>
-            </w:r>
           </w:p>
         </w:tc>
         <w:tc>
@@ -2156,14 +2132,6 @@
             <w:pPr>
               <w:spacing w:before="0" w:after="0"/>
             </w:pPr>
-            <w:r>
-              <w:rPr>
-                <w:rFonts w:ascii="Arial" w:hAnsi="Arial"/>
-                <w:color w:val="1E293B"/>
-                <w:sz w:val="18"/>
-              </w:rPr>
-              <w:t>3</w:t>
-            </w:r>
           </w:p>
         </w:tc>
         <w:tc>
@@ -2181,14 +2149,6 @@
             <w:pPr>
               <w:spacing w:before="0" w:after="0"/>
             </w:pPr>
-            <w:r>
-              <w:rPr>
-                <w:rFonts w:ascii="Arial" w:hAnsi="Arial"/>
-                <w:color w:val="1E293B"/>
-                <w:sz w:val="18"/>
-              </w:rPr>
-              <w:t>3.000.000</w:t>
-            </w:r>
           </w:p>
         </w:tc>
         <w:tc>
@@ -2206,14 +2166,6 @@
             <w:pPr>
               <w:spacing w:before="0" w:after="0"/>
             </w:pPr>
-            <w:r>
-              <w:rPr>
-                <w:rFonts w:ascii="Arial" w:hAnsi="Arial"/>
-                <w:color w:val="1E293B"/>
-                <w:sz w:val="18"/>
-              </w:rPr>
-              <w:t>Trọn gói 3 chi nhánh</w:t>
-            </w:r>
           </w:p>
         </w:tc>
       </w:tr>
@@ -2245,110 +2197,6 @@
               <w:right w:w="100" w:type="dxa"/>
             </w:tcMar>
             <w:shd w:fill="FFFFFF"/>
-          </w:tcPr>
-          <w:p>
-            <w:pPr>
-              <w:spacing w:before="0" w:after="0"/>
-            </w:pPr>
-          </w:p>
-        </w:tc>
-        <w:tc>
-          <w:tcPr>
-            <w:tcW w:type="dxa" w:w="1704"/>
-            <w:tcMar>
-              <w:top w:w="70" w:type="dxa"/>
-              <w:bottom w:w="70" w:type="dxa"/>
-              <w:left w:w="100" w:type="dxa"/>
-              <w:right w:w="100" w:type="dxa"/>
-            </w:tcMar>
-            <w:shd w:fill="FFFFFF"/>
-          </w:tcPr>
-          <w:p>
-            <w:pPr>
-              <w:spacing w:before="0" w:after="0"/>
-            </w:pPr>
-          </w:p>
-        </w:tc>
-        <w:tc>
-          <w:tcPr>
-            <w:tcW w:type="dxa" w:w="1704"/>
-            <w:tcMar>
-              <w:top w:w="70" w:type="dxa"/>
-              <w:bottom w:w="70" w:type="dxa"/>
-              <w:left w:w="100" w:type="dxa"/>
-              <w:right w:w="100" w:type="dxa"/>
-            </w:tcMar>
-            <w:shd w:fill="FFFFFF"/>
-          </w:tcPr>
-          <w:p>
-            <w:pPr>
-              <w:spacing w:before="0" w:after="0"/>
-            </w:pPr>
-          </w:p>
-        </w:tc>
-        <w:tc>
-          <w:tcPr>
-            <w:tcW w:type="dxa" w:w="1704"/>
-            <w:tcMar>
-              <w:top w:w="70" w:type="dxa"/>
-              <w:bottom w:w="70" w:type="dxa"/>
-              <w:left w:w="100" w:type="dxa"/>
-              <w:right w:w="100" w:type="dxa"/>
-            </w:tcMar>
-            <w:shd w:fill="FFFFFF"/>
-          </w:tcPr>
-          <w:p>
-            <w:pPr>
-              <w:spacing w:before="0" w:after="0"/>
-            </w:pPr>
-          </w:p>
-        </w:tc>
-        <w:tc>
-          <w:tcPr>
-            <w:tcW w:type="dxa" w:w="1704"/>
-            <w:tcMar>
-              <w:top w:w="70" w:type="dxa"/>
-              <w:bottom w:w="70" w:type="dxa"/>
-              <w:left w:w="100" w:type="dxa"/>
-              <w:right w:w="100" w:type="dxa"/>
-            </w:tcMar>
-            <w:shd w:fill="FFFFFF"/>
-          </w:tcPr>
-          <w:p>
-            <w:pPr>
-              <w:spacing w:before="0" w:after="0"/>
-            </w:pPr>
-          </w:p>
-        </w:tc>
-      </w:tr>
-      <w:tr>
-        <w:tc>
-          <w:tcPr>
-            <w:tcW w:type="dxa" w:w="1704"/>
-            <w:tcMar>
-              <w:top w:w="70" w:type="dxa"/>
-              <w:bottom w:w="70" w:type="dxa"/>
-              <w:left w:w="100" w:type="dxa"/>
-              <w:right w:w="100" w:type="dxa"/>
-            </w:tcMar>
-            <w:shd w:fill="F8FAFC"/>
-          </w:tcPr>
-          <w:p>
-            <w:pPr>
-              <w:spacing w:before="0" w:after="0"/>
-            </w:pPr>
-          </w:p>
-        </w:tc>
-        <w:tc>
-          <w:tcPr>
-            <w:tcW w:type="dxa" w:w="1704"/>
-            <w:tcMar>
-              <w:top w:w="70" w:type="dxa"/>
-              <w:bottom w:w="70" w:type="dxa"/>
-              <w:left w:w="100" w:type="dxa"/>
-              <w:right w:w="100" w:type="dxa"/>
-            </w:tcMar>
-            <w:shd w:fill="F8FAFC"/>
           </w:tcPr>
           <w:p>
             <w:pPr>
@@ -2374,7 +2222,7 @@
               <w:left w:w="100" w:type="dxa"/>
               <w:right w:w="100" w:type="dxa"/>
             </w:tcMar>
-            <w:shd w:fill="F8FAFC"/>
+            <w:shd w:fill="FFFFFF"/>
           </w:tcPr>
           <w:p>
             <w:pPr>
@@ -2391,7 +2239,7 @@
               <w:left w:w="100" w:type="dxa"/>
               <w:right w:w="100" w:type="dxa"/>
             </w:tcMar>
-            <w:shd w:fill="F8FAFC"/>
+            <w:shd w:fill="FFFFFF"/>
           </w:tcPr>
           <w:p>
             <w:pPr>
@@ -2408,7 +2256,7 @@
               <w:left w:w="100" w:type="dxa"/>
               <w:right w:w="100" w:type="dxa"/>
             </w:tcMar>
-            <w:shd w:fill="F8FAFC"/>
+            <w:shd w:fill="FFFFFF"/>
           </w:tcPr>
           <w:p>
             <w:pPr>
@@ -2421,7 +2269,7 @@
                 <w:color w:val="1E293B"/>
                 <w:sz w:val="18"/>
               </w:rPr>
-              <w:t>41.490.000</w:t>
+              <w:t>37.890.000</w:t>
             </w:r>
           </w:p>
         </w:tc>
@@ -2434,7 +2282,7 @@
               <w:left w:w="100" w:type="dxa"/>
               <w:right w:w="100" w:type="dxa"/>
             </w:tcMar>
-            <w:shd w:fill="F8FAFC"/>
+            <w:shd w:fill="FFFFFF"/>
           </w:tcPr>
           <w:p>
             <w:pPr>
@@ -2453,7 +2301,7 @@
               <w:left w:w="100" w:type="dxa"/>
               <w:right w:w="100" w:type="dxa"/>
             </w:tcMar>
-            <w:shd w:fill="FFFFFF"/>
+            <w:shd w:fill="F8FAFC"/>
           </w:tcPr>
           <w:p>
             <w:pPr>
@@ -2470,21 +2318,20 @@
               <w:left w:w="100" w:type="dxa"/>
               <w:right w:w="100" w:type="dxa"/>
             </w:tcMar>
-            <w:shd w:fill="FFFFFF"/>
-          </w:tcPr>
-          <w:p>
-            <w:pPr>
-              <w:spacing w:before="0" w:after="0"/>
-            </w:pPr>
-            <w:r>
-              <w:rPr>
-                <w:rFonts w:ascii="Arial" w:hAnsi="Arial"/>
-                <w:b/>
+            <w:shd w:fill="F8FAFC"/>
+          </w:tcPr>
+          <w:p>
+            <w:pPr>
+              <w:spacing w:before="0" w:after="0"/>
+            </w:pPr>
+            <w:r>
+              <w:rPr>
+                <w:rFonts w:ascii="Arial" w:hAnsi="Arial"/>
                 <w:i/>
                 <w:color w:val="1E293B"/>
                 <w:sz w:val="18"/>
               </w:rPr>
-              <w:t>Nếu dùng lại máy in cũ</w:t>
+              <w:t>Dùng lại máy POS cũ</w:t>
             </w:r>
           </w:p>
         </w:tc>
@@ -2497,7 +2344,7 @@
               <w:left w:w="100" w:type="dxa"/>
               <w:right w:w="100" w:type="dxa"/>
             </w:tcMar>
-            <w:shd w:fill="FFFFFF"/>
+            <w:shd w:fill="F8FAFC"/>
           </w:tcPr>
           <w:p>
             <w:pPr>
@@ -2514,7 +2361,7 @@
               <w:left w:w="100" w:type="dxa"/>
               <w:right w:w="100" w:type="dxa"/>
             </w:tcMar>
-            <w:shd w:fill="FFFFFF"/>
+            <w:shd w:fill="F8FAFC"/>
           </w:tcPr>
           <w:p>
             <w:pPr>
@@ -2531,7 +2378,7 @@
               <w:left w:w="100" w:type="dxa"/>
               <w:right w:w="100" w:type="dxa"/>
             </w:tcMar>
-            <w:shd w:fill="FFFFFF"/>
+            <w:shd w:fill="F8FAFC"/>
           </w:tcPr>
           <w:p>
             <w:pPr>
@@ -2544,7 +2391,7 @@
                 <w:color w:val="1E293B"/>
                 <w:sz w:val="18"/>
               </w:rPr>
-              <w:t>35.490.000</w:t>
+              <w:t>10.890.000</w:t>
             </w:r>
           </w:p>
         </w:tc>
@@ -2557,7 +2404,7 @@
               <w:left w:w="100" w:type="dxa"/>
               <w:right w:w="100" w:type="dxa"/>
             </w:tcMar>
-            <w:shd w:fill="FFFFFF"/>
+            <w:shd w:fill="F8FAFC"/>
           </w:tcPr>
           <w:p>
             <w:pPr>
@@ -2570,7 +2417,635 @@
                 <w:color w:val="1E293B"/>
                 <w:sz w:val="18"/>
               </w:rPr>
-              <w:t>Tiết kiệm 6 triệu</w:t>
+              <w:t>Tiết kiệm 27 triệu</w:t>
+            </w:r>
+          </w:p>
+        </w:tc>
+      </w:tr>
+      <w:tr>
+        <w:tc>
+          <w:tcPr>
+            <w:tcW w:type="dxa" w:w="1704"/>
+            <w:tcMar>
+              <w:top w:w="70" w:type="dxa"/>
+              <w:bottom w:w="70" w:type="dxa"/>
+              <w:left w:w="100" w:type="dxa"/>
+              <w:right w:w="100" w:type="dxa"/>
+            </w:tcMar>
+            <w:shd w:fill="FFFFFF"/>
+          </w:tcPr>
+          <w:p>
+            <w:pPr>
+              <w:spacing w:before="0" w:after="0"/>
+            </w:pPr>
+          </w:p>
+        </w:tc>
+        <w:tc>
+          <w:tcPr>
+            <w:tcW w:type="dxa" w:w="1704"/>
+            <w:tcMar>
+              <w:top w:w="70" w:type="dxa"/>
+              <w:bottom w:w="70" w:type="dxa"/>
+              <w:left w:w="100" w:type="dxa"/>
+              <w:right w:w="100" w:type="dxa"/>
+            </w:tcMar>
+            <w:shd w:fill="FFFFFF"/>
+          </w:tcPr>
+          <w:p>
+            <w:pPr>
+              <w:spacing w:before="0" w:after="0"/>
+            </w:pPr>
+            <w:r>
+              <w:rPr>
+                <w:rFonts w:ascii="Arial" w:hAnsi="Arial"/>
+                <w:i/>
+                <w:color w:val="1E293B"/>
+                <w:sz w:val="18"/>
+              </w:rPr>
+              <w:t>Dùng lại cả máy in cũ</w:t>
+            </w:r>
+          </w:p>
+        </w:tc>
+        <w:tc>
+          <w:tcPr>
+            <w:tcW w:type="dxa" w:w="1704"/>
+            <w:tcMar>
+              <w:top w:w="70" w:type="dxa"/>
+              <w:bottom w:w="70" w:type="dxa"/>
+              <w:left w:w="100" w:type="dxa"/>
+              <w:right w:w="100" w:type="dxa"/>
+            </w:tcMar>
+            <w:shd w:fill="FFFFFF"/>
+          </w:tcPr>
+          <w:p>
+            <w:pPr>
+              <w:spacing w:before="0" w:after="0"/>
+            </w:pPr>
+          </w:p>
+        </w:tc>
+        <w:tc>
+          <w:tcPr>
+            <w:tcW w:type="dxa" w:w="1704"/>
+            <w:tcMar>
+              <w:top w:w="70" w:type="dxa"/>
+              <w:bottom w:w="70" w:type="dxa"/>
+              <w:left w:w="100" w:type="dxa"/>
+              <w:right w:w="100" w:type="dxa"/>
+            </w:tcMar>
+            <w:shd w:fill="FFFFFF"/>
+          </w:tcPr>
+          <w:p>
+            <w:pPr>
+              <w:spacing w:before="0" w:after="0"/>
+            </w:pPr>
+          </w:p>
+        </w:tc>
+        <w:tc>
+          <w:tcPr>
+            <w:tcW w:type="dxa" w:w="1704"/>
+            <w:tcMar>
+              <w:top w:w="70" w:type="dxa"/>
+              <w:bottom w:w="70" w:type="dxa"/>
+              <w:left w:w="100" w:type="dxa"/>
+              <w:right w:w="100" w:type="dxa"/>
+            </w:tcMar>
+            <w:shd w:fill="FFFFFF"/>
+          </w:tcPr>
+          <w:p>
+            <w:pPr>
+              <w:spacing w:before="0" w:after="0"/>
+            </w:pPr>
+            <w:r>
+              <w:rPr>
+                <w:rFonts w:ascii="Arial" w:hAnsi="Arial"/>
+                <w:i/>
+                <w:color w:val="1E293B"/>
+                <w:sz w:val="18"/>
+              </w:rPr>
+              <w:t>4.890.000</w:t>
+            </w:r>
+          </w:p>
+        </w:tc>
+        <w:tc>
+          <w:tcPr>
+            <w:tcW w:type="dxa" w:w="1704"/>
+            <w:tcMar>
+              <w:top w:w="70" w:type="dxa"/>
+              <w:bottom w:w="70" w:type="dxa"/>
+              <w:left w:w="100" w:type="dxa"/>
+              <w:right w:w="100" w:type="dxa"/>
+            </w:tcMar>
+            <w:shd w:fill="FFFFFF"/>
+          </w:tcPr>
+          <w:p>
+            <w:pPr>
+              <w:spacing w:before="0" w:after="0"/>
+            </w:pPr>
+            <w:r>
+              <w:rPr>
+                <w:rFonts w:ascii="Arial" w:hAnsi="Arial"/>
+                <w:i/>
+                <w:color w:val="1E293B"/>
+                <w:sz w:val="18"/>
+              </w:rPr>
+              <w:t>Tiết kiệm thêm 6 triệu</w:t>
+            </w:r>
+          </w:p>
+        </w:tc>
+      </w:tr>
+    </w:tbl>
+    <w:p>
+      <w:pPr>
+        <w:spacing w:after="40"/>
+      </w:pPr>
+    </w:p>
+    <w:p>
+      <w:pPr>
+        <w:keepNext/>
+        <w:spacing w:before="200" w:after="80"/>
+      </w:pPr>
+      <w:r>
+        <w:rPr>
+          <w:rFonts w:ascii="Arial" w:hAnsi="Arial"/>
+          <w:b/>
+          <w:color w:val="2563EB"/>
+          <w:sz w:val="22"/>
+        </w:rPr>
+        <w:t>Thiết bị tùy chọn (Thương lượng — có thể cắt giảm)</w:t>
+      </w:r>
+    </w:p>
+    <w:tbl>
+      <w:tblPr>
+        <w:tblW w:type="auto" w:w="0"/>
+        <w:jc w:val="center"/>
+        <w:tblLook w:firstColumn="1" w:firstRow="1" w:lastColumn="0" w:lastRow="0" w:noHBand="0" w:noVBand="1" w:val="04A0"/>
+        <w:tblBorders>
+          <w:top w:val="single" w:sz="6" w:space="0" w:color="CBD5E1"/>
+          <w:bottom w:val="single" w:sz="6" w:space="0" w:color="CBD5E1"/>
+          <w:left w:val="single" w:sz="6" w:space="0" w:color="CBD5E1"/>
+          <w:right w:val="single" w:sz="6" w:space="0" w:color="CBD5E1"/>
+          <w:insideH w:val="single" w:sz="4" w:space="0" w:color="E2E8F0"/>
+          <w:insideV w:val="single" w:sz="4" w:space="0" w:color="E2E8F0"/>
+        </w:tblBorders>
+      </w:tblPr>
+      <w:tblGrid>
+        <w:gridCol w:w="1704"/>
+        <w:gridCol w:w="1704"/>
+        <w:gridCol w:w="1704"/>
+        <w:gridCol w:w="1704"/>
+        <w:gridCol w:w="1704"/>
+        <w:gridCol w:w="1704"/>
+      </w:tblGrid>
+      <w:tr>
+        <w:tc>
+          <w:tcPr>
+            <w:tcW w:type="dxa" w:w="1704"/>
+            <w:tcMar>
+              <w:top w:w="70" w:type="dxa"/>
+              <w:bottom w:w="70" w:type="dxa"/>
+              <w:left w:w="100" w:type="dxa"/>
+              <w:right w:w="100" w:type="dxa"/>
+            </w:tcMar>
+            <w:shd w:fill="0F172A"/>
+          </w:tcPr>
+          <w:p>
+            <w:pPr>
+              <w:spacing w:before="0" w:after="0"/>
+            </w:pPr>
+            <w:r>
+              <w:rPr>
+                <w:rFonts w:ascii="Arial" w:hAnsi="Arial"/>
+                <w:b/>
+                <w:color w:val="FFFFFF"/>
+                <w:sz w:val="18"/>
+              </w:rPr>
+              <w:t>STT</w:t>
+            </w:r>
+          </w:p>
+        </w:tc>
+        <w:tc>
+          <w:tcPr>
+            <w:tcW w:type="dxa" w:w="1704"/>
+            <w:tcMar>
+              <w:top w:w="70" w:type="dxa"/>
+              <w:bottom w:w="70" w:type="dxa"/>
+              <w:left w:w="100" w:type="dxa"/>
+              <w:right w:w="100" w:type="dxa"/>
+            </w:tcMar>
+            <w:shd w:fill="0F172A"/>
+          </w:tcPr>
+          <w:p>
+            <w:pPr>
+              <w:spacing w:before="0" w:after="0"/>
+            </w:pPr>
+            <w:r>
+              <w:rPr>
+                <w:rFonts w:ascii="Arial" w:hAnsi="Arial"/>
+                <w:b/>
+                <w:color w:val="FFFFFF"/>
+                <w:sz w:val="18"/>
+              </w:rPr>
+              <w:t>Hạng mục</w:t>
+            </w:r>
+          </w:p>
+        </w:tc>
+        <w:tc>
+          <w:tcPr>
+            <w:tcW w:type="dxa" w:w="1704"/>
+            <w:tcMar>
+              <w:top w:w="70" w:type="dxa"/>
+              <w:bottom w:w="70" w:type="dxa"/>
+              <w:left w:w="100" w:type="dxa"/>
+              <w:right w:w="100" w:type="dxa"/>
+            </w:tcMar>
+            <w:shd w:fill="0F172A"/>
+          </w:tcPr>
+          <w:p>
+            <w:pPr>
+              <w:spacing w:before="0" w:after="0"/>
+            </w:pPr>
+            <w:r>
+              <w:rPr>
+                <w:rFonts w:ascii="Arial" w:hAnsi="Arial"/>
+                <w:b/>
+                <w:color w:val="FFFFFF"/>
+                <w:sz w:val="18"/>
+              </w:rPr>
+              <w:t>Đơn giá</w:t>
+            </w:r>
+          </w:p>
+        </w:tc>
+        <w:tc>
+          <w:tcPr>
+            <w:tcW w:type="dxa" w:w="1704"/>
+            <w:tcMar>
+              <w:top w:w="70" w:type="dxa"/>
+              <w:bottom w:w="70" w:type="dxa"/>
+              <w:left w:w="100" w:type="dxa"/>
+              <w:right w:w="100" w:type="dxa"/>
+            </w:tcMar>
+            <w:shd w:fill="0F172A"/>
+          </w:tcPr>
+          <w:p>
+            <w:pPr>
+              <w:spacing w:before="0" w:after="0"/>
+            </w:pPr>
+            <w:r>
+              <w:rPr>
+                <w:rFonts w:ascii="Arial" w:hAnsi="Arial"/>
+                <w:b/>
+                <w:color w:val="FFFFFF"/>
+                <w:sz w:val="18"/>
+              </w:rPr>
+              <w:t>SL</w:t>
+            </w:r>
+          </w:p>
+        </w:tc>
+        <w:tc>
+          <w:tcPr>
+            <w:tcW w:type="dxa" w:w="1704"/>
+            <w:tcMar>
+              <w:top w:w="70" w:type="dxa"/>
+              <w:bottom w:w="70" w:type="dxa"/>
+              <w:left w:w="100" w:type="dxa"/>
+              <w:right w:w="100" w:type="dxa"/>
+            </w:tcMar>
+            <w:shd w:fill="0F172A"/>
+          </w:tcPr>
+          <w:p>
+            <w:pPr>
+              <w:spacing w:before="0" w:after="0"/>
+            </w:pPr>
+            <w:r>
+              <w:rPr>
+                <w:rFonts w:ascii="Arial" w:hAnsi="Arial"/>
+                <w:b/>
+                <w:color w:val="FFFFFF"/>
+                <w:sz w:val="18"/>
+              </w:rPr>
+              <w:t>Thành tiền</w:t>
+            </w:r>
+          </w:p>
+        </w:tc>
+        <w:tc>
+          <w:tcPr>
+            <w:tcW w:type="dxa" w:w="1704"/>
+            <w:tcMar>
+              <w:top w:w="70" w:type="dxa"/>
+              <w:bottom w:w="70" w:type="dxa"/>
+              <w:left w:w="100" w:type="dxa"/>
+              <w:right w:w="100" w:type="dxa"/>
+            </w:tcMar>
+            <w:shd w:fill="0F172A"/>
+          </w:tcPr>
+          <w:p>
+            <w:pPr>
+              <w:spacing w:before="0" w:after="0"/>
+            </w:pPr>
+            <w:r>
+              <w:rPr>
+                <w:rFonts w:ascii="Arial" w:hAnsi="Arial"/>
+                <w:b/>
+                <w:color w:val="FFFFFF"/>
+                <w:sz w:val="18"/>
+              </w:rPr>
+              <w:t>Ghi chú</w:t>
+            </w:r>
+          </w:p>
+        </w:tc>
+      </w:tr>
+      <w:tr>
+        <w:tc>
+          <w:tcPr>
+            <w:tcW w:type="dxa" w:w="1704"/>
+            <w:tcMar>
+              <w:top w:w="70" w:type="dxa"/>
+              <w:bottom w:w="70" w:type="dxa"/>
+              <w:left w:w="100" w:type="dxa"/>
+              <w:right w:w="100" w:type="dxa"/>
+            </w:tcMar>
+            <w:shd w:fill="FFFFFF"/>
+          </w:tcPr>
+          <w:p>
+            <w:pPr>
+              <w:spacing w:before="0" w:after="0"/>
+            </w:pPr>
+            <w:r>
+              <w:rPr>
+                <w:rFonts w:ascii="Arial" w:hAnsi="Arial"/>
+                <w:color w:val="1E293B"/>
+                <w:sz w:val="18"/>
+              </w:rPr>
+              <w:t>1</w:t>
+            </w:r>
+          </w:p>
+        </w:tc>
+        <w:tc>
+          <w:tcPr>
+            <w:tcW w:type="dxa" w:w="1704"/>
+            <w:tcMar>
+              <w:top w:w="70" w:type="dxa"/>
+              <w:bottom w:w="70" w:type="dxa"/>
+              <w:left w:w="100" w:type="dxa"/>
+              <w:right w:w="100" w:type="dxa"/>
+            </w:tcMar>
+            <w:shd w:fill="FFFFFF"/>
+          </w:tcPr>
+          <w:p>
+            <w:pPr>
+              <w:spacing w:before="0" w:after="0"/>
+            </w:pPr>
+            <w:r>
+              <w:rPr>
+                <w:rFonts w:ascii="Arial" w:hAnsi="Arial"/>
+                <w:color w:val="1E293B"/>
+                <w:sz w:val="18"/>
+              </w:rPr>
+              <w:t>Router WiFi + 4G Backup</w:t>
+            </w:r>
+          </w:p>
+        </w:tc>
+        <w:tc>
+          <w:tcPr>
+            <w:tcW w:type="dxa" w:w="1704"/>
+            <w:tcMar>
+              <w:top w:w="70" w:type="dxa"/>
+              <w:bottom w:w="70" w:type="dxa"/>
+              <w:left w:w="100" w:type="dxa"/>
+              <w:right w:w="100" w:type="dxa"/>
+            </w:tcMar>
+            <w:shd w:fill="FFFFFF"/>
+          </w:tcPr>
+          <w:p>
+            <w:pPr>
+              <w:spacing w:before="0" w:after="0"/>
+            </w:pPr>
+            <w:r>
+              <w:rPr>
+                <w:rFonts w:ascii="Arial" w:hAnsi="Arial"/>
+                <w:color w:val="1E293B"/>
+                <w:sz w:val="18"/>
+              </w:rPr>
+              <w:t>1.200.000</w:t>
+            </w:r>
+          </w:p>
+        </w:tc>
+        <w:tc>
+          <w:tcPr>
+            <w:tcW w:type="dxa" w:w="1704"/>
+            <w:tcMar>
+              <w:top w:w="70" w:type="dxa"/>
+              <w:bottom w:w="70" w:type="dxa"/>
+              <w:left w:w="100" w:type="dxa"/>
+              <w:right w:w="100" w:type="dxa"/>
+            </w:tcMar>
+            <w:shd w:fill="FFFFFF"/>
+          </w:tcPr>
+          <w:p>
+            <w:pPr>
+              <w:spacing w:before="0" w:after="0"/>
+            </w:pPr>
+            <w:r>
+              <w:rPr>
+                <w:rFonts w:ascii="Arial" w:hAnsi="Arial"/>
+                <w:color w:val="1E293B"/>
+                <w:sz w:val="18"/>
+              </w:rPr>
+              <w:t>3</w:t>
+            </w:r>
+          </w:p>
+        </w:tc>
+        <w:tc>
+          <w:tcPr>
+            <w:tcW w:type="dxa" w:w="1704"/>
+            <w:tcMar>
+              <w:top w:w="70" w:type="dxa"/>
+              <w:bottom w:w="70" w:type="dxa"/>
+              <w:left w:w="100" w:type="dxa"/>
+              <w:right w:w="100" w:type="dxa"/>
+            </w:tcMar>
+            <w:shd w:fill="FFFFFF"/>
+          </w:tcPr>
+          <w:p>
+            <w:pPr>
+              <w:spacing w:before="0" w:after="0"/>
+            </w:pPr>
+            <w:r>
+              <w:rPr>
+                <w:rFonts w:ascii="Arial" w:hAnsi="Arial"/>
+                <w:color w:val="1E293B"/>
+                <w:sz w:val="18"/>
+              </w:rPr>
+              <w:t>3.600.000</w:t>
+            </w:r>
+          </w:p>
+        </w:tc>
+        <w:tc>
+          <w:tcPr>
+            <w:tcW w:type="dxa" w:w="1704"/>
+            <w:tcMar>
+              <w:top w:w="70" w:type="dxa"/>
+              <w:bottom w:w="70" w:type="dxa"/>
+              <w:left w:w="100" w:type="dxa"/>
+              <w:right w:w="100" w:type="dxa"/>
+            </w:tcMar>
+            <w:shd w:fill="FFFFFF"/>
+          </w:tcPr>
+          <w:p>
+            <w:pPr>
+              <w:spacing w:before="0" w:after="0"/>
+            </w:pPr>
+            <w:r>
+              <w:rPr>
+                <w:rFonts w:ascii="Arial" w:hAnsi="Arial"/>
+                <w:color w:val="1E293B"/>
+                <w:sz w:val="18"/>
+              </w:rPr>
+              <w:t>Dự phòng mất WiFi. Nếu WiFi quán ổn định, có thể bỏ</w:t>
+            </w:r>
+          </w:p>
+        </w:tc>
+      </w:tr>
+      <w:tr>
+        <w:tc>
+          <w:tcPr>
+            <w:tcW w:type="dxa" w:w="1704"/>
+            <w:tcMar>
+              <w:top w:w="70" w:type="dxa"/>
+              <w:bottom w:w="70" w:type="dxa"/>
+              <w:left w:w="100" w:type="dxa"/>
+              <w:right w:w="100" w:type="dxa"/>
+            </w:tcMar>
+            <w:shd w:fill="F8FAFC"/>
+          </w:tcPr>
+          <w:p>
+            <w:pPr>
+              <w:spacing w:before="0" w:after="0"/>
+            </w:pPr>
+          </w:p>
+        </w:tc>
+        <w:tc>
+          <w:tcPr>
+            <w:tcW w:type="dxa" w:w="1704"/>
+            <w:tcMar>
+              <w:top w:w="70" w:type="dxa"/>
+              <w:bottom w:w="70" w:type="dxa"/>
+              <w:left w:w="100" w:type="dxa"/>
+              <w:right w:w="100" w:type="dxa"/>
+            </w:tcMar>
+            <w:shd w:fill="F8FAFC"/>
+          </w:tcPr>
+          <w:p>
+            <w:pPr>
+              <w:spacing w:before="0" w:after="0"/>
+            </w:pPr>
+            <w:r>
+              <w:rPr>
+                <w:rFonts w:ascii="Arial" w:hAnsi="Arial"/>
+                <w:color w:val="1E293B"/>
+                <w:sz w:val="18"/>
+              </w:rPr>
+              <w:t>SIM 4G Data hàng tháng</w:t>
+            </w:r>
+          </w:p>
+        </w:tc>
+        <w:tc>
+          <w:tcPr>
+            <w:tcW w:type="dxa" w:w="1704"/>
+            <w:tcMar>
+              <w:top w:w="70" w:type="dxa"/>
+              <w:bottom w:w="70" w:type="dxa"/>
+              <w:left w:w="100" w:type="dxa"/>
+              <w:right w:w="100" w:type="dxa"/>
+            </w:tcMar>
+            <w:shd w:fill="F8FAFC"/>
+          </w:tcPr>
+          <w:p>
+            <w:pPr>
+              <w:spacing w:before="0" w:after="0"/>
+            </w:pPr>
+            <w:r>
+              <w:rPr>
+                <w:rFonts w:ascii="Arial" w:hAnsi="Arial"/>
+                <w:color w:val="1E293B"/>
+                <w:sz w:val="18"/>
+              </w:rPr>
+              <w:t>150.000</w:t>
+            </w:r>
+          </w:p>
+        </w:tc>
+        <w:tc>
+          <w:tcPr>
+            <w:tcW w:type="dxa" w:w="1704"/>
+            <w:tcMar>
+              <w:top w:w="70" w:type="dxa"/>
+              <w:bottom w:w="70" w:type="dxa"/>
+              <w:left w:w="100" w:type="dxa"/>
+              <w:right w:w="100" w:type="dxa"/>
+            </w:tcMar>
+            <w:shd w:fill="F8FAFC"/>
+          </w:tcPr>
+          <w:p>
+            <w:pPr>
+              <w:spacing w:before="0" w:after="0"/>
+            </w:pPr>
+            <w:r>
+              <w:rPr>
+                <w:rFonts w:ascii="Arial" w:hAnsi="Arial"/>
+                <w:color w:val="1E293B"/>
+                <w:sz w:val="18"/>
+              </w:rPr>
+              <w:t>3</w:t>
+            </w:r>
+          </w:p>
+        </w:tc>
+        <w:tc>
+          <w:tcPr>
+            <w:tcW w:type="dxa" w:w="1704"/>
+            <w:tcMar>
+              <w:top w:w="70" w:type="dxa"/>
+              <w:bottom w:w="70" w:type="dxa"/>
+              <w:left w:w="100" w:type="dxa"/>
+              <w:right w:w="100" w:type="dxa"/>
+            </w:tcMar>
+            <w:shd w:fill="F8FAFC"/>
+          </w:tcPr>
+          <w:p>
+            <w:pPr>
+              <w:spacing w:before="0" w:after="0"/>
+            </w:pPr>
+            <w:r>
+              <w:rPr>
+                <w:rFonts w:ascii="Arial" w:hAnsi="Arial"/>
+                <w:color w:val="1E293B"/>
+                <w:sz w:val="18"/>
+              </w:rPr>
+              <w:t>450.000/tháng</w:t>
+            </w:r>
+          </w:p>
+        </w:tc>
+        <w:tc>
+          <w:tcPr>
+            <w:tcW w:type="dxa" w:w="1704"/>
+            <w:tcMar>
+              <w:top w:w="70" w:type="dxa"/>
+              <w:bottom w:w="70" w:type="dxa"/>
+              <w:left w:w="100" w:type="dxa"/>
+              <w:right w:w="100" w:type="dxa"/>
+            </w:tcMar>
+            <w:shd w:fill="F8FAFC"/>
+          </w:tcPr>
+          <w:p>
+            <w:pPr>
+              <w:spacing w:before="0" w:after="0"/>
+            </w:pPr>
+            <w:r>
+              <w:rPr>
+                <w:rFonts w:ascii="Arial" w:hAnsi="Arial"/>
+                <w:color w:val="1E293B"/>
+                <w:sz w:val="18"/>
+              </w:rPr>
+              <w:t>Chỉ phát sinh nếu lắp Router 4G</w:t>
             </w:r>
           </w:p>
         </w:tc>
@@ -3078,7 +3553,7 @@
                 <w:color w:val="1E293B"/>
                 <w:sz w:val="18"/>
               </w:rPr>
-              <w:t>SIM 4G Data backup (3 quán)</w:t>
+              <w:t>Giấy in nhiệt (tiêu hao)</w:t>
             </w:r>
           </w:p>
         </w:tc>
@@ -3103,7 +3578,7 @@
                 <w:color w:val="1E293B"/>
                 <w:sz w:val="18"/>
               </w:rPr>
-              <w:t>450.000</w:t>
+              <w:t>180.000</w:t>
             </w:r>
           </w:p>
         </w:tc>
@@ -3128,7 +3603,7 @@
                 <w:color w:val="1E293B"/>
                 <w:sz w:val="18"/>
               </w:rPr>
-              <w:t>3 quán x 150.000/tháng</w:t>
+              <w:t>3 quán x 3 cuộn/tháng x 20.000/cuộn</w:t>
             </w:r>
           </w:p>
         </w:tc>
@@ -3149,14 +3624,6 @@
             <w:pPr>
               <w:spacing w:before="0" w:after="0"/>
             </w:pPr>
-            <w:r>
-              <w:rPr>
-                <w:rFonts w:ascii="Arial" w:hAnsi="Arial"/>
-                <w:color w:val="1E293B"/>
-                <w:sz w:val="18"/>
-              </w:rPr>
-              <w:t>5</w:t>
-            </w:r>
           </w:p>
         </w:tc>
         <w:tc>
@@ -3174,14 +3641,6 @@
             <w:pPr>
               <w:spacing w:before="0" w:after="0"/>
             </w:pPr>
-            <w:r>
-              <w:rPr>
-                <w:rFonts w:ascii="Arial" w:hAnsi="Arial"/>
-                <w:color w:val="1E293B"/>
-                <w:sz w:val="18"/>
-              </w:rPr>
-              <w:t>Giấy in nhiệt (tiêu hao)</w:t>
-            </w:r>
           </w:p>
         </w:tc>
         <w:tc>
@@ -3199,14 +3658,6 @@
             <w:pPr>
               <w:spacing w:before="0" w:after="0"/>
             </w:pPr>
-            <w:r>
-              <w:rPr>
-                <w:rFonts w:ascii="Arial" w:hAnsi="Arial"/>
-                <w:color w:val="1E293B"/>
-                <w:sz w:val="18"/>
-              </w:rPr>
-              <w:t>180.000</w:t>
-            </w:r>
           </w:p>
         </w:tc>
         <w:tc>
@@ -3224,14 +3675,6 @@
             <w:pPr>
               <w:spacing w:before="0" w:after="0"/>
             </w:pPr>
-            <w:r>
-              <w:rPr>
-                <w:rFonts w:ascii="Arial" w:hAnsi="Arial"/>
-                <w:color w:val="1E293B"/>
-                <w:sz w:val="18"/>
-              </w:rPr>
-              <w:t>3 quán x 3 cuộn/tháng x 20.000/cuộn</w:t>
-            </w:r>
           </w:p>
         </w:tc>
       </w:tr>
@@ -3263,76 +3706,6 @@
               <w:right w:w="100" w:type="dxa"/>
             </w:tcMar>
             <w:shd w:fill="F8FAFC"/>
-          </w:tcPr>
-          <w:p>
-            <w:pPr>
-              <w:spacing w:before="0" w:after="0"/>
-            </w:pPr>
-          </w:p>
-        </w:tc>
-        <w:tc>
-          <w:tcPr>
-            <w:tcW w:type="dxa" w:w="2556"/>
-            <w:tcMar>
-              <w:top w:w="70" w:type="dxa"/>
-              <w:bottom w:w="70" w:type="dxa"/>
-              <w:left w:w="100" w:type="dxa"/>
-              <w:right w:w="100" w:type="dxa"/>
-            </w:tcMar>
-            <w:shd w:fill="F8FAFC"/>
-          </w:tcPr>
-          <w:p>
-            <w:pPr>
-              <w:spacing w:before="0" w:after="0"/>
-            </w:pPr>
-          </w:p>
-        </w:tc>
-        <w:tc>
-          <w:tcPr>
-            <w:tcW w:type="dxa" w:w="2556"/>
-            <w:tcMar>
-              <w:top w:w="70" w:type="dxa"/>
-              <w:bottom w:w="70" w:type="dxa"/>
-              <w:left w:w="100" w:type="dxa"/>
-              <w:right w:w="100" w:type="dxa"/>
-            </w:tcMar>
-            <w:shd w:fill="F8FAFC"/>
-          </w:tcPr>
-          <w:p>
-            <w:pPr>
-              <w:spacing w:before="0" w:after="0"/>
-            </w:pPr>
-          </w:p>
-        </w:tc>
-      </w:tr>
-      <w:tr>
-        <w:tc>
-          <w:tcPr>
-            <w:tcW w:type="dxa" w:w="2556"/>
-            <w:tcMar>
-              <w:top w:w="70" w:type="dxa"/>
-              <w:bottom w:w="70" w:type="dxa"/>
-              <w:left w:w="100" w:type="dxa"/>
-              <w:right w:w="100" w:type="dxa"/>
-            </w:tcMar>
-            <w:shd w:fill="FFFFFF"/>
-          </w:tcPr>
-          <w:p>
-            <w:pPr>
-              <w:spacing w:before="0" w:after="0"/>
-            </w:pPr>
-          </w:p>
-        </w:tc>
-        <w:tc>
-          <w:tcPr>
-            <w:tcW w:type="dxa" w:w="2556"/>
-            <w:tcMar>
-              <w:top w:w="70" w:type="dxa"/>
-              <w:bottom w:w="70" w:type="dxa"/>
-              <w:left w:w="100" w:type="dxa"/>
-              <w:right w:w="100" w:type="dxa"/>
-            </w:tcMar>
-            <w:shd w:fill="FFFFFF"/>
           </w:tcPr>
           <w:p>
             <w:pPr>
@@ -3358,7 +3731,7 @@
               <w:left w:w="100" w:type="dxa"/>
               <w:right w:w="100" w:type="dxa"/>
             </w:tcMar>
-            <w:shd w:fill="FFFFFF"/>
+            <w:shd w:fill="F8FAFC"/>
           </w:tcPr>
           <w:p>
             <w:pPr>
@@ -3371,7 +3744,7 @@
                 <w:color w:val="1E293B"/>
                 <w:sz w:val="18"/>
               </w:rPr>
-              <w:t>1.860.000</w:t>
+              <w:t>1.410.000</w:t>
             </w:r>
           </w:p>
         </w:tc>
@@ -3384,7 +3757,7 @@
               <w:left w:w="100" w:type="dxa"/>
               <w:right w:w="100" w:type="dxa"/>
             </w:tcMar>
-            <w:shd w:fill="FFFFFF"/>
+            <w:shd w:fill="F8FAFC"/>
           </w:tcPr>
           <w:p>
             <w:pPr>
@@ -3397,7 +3770,104 @@
                 <w:color w:val="1E293B"/>
                 <w:sz w:val="18"/>
               </w:rPr>
-              <w:t>~620.000/chi nhánh</w:t>
+              <w:t>~470.000/chi nhánh</w:t>
+            </w:r>
+          </w:p>
+        </w:tc>
+      </w:tr>
+      <w:tr>
+        <w:tc>
+          <w:tcPr>
+            <w:tcW w:type="dxa" w:w="2556"/>
+            <w:tcMar>
+              <w:top w:w="70" w:type="dxa"/>
+              <w:bottom w:w="70" w:type="dxa"/>
+              <w:left w:w="100" w:type="dxa"/>
+              <w:right w:w="100" w:type="dxa"/>
+            </w:tcMar>
+            <w:shd w:fill="FFFFFF"/>
+          </w:tcPr>
+          <w:p>
+            <w:pPr>
+              <w:spacing w:before="0" w:after="0"/>
+            </w:pPr>
+          </w:p>
+        </w:tc>
+        <w:tc>
+          <w:tcPr>
+            <w:tcW w:type="dxa" w:w="2556"/>
+            <w:tcMar>
+              <w:top w:w="70" w:type="dxa"/>
+              <w:bottom w:w="70" w:type="dxa"/>
+              <w:left w:w="100" w:type="dxa"/>
+              <w:right w:w="100" w:type="dxa"/>
+            </w:tcMar>
+            <w:shd w:fill="FFFFFF"/>
+          </w:tcPr>
+          <w:p>
+            <w:pPr>
+              <w:spacing w:before="0" w:after="0"/>
+            </w:pPr>
+            <w:r>
+              <w:rPr>
+                <w:rFonts w:ascii="Arial" w:hAnsi="Arial"/>
+                <w:i/>
+                <w:color w:val="1E293B"/>
+                <w:sz w:val="18"/>
+              </w:rPr>
+              <w:t>Nếu có Router 4G (tùy chọn)</w:t>
+            </w:r>
+          </w:p>
+        </w:tc>
+        <w:tc>
+          <w:tcPr>
+            <w:tcW w:type="dxa" w:w="2556"/>
+            <w:tcMar>
+              <w:top w:w="70" w:type="dxa"/>
+              <w:bottom w:w="70" w:type="dxa"/>
+              <w:left w:w="100" w:type="dxa"/>
+              <w:right w:w="100" w:type="dxa"/>
+            </w:tcMar>
+            <w:shd w:fill="FFFFFF"/>
+          </w:tcPr>
+          <w:p>
+            <w:pPr>
+              <w:spacing w:before="0" w:after="0"/>
+            </w:pPr>
+            <w:r>
+              <w:rPr>
+                <w:rFonts w:ascii="Arial" w:hAnsi="Arial"/>
+                <w:i/>
+                <w:color w:val="1E293B"/>
+                <w:sz w:val="18"/>
+              </w:rPr>
+              <w:t>+450.000</w:t>
+            </w:r>
+          </w:p>
+        </w:tc>
+        <w:tc>
+          <w:tcPr>
+            <w:tcW w:type="dxa" w:w="2556"/>
+            <w:tcMar>
+              <w:top w:w="70" w:type="dxa"/>
+              <w:bottom w:w="70" w:type="dxa"/>
+              <w:left w:w="100" w:type="dxa"/>
+              <w:right w:w="100" w:type="dxa"/>
+            </w:tcMar>
+            <w:shd w:fill="FFFFFF"/>
+          </w:tcPr>
+          <w:p>
+            <w:pPr>
+              <w:spacing w:before="0" w:after="0"/>
+            </w:pPr>
+            <w:r>
+              <w:rPr>
+                <w:rFonts w:ascii="Arial" w:hAnsi="Arial"/>
+                <w:i/>
+                <w:color w:val="1E293B"/>
+                <w:sz w:val="18"/>
+              </w:rPr>
+              <w:t>Thêm SIM 4G 3 quán</w:t>
             </w:r>
           </w:p>
         </w:tc>
@@ -5165,7 +5635,7 @@
           <w:color w:val="2563EB"/>
           <w:sz w:val="22"/>
         </w:rPr>
-        <w:t>Phương án 1: Triển khai thí điểm 1 chi nhánh trước</w:t>
+        <w:t>Phương án 1: Triển khai thí điểm 1 chi nhánh (Khuyến nghị)</w:t>
       </w:r>
     </w:p>
     <w:tbl>
@@ -5183,13 +5653,14 @@
         </w:tblBorders>
       </w:tblPr>
       <w:tblGrid>
-        <w:gridCol w:w="5112"/>
-        <w:gridCol w:w="5112"/>
+        <w:gridCol w:w="3408"/>
+        <w:gridCol w:w="3408"/>
+        <w:gridCol w:w="3408"/>
       </w:tblGrid>
       <w:tr>
         <w:tc>
           <w:tcPr>
-            <w:tcW w:type="dxa" w:w="5112"/>
+            <w:tcW w:type="dxa" w:w="3408"/>
             <w:tcMar>
               <w:top w:w="70" w:type="dxa"/>
               <w:bottom w:w="70" w:type="dxa"/>
@@ -5215,7 +5686,7 @@
         </w:tc>
         <w:tc>
           <w:tcPr>
-            <w:tcW w:type="dxa" w:w="5112"/>
+            <w:tcW w:type="dxa" w:w="3408"/>
             <w:tcMar>
               <w:top w:w="70" w:type="dxa"/>
               <w:bottom w:w="70" w:type="dxa"/>
@@ -5235,7 +5706,33 @@
                 <w:color w:val="FFFFFF"/>
                 <w:sz w:val="18"/>
               </w:rPr>
-              <w:t>Chi phí</w:t>
+              <w:t>Mua mới</w:t>
+            </w:r>
+          </w:p>
+        </w:tc>
+        <w:tc>
+          <w:tcPr>
+            <w:tcW w:type="dxa" w:w="3408"/>
+            <w:tcMar>
+              <w:top w:w="70" w:type="dxa"/>
+              <w:bottom w:w="70" w:type="dxa"/>
+              <w:left w:w="100" w:type="dxa"/>
+              <w:right w:w="100" w:type="dxa"/>
+            </w:tcMar>
+            <w:shd w:fill="0F172A"/>
+          </w:tcPr>
+          <w:p>
+            <w:pPr>
+              <w:spacing w:before="0" w:after="0"/>
+            </w:pPr>
+            <w:r>
+              <w:rPr>
+                <w:rFonts w:ascii="Arial" w:hAnsi="Arial"/>
+                <w:b/>
+                <w:color w:val="FFFFFF"/>
+                <w:sz w:val="18"/>
+              </w:rPr>
+              <w:t>Dùng lại POS cũ</w:t>
             </w:r>
           </w:p>
         </w:tc>
@@ -5243,7 +5740,7 @@
       <w:tr>
         <w:tc>
           <w:tcPr>
-            <w:tcW w:type="dxa" w:w="5112"/>
+            <w:tcW w:type="dxa" w:w="3408"/>
             <w:tcMar>
               <w:top w:w="70" w:type="dxa"/>
               <w:bottom w:w="70" w:type="dxa"/>
@@ -5262,13 +5759,13 @@
                 <w:color w:val="1E293B"/>
                 <w:sz w:val="18"/>
               </w:rPr>
-              <w:t>Phát triển phần mềm (trọn gói, dùng chung cho mọi chi nhánh)</w:t>
-            </w:r>
-          </w:p>
-        </w:tc>
-        <w:tc>
-          <w:tcPr>
-            <w:tcW w:type="dxa" w:w="5112"/>
+              <w:t>Phát triển phần mềm</w:t>
+            </w:r>
+          </w:p>
+        </w:tc>
+        <w:tc>
+          <w:tcPr>
+            <w:tcW w:type="dxa" w:w="3408"/>
             <w:tcMar>
               <w:top w:w="70" w:type="dxa"/>
               <w:bottom w:w="70" w:type="dxa"/>
@@ -5287,7 +5784,32 @@
                 <w:color w:val="1E293B"/>
                 <w:sz w:val="18"/>
               </w:rPr>
-              <w:t>35.000.000</w:t>
+              <w:t>15.000.000</w:t>
+            </w:r>
+          </w:p>
+        </w:tc>
+        <w:tc>
+          <w:tcPr>
+            <w:tcW w:type="dxa" w:w="3408"/>
+            <w:tcMar>
+              <w:top w:w="70" w:type="dxa"/>
+              <w:bottom w:w="70" w:type="dxa"/>
+              <w:left w:w="100" w:type="dxa"/>
+              <w:right w:w="100" w:type="dxa"/>
+            </w:tcMar>
+            <w:shd w:fill="FFFFFF"/>
+          </w:tcPr>
+          <w:p>
+            <w:pPr>
+              <w:spacing w:before="0" w:after="0"/>
+            </w:pPr>
+            <w:r>
+              <w:rPr>
+                <w:rFonts w:ascii="Arial" w:hAnsi="Arial"/>
+                <w:color w:val="1E293B"/>
+                <w:sz w:val="18"/>
+              </w:rPr>
+              <w:t>15.000.000</w:t>
             </w:r>
           </w:p>
         </w:tc>
@@ -5295,7 +5817,7 @@
       <w:tr>
         <w:tc>
           <w:tcPr>
-            <w:tcW w:type="dxa" w:w="5112"/>
+            <w:tcW w:type="dxa" w:w="3408"/>
             <w:tcMar>
               <w:top w:w="70" w:type="dxa"/>
               <w:bottom w:w="70" w:type="dxa"/>
@@ -5314,13 +5836,13 @@
                 <w:color w:val="1E293B"/>
                 <w:sz w:val="18"/>
               </w:rPr>
-              <w:t>Thiết bị 1 chi nhánh (POS + Máy in + QR 20 bàn + Router 4G + Lắp đặt)</w:t>
-            </w:r>
-          </w:p>
-        </w:tc>
-        <w:tc>
-          <w:tcPr>
-            <w:tcW w:type="dxa" w:w="5112"/>
+              <w:t>Thiết bị 1 chi nhánh</w:t>
+            </w:r>
+          </w:p>
+        </w:tc>
+        <w:tc>
+          <w:tcPr>
+            <w:tcW w:type="dxa" w:w="3408"/>
             <w:tcMar>
               <w:top w:w="70" w:type="dxa"/>
               <w:bottom w:w="70" w:type="dxa"/>
@@ -5339,7 +5861,32 @@
                 <w:color w:val="1E293B"/>
                 <w:sz w:val="18"/>
               </w:rPr>
-              <w:t>13.890.000</w:t>
+              <w:t>12.630.000</w:t>
+            </w:r>
+          </w:p>
+        </w:tc>
+        <w:tc>
+          <w:tcPr>
+            <w:tcW w:type="dxa" w:w="3408"/>
+            <w:tcMar>
+              <w:top w:w="70" w:type="dxa"/>
+              <w:bottom w:w="70" w:type="dxa"/>
+              <w:left w:w="100" w:type="dxa"/>
+              <w:right w:w="100" w:type="dxa"/>
+            </w:tcMar>
+            <w:shd w:fill="F8FAFC"/>
+          </w:tcPr>
+          <w:p>
+            <w:pPr>
+              <w:spacing w:before="0" w:after="0"/>
+            </w:pPr>
+            <w:r>
+              <w:rPr>
+                <w:rFonts w:ascii="Arial" w:hAnsi="Arial"/>
+                <w:color w:val="1E293B"/>
+                <w:sz w:val="18"/>
+              </w:rPr>
+              <w:t>1.630.000</w:t>
             </w:r>
           </w:p>
         </w:tc>
@@ -5347,7 +5894,7 @@
       <w:tr>
         <w:tc>
           <w:tcPr>
-            <w:tcW w:type="dxa" w:w="5112"/>
+            <w:tcW w:type="dxa" w:w="3408"/>
             <w:tcMar>
               <w:top w:w="70" w:type="dxa"/>
               <w:bottom w:w="70" w:type="dxa"/>
@@ -5367,13 +5914,13 @@
                 <w:color w:val="1E293B"/>
                 <w:sz w:val="18"/>
               </w:rPr>
-              <w:t>TỔNG BAN ĐẦU (1 CHI NHÁNH)</w:t>
-            </w:r>
-          </w:p>
-        </w:tc>
-        <w:tc>
-          <w:tcPr>
-            <w:tcW w:type="dxa" w:w="5112"/>
+              <w:t>TỔNG BAN ĐẦU</w:t>
+            </w:r>
+          </w:p>
+        </w:tc>
+        <w:tc>
+          <w:tcPr>
+            <w:tcW w:type="dxa" w:w="3408"/>
             <w:tcMar>
               <w:top w:w="70" w:type="dxa"/>
               <w:bottom w:w="70" w:type="dxa"/>
@@ -5393,61 +5940,33 @@
                 <w:color w:val="1E293B"/>
                 <w:sz w:val="18"/>
               </w:rPr>
-              <w:t>48.890.000</w:t>
-            </w:r>
-          </w:p>
-        </w:tc>
-      </w:tr>
-      <w:tr>
-        <w:tc>
-          <w:tcPr>
-            <w:tcW w:type="dxa" w:w="5112"/>
-            <w:tcMar>
-              <w:top w:w="70" w:type="dxa"/>
-              <w:bottom w:w="70" w:type="dxa"/>
-              <w:left w:w="100" w:type="dxa"/>
-              <w:right w:w="100" w:type="dxa"/>
-            </w:tcMar>
-            <w:shd w:fill="F8FAFC"/>
-          </w:tcPr>
-          <w:p>
-            <w:pPr>
-              <w:spacing w:before="0" w:after="0"/>
-            </w:pPr>
-            <w:r>
-              <w:rPr>
-                <w:rFonts w:ascii="Arial" w:hAnsi="Arial"/>
-                <w:i/>
+              <w:t>27.630.000</w:t>
+            </w:r>
+          </w:p>
+        </w:tc>
+        <w:tc>
+          <w:tcPr>
+            <w:tcW w:type="dxa" w:w="3408"/>
+            <w:tcMar>
+              <w:top w:w="70" w:type="dxa"/>
+              <w:bottom w:w="70" w:type="dxa"/>
+              <w:left w:w="100" w:type="dxa"/>
+              <w:right w:w="100" w:type="dxa"/>
+            </w:tcMar>
+            <w:shd w:fill="FFFFFF"/>
+          </w:tcPr>
+          <w:p>
+            <w:pPr>
+              <w:spacing w:before="0" w:after="0"/>
+            </w:pPr>
+            <w:r>
+              <w:rPr>
+                <w:rFonts w:ascii="Arial" w:hAnsi="Arial"/>
+                <w:b/>
                 <w:color w:val="1E293B"/>
                 <w:sz w:val="18"/>
               </w:rPr>
-              <w:t>Dùng lại máy in cũ</w:t>
-            </w:r>
-          </w:p>
-        </w:tc>
-        <w:tc>
-          <w:tcPr>
-            <w:tcW w:type="dxa" w:w="5112"/>
-            <w:tcMar>
-              <w:top w:w="70" w:type="dxa"/>
-              <w:bottom w:w="70" w:type="dxa"/>
-              <w:left w:w="100" w:type="dxa"/>
-              <w:right w:w="100" w:type="dxa"/>
-            </w:tcMar>
-            <w:shd w:fill="F8FAFC"/>
-          </w:tcPr>
-          <w:p>
-            <w:pPr>
-              <w:spacing w:before="0" w:after="0"/>
-            </w:pPr>
-            <w:r>
-              <w:rPr>
-                <w:rFonts w:ascii="Arial" w:hAnsi="Arial"/>
-                <w:i/>
-                <w:color w:val="1E293B"/>
-                <w:sz w:val="18"/>
-              </w:rPr>
-              <w:t>46.890.000</w:t>
+              <w:t>16.630.000</w:t>
             </w:r>
           </w:p>
         </w:tc>
@@ -5552,7 +6071,7 @@
                 <w:color w:val="1E293B"/>
                 <w:sz w:val="18"/>
               </w:rPr>
-              <w:t>Vận hành (Server + Domain + AI + SIM 4G + Giấy in)</w:t>
+              <w:t>Vận hành (Server + Domain + AI + Giấy in)</w:t>
             </w:r>
           </w:p>
         </w:tc>
@@ -5577,7 +6096,7 @@
                 <w:color w:val="1E293B"/>
                 <w:sz w:val="18"/>
               </w:rPr>
-              <w:t>1.440.000</w:t>
+              <w:t>1.270.000</w:t>
             </w:r>
           </w:p>
         </w:tc>
@@ -5657,7 +6176,7 @@
                 <w:color w:val="1E293B"/>
                 <w:sz w:val="18"/>
               </w:rPr>
-              <w:t>TỔNG HÀNG THÁNG (1 CHI NHÁNH)</w:t>
+              <w:t>TỔNG HÀNG THÁNG</w:t>
             </w:r>
           </w:p>
         </w:tc>
@@ -5683,7 +6202,7 @@
                 <w:color w:val="1E293B"/>
                 <w:sz w:val="18"/>
               </w:rPr>
-              <w:t>3.440.000</w:t>
+              <w:t>3.270.000</w:t>
             </w:r>
           </w:p>
         </w:tc>
@@ -5721,13 +6240,14 @@
         </w:tblBorders>
       </w:tblPr>
       <w:tblGrid>
-        <w:gridCol w:w="5112"/>
-        <w:gridCol w:w="5112"/>
+        <w:gridCol w:w="3408"/>
+        <w:gridCol w:w="3408"/>
+        <w:gridCol w:w="3408"/>
       </w:tblGrid>
       <w:tr>
         <w:tc>
           <w:tcPr>
-            <w:tcW w:type="dxa" w:w="5112"/>
+            <w:tcW w:type="dxa" w:w="3408"/>
             <w:tcMar>
               <w:top w:w="70" w:type="dxa"/>
               <w:bottom w:w="70" w:type="dxa"/>
@@ -5753,7 +6273,7 @@
         </w:tc>
         <w:tc>
           <w:tcPr>
-            <w:tcW w:type="dxa" w:w="5112"/>
+            <w:tcW w:type="dxa" w:w="3408"/>
             <w:tcMar>
               <w:top w:w="70" w:type="dxa"/>
               <w:bottom w:w="70" w:type="dxa"/>
@@ -5773,7 +6293,33 @@
                 <w:color w:val="FFFFFF"/>
                 <w:sz w:val="18"/>
               </w:rPr>
-              <w:t>Chi phí/chi nhánh</w:t>
+              <w:t>Mua mới</w:t>
+            </w:r>
+          </w:p>
+        </w:tc>
+        <w:tc>
+          <w:tcPr>
+            <w:tcW w:type="dxa" w:w="3408"/>
+            <w:tcMar>
+              <w:top w:w="70" w:type="dxa"/>
+              <w:bottom w:w="70" w:type="dxa"/>
+              <w:left w:w="100" w:type="dxa"/>
+              <w:right w:w="100" w:type="dxa"/>
+            </w:tcMar>
+            <w:shd w:fill="0F172A"/>
+          </w:tcPr>
+          <w:p>
+            <w:pPr>
+              <w:spacing w:before="0" w:after="0"/>
+            </w:pPr>
+            <w:r>
+              <w:rPr>
+                <w:rFonts w:ascii="Arial" w:hAnsi="Arial"/>
+                <w:b/>
+                <w:color w:val="FFFFFF"/>
+                <w:sz w:val="18"/>
+              </w:rPr>
+              <w:t>Dùng lại POS cũ</w:t>
             </w:r>
           </w:p>
         </w:tc>
@@ -5781,7 +6327,7 @@
       <w:tr>
         <w:tc>
           <w:tcPr>
-            <w:tcW w:type="dxa" w:w="5112"/>
+            <w:tcW w:type="dxa" w:w="3408"/>
             <w:tcMar>
               <w:top w:w="70" w:type="dxa"/>
               <w:bottom w:w="70" w:type="dxa"/>
@@ -5800,13 +6346,13 @@
                 <w:color w:val="1E293B"/>
                 <w:sz w:val="18"/>
               </w:rPr>
-              <w:t>Thiết bị (POS + Máy in + QR + Router + Lắp đặt)</w:t>
-            </w:r>
-          </w:p>
-        </w:tc>
-        <w:tc>
-          <w:tcPr>
-            <w:tcW w:type="dxa" w:w="5112"/>
+              <w:t>Thiết bị (POS + Máy in + QR + Lắp đặt)</w:t>
+            </w:r>
+          </w:p>
+        </w:tc>
+        <w:tc>
+          <w:tcPr>
+            <w:tcW w:type="dxa" w:w="3408"/>
             <w:tcMar>
               <w:top w:w="70" w:type="dxa"/>
               <w:bottom w:w="70" w:type="dxa"/>
@@ -5825,7 +6371,32 @@
                 <w:color w:val="1E293B"/>
                 <w:sz w:val="18"/>
               </w:rPr>
-              <w:t>13.890.000</w:t>
+              <w:t>12.630.000</w:t>
+            </w:r>
+          </w:p>
+        </w:tc>
+        <w:tc>
+          <w:tcPr>
+            <w:tcW w:type="dxa" w:w="3408"/>
+            <w:tcMar>
+              <w:top w:w="70" w:type="dxa"/>
+              <w:bottom w:w="70" w:type="dxa"/>
+              <w:left w:w="100" w:type="dxa"/>
+              <w:right w:w="100" w:type="dxa"/>
+            </w:tcMar>
+            <w:shd w:fill="FFFFFF"/>
+          </w:tcPr>
+          <w:p>
+            <w:pPr>
+              <w:spacing w:before="0" w:after="0"/>
+            </w:pPr>
+            <w:r>
+              <w:rPr>
+                <w:rFonts w:ascii="Arial" w:hAnsi="Arial"/>
+                <w:color w:val="1E293B"/>
+                <w:sz w:val="18"/>
+              </w:rPr>
+              <w:t>1.630.000</w:t>
             </w:r>
           </w:p>
         </w:tc>
@@ -5833,7 +6404,7 @@
       <w:tr>
         <w:tc>
           <w:tcPr>
-            <w:tcW w:type="dxa" w:w="5112"/>
+            <w:tcW w:type="dxa" w:w="3408"/>
             <w:tcMar>
               <w:top w:w="70" w:type="dxa"/>
               <w:bottom w:w="70" w:type="dxa"/>
@@ -5852,13 +6423,13 @@
                 <w:color w:val="1E293B"/>
                 <w:sz w:val="18"/>
               </w:rPr>
-              <w:t>Vận hành thêm hàng tháng (SIM 4G + Giấy in)</w:t>
-            </w:r>
-          </w:p>
-        </w:tc>
-        <w:tc>
-          <w:tcPr>
-            <w:tcW w:type="dxa" w:w="5112"/>
+              <w:t>Vận hành thêm hàng tháng (Giấy in)</w:t>
+            </w:r>
+          </w:p>
+        </w:tc>
+        <w:tc>
+          <w:tcPr>
+            <w:tcW w:type="dxa" w:w="3408"/>
             <w:tcMar>
               <w:top w:w="70" w:type="dxa"/>
               <w:bottom w:w="70" w:type="dxa"/>
@@ -5877,7 +6448,32 @@
                 <w:color w:val="1E293B"/>
                 <w:sz w:val="18"/>
               </w:rPr>
-              <w:t>210.000</w:t>
+              <w:t>60.000</w:t>
+            </w:r>
+          </w:p>
+        </w:tc>
+        <w:tc>
+          <w:tcPr>
+            <w:tcW w:type="dxa" w:w="3408"/>
+            <w:tcMar>
+              <w:top w:w="70" w:type="dxa"/>
+              <w:bottom w:w="70" w:type="dxa"/>
+              <w:left w:w="100" w:type="dxa"/>
+              <w:right w:w="100" w:type="dxa"/>
+            </w:tcMar>
+            <w:shd w:fill="F8FAFC"/>
+          </w:tcPr>
+          <w:p>
+            <w:pPr>
+              <w:spacing w:before="0" w:after="0"/>
+            </w:pPr>
+            <w:r>
+              <w:rPr>
+                <w:rFonts w:ascii="Arial" w:hAnsi="Arial"/>
+                <w:color w:val="1E293B"/>
+                <w:sz w:val="18"/>
+              </w:rPr>
+              <w:t>60.000</w:t>
             </w:r>
           </w:p>
         </w:tc>
@@ -5885,7 +6481,7 @@
       <w:tr>
         <w:tc>
           <w:tcPr>
-            <w:tcW w:type="dxa" w:w="5112"/>
+            <w:tcW w:type="dxa" w:w="3408"/>
             <w:tcMar>
               <w:top w:w="70" w:type="dxa"/>
               <w:bottom w:w="70" w:type="dxa"/>
@@ -5910,7 +6506,7 @@
         </w:tc>
         <w:tc>
           <w:tcPr>
-            <w:tcW w:type="dxa" w:w="5112"/>
+            <w:tcW w:type="dxa" w:w="3408"/>
             <w:tcMar>
               <w:top w:w="70" w:type="dxa"/>
               <w:bottom w:w="70" w:type="dxa"/>
@@ -5929,7 +6525,32 @@
                 <w:color w:val="1E293B"/>
                 <w:sz w:val="18"/>
               </w:rPr>
-              <w:t>0 (đã phát triển, dùng chung)</w:t>
+              <w:t>0 (dùng chung)</w:t>
+            </w:r>
+          </w:p>
+        </w:tc>
+        <w:tc>
+          <w:tcPr>
+            <w:tcW w:type="dxa" w:w="3408"/>
+            <w:tcMar>
+              <w:top w:w="70" w:type="dxa"/>
+              <w:bottom w:w="70" w:type="dxa"/>
+              <w:left w:w="100" w:type="dxa"/>
+              <w:right w:w="100" w:type="dxa"/>
+            </w:tcMar>
+            <w:shd w:fill="FFFFFF"/>
+          </w:tcPr>
+          <w:p>
+            <w:pPr>
+              <w:spacing w:before="0" w:after="0"/>
+            </w:pPr>
+            <w:r>
+              <w:rPr>
+                <w:rFonts w:ascii="Arial" w:hAnsi="Arial"/>
+                <w:color w:val="1E293B"/>
+                <w:sz w:val="18"/>
+              </w:rPr>
+              <w:t>0 (dùng chung)</w:t>
             </w:r>
           </w:p>
         </w:tc>
@@ -5970,13 +6591,14 @@
         </w:tblBorders>
       </w:tblPr>
       <w:tblGrid>
-        <w:gridCol w:w="5112"/>
-        <w:gridCol w:w="5112"/>
+        <w:gridCol w:w="3408"/>
+        <w:gridCol w:w="3408"/>
+        <w:gridCol w:w="3408"/>
       </w:tblGrid>
       <w:tr>
         <w:tc>
           <w:tcPr>
-            <w:tcW w:type="dxa" w:w="5112"/>
+            <w:tcW w:type="dxa" w:w="3408"/>
             <w:tcMar>
               <w:top w:w="70" w:type="dxa"/>
               <w:bottom w:w="70" w:type="dxa"/>
@@ -6002,7 +6624,7 @@
         </w:tc>
         <w:tc>
           <w:tcPr>
-            <w:tcW w:type="dxa" w:w="5112"/>
+            <w:tcW w:type="dxa" w:w="3408"/>
             <w:tcMar>
               <w:top w:w="70" w:type="dxa"/>
               <w:bottom w:w="70" w:type="dxa"/>
@@ -6022,7 +6644,33 @@
                 <w:color w:val="FFFFFF"/>
                 <w:sz w:val="18"/>
               </w:rPr>
-              <w:t>Chi phí</w:t>
+              <w:t>Mua mới</w:t>
+            </w:r>
+          </w:p>
+        </w:tc>
+        <w:tc>
+          <w:tcPr>
+            <w:tcW w:type="dxa" w:w="3408"/>
+            <w:tcMar>
+              <w:top w:w="70" w:type="dxa"/>
+              <w:bottom w:w="70" w:type="dxa"/>
+              <w:left w:w="100" w:type="dxa"/>
+              <w:right w:w="100" w:type="dxa"/>
+            </w:tcMar>
+            <w:shd w:fill="0F172A"/>
+          </w:tcPr>
+          <w:p>
+            <w:pPr>
+              <w:spacing w:before="0" w:after="0"/>
+            </w:pPr>
+            <w:r>
+              <w:rPr>
+                <w:rFonts w:ascii="Arial" w:hAnsi="Arial"/>
+                <w:b/>
+                <w:color w:val="FFFFFF"/>
+                <w:sz w:val="18"/>
+              </w:rPr>
+              <w:t>Dùng lại POS cũ</w:t>
             </w:r>
           </w:p>
         </w:tc>
@@ -6030,7 +6678,7 @@
       <w:tr>
         <w:tc>
           <w:tcPr>
-            <w:tcW w:type="dxa" w:w="5112"/>
+            <w:tcW w:type="dxa" w:w="3408"/>
             <w:tcMar>
               <w:top w:w="70" w:type="dxa"/>
               <w:bottom w:w="70" w:type="dxa"/>
@@ -6055,7 +6703,7 @@
         </w:tc>
         <w:tc>
           <w:tcPr>
-            <w:tcW w:type="dxa" w:w="5112"/>
+            <w:tcW w:type="dxa" w:w="3408"/>
             <w:tcMar>
               <w:top w:w="70" w:type="dxa"/>
               <w:bottom w:w="70" w:type="dxa"/>
@@ -6074,7 +6722,32 @@
                 <w:color w:val="1E293B"/>
                 <w:sz w:val="18"/>
               </w:rPr>
-              <w:t>35.000.000</w:t>
+              <w:t>15.000.000</w:t>
+            </w:r>
+          </w:p>
+        </w:tc>
+        <w:tc>
+          <w:tcPr>
+            <w:tcW w:type="dxa" w:w="3408"/>
+            <w:tcMar>
+              <w:top w:w="70" w:type="dxa"/>
+              <w:bottom w:w="70" w:type="dxa"/>
+              <w:left w:w="100" w:type="dxa"/>
+              <w:right w:w="100" w:type="dxa"/>
+            </w:tcMar>
+            <w:shd w:fill="FFFFFF"/>
+          </w:tcPr>
+          <w:p>
+            <w:pPr>
+              <w:spacing w:before="0" w:after="0"/>
+            </w:pPr>
+            <w:r>
+              <w:rPr>
+                <w:rFonts w:ascii="Arial" w:hAnsi="Arial"/>
+                <w:color w:val="1E293B"/>
+                <w:sz w:val="18"/>
+              </w:rPr>
+              <w:t>15.000.000</w:t>
             </w:r>
           </w:p>
         </w:tc>
@@ -6082,7 +6755,7 @@
       <w:tr>
         <w:tc>
           <w:tcPr>
-            <w:tcW w:type="dxa" w:w="5112"/>
+            <w:tcW w:type="dxa" w:w="3408"/>
             <w:tcMar>
               <w:top w:w="70" w:type="dxa"/>
               <w:bottom w:w="70" w:type="dxa"/>
@@ -6101,13 +6774,13 @@
                 <w:color w:val="1E293B"/>
                 <w:sz w:val="18"/>
               </w:rPr>
-              <w:t>Thiết bị phần cứng (3 chi nhánh)</w:t>
-            </w:r>
-          </w:p>
-        </w:tc>
-        <w:tc>
-          <w:tcPr>
-            <w:tcW w:type="dxa" w:w="5112"/>
+              <w:t>Thiết bị 3 chi nhánh</w:t>
+            </w:r>
+          </w:p>
+        </w:tc>
+        <w:tc>
+          <w:tcPr>
+            <w:tcW w:type="dxa" w:w="3408"/>
             <w:tcMar>
               <w:top w:w="70" w:type="dxa"/>
               <w:bottom w:w="70" w:type="dxa"/>
@@ -6126,7 +6799,32 @@
                 <w:color w:val="1E293B"/>
                 <w:sz w:val="18"/>
               </w:rPr>
-              <w:t>41.490.000</w:t>
+              <w:t>37.890.000</w:t>
+            </w:r>
+          </w:p>
+        </w:tc>
+        <w:tc>
+          <w:tcPr>
+            <w:tcW w:type="dxa" w:w="3408"/>
+            <w:tcMar>
+              <w:top w:w="70" w:type="dxa"/>
+              <w:bottom w:w="70" w:type="dxa"/>
+              <w:left w:w="100" w:type="dxa"/>
+              <w:right w:w="100" w:type="dxa"/>
+            </w:tcMar>
+            <w:shd w:fill="F8FAFC"/>
+          </w:tcPr>
+          <w:p>
+            <w:pPr>
+              <w:spacing w:before="0" w:after="0"/>
+            </w:pPr>
+            <w:r>
+              <w:rPr>
+                <w:rFonts w:ascii="Arial" w:hAnsi="Arial"/>
+                <w:color w:val="1E293B"/>
+                <w:sz w:val="18"/>
+              </w:rPr>
+              <w:t>4.890.000</w:t>
             </w:r>
           </w:p>
         </w:tc>
@@ -6134,7 +6832,7 @@
       <w:tr>
         <w:tc>
           <w:tcPr>
-            <w:tcW w:type="dxa" w:w="5112"/>
+            <w:tcW w:type="dxa" w:w="3408"/>
             <w:tcMar>
               <w:top w:w="70" w:type="dxa"/>
               <w:bottom w:w="70" w:type="dxa"/>
@@ -6154,13 +6852,13 @@
                 <w:color w:val="1E293B"/>
                 <w:sz w:val="18"/>
               </w:rPr>
-              <w:t>TỔNG BAN ĐẦU (3 CHI NHÁNH)</w:t>
-            </w:r>
-          </w:p>
-        </w:tc>
-        <w:tc>
-          <w:tcPr>
-            <w:tcW w:type="dxa" w:w="5112"/>
+              <w:t>TỔNG BAN ĐẦU</w:t>
+            </w:r>
+          </w:p>
+        </w:tc>
+        <w:tc>
+          <w:tcPr>
+            <w:tcW w:type="dxa" w:w="3408"/>
             <w:tcMar>
               <w:top w:w="70" w:type="dxa"/>
               <w:bottom w:w="70" w:type="dxa"/>
@@ -6180,61 +6878,33 @@
                 <w:color w:val="1E293B"/>
                 <w:sz w:val="18"/>
               </w:rPr>
-              <w:t>76.490.000</w:t>
-            </w:r>
-          </w:p>
-        </w:tc>
-      </w:tr>
-      <w:tr>
-        <w:tc>
-          <w:tcPr>
-            <w:tcW w:type="dxa" w:w="5112"/>
-            <w:tcMar>
-              <w:top w:w="70" w:type="dxa"/>
-              <w:bottom w:w="70" w:type="dxa"/>
-              <w:left w:w="100" w:type="dxa"/>
-              <w:right w:w="100" w:type="dxa"/>
-            </w:tcMar>
-            <w:shd w:fill="F8FAFC"/>
-          </w:tcPr>
-          <w:p>
-            <w:pPr>
-              <w:spacing w:before="0" w:after="0"/>
-            </w:pPr>
-            <w:r>
-              <w:rPr>
-                <w:rFonts w:ascii="Arial" w:hAnsi="Arial"/>
-                <w:i/>
+              <w:t>52.890.000</w:t>
+            </w:r>
+          </w:p>
+        </w:tc>
+        <w:tc>
+          <w:tcPr>
+            <w:tcW w:type="dxa" w:w="3408"/>
+            <w:tcMar>
+              <w:top w:w="70" w:type="dxa"/>
+              <w:bottom w:w="70" w:type="dxa"/>
+              <w:left w:w="100" w:type="dxa"/>
+              <w:right w:w="100" w:type="dxa"/>
+            </w:tcMar>
+            <w:shd w:fill="FFFFFF"/>
+          </w:tcPr>
+          <w:p>
+            <w:pPr>
+              <w:spacing w:before="0" w:after="0"/>
+            </w:pPr>
+            <w:r>
+              <w:rPr>
+                <w:rFonts w:ascii="Arial" w:hAnsi="Arial"/>
+                <w:b/>
                 <w:color w:val="1E293B"/>
                 <w:sz w:val="18"/>
               </w:rPr>
-              <w:t>Dùng lại máy in cũ</w:t>
-            </w:r>
-          </w:p>
-        </w:tc>
-        <w:tc>
-          <w:tcPr>
-            <w:tcW w:type="dxa" w:w="5112"/>
-            <w:tcMar>
-              <w:top w:w="70" w:type="dxa"/>
-              <w:bottom w:w="70" w:type="dxa"/>
-              <w:left w:w="100" w:type="dxa"/>
-              <w:right w:w="100" w:type="dxa"/>
-            </w:tcMar>
-            <w:shd w:fill="F8FAFC"/>
-          </w:tcPr>
-          <w:p>
-            <w:pPr>
-              <w:spacing w:before="0" w:after="0"/>
-            </w:pPr>
-            <w:r>
-              <w:rPr>
-                <w:rFonts w:ascii="Arial" w:hAnsi="Arial"/>
-                <w:i/>
-                <w:color w:val="1E293B"/>
-                <w:sz w:val="18"/>
-              </w:rPr>
-              <w:t>70.490.000</w:t>
+              <w:t>19.890.000</w:t>
             </w:r>
           </w:p>
         </w:tc>
@@ -6364,7 +7034,7 @@
                 <w:color w:val="1E293B"/>
                 <w:sz w:val="18"/>
               </w:rPr>
-              <w:t>1.860.000</w:t>
+              <w:t>1.410.000</w:t>
             </w:r>
           </w:p>
         </w:tc>
@@ -6444,7 +7114,7 @@
                 <w:color w:val="1E293B"/>
                 <w:sz w:val="18"/>
               </w:rPr>
-              <w:t>TỔNG HÀNG THÁNG (3 CHI NHÁNH)</w:t>
+              <w:t>TỔNG HÀNG THÁNG</w:t>
             </w:r>
           </w:p>
         </w:tc>
@@ -6470,7 +7140,7 @@
                 <w:color w:val="1E293B"/>
                 <w:sz w:val="18"/>
               </w:rPr>
-              <w:t>3.860.000</w:t>
+              <w:t>3.410.000</w:t>
             </w:r>
           </w:p>
         </w:tc>
@@ -6493,7 +7163,567 @@
           <w:color w:val="2563EB"/>
           <w:sz w:val="22"/>
         </w:rPr>
-        <w:t>So sánh 2 phương án</w:t>
+        <w:t>So sánh các phương án</w:t>
+      </w:r>
+    </w:p>
+    <w:tbl>
+      <w:tblPr>
+        <w:tblW w:type="auto" w:w="0"/>
+        <w:jc w:val="center"/>
+        <w:tblLook w:firstColumn="1" w:firstRow="1" w:lastColumn="0" w:lastRow="0" w:noHBand="0" w:noVBand="1" w:val="04A0"/>
+        <w:tblBorders>
+          <w:top w:val="single" w:sz="6" w:space="0" w:color="CBD5E1"/>
+          <w:bottom w:val="single" w:sz="6" w:space="0" w:color="CBD5E1"/>
+          <w:left w:val="single" w:sz="6" w:space="0" w:color="CBD5E1"/>
+          <w:right w:val="single" w:sz="6" w:space="0" w:color="CBD5E1"/>
+          <w:insideH w:val="single" w:sz="4" w:space="0" w:color="E2E8F0"/>
+          <w:insideV w:val="single" w:sz="4" w:space="0" w:color="E2E8F0"/>
+        </w:tblBorders>
+      </w:tblPr>
+      <w:tblGrid>
+        <w:gridCol w:w="2045"/>
+        <w:gridCol w:w="2045"/>
+        <w:gridCol w:w="2045"/>
+        <w:gridCol w:w="2045"/>
+        <w:gridCol w:w="2045"/>
+      </w:tblGrid>
+      <w:tr>
+        <w:tc>
+          <w:tcPr>
+            <w:tcW w:type="dxa" w:w="2045"/>
+            <w:tcMar>
+              <w:top w:w="70" w:type="dxa"/>
+              <w:bottom w:w="70" w:type="dxa"/>
+              <w:left w:w="100" w:type="dxa"/>
+              <w:right w:w="100" w:type="dxa"/>
+            </w:tcMar>
+            <w:shd w:fill="0F172A"/>
+          </w:tcPr>
+          <w:p>
+            <w:pPr>
+              <w:spacing w:before="0" w:after="0"/>
+            </w:pPr>
+            <w:r>
+              <w:rPr>
+                <w:rFonts w:ascii="Arial" w:hAnsi="Arial"/>
+                <w:b/>
+                <w:color w:val="FFFFFF"/>
+                <w:sz w:val="18"/>
+              </w:rPr>
+              <w:t>Tiêu chí</w:t>
+            </w:r>
+          </w:p>
+        </w:tc>
+        <w:tc>
+          <w:tcPr>
+            <w:tcW w:type="dxa" w:w="2045"/>
+            <w:tcMar>
+              <w:top w:w="70" w:type="dxa"/>
+              <w:bottom w:w="70" w:type="dxa"/>
+              <w:left w:w="100" w:type="dxa"/>
+              <w:right w:w="100" w:type="dxa"/>
+            </w:tcMar>
+            <w:shd w:fill="0F172A"/>
+          </w:tcPr>
+          <w:p>
+            <w:pPr>
+              <w:spacing w:before="0" w:after="0"/>
+            </w:pPr>
+            <w:r>
+              <w:rPr>
+                <w:rFonts w:ascii="Arial" w:hAnsi="Arial"/>
+                <w:b/>
+                <w:color w:val="FFFFFF"/>
+                <w:sz w:val="18"/>
+              </w:rPr>
+              <w:t>1 chi nhánh (mua mới)</w:t>
+            </w:r>
+          </w:p>
+        </w:tc>
+        <w:tc>
+          <w:tcPr>
+            <w:tcW w:type="dxa" w:w="2045"/>
+            <w:tcMar>
+              <w:top w:w="70" w:type="dxa"/>
+              <w:bottom w:w="70" w:type="dxa"/>
+              <w:left w:w="100" w:type="dxa"/>
+              <w:right w:w="100" w:type="dxa"/>
+            </w:tcMar>
+            <w:shd w:fill="0F172A"/>
+          </w:tcPr>
+          <w:p>
+            <w:pPr>
+              <w:spacing w:before="0" w:after="0"/>
+            </w:pPr>
+            <w:r>
+              <w:rPr>
+                <w:rFonts w:ascii="Arial" w:hAnsi="Arial"/>
+                <w:b/>
+                <w:color w:val="FFFFFF"/>
+                <w:sz w:val="18"/>
+              </w:rPr>
+              <w:t>1 chi nhánh (POS cũ)</w:t>
+            </w:r>
+          </w:p>
+        </w:tc>
+        <w:tc>
+          <w:tcPr>
+            <w:tcW w:type="dxa" w:w="2045"/>
+            <w:tcMar>
+              <w:top w:w="70" w:type="dxa"/>
+              <w:bottom w:w="70" w:type="dxa"/>
+              <w:left w:w="100" w:type="dxa"/>
+              <w:right w:w="100" w:type="dxa"/>
+            </w:tcMar>
+            <w:shd w:fill="0F172A"/>
+          </w:tcPr>
+          <w:p>
+            <w:pPr>
+              <w:spacing w:before="0" w:after="0"/>
+            </w:pPr>
+            <w:r>
+              <w:rPr>
+                <w:rFonts w:ascii="Arial" w:hAnsi="Arial"/>
+                <w:b/>
+                <w:color w:val="FFFFFF"/>
+                <w:sz w:val="18"/>
+              </w:rPr>
+              <w:t>3 chi nhánh (mua mới)</w:t>
+            </w:r>
+          </w:p>
+        </w:tc>
+        <w:tc>
+          <w:tcPr>
+            <w:tcW w:type="dxa" w:w="2045"/>
+            <w:tcMar>
+              <w:top w:w="70" w:type="dxa"/>
+              <w:bottom w:w="70" w:type="dxa"/>
+              <w:left w:w="100" w:type="dxa"/>
+              <w:right w:w="100" w:type="dxa"/>
+            </w:tcMar>
+            <w:shd w:fill="0F172A"/>
+          </w:tcPr>
+          <w:p>
+            <w:pPr>
+              <w:spacing w:before="0" w:after="0"/>
+            </w:pPr>
+            <w:r>
+              <w:rPr>
+                <w:rFonts w:ascii="Arial" w:hAnsi="Arial"/>
+                <w:b/>
+                <w:color w:val="FFFFFF"/>
+                <w:sz w:val="18"/>
+              </w:rPr>
+              <w:t>3 chi nhánh (POS cũ)</w:t>
+            </w:r>
+          </w:p>
+        </w:tc>
+      </w:tr>
+      <w:tr>
+        <w:tc>
+          <w:tcPr>
+            <w:tcW w:type="dxa" w:w="2045"/>
+            <w:tcMar>
+              <w:top w:w="70" w:type="dxa"/>
+              <w:bottom w:w="70" w:type="dxa"/>
+              <w:left w:w="100" w:type="dxa"/>
+              <w:right w:w="100" w:type="dxa"/>
+            </w:tcMar>
+            <w:shd w:fill="FFFFFF"/>
+          </w:tcPr>
+          <w:p>
+            <w:pPr>
+              <w:spacing w:before="0" w:after="0"/>
+            </w:pPr>
+            <w:r>
+              <w:rPr>
+                <w:rFonts w:ascii="Arial" w:hAnsi="Arial"/>
+                <w:b/>
+                <w:color w:val="1E293B"/>
+                <w:sz w:val="18"/>
+              </w:rPr>
+              <w:t>Đầu tư ban đầu</w:t>
+            </w:r>
+          </w:p>
+        </w:tc>
+        <w:tc>
+          <w:tcPr>
+            <w:tcW w:type="dxa" w:w="2045"/>
+            <w:tcMar>
+              <w:top w:w="70" w:type="dxa"/>
+              <w:bottom w:w="70" w:type="dxa"/>
+              <w:left w:w="100" w:type="dxa"/>
+              <w:right w:w="100" w:type="dxa"/>
+            </w:tcMar>
+            <w:shd w:fill="FFFFFF"/>
+          </w:tcPr>
+          <w:p>
+            <w:pPr>
+              <w:spacing w:before="0" w:after="0"/>
+            </w:pPr>
+            <w:r>
+              <w:rPr>
+                <w:rFonts w:ascii="Arial" w:hAnsi="Arial"/>
+                <w:b/>
+                <w:color w:val="1E293B"/>
+                <w:sz w:val="18"/>
+              </w:rPr>
+              <w:t>27.630.000</w:t>
+            </w:r>
+          </w:p>
+        </w:tc>
+        <w:tc>
+          <w:tcPr>
+            <w:tcW w:type="dxa" w:w="2045"/>
+            <w:tcMar>
+              <w:top w:w="70" w:type="dxa"/>
+              <w:bottom w:w="70" w:type="dxa"/>
+              <w:left w:w="100" w:type="dxa"/>
+              <w:right w:w="100" w:type="dxa"/>
+            </w:tcMar>
+            <w:shd w:fill="FFFFFF"/>
+          </w:tcPr>
+          <w:p>
+            <w:pPr>
+              <w:spacing w:before="0" w:after="0"/>
+            </w:pPr>
+            <w:r>
+              <w:rPr>
+                <w:rFonts w:ascii="Arial" w:hAnsi="Arial"/>
+                <w:b/>
+                <w:color w:val="1E293B"/>
+                <w:sz w:val="18"/>
+              </w:rPr>
+              <w:t>16.630.000</w:t>
+            </w:r>
+          </w:p>
+        </w:tc>
+        <w:tc>
+          <w:tcPr>
+            <w:tcW w:type="dxa" w:w="2045"/>
+            <w:tcMar>
+              <w:top w:w="70" w:type="dxa"/>
+              <w:bottom w:w="70" w:type="dxa"/>
+              <w:left w:w="100" w:type="dxa"/>
+              <w:right w:w="100" w:type="dxa"/>
+            </w:tcMar>
+            <w:shd w:fill="FFFFFF"/>
+          </w:tcPr>
+          <w:p>
+            <w:pPr>
+              <w:spacing w:before="0" w:after="0"/>
+            </w:pPr>
+            <w:r>
+              <w:rPr>
+                <w:rFonts w:ascii="Arial" w:hAnsi="Arial"/>
+                <w:b/>
+                <w:color w:val="1E293B"/>
+                <w:sz w:val="18"/>
+              </w:rPr>
+              <w:t>52.890.000</w:t>
+            </w:r>
+          </w:p>
+        </w:tc>
+        <w:tc>
+          <w:tcPr>
+            <w:tcW w:type="dxa" w:w="2045"/>
+            <w:tcMar>
+              <w:top w:w="70" w:type="dxa"/>
+              <w:bottom w:w="70" w:type="dxa"/>
+              <w:left w:w="100" w:type="dxa"/>
+              <w:right w:w="100" w:type="dxa"/>
+            </w:tcMar>
+            <w:shd w:fill="FFFFFF"/>
+          </w:tcPr>
+          <w:p>
+            <w:pPr>
+              <w:spacing w:before="0" w:after="0"/>
+            </w:pPr>
+            <w:r>
+              <w:rPr>
+                <w:rFonts w:ascii="Arial" w:hAnsi="Arial"/>
+                <w:b/>
+                <w:color w:val="1E293B"/>
+                <w:sz w:val="18"/>
+              </w:rPr>
+              <w:t>19.890.000</w:t>
+            </w:r>
+          </w:p>
+        </w:tc>
+      </w:tr>
+      <w:tr>
+        <w:tc>
+          <w:tcPr>
+            <w:tcW w:type="dxa" w:w="2045"/>
+            <w:tcMar>
+              <w:top w:w="70" w:type="dxa"/>
+              <w:bottom w:w="70" w:type="dxa"/>
+              <w:left w:w="100" w:type="dxa"/>
+              <w:right w:w="100" w:type="dxa"/>
+            </w:tcMar>
+            <w:shd w:fill="F8FAFC"/>
+          </w:tcPr>
+          <w:p>
+            <w:pPr>
+              <w:spacing w:before="0" w:after="0"/>
+            </w:pPr>
+            <w:r>
+              <w:rPr>
+                <w:rFonts w:ascii="Arial" w:hAnsi="Arial"/>
+                <w:color w:val="1E293B"/>
+                <w:sz w:val="18"/>
+              </w:rPr>
+              <w:t>Hàng tháng</w:t>
+            </w:r>
+          </w:p>
+        </w:tc>
+        <w:tc>
+          <w:tcPr>
+            <w:tcW w:type="dxa" w:w="2045"/>
+            <w:tcMar>
+              <w:top w:w="70" w:type="dxa"/>
+              <w:bottom w:w="70" w:type="dxa"/>
+              <w:left w:w="100" w:type="dxa"/>
+              <w:right w:w="100" w:type="dxa"/>
+            </w:tcMar>
+            <w:shd w:fill="F8FAFC"/>
+          </w:tcPr>
+          <w:p>
+            <w:pPr>
+              <w:spacing w:before="0" w:after="0"/>
+            </w:pPr>
+            <w:r>
+              <w:rPr>
+                <w:rFonts w:ascii="Arial" w:hAnsi="Arial"/>
+                <w:color w:val="1E293B"/>
+                <w:sz w:val="18"/>
+              </w:rPr>
+              <w:t>3.270.000</w:t>
+            </w:r>
+          </w:p>
+        </w:tc>
+        <w:tc>
+          <w:tcPr>
+            <w:tcW w:type="dxa" w:w="2045"/>
+            <w:tcMar>
+              <w:top w:w="70" w:type="dxa"/>
+              <w:bottom w:w="70" w:type="dxa"/>
+              <w:left w:w="100" w:type="dxa"/>
+              <w:right w:w="100" w:type="dxa"/>
+            </w:tcMar>
+            <w:shd w:fill="F8FAFC"/>
+          </w:tcPr>
+          <w:p>
+            <w:pPr>
+              <w:spacing w:before="0" w:after="0"/>
+            </w:pPr>
+            <w:r>
+              <w:rPr>
+                <w:rFonts w:ascii="Arial" w:hAnsi="Arial"/>
+                <w:color w:val="1E293B"/>
+                <w:sz w:val="18"/>
+              </w:rPr>
+              <w:t>3.270.000</w:t>
+            </w:r>
+          </w:p>
+        </w:tc>
+        <w:tc>
+          <w:tcPr>
+            <w:tcW w:type="dxa" w:w="2045"/>
+            <w:tcMar>
+              <w:top w:w="70" w:type="dxa"/>
+              <w:bottom w:w="70" w:type="dxa"/>
+              <w:left w:w="100" w:type="dxa"/>
+              <w:right w:w="100" w:type="dxa"/>
+            </w:tcMar>
+            <w:shd w:fill="F8FAFC"/>
+          </w:tcPr>
+          <w:p>
+            <w:pPr>
+              <w:spacing w:before="0" w:after="0"/>
+            </w:pPr>
+            <w:r>
+              <w:rPr>
+                <w:rFonts w:ascii="Arial" w:hAnsi="Arial"/>
+                <w:color w:val="1E293B"/>
+                <w:sz w:val="18"/>
+              </w:rPr>
+              <w:t>3.410.000</w:t>
+            </w:r>
+          </w:p>
+        </w:tc>
+        <w:tc>
+          <w:tcPr>
+            <w:tcW w:type="dxa" w:w="2045"/>
+            <w:tcMar>
+              <w:top w:w="70" w:type="dxa"/>
+              <w:bottom w:w="70" w:type="dxa"/>
+              <w:left w:w="100" w:type="dxa"/>
+              <w:right w:w="100" w:type="dxa"/>
+            </w:tcMar>
+            <w:shd w:fill="F8FAFC"/>
+          </w:tcPr>
+          <w:p>
+            <w:pPr>
+              <w:spacing w:before="0" w:after="0"/>
+            </w:pPr>
+            <w:r>
+              <w:rPr>
+                <w:rFonts w:ascii="Arial" w:hAnsi="Arial"/>
+                <w:color w:val="1E293B"/>
+                <w:sz w:val="18"/>
+              </w:rPr>
+              <w:t>3.410.000</w:t>
+            </w:r>
+          </w:p>
+        </w:tc>
+      </w:tr>
+      <w:tr>
+        <w:tc>
+          <w:tcPr>
+            <w:tcW w:type="dxa" w:w="2045"/>
+            <w:tcMar>
+              <w:top w:w="70" w:type="dxa"/>
+              <w:bottom w:w="70" w:type="dxa"/>
+              <w:left w:w="100" w:type="dxa"/>
+              <w:right w:w="100" w:type="dxa"/>
+            </w:tcMar>
+            <w:shd w:fill="FFFFFF"/>
+          </w:tcPr>
+          <w:p>
+            <w:pPr>
+              <w:spacing w:before="0" w:after="0"/>
+            </w:pPr>
+            <w:r>
+              <w:rPr>
+                <w:rFonts w:ascii="Arial" w:hAnsi="Arial"/>
+                <w:color w:val="1E293B"/>
+                <w:sz w:val="18"/>
+              </w:rPr>
+              <w:t>Hoàn vốn</w:t>
+            </w:r>
+          </w:p>
+        </w:tc>
+        <w:tc>
+          <w:tcPr>
+            <w:tcW w:type="dxa" w:w="2045"/>
+            <w:tcMar>
+              <w:top w:w="70" w:type="dxa"/>
+              <w:bottom w:w="70" w:type="dxa"/>
+              <w:left w:w="100" w:type="dxa"/>
+              <w:right w:w="100" w:type="dxa"/>
+            </w:tcMar>
+            <w:shd w:fill="FFFFFF"/>
+          </w:tcPr>
+          <w:p>
+            <w:pPr>
+              <w:spacing w:before="0" w:after="0"/>
+            </w:pPr>
+            <w:r>
+              <w:rPr>
+                <w:rFonts w:ascii="Arial" w:hAnsi="Arial"/>
+                <w:color w:val="1E293B"/>
+                <w:sz w:val="18"/>
+              </w:rPr>
+              <w:t>~1 tháng</w:t>
+            </w:r>
+          </w:p>
+        </w:tc>
+        <w:tc>
+          <w:tcPr>
+            <w:tcW w:type="dxa" w:w="2045"/>
+            <w:tcMar>
+              <w:top w:w="70" w:type="dxa"/>
+              <w:bottom w:w="70" w:type="dxa"/>
+              <w:left w:w="100" w:type="dxa"/>
+              <w:right w:w="100" w:type="dxa"/>
+            </w:tcMar>
+            <w:shd w:fill="FFFFFF"/>
+          </w:tcPr>
+          <w:p>
+            <w:pPr>
+              <w:spacing w:before="0" w:after="0"/>
+            </w:pPr>
+            <w:r>
+              <w:rPr>
+                <w:rFonts w:ascii="Arial" w:hAnsi="Arial"/>
+                <w:color w:val="1E293B"/>
+                <w:sz w:val="18"/>
+              </w:rPr>
+              <w:t>&lt; 1 tháng</w:t>
+            </w:r>
+          </w:p>
+        </w:tc>
+        <w:tc>
+          <w:tcPr>
+            <w:tcW w:type="dxa" w:w="2045"/>
+            <w:tcMar>
+              <w:top w:w="70" w:type="dxa"/>
+              <w:bottom w:w="70" w:type="dxa"/>
+              <w:left w:w="100" w:type="dxa"/>
+              <w:right w:w="100" w:type="dxa"/>
+            </w:tcMar>
+            <w:shd w:fill="FFFFFF"/>
+          </w:tcPr>
+          <w:p>
+            <w:pPr>
+              <w:spacing w:before="0" w:after="0"/>
+            </w:pPr>
+            <w:r>
+              <w:rPr>
+                <w:rFonts w:ascii="Arial" w:hAnsi="Arial"/>
+                <w:color w:val="1E293B"/>
+                <w:sz w:val="18"/>
+              </w:rPr>
+              <w:t>~2 tháng</w:t>
+            </w:r>
+          </w:p>
+        </w:tc>
+        <w:tc>
+          <w:tcPr>
+            <w:tcW w:type="dxa" w:w="2045"/>
+            <w:tcMar>
+              <w:top w:w="70" w:type="dxa"/>
+              <w:bottom w:w="70" w:type="dxa"/>
+              <w:left w:w="100" w:type="dxa"/>
+              <w:right w:w="100" w:type="dxa"/>
+            </w:tcMar>
+            <w:shd w:fill="FFFFFF"/>
+          </w:tcPr>
+          <w:p>
+            <w:pPr>
+              <w:spacing w:before="0" w:after="0"/>
+            </w:pPr>
+            <w:r>
+              <w:rPr>
+                <w:rFonts w:ascii="Arial" w:hAnsi="Arial"/>
+                <w:color w:val="1E293B"/>
+                <w:sz w:val="18"/>
+              </w:rPr>
+              <w:t>&lt; 1 tháng</w:t>
+            </w:r>
+          </w:p>
+        </w:tc>
+      </w:tr>
+    </w:tbl>
+    <w:p>
+      <w:pPr>
+        <w:spacing w:after="40"/>
+      </w:pPr>
+    </w:p>
+    <w:p>
+      <w:pPr>
+        <w:keepNext/>
+        <w:spacing w:before="200" w:after="80"/>
+      </w:pPr>
+      <w:r>
+        <w:rPr>
+          <w:rFonts w:ascii="Arial" w:hAnsi="Arial"/>
+          <w:b/>
+          <w:color w:val="2563EB"/>
+          <w:sz w:val="22"/>
+        </w:rPr>
+        <w:t>Tổng theo thời gian (1 chi nhánh, dùng lại POS cũ — chi phí thấp nhất)</w:t>
       </w:r>
     </w:p>
     <w:tbl>
@@ -6538,7 +7768,7 @@
                 <w:color w:val="FFFFFF"/>
                 <w:sz w:val="18"/>
               </w:rPr>
-              <w:t>Tiêu chí</w:t>
+              <w:t>Mốc thời gian</w:t>
             </w:r>
           </w:p>
         </w:tc>
@@ -6564,7 +7794,7 @@
                 <w:color w:val="FFFFFF"/>
                 <w:sz w:val="18"/>
               </w:rPr>
-              <w:t>1 chi nhánh thí điểm</w:t>
+              <w:t>Chi phí</w:t>
             </w:r>
           </w:p>
         </w:tc>
@@ -6590,37 +7820,12 @@
                 <w:color w:val="FFFFFF"/>
                 <w:sz w:val="18"/>
               </w:rPr>
-              <w:t>3 chi nhánh đồng loạt</w:t>
+              <w:t>Ghi chú</w:t>
             </w:r>
           </w:p>
         </w:tc>
       </w:tr>
       <w:tr>
-        <w:tc>
-          <w:tcPr>
-            <w:tcW w:type="dxa" w:w="3408"/>
-            <w:tcMar>
-              <w:top w:w="70" w:type="dxa"/>
-              <w:bottom w:w="70" w:type="dxa"/>
-              <w:left w:w="100" w:type="dxa"/>
-              <w:right w:w="100" w:type="dxa"/>
-            </w:tcMar>
-            <w:shd w:fill="FFFFFF"/>
-          </w:tcPr>
-          <w:p>
-            <w:pPr>
-              <w:spacing w:before="0" w:after="0"/>
-            </w:pPr>
-            <w:r>
-              <w:rPr>
-                <w:rFonts w:ascii="Arial" w:hAnsi="Arial"/>
-                <w:color w:val="1E293B"/>
-                <w:sz w:val="18"/>
-              </w:rPr>
-              <w:t>Đầu tư ban đầu</w:t>
-            </w:r>
-          </w:p>
-        </w:tc>
         <w:tc>
           <w:tcPr>
             <w:tcW w:type="dxa" w:w="3408"/>
@@ -6643,7 +7848,7 @@
                 <w:color w:val="1E293B"/>
                 <w:sz w:val="18"/>
               </w:rPr>
-              <w:t>48.890.000</w:t>
+              <w:t>Ban đầu</w:t>
             </w:r>
           </w:p>
         </w:tc>
@@ -6669,7 +7874,32 @@
                 <w:color w:val="1E293B"/>
                 <w:sz w:val="18"/>
               </w:rPr>
-              <w:t>76.490.000</w:t>
+              <w:t>16.630.000</w:t>
+            </w:r>
+          </w:p>
+        </w:tc>
+        <w:tc>
+          <w:tcPr>
+            <w:tcW w:type="dxa" w:w="3408"/>
+            <w:tcMar>
+              <w:top w:w="70" w:type="dxa"/>
+              <w:bottom w:w="70" w:type="dxa"/>
+              <w:left w:w="100" w:type="dxa"/>
+              <w:right w:w="100" w:type="dxa"/>
+            </w:tcMar>
+            <w:shd w:fill="FFFFFF"/>
+          </w:tcPr>
+          <w:p>
+            <w:pPr>
+              <w:spacing w:before="0" w:after="0"/>
+            </w:pPr>
+            <w:r>
+              <w:rPr>
+                <w:rFonts w:ascii="Arial" w:hAnsi="Arial"/>
+                <w:color w:val="1E293B"/>
+                <w:sz w:val="18"/>
+              </w:rPr>
+              <w:t>Phần mềm + thiết bị phụ</w:t>
             </w:r>
           </w:p>
         </w:tc>
@@ -6685,434 +7915,6 @@
               <w:right w:w="100" w:type="dxa"/>
             </w:tcMar>
             <w:shd w:fill="F8FAFC"/>
-          </w:tcPr>
-          <w:p>
-            <w:pPr>
-              <w:spacing w:before="0" w:after="0"/>
-            </w:pPr>
-            <w:r>
-              <w:rPr>
-                <w:rFonts w:ascii="Arial" w:hAnsi="Arial"/>
-                <w:color w:val="1E293B"/>
-                <w:sz w:val="18"/>
-              </w:rPr>
-              <w:t>Hàng tháng</w:t>
-            </w:r>
-          </w:p>
-        </w:tc>
-        <w:tc>
-          <w:tcPr>
-            <w:tcW w:type="dxa" w:w="3408"/>
-            <w:tcMar>
-              <w:top w:w="70" w:type="dxa"/>
-              <w:bottom w:w="70" w:type="dxa"/>
-              <w:left w:w="100" w:type="dxa"/>
-              <w:right w:w="100" w:type="dxa"/>
-            </w:tcMar>
-            <w:shd w:fill="F8FAFC"/>
-          </w:tcPr>
-          <w:p>
-            <w:pPr>
-              <w:spacing w:before="0" w:after="0"/>
-            </w:pPr>
-            <w:r>
-              <w:rPr>
-                <w:rFonts w:ascii="Arial" w:hAnsi="Arial"/>
-                <w:color w:val="1E293B"/>
-                <w:sz w:val="18"/>
-              </w:rPr>
-              <w:t>3.440.000</w:t>
-            </w:r>
-          </w:p>
-        </w:tc>
-        <w:tc>
-          <w:tcPr>
-            <w:tcW w:type="dxa" w:w="3408"/>
-            <w:tcMar>
-              <w:top w:w="70" w:type="dxa"/>
-              <w:bottom w:w="70" w:type="dxa"/>
-              <w:left w:w="100" w:type="dxa"/>
-              <w:right w:w="100" w:type="dxa"/>
-            </w:tcMar>
-            <w:shd w:fill="F8FAFC"/>
-          </w:tcPr>
-          <w:p>
-            <w:pPr>
-              <w:spacing w:before="0" w:after="0"/>
-            </w:pPr>
-            <w:r>
-              <w:rPr>
-                <w:rFonts w:ascii="Arial" w:hAnsi="Arial"/>
-                <w:color w:val="1E293B"/>
-                <w:sz w:val="18"/>
-              </w:rPr>
-              <w:t>3.860.000</w:t>
-            </w:r>
-          </w:p>
-        </w:tc>
-      </w:tr>
-      <w:tr>
-        <w:tc>
-          <w:tcPr>
-            <w:tcW w:type="dxa" w:w="3408"/>
-            <w:tcMar>
-              <w:top w:w="70" w:type="dxa"/>
-              <w:bottom w:w="70" w:type="dxa"/>
-              <w:left w:w="100" w:type="dxa"/>
-              <w:right w:w="100" w:type="dxa"/>
-            </w:tcMar>
-            <w:shd w:fill="FFFFFF"/>
-          </w:tcPr>
-          <w:p>
-            <w:pPr>
-              <w:spacing w:before="0" w:after="0"/>
-            </w:pPr>
-            <w:r>
-              <w:rPr>
-                <w:rFonts w:ascii="Arial" w:hAnsi="Arial"/>
-                <w:color w:val="1E293B"/>
-                <w:sz w:val="18"/>
-              </w:rPr>
-              <w:t>Rủi ro</w:t>
-            </w:r>
-          </w:p>
-        </w:tc>
-        <w:tc>
-          <w:tcPr>
-            <w:tcW w:type="dxa" w:w="3408"/>
-            <w:tcMar>
-              <w:top w:w="70" w:type="dxa"/>
-              <w:bottom w:w="70" w:type="dxa"/>
-              <w:left w:w="100" w:type="dxa"/>
-              <w:right w:w="100" w:type="dxa"/>
-            </w:tcMar>
-            <w:shd w:fill="FFFFFF"/>
-          </w:tcPr>
-          <w:p>
-            <w:pPr>
-              <w:spacing w:before="0" w:after="0"/>
-            </w:pPr>
-            <w:r>
-              <w:rPr>
-                <w:rFonts w:ascii="Arial" w:hAnsi="Arial"/>
-                <w:color w:val="1E293B"/>
-                <w:sz w:val="18"/>
-              </w:rPr>
-              <w:t>Thấp — thử trước, mở rộng sau</w:t>
-            </w:r>
-          </w:p>
-        </w:tc>
-        <w:tc>
-          <w:tcPr>
-            <w:tcW w:type="dxa" w:w="3408"/>
-            <w:tcMar>
-              <w:top w:w="70" w:type="dxa"/>
-              <w:bottom w:w="70" w:type="dxa"/>
-              <w:left w:w="100" w:type="dxa"/>
-              <w:right w:w="100" w:type="dxa"/>
-            </w:tcMar>
-            <w:shd w:fill="FFFFFF"/>
-          </w:tcPr>
-          <w:p>
-            <w:pPr>
-              <w:spacing w:before="0" w:after="0"/>
-            </w:pPr>
-            <w:r>
-              <w:rPr>
-                <w:rFonts w:ascii="Arial" w:hAnsi="Arial"/>
-                <w:color w:val="1E293B"/>
-                <w:sz w:val="18"/>
-              </w:rPr>
-              <w:t>Trung bình — triển khai cùng lúc</w:t>
-            </w:r>
-          </w:p>
-        </w:tc>
-      </w:tr>
-      <w:tr>
-        <w:tc>
-          <w:tcPr>
-            <w:tcW w:type="dxa" w:w="3408"/>
-            <w:tcMar>
-              <w:top w:w="70" w:type="dxa"/>
-              <w:bottom w:w="70" w:type="dxa"/>
-              <w:left w:w="100" w:type="dxa"/>
-              <w:right w:w="100" w:type="dxa"/>
-            </w:tcMar>
-            <w:shd w:fill="F8FAFC"/>
-          </w:tcPr>
-          <w:p>
-            <w:pPr>
-              <w:spacing w:before="0" w:after="0"/>
-            </w:pPr>
-            <w:r>
-              <w:rPr>
-                <w:rFonts w:ascii="Arial" w:hAnsi="Arial"/>
-                <w:color w:val="1E293B"/>
-                <w:sz w:val="18"/>
-              </w:rPr>
-              <w:t>Hoàn vốn</w:t>
-            </w:r>
-          </w:p>
-        </w:tc>
-        <w:tc>
-          <w:tcPr>
-            <w:tcW w:type="dxa" w:w="3408"/>
-            <w:tcMar>
-              <w:top w:w="70" w:type="dxa"/>
-              <w:bottom w:w="70" w:type="dxa"/>
-              <w:left w:w="100" w:type="dxa"/>
-              <w:right w:w="100" w:type="dxa"/>
-            </w:tcMar>
-            <w:shd w:fill="F8FAFC"/>
-          </w:tcPr>
-          <w:p>
-            <w:pPr>
-              <w:spacing w:before="0" w:after="0"/>
-            </w:pPr>
-            <w:r>
-              <w:rPr>
-                <w:rFonts w:ascii="Arial" w:hAnsi="Arial"/>
-                <w:color w:val="1E293B"/>
-                <w:sz w:val="18"/>
-              </w:rPr>
-              <w:t>~2 tháng (tiết kiệm lương 1 thu ngân)</w:t>
-            </w:r>
-          </w:p>
-        </w:tc>
-        <w:tc>
-          <w:tcPr>
-            <w:tcW w:type="dxa" w:w="3408"/>
-            <w:tcMar>
-              <w:top w:w="70" w:type="dxa"/>
-              <w:bottom w:w="70" w:type="dxa"/>
-              <w:left w:w="100" w:type="dxa"/>
-              <w:right w:w="100" w:type="dxa"/>
-            </w:tcMar>
-            <w:shd w:fill="F8FAFC"/>
-          </w:tcPr>
-          <w:p>
-            <w:pPr>
-              <w:spacing w:before="0" w:after="0"/>
-            </w:pPr>
-            <w:r>
-              <w:rPr>
-                <w:rFonts w:ascii="Arial" w:hAnsi="Arial"/>
-                <w:color w:val="1E293B"/>
-                <w:sz w:val="18"/>
-              </w:rPr>
-              <w:t>~2-3 tháng (tiết kiệm lương 3 thu ngân)</w:t>
-            </w:r>
-          </w:p>
-        </w:tc>
-      </w:tr>
-      <w:tr>
-        <w:tc>
-          <w:tcPr>
-            <w:tcW w:type="dxa" w:w="3408"/>
-            <w:tcMar>
-              <w:top w:w="70" w:type="dxa"/>
-              <w:bottom w:w="70" w:type="dxa"/>
-              <w:left w:w="100" w:type="dxa"/>
-              <w:right w:w="100" w:type="dxa"/>
-            </w:tcMar>
-            <w:shd w:fill="FFFFFF"/>
-          </w:tcPr>
-          <w:p>
-            <w:pPr>
-              <w:spacing w:before="0" w:after="0"/>
-            </w:pPr>
-            <w:r>
-              <w:rPr>
-                <w:rFonts w:ascii="Arial" w:hAnsi="Arial"/>
-                <w:color w:val="1E293B"/>
-                <w:sz w:val="18"/>
-              </w:rPr>
-              <w:t>Thời gian mở rộng</w:t>
-            </w:r>
-          </w:p>
-        </w:tc>
-        <w:tc>
-          <w:tcPr>
-            <w:tcW w:type="dxa" w:w="3408"/>
-            <w:tcMar>
-              <w:top w:w="70" w:type="dxa"/>
-              <w:bottom w:w="70" w:type="dxa"/>
-              <w:left w:w="100" w:type="dxa"/>
-              <w:right w:w="100" w:type="dxa"/>
-            </w:tcMar>
-            <w:shd w:fill="FFFFFF"/>
-          </w:tcPr>
-          <w:p>
-            <w:pPr>
-              <w:spacing w:before="0" w:after="0"/>
-            </w:pPr>
-            <w:r>
-              <w:rPr>
-                <w:rFonts w:ascii="Arial" w:hAnsi="Arial"/>
-                <w:color w:val="1E293B"/>
-                <w:sz w:val="18"/>
-              </w:rPr>
-              <w:t>Thêm chi nhánh bất kỳ lúc nào</w:t>
-            </w:r>
-          </w:p>
-        </w:tc>
-        <w:tc>
-          <w:tcPr>
-            <w:tcW w:type="dxa" w:w="3408"/>
-            <w:tcMar>
-              <w:top w:w="70" w:type="dxa"/>
-              <w:bottom w:w="70" w:type="dxa"/>
-              <w:left w:w="100" w:type="dxa"/>
-              <w:right w:w="100" w:type="dxa"/>
-            </w:tcMar>
-            <w:shd w:fill="FFFFFF"/>
-          </w:tcPr>
-          <w:p>
-            <w:pPr>
-              <w:spacing w:before="0" w:after="0"/>
-            </w:pPr>
-            <w:r>
-              <w:rPr>
-                <w:rFonts w:ascii="Arial" w:hAnsi="Arial"/>
-                <w:color w:val="1E293B"/>
-                <w:sz w:val="18"/>
-              </w:rPr>
-              <w:t>Không cần — đã triển khai đủ</w:t>
-            </w:r>
-          </w:p>
-        </w:tc>
-      </w:tr>
-    </w:tbl>
-    <w:p>
-      <w:pPr>
-        <w:spacing w:after="40"/>
-      </w:pPr>
-    </w:p>
-    <w:p>
-      <w:pPr>
-        <w:keepNext/>
-        <w:spacing w:before="200" w:after="80"/>
-      </w:pPr>
-      <w:r>
-        <w:rPr>
-          <w:rFonts w:ascii="Arial" w:hAnsi="Arial"/>
-          <w:b/>
-          <w:color w:val="2563EB"/>
-          <w:sz w:val="22"/>
-        </w:rPr>
-        <w:t>Tổng theo thời gian (Phương án 1 chi nhánh)</w:t>
-      </w:r>
-    </w:p>
-    <w:tbl>
-      <w:tblPr>
-        <w:tblW w:type="auto" w:w="0"/>
-        <w:jc w:val="center"/>
-        <w:tblLook w:firstColumn="1" w:firstRow="1" w:lastColumn="0" w:lastRow="0" w:noHBand="0" w:noVBand="1" w:val="04A0"/>
-        <w:tblBorders>
-          <w:top w:val="single" w:sz="6" w:space="0" w:color="CBD5E1"/>
-          <w:bottom w:val="single" w:sz="6" w:space="0" w:color="CBD5E1"/>
-          <w:left w:val="single" w:sz="6" w:space="0" w:color="CBD5E1"/>
-          <w:right w:val="single" w:sz="6" w:space="0" w:color="CBD5E1"/>
-          <w:insideH w:val="single" w:sz="4" w:space="0" w:color="E2E8F0"/>
-          <w:insideV w:val="single" w:sz="4" w:space="0" w:color="E2E8F0"/>
-        </w:tblBorders>
-      </w:tblPr>
-      <w:tblGrid>
-        <w:gridCol w:w="3408"/>
-        <w:gridCol w:w="3408"/>
-        <w:gridCol w:w="3408"/>
-      </w:tblGrid>
-      <w:tr>
-        <w:tc>
-          <w:tcPr>
-            <w:tcW w:type="dxa" w:w="3408"/>
-            <w:tcMar>
-              <w:top w:w="70" w:type="dxa"/>
-              <w:bottom w:w="70" w:type="dxa"/>
-              <w:left w:w="100" w:type="dxa"/>
-              <w:right w:w="100" w:type="dxa"/>
-            </w:tcMar>
-            <w:shd w:fill="0F172A"/>
-          </w:tcPr>
-          <w:p>
-            <w:pPr>
-              <w:spacing w:before="0" w:after="0"/>
-            </w:pPr>
-            <w:r>
-              <w:rPr>
-                <w:rFonts w:ascii="Arial" w:hAnsi="Arial"/>
-                <w:b/>
-                <w:color w:val="FFFFFF"/>
-                <w:sz w:val="18"/>
-              </w:rPr>
-              <w:t>Mốc thời gian</w:t>
-            </w:r>
-          </w:p>
-        </w:tc>
-        <w:tc>
-          <w:tcPr>
-            <w:tcW w:type="dxa" w:w="3408"/>
-            <w:tcMar>
-              <w:top w:w="70" w:type="dxa"/>
-              <w:bottom w:w="70" w:type="dxa"/>
-              <w:left w:w="100" w:type="dxa"/>
-              <w:right w:w="100" w:type="dxa"/>
-            </w:tcMar>
-            <w:shd w:fill="0F172A"/>
-          </w:tcPr>
-          <w:p>
-            <w:pPr>
-              <w:spacing w:before="0" w:after="0"/>
-            </w:pPr>
-            <w:r>
-              <w:rPr>
-                <w:rFonts w:ascii="Arial" w:hAnsi="Arial"/>
-                <w:b/>
-                <w:color w:val="FFFFFF"/>
-                <w:sz w:val="18"/>
-              </w:rPr>
-              <w:t>Chi phí</w:t>
-            </w:r>
-          </w:p>
-        </w:tc>
-        <w:tc>
-          <w:tcPr>
-            <w:tcW w:type="dxa" w:w="3408"/>
-            <w:tcMar>
-              <w:top w:w="70" w:type="dxa"/>
-              <w:bottom w:w="70" w:type="dxa"/>
-              <w:left w:w="100" w:type="dxa"/>
-              <w:right w:w="100" w:type="dxa"/>
-            </w:tcMar>
-            <w:shd w:fill="0F172A"/>
-          </w:tcPr>
-          <w:p>
-            <w:pPr>
-              <w:spacing w:before="0" w:after="0"/>
-            </w:pPr>
-            <w:r>
-              <w:rPr>
-                <w:rFonts w:ascii="Arial" w:hAnsi="Arial"/>
-                <w:b/>
-                <w:color w:val="FFFFFF"/>
-                <w:sz w:val="18"/>
-              </w:rPr>
-              <w:t>Ghi chú</w:t>
-            </w:r>
-          </w:p>
-        </w:tc>
-      </w:tr>
-      <w:tr>
-        <w:tc>
-          <w:tcPr>
-            <w:tcW w:type="dxa" w:w="3408"/>
-            <w:tcMar>
-              <w:top w:w="70" w:type="dxa"/>
-              <w:bottom w:w="70" w:type="dxa"/>
-              <w:left w:w="100" w:type="dxa"/>
-              <w:right w:w="100" w:type="dxa"/>
-            </w:tcMar>
-            <w:shd w:fill="FFFFFF"/>
           </w:tcPr>
           <w:p>
             <w:pPr>
@@ -7125,7 +7927,7 @@
                 <w:color w:val="1E293B"/>
                 <w:sz w:val="18"/>
               </w:rPr>
-              <w:t>Ban đầu</w:t>
+              <w:t>Mỗi tháng</w:t>
             </w:r>
           </w:p>
         </w:tc>
@@ -7138,7 +7940,7 @@
               <w:left w:w="100" w:type="dxa"/>
               <w:right w:w="100" w:type="dxa"/>
             </w:tcMar>
-            <w:shd w:fill="FFFFFF"/>
+            <w:shd w:fill="F8FAFC"/>
           </w:tcPr>
           <w:p>
             <w:pPr>
@@ -7151,7 +7953,7 @@
                 <w:color w:val="1E293B"/>
                 <w:sz w:val="18"/>
               </w:rPr>
-              <w:t>48.890.000</w:t>
+              <w:t>3.270.000</w:t>
             </w:r>
           </w:p>
         </w:tc>
@@ -7164,7 +7966,7 @@
               <w:left w:w="100" w:type="dxa"/>
               <w:right w:w="100" w:type="dxa"/>
             </w:tcMar>
-            <w:shd w:fill="FFFFFF"/>
+            <w:shd w:fill="F8FAFC"/>
           </w:tcPr>
           <w:p>
             <w:pPr>
@@ -7176,7 +7978,7 @@
                 <w:color w:val="1E293B"/>
                 <w:sz w:val="18"/>
               </w:rPr>
-              <w:t>Phần mềm + thiết bị 1 quán</w:t>
+              <w:t>Vận hành + bảo trì</w:t>
             </w:r>
           </w:p>
         </w:tc>
@@ -7191,7 +7993,7 @@
               <w:left w:w="100" w:type="dxa"/>
               <w:right w:w="100" w:type="dxa"/>
             </w:tcMar>
-            <w:shd w:fill="F8FAFC"/>
+            <w:shd w:fill="FFFFFF"/>
           </w:tcPr>
           <w:p>
             <w:pPr>
@@ -7204,7 +8006,7 @@
                 <w:color w:val="1E293B"/>
                 <w:sz w:val="18"/>
               </w:rPr>
-              <w:t>Mỗi tháng</w:t>
+              <w:t>Năm đầu tiên</w:t>
             </w:r>
           </w:p>
         </w:tc>
@@ -7217,7 +8019,7 @@
               <w:left w:w="100" w:type="dxa"/>
               <w:right w:w="100" w:type="dxa"/>
             </w:tcMar>
-            <w:shd w:fill="F8FAFC"/>
+            <w:shd w:fill="FFFFFF"/>
           </w:tcPr>
           <w:p>
             <w:pPr>
@@ -7230,7 +8032,7 @@
                 <w:color w:val="1E293B"/>
                 <w:sz w:val="18"/>
               </w:rPr>
-              <w:t>3.440.000</w:t>
+              <w:t>~46.060.000</w:t>
             </w:r>
           </w:p>
         </w:tc>
@@ -7243,7 +8045,7 @@
               <w:left w:w="100" w:type="dxa"/>
               <w:right w:w="100" w:type="dxa"/>
             </w:tcMar>
-            <w:shd w:fill="F8FAFC"/>
+            <w:shd w:fill="FFFFFF"/>
           </w:tcPr>
           <w:p>
             <w:pPr>
@@ -7255,7 +8057,7 @@
                 <w:color w:val="1E293B"/>
                 <w:sz w:val="18"/>
               </w:rPr>
-              <w:t>Vận hành + bảo trì</w:t>
+              <w:t>Ban đầu + 9 tháng (3 tháng BH miễn phí)</w:t>
             </w:r>
           </w:p>
         </w:tc>
@@ -7270,7 +8072,7 @@
               <w:left w:w="100" w:type="dxa"/>
               <w:right w:w="100" w:type="dxa"/>
             </w:tcMar>
-            <w:shd w:fill="FFFFFF"/>
+            <w:shd w:fill="F8FAFC"/>
           </w:tcPr>
           <w:p>
             <w:pPr>
@@ -7283,7 +8085,7 @@
                 <w:color w:val="1E293B"/>
                 <w:sz w:val="18"/>
               </w:rPr>
-              <w:t>Năm đầu tiên</w:t>
+              <w:t>Mở rộng thêm 1 quán</w:t>
             </w:r>
           </w:p>
         </w:tc>
@@ -7296,7 +8098,7 @@
               <w:left w:w="100" w:type="dxa"/>
               <w:right w:w="100" w:type="dxa"/>
             </w:tcMar>
-            <w:shd w:fill="FFFFFF"/>
+            <w:shd w:fill="F8FAFC"/>
           </w:tcPr>
           <w:p>
             <w:pPr>
@@ -7309,7 +8111,7 @@
                 <w:color w:val="1E293B"/>
                 <w:sz w:val="18"/>
               </w:rPr>
-              <w:t>~79.850.000</w:t>
+              <w:t>+1.630.000</w:t>
             </w:r>
           </w:p>
         </w:tc>
@@ -7322,7 +8124,7 @@
               <w:left w:w="100" w:type="dxa"/>
               <w:right w:w="100" w:type="dxa"/>
             </w:tcMar>
-            <w:shd w:fill="FFFFFF"/>
+            <w:shd w:fill="F8FAFC"/>
           </w:tcPr>
           <w:p>
             <w:pPr>
@@ -7334,86 +8136,7 @@
                 <w:color w:val="1E293B"/>
                 <w:sz w:val="18"/>
               </w:rPr>
-              <w:t>Ban đầu + 9 tháng (3 tháng BH miễn phí)</w:t>
-            </w:r>
-          </w:p>
-        </w:tc>
-      </w:tr>
-      <w:tr>
-        <w:tc>
-          <w:tcPr>
-            <w:tcW w:type="dxa" w:w="3408"/>
-            <w:tcMar>
-              <w:top w:w="70" w:type="dxa"/>
-              <w:bottom w:w="70" w:type="dxa"/>
-              <w:left w:w="100" w:type="dxa"/>
-              <w:right w:w="100" w:type="dxa"/>
-            </w:tcMar>
-            <w:shd w:fill="F8FAFC"/>
-          </w:tcPr>
-          <w:p>
-            <w:pPr>
-              <w:spacing w:before="0" w:after="0"/>
-            </w:pPr>
-            <w:r>
-              <w:rPr>
-                <w:rFonts w:ascii="Arial" w:hAnsi="Arial"/>
-                <w:b/>
-                <w:color w:val="1E293B"/>
-                <w:sz w:val="18"/>
-              </w:rPr>
-              <w:t>Mở rộng thêm 1 quán</w:t>
-            </w:r>
-          </w:p>
-        </w:tc>
-        <w:tc>
-          <w:tcPr>
-            <w:tcW w:type="dxa" w:w="3408"/>
-            <w:tcMar>
-              <w:top w:w="70" w:type="dxa"/>
-              <w:bottom w:w="70" w:type="dxa"/>
-              <w:left w:w="100" w:type="dxa"/>
-              <w:right w:w="100" w:type="dxa"/>
-            </w:tcMar>
-            <w:shd w:fill="F8FAFC"/>
-          </w:tcPr>
-          <w:p>
-            <w:pPr>
-              <w:spacing w:before="0" w:after="0"/>
-            </w:pPr>
-            <w:r>
-              <w:rPr>
-                <w:rFonts w:ascii="Arial" w:hAnsi="Arial"/>
-                <w:b/>
-                <w:color w:val="1E293B"/>
-                <w:sz w:val="18"/>
-              </w:rPr>
-              <w:t>+13.890.000</w:t>
-            </w:r>
-          </w:p>
-        </w:tc>
-        <w:tc>
-          <w:tcPr>
-            <w:tcW w:type="dxa" w:w="3408"/>
-            <w:tcMar>
-              <w:top w:w="70" w:type="dxa"/>
-              <w:bottom w:w="70" w:type="dxa"/>
-              <w:left w:w="100" w:type="dxa"/>
-              <w:right w:w="100" w:type="dxa"/>
-            </w:tcMar>
-            <w:shd w:fill="F8FAFC"/>
-          </w:tcPr>
-          <w:p>
-            <w:pPr>
-              <w:spacing w:before="0" w:after="0"/>
-            </w:pPr>
-            <w:r>
-              <w:rPr>
-                <w:rFonts w:ascii="Arial" w:hAnsi="Arial"/>
-                <w:color w:val="1E293B"/>
-                <w:sz w:val="18"/>
-              </w:rPr>
-              <w:t>Chỉ mua thiết bị, phần mềm dùng chung</w:t>
+              <w:t>Chỉ QR + lắp đặt, phần mềm dùng chung</w:t>
             </w:r>
           </w:p>
         </w:tc>
@@ -7946,7 +8669,7 @@
                 <w:color w:val="1E293B"/>
                 <w:sz w:val="18"/>
               </w:rPr>
-              <w:t>3.860.000</w:t>
+              <w:t>3.410.000</w:t>
             </w:r>
           </w:p>
         </w:tc>
@@ -7971,7 +8694,7 @@
                 <w:color w:val="1E293B"/>
                 <w:sz w:val="18"/>
               </w:rPr>
-              <w:t>+2.360.000</w:t>
+              <w:t>+1.910.000</w:t>
             </w:r>
           </w:p>
         </w:tc>
@@ -8121,7 +8844,7 @@
                 <w:color w:val="1E293B"/>
                 <w:sz w:val="18"/>
               </w:rPr>
-              <w:t>~6.860.000</w:t>
+              <w:t>~6.410.000</w:t>
             </w:r>
           </w:p>
         </w:tc>
@@ -8147,7 +8870,7 @@
                 <w:color w:val="1E293B"/>
                 <w:sz w:val="18"/>
               </w:rPr>
-              <w:t>Tiết kiệm ~28 - 35 triệu</w:t>
+              <w:t>Tiết kiệm ~29 - 36 triệu</w:t>
             </w:r>
           </w:p>
         </w:tc>
@@ -8204,7 +8927,7 @@
                 <w:color w:val="1E293B"/>
                 <w:sz w:val="19"/>
               </w:rPr>
-              <w:t>28 - 35 triệu/tháng</w:t>
+              <w:t>29 - 36 triệu/tháng</w:t>
             </w:r>
             <w:r>
               <w:rPr>
@@ -8226,7 +8949,7 @@
                 <w:color w:val="1E293B"/>
                 <w:sz w:val="19"/>
               </w:rPr>
-              <w:t>Thời gian hoàn vốn toàn bộ:</w:t>
+              <w:t>Thời gian hoàn vốn</w:t>
             </w:r>
             <w:r>
               <w:rPr>
@@ -8234,7 +8957,7 @@
                 <w:color w:val="1E293B"/>
                 <w:sz w:val="19"/>
               </w:rPr>
-              <w:t xml:space="preserve"> Khoảng </w:t>
+              <w:t xml:space="preserve"> (dùng POS cũ, 3 quán): </w:t>
             </w:r>
             <w:r>
               <w:rPr>
@@ -8243,7 +8966,7 @@
                 <w:color w:val="1E293B"/>
                 <w:sz w:val="19"/>
               </w:rPr>
-              <w:t>2 - 3 tháng</w:t>
+              <w:t>Chưa đến 1 tháng</w:t>
             </w:r>
             <w:r>
               <w:rPr>
@@ -8251,7 +8974,7 @@
                 <w:color w:val="1E293B"/>
                 <w:sz w:val="19"/>
               </w:rPr>
-              <w:t xml:space="preserve"> vận hành.</w:t>
+              <w:t>.</w:t>
             </w:r>
           </w:p>
           <w:p>
@@ -8264,7 +8987,7 @@
                 <w:color w:val="1E293B"/>
                 <w:sz w:val="19"/>
               </w:rPr>
-              <w:t>Từ tháng thứ 4 trở đi, toàn bộ khoản tiết kiệm là lợi nhuận ròng.</w:t>
+              <w:t>Từ tháng thứ 2 trở đi, toàn bộ khoản tiết kiệm là lợi nhuận ròng.</w:t>
             </w:r>
           </w:p>
         </w:tc>
@@ -8506,7 +9229,7 @@
                 <w:color w:val="1E293B"/>
                 <w:sz w:val="18"/>
               </w:rPr>
-              <w:t>15.000.000</w:t>
+              <w:t>7.000.000</w:t>
             </w:r>
           </w:p>
         </w:tc>
@@ -8608,7 +9331,7 @@
                 <w:color w:val="1E293B"/>
                 <w:sz w:val="18"/>
               </w:rPr>
-              <w:t>12.000.000 + 13.890.000</w:t>
+              <w:t>5.000.000 + thiết bị</w:t>
             </w:r>
           </w:p>
         </w:tc>
@@ -8710,7 +9433,7 @@
                 <w:color w:val="1E293B"/>
                 <w:sz w:val="18"/>
               </w:rPr>
-              <w:t>8.000.000</w:t>
+              <w:t>3.000.000</w:t>
             </w:r>
           </w:p>
         </w:tc>
@@ -8812,7 +9535,7 @@
                 <w:color w:val="1E293B"/>
                 <w:sz w:val="18"/>
               </w:rPr>
-              <w:t>3.440.000</w:t>
+              <w:t>3.270.000</w:t>
             </w:r>
           </w:p>
         </w:tc>
@@ -9061,7 +9784,7 @@
                 <w:color w:val="1E293B"/>
                 <w:sz w:val="18"/>
               </w:rPr>
-              <w:t>15.000.000</w:t>
+              <w:t>7.000.000</w:t>
             </w:r>
           </w:p>
         </w:tc>
@@ -9163,7 +9886,7 @@
                 <w:color w:val="1E293B"/>
                 <w:sz w:val="18"/>
               </w:rPr>
-              <w:t>12.000.000 + 41.490.000</w:t>
+              <w:t>5.000.000 + thiết bị</w:t>
             </w:r>
           </w:p>
         </w:tc>
@@ -9265,7 +9988,7 @@
                 <w:color w:val="1E293B"/>
                 <w:sz w:val="18"/>
               </w:rPr>
-              <w:t>8.000.000</w:t>
+              <w:t>3.000.000</w:t>
             </w:r>
           </w:p>
         </w:tc>
@@ -9367,7 +10090,7 @@
                 <w:color w:val="1E293B"/>
                 <w:sz w:val="18"/>
               </w:rPr>
-              <w:t>3.860.000</w:t>
+              <w:t>3.410.000</w:t>
             </w:r>
           </w:p>
         </w:tc>
@@ -9483,7 +10206,7 @@
           <w:rFonts w:ascii="Arial" w:hAnsi="Arial"/>
           <w:sz w:val="20"/>
         </w:rPr>
-        <w:t>5. Hệ thống có cơ chế dự phòng mất mạng 3 lớp: Router 4G, Offline Mode trên POS, và PWA cache menu.</w:t>
+        <w:t>5. Hệ thống có chế độ Offline Mode trên POS và PWA cache menu. Router 4G là tùy chọn thêm nếu cần.</w:t>
       </w:r>
     </w:p>
     <w:p>
@@ -9496,7 +10219,7 @@
           <w:rFonts w:ascii="Arial" w:hAnsi="Arial"/>
           <w:sz w:val="20"/>
         </w:rPr>
-        <w:t>6. Máy in cũ của cây POS (chuẩn ESC/POS, khổ 80mm) có thể tái sử dụng, giảm 6 triệu chi phí thiết bị.</w:t>
+        <w:t>6. Nếu quán đã có máy POS cũ (Android, cảm ứng), có thể tái sử dụng — tiết kiệm đến 27 triệu. Máy in cũ ESC/POS cũng tái sử dụng được.</w:t>
       </w:r>
     </w:p>
     <w:p>
@@ -9522,7 +10245,7 @@
           <w:rFonts w:ascii="Arial" w:hAnsi="Arial"/>
           <w:sz w:val="20"/>
         </w:rPr>
-        <w:t>8. Khi mất mạng hoàn toàn, quán vẫn hoạt động: NV tạo đơn trên POS, thu tiền mặt, dữ liệu tự đồng bộ khi có mạng.</w:t>
+        <w:t>8. Khi mất mạng, quán vẫn hoạt động: NV tạo đơn trên POS, thu tiền mặt, dữ liệu tự đồng bộ khi có mạng.</w:t>
       </w:r>
     </w:p>
     <w:p>

</xml_diff>

<commit_message>
docs: maintenance basic 2M->1M, advanced->negotiable, update all monthly totals
</commit_message>
<xml_diff>
--- a/BaoGia_KhachHang.docx
+++ b/BaoGia_KhachHang.docx
@@ -4068,7 +4068,7 @@
                 <w:color w:val="1E293B"/>
                 <w:sz w:val="18"/>
               </w:rPr>
-              <w:t>2.000.000</w:t>
+              <w:t>1.000.000</w:t>
             </w:r>
           </w:p>
         </w:tc>
@@ -4145,7 +4145,7 @@
                 <w:color w:val="1E293B"/>
                 <w:sz w:val="18"/>
               </w:rPr>
-              <w:t>4.000.000</w:t>
+              <w:t>Thương lượng</w:t>
             </w:r>
           </w:p>
         </w:tc>
@@ -4170,7 +4170,7 @@
                 <w:color w:val="1E293B"/>
                 <w:sz w:val="18"/>
               </w:rPr>
-              <w:t>Gói cơ bản + phát triển tính năng mới nhỏ, tối ưu hiệu năng, hỗ trợ ngoài giờ</w:t>
+              <w:t>Gói cơ bản + phát triển tính năng mới, tối ưu hiệu năng, hỗ trợ ngoài giờ</w:t>
             </w:r>
           </w:p>
         </w:tc>
@@ -6148,7 +6148,7 @@
                 <w:color w:val="1E293B"/>
                 <w:sz w:val="18"/>
               </w:rPr>
-              <w:t>2.000.000</w:t>
+              <w:t>1.000.000</w:t>
             </w:r>
           </w:p>
         </w:tc>
@@ -6202,7 +6202,7 @@
                 <w:color w:val="1E293B"/>
                 <w:sz w:val="18"/>
               </w:rPr>
-              <w:t>3.270.000</w:t>
+              <w:t>2.270.000</w:t>
             </w:r>
           </w:p>
         </w:tc>
@@ -7086,7 +7086,7 @@
                 <w:color w:val="1E293B"/>
                 <w:sz w:val="18"/>
               </w:rPr>
-              <w:t>2.000.000</w:t>
+              <w:t>1.000.000</w:t>
             </w:r>
           </w:p>
         </w:tc>
@@ -7140,7 +7140,7 @@
                 <w:color w:val="1E293B"/>
                 <w:sz w:val="18"/>
               </w:rPr>
-              <w:t>3.410.000</w:t>
+              <w:t>2.410.000</w:t>
             </w:r>
           </w:p>
         </w:tc>
@@ -7498,7 +7498,7 @@
                 <w:color w:val="1E293B"/>
                 <w:sz w:val="18"/>
               </w:rPr>
-              <w:t>3.270.000</w:t>
+              <w:t>2.270.000</w:t>
             </w:r>
           </w:p>
         </w:tc>
@@ -7523,7 +7523,7 @@
                 <w:color w:val="1E293B"/>
                 <w:sz w:val="18"/>
               </w:rPr>
-              <w:t>3.270.000</w:t>
+              <w:t>2.270.000</w:t>
             </w:r>
           </w:p>
         </w:tc>
@@ -7548,7 +7548,7 @@
                 <w:color w:val="1E293B"/>
                 <w:sz w:val="18"/>
               </w:rPr>
-              <w:t>3.410.000</w:t>
+              <w:t>2.410.000</w:t>
             </w:r>
           </w:p>
         </w:tc>
@@ -7573,7 +7573,7 @@
                 <w:color w:val="1E293B"/>
                 <w:sz w:val="18"/>
               </w:rPr>
-              <w:t>3.410.000</w:t>
+              <w:t>2.410.000</w:t>
             </w:r>
           </w:p>
         </w:tc>
@@ -7625,7 +7625,7 @@
                 <w:color w:val="1E293B"/>
                 <w:sz w:val="18"/>
               </w:rPr>
-              <w:t>~1 tháng</w:t>
+              <w:t>&lt; 1 tháng</w:t>
             </w:r>
           </w:p>
         </w:tc>
@@ -7953,7 +7953,7 @@
                 <w:color w:val="1E293B"/>
                 <w:sz w:val="18"/>
               </w:rPr>
-              <w:t>3.270.000</w:t>
+              <w:t>2.270.000</w:t>
             </w:r>
           </w:p>
         </w:tc>
@@ -8032,7 +8032,7 @@
                 <w:color w:val="1E293B"/>
                 <w:sz w:val="18"/>
               </w:rPr>
-              <w:t>~46.060.000</w:t>
+              <w:t>~37.060.000</w:t>
             </w:r>
           </w:p>
         </w:tc>
@@ -8669,7 +8669,7 @@
                 <w:color w:val="1E293B"/>
                 <w:sz w:val="18"/>
               </w:rPr>
-              <w:t>3.410.000</w:t>
+              <w:t>2.410.000</w:t>
             </w:r>
           </w:p>
         </w:tc>
@@ -8694,7 +8694,7 @@
                 <w:color w:val="1E293B"/>
                 <w:sz w:val="18"/>
               </w:rPr>
-              <w:t>+1.910.000</w:t>
+              <w:t>+910.000</w:t>
             </w:r>
           </w:p>
         </w:tc>
@@ -8844,7 +8844,7 @@
                 <w:color w:val="1E293B"/>
                 <w:sz w:val="18"/>
               </w:rPr>
-              <w:t>~6.410.000</w:t>
+              <w:t>~5.410.000</w:t>
             </w:r>
           </w:p>
         </w:tc>
@@ -8870,7 +8870,7 @@
                 <w:color w:val="1E293B"/>
                 <w:sz w:val="18"/>
               </w:rPr>
-              <w:t>Tiết kiệm ~29 - 36 triệu</w:t>
+              <w:t>Tiết kiệm ~30 - 37 triệu</w:t>
             </w:r>
           </w:p>
         </w:tc>
@@ -8927,7 +8927,7 @@
                 <w:color w:val="1E293B"/>
                 <w:sz w:val="19"/>
               </w:rPr>
-              <w:t>29 - 36 triệu/tháng</w:t>
+              <w:t>30 - 37 triệu/tháng</w:t>
             </w:r>
             <w:r>
               <w:rPr>
@@ -9535,7 +9535,7 @@
                 <w:color w:val="1E293B"/>
                 <w:sz w:val="18"/>
               </w:rPr>
-              <w:t>3.270.000</w:t>
+              <w:t>2.270.000</w:t>
             </w:r>
           </w:p>
         </w:tc>
@@ -10090,7 +10090,7 @@
                 <w:color w:val="1E293B"/>
                 <w:sz w:val="18"/>
               </w:rPr>
-              <w:t>3.410.000</w:t>
+              <w:t>2.410.000</w:t>
             </w:r>
           </w:p>
         </w:tc>

</xml_diff>